<commit_message>
Small GT results: Mars 100 saves 17 % and is complementary to flexibility
- Fleet sensitivity now with fixed and flexible demand: 2 main + Mars 100 gives
  53.9 kt (fixed) and 47.8 kt (flexible); flexibility still saves 11 %
- Run cache key ignores the sensitivity and validation sections, so editing the
  run list no longer invalidates finished runs (existing runs re-keyed)
- Paper: Methods 2.1 justification revised (fleet fixed to isolate the value of
  flexibility), new small-GT result, discussion and conclusion; all case-3 and
  sensitivity numbers updated to this run; Fig. 4 is now week 3
- Fig. 7 fleet labels on two lines
</commit_message>
<xml_diff>
--- a/docs/paper/paper.docx
+++ b/docs/paper/paper.docx
@@ -125,7 +125,7 @@
         <w:t xml:space="preserve"> </w:t>
       </w:r>
       <w:r>
-        <w:t xml:space="preserve">cuts them by a further 11 % (7.1 kt/yr) without any loss of production,</w:t>
+        <w:t xml:space="preserve">cuts them by a further 11 % (7.2 kt/yr) without lost production,</w:t>
       </w:r>
       <w:r>
         <w:t xml:space="preserve"> </w:t>
@@ -137,13 +137,19 @@
         <w:t xml:space="preserve"> </w:t>
       </w:r>
       <w:r>
-        <w:t xml:space="preserve">turbines online fall from 1,702 to 30. About 24 h of deferrable injection</w:t>
-      </w:r>
-      <w:r>
-        <w:t xml:space="preserve"> </w:t>
-      </w:r>
-      <w:r>
-        <w:t xml:space="preserve">captures the full benefit; prices do not change the schedule. Operating</w:t>
+        <w:t xml:space="preserve">turbines online fall from 1,702 to 28. About 24 h of deferrable injection</w:t>
+      </w:r>
+      <w:r>
+        <w:t xml:space="preserve"> </w:t>
+      </w:r>
+      <w:r>
+        <w:t xml:space="preserve">captures the full benefit, and a small added gas turbine saves a similar</w:t>
+      </w:r>
+      <w:r>
+        <w:t xml:space="preserve"> </w:t>
+      </w:r>
+      <w:r>
+        <w:t xml:space="preserve">amount on top. Operating</w:t>
       </w:r>
       <w:r>
         <w:t xml:space="preserve"> </w:t>
@@ -155,13 +161,7 @@
         <w:t xml:space="preserve"> </w:t>
       </w:r>
       <w:r>
-        <w:t xml:space="preserve">reproduces the CO2 avoided per MWh of wind reported for Hywind Tampen within</w:t>
-      </w:r>
-      <w:r>
-        <w:t xml:space="preserve"> </w:t>
-      </w:r>
-      <w:r>
-        <w:t xml:space="preserve">2 %.</w:t>
+        <w:t xml:space="preserve">reproduces Hywind Tampen’s reported CO2 avoided per MWh of wind within 2 %.</w:t>
       </w:r>
     </w:p>
     <w:p>
@@ -2782,6 +2782,86 @@
         <w:pStyle w:val="BodyText"/>
       </w:pPr>
       <w:r>
+        <w:t xml:space="preserve">The base case uses the existing main turbines rather than a new, smaller</w:t>
+      </w:r>
+      <w:r>
+        <w:t xml:space="preserve"> </w:t>
+      </w:r>
+      <w:r>
+        <w:t xml:space="preserve">GT, for three reasons. First, wind is being added to existing platforms that</w:t>
+      </w:r>
+      <w:r>
+        <w:t xml:space="preserve"> </w:t>
+      </w:r>
+      <w:r>
+        <w:t xml:space="preserve">keep their installed turbines; the five platforms supplied by Hywind Tampen</w:t>
+      </w:r>
+      <w:r>
+        <w:t xml:space="preserve"> </w:t>
+      </w:r>
+      <w:r>
+        <w:t xml:space="preserve">are an example [8]. Second, load flexibility is an operational</w:t>
+      </w:r>
+      <w:r>
+        <w:t xml:space="preserve"> </w:t>
+      </w:r>
+      <w:r>
+        <w:t xml:space="preserve">measure, whereas a new GT is an investment; keeping the fleet fixed isolates</w:t>
+      </w:r>
+      <w:r>
+        <w:t xml:space="preserve"> </w:t>
+      </w:r>
+      <w:r>
+        <w:t xml:space="preserve">the value of flexibility. The effect of a smaller unit is quantified</w:t>
+      </w:r>
+      <w:r>
+        <w:t xml:space="preserve"> </w:t>
+      </w:r>
+      <w:r>
+        <w:t xml:space="preserve">separately in the sensitivity analysis with an 11.35 MW Solar Turbines</w:t>
+      </w:r>
+      <w:r>
+        <w:t xml:space="preserve"> </w:t>
+      </w:r>
+      <w:r>
+        <w:t xml:space="preserve">Mars 100 [16], either replacing one main unit or added to the</w:t>
+      </w:r>
+      <w:r>
+        <w:t xml:space="preserve"> </w:t>
+      </w:r>
+      <w:r>
+        <w:t xml:space="preserve">three, with both fixed and flexible demand. Third, the main turbine is a published reference machine with</w:t>
+      </w:r>
+      <w:r>
+        <w:t xml:space="preserve"> </w:t>
+      </w:r>
+      <w:r>
+        <w:t xml:space="preserve">a documented part-load curve [9], whereas manufacturers publish</w:t>
+      </w:r>
+      <w:r>
+        <w:t xml:space="preserve"> </w:t>
+      </w:r>
+      <w:r>
+        <w:t xml:space="preserve">only full-load ratings for small units. A small unit alone could not carry</w:t>
+      </w:r>
+      <w:r>
+        <w:t xml:space="preserve"> </w:t>
+      </w:r>
+      <w:r>
+        <w:t xml:space="preserve">the 20 MW platform with 5 MW of reserve in calm periods, so it is meaningful</w:t>
+      </w:r>
+      <w:r>
+        <w:t xml:space="preserve"> </w:t>
+      </w:r>
+      <w:r>
+        <w:t xml:space="preserve">only as part of a mixed fleet.</w:t>
+      </w:r>
+    </w:p>
+    <w:p>
+      <w:pPr>
+        <w:pStyle w:val="BodyText"/>
+      </w:pPr>
+      <w:r>
         <w:t xml:space="preserve">Process behaviour is represented by steady-state operating points with ramp</w:t>
       </w:r>
       <w:r>
@@ -2800,13 +2880,13 @@
         <w:t xml:space="preserve"> </w:t>
       </w:r>
       <w:r>
-        <w:t xml:space="preserve">[16] and Pyomo with the HiGHS solver for optimisation</w:t>
-      </w:r>
-      <w:r>
-        <w:t xml:space="preserve"> </w:t>
-      </w:r>
-      <w:r>
-        <w:t xml:space="preserve">[17,18]. Every parameter is stored in a single</w:t>
+        <w:t xml:space="preserve">[17] and Pyomo with the HiGHS solver for optimisation</w:t>
+      </w:r>
+      <w:r>
+        <w:t xml:space="preserve"> </w:t>
+      </w:r>
+      <w:r>
+        <w:t xml:space="preserve">[18,19]. Every parameter is stored in a single</w:t>
       </w:r>
       <w:r>
         <w:t xml:space="preserve"> </w:t>
@@ -2965,7 +3045,7 @@
         <w:t xml:space="preserve"> </w:t>
       </w:r>
       <w:r>
-        <w:t xml:space="preserve">2023 were taken from the ERA5 reanalysis [19] at the grid point</w:t>
+        <w:t xml:space="preserve">2023 were taken from the ERA5 reanalysis [20] at the grid point</w:t>
       </w:r>
       <w:r>
         <w:t xml:space="preserve"> </w:t>
@@ -3118,7 +3198,7 @@
         <w:pStyle w:val="FirstParagraph"/>
       </w:pPr>
       <w:r>
-        <w:t xml:space="preserve">the exponent recommended for near-neutral conditions at sea [20].</w:t>
+        <w:t xml:space="preserve">the exponent recommended for near-neutral conditions at sea [21].</w:t>
       </w:r>
       <w:r>
         <w:t xml:space="preserve"> </w:t>
@@ -3130,7 +3210,7 @@
         <w:t xml:space="preserve"> </w:t>
       </w:r>
       <w:r>
-        <w:t xml:space="preserve">reference turbine [21], with cut-in at 3 m/s, rated power from</w:t>
+        <w:t xml:space="preserve">reference turbine [22], with cut-in at 3 m/s, rated power from</w:t>
       </w:r>
       <w:r>
         <w:t xml:space="preserve"> </w:t>
@@ -3597,7 +3677,7 @@
         <w:t xml:space="preserve"> </w:t>
       </w:r>
       <w:r>
-        <w:t xml:space="preserve">NeqSim to ISO 6976 [22] from a generic North Sea fuel gas</w:t>
+        <w:t xml:space="preserve">NeqSim to ISO 6976 [23] from a generic North Sea fuel gas</w:t>
       </w:r>
       <w:r>
         <w:t xml:space="preserve"> </w:t>
@@ -3687,7 +3767,7 @@
         <w:t xml:space="preserve"> </w:t>
       </w:r>
       <w:r>
-        <w:t xml:space="preserve">[23];</w:t>
+        <w:t xml:space="preserve">[24];</w:t>
       </w:r>
     </w:p>
     <w:p>
@@ -3729,7 +3809,7 @@
         <w:t xml:space="preserve"> </w:t>
       </w:r>
       <w:r>
-        <w:t xml:space="preserve">reported for a real platform [23];</w:t>
+        <w:t xml:space="preserve">reported for a real platform [24];</w:t>
       </w:r>
     </w:p>
     <w:p>
@@ -3777,7 +3857,7 @@
         <w:t xml:space="preserve"> </w:t>
       </w:r>
       <w:r>
-        <w:t xml:space="preserve">[24];</w:t>
+        <w:t xml:space="preserve">[25];</w:t>
       </w:r>
     </w:p>
     <w:p>
@@ -4750,7 +4830,7 @@
         <w:t xml:space="preserve"> </w:t>
       </w:r>
       <w:r>
-        <w:t xml:space="preserve">real North Sea platforms [23], which shows that recycle is common</w:t>
+        <w:t xml:space="preserve">real North Sea platforms [24], which shows that recycle is common</w:t>
       </w:r>
       <w:r>
         <w:t xml:space="preserve"> </w:t>
@@ -5877,7 +5957,7 @@
         <w:t xml:space="preserve"> </w:t>
       </w:r>
       <w:r>
-        <w:t xml:space="preserve">total CO2 price in 2030 [25],</w:t>
+        <w:t xml:space="preserve">total CO2 price in 2030 [26],</w:t>
       </w:r>
       <w:r>
         <w:t xml:space="preserve"> </w:t>
@@ -7729,13 +7809,25 @@
         <w:pStyle w:val="Compact"/>
       </w:pPr>
       <w:r>
-        <w:t xml:space="preserve">GT fleet: three main units, or two main units and one smaller unit</w:t>
-      </w:r>
-      <w:r>
-        <w:t xml:space="preserve"> </w:t>
-      </w:r>
-      <w:r>
-        <w:t xml:space="preserve">(19 MW, data not verified);</w:t>
+        <w:t xml:space="preserve">GT fleet: three main units; two main units and one small unit, a Solar</w:t>
+      </w:r>
+      <w:r>
+        <w:t xml:space="preserve"> </w:t>
+      </w:r>
+      <w:r>
+        <w:t xml:space="preserve">Turbines Mars 100 rated 11.35 MW with 32.9 % ISO efficiency</w:t>
+      </w:r>
+      <w:r>
+        <w:t xml:space="preserve"> </w:t>
+      </w:r>
+      <w:r>
+        <w:t xml:space="preserve">[16] and the same relative part-load curve as the main units;</w:t>
+      </w:r>
+      <w:r>
+        <w:t xml:space="preserve"> </w:t>
+      </w:r>
+      <w:r>
+        <w:t xml:space="preserve">or the three main units with one small unit added;</w:t>
       </w:r>
     </w:p>
     <w:p>
@@ -7789,13 +7881,13 @@
         <w:t xml:space="preserve"> </w:t>
       </w:r>
       <w:r>
-        <w:t xml:space="preserve">[23,26], six modelled platforms [10], the</w:t>
-      </w:r>
-      <w:r>
-        <w:t xml:space="preserve"> </w:t>
-      </w:r>
-      <w:r>
-        <w:t xml:space="preserve">Johan Castberg development plan [27], and the average demand</w:t>
+        <w:t xml:space="preserve">[24,27], six modelled platforms [10], the</w:t>
+      </w:r>
+      <w:r>
+        <w:t xml:space="preserve"> </w:t>
+      </w:r>
+      <w:r>
+        <w:t xml:space="preserve">Johan Castberg development plan [28], and the average demand</w:t>
       </w:r>
       <w:r>
         <w:t xml:space="preserve"> </w:t>
@@ -7823,7 +7915,7 @@
         <w:t xml:space="preserve"> </w:t>
       </w:r>
       <w:r>
-        <w:t xml:space="preserve">Hywind Tampen [8,28];</w:t>
+        <w:t xml:space="preserve">Hywind Tampen [8,29];</w:t>
       </w:r>
     </w:p>
     <w:p>
@@ -7895,7 +7987,7 @@
         <w:t xml:space="preserve"> </w:t>
       </w:r>
       <w:r>
-        <w:t xml:space="preserve">non-electrified hubs [29];</w:t>
+        <w:t xml:space="preserve">non-electrified hubs [30];</w:t>
       </w:r>
     </w:p>
     <w:p>
@@ -7929,13 +8021,13 @@
         <w:t xml:space="preserve"> </w:t>
       </w:r>
       <w:r>
-        <w:t xml:space="preserve">[30] and net production from the Norwegian Offshore</w:t>
-      </w:r>
-      <w:r>
-        <w:t xml:space="preserve"> </w:t>
-      </w:r>
-      <w:r>
-        <w:t xml:space="preserve">Directorate [31], summed over the fields processed at each</w:t>
+        <w:t xml:space="preserve">[31] and net production from the Norwegian Offshore</w:t>
+      </w:r>
+      <w:r>
+        <w:t xml:space="preserve"> </w:t>
+      </w:r>
+      <w:r>
+        <w:t xml:space="preserve">Directorate [32], summed over the fields processed at each</w:t>
       </w:r>
       <w:r>
         <w:t xml:space="preserve"> </w:t>
@@ -8415,7 +8507,7 @@
               <w:jc w:val="left"/>
             </w:pPr>
             <w:r>
-              <w:t xml:space="preserve">57.6</w:t>
+              <w:t xml:space="preserve">57.5</w:t>
             </w:r>
           </w:p>
         </w:tc>
@@ -8477,7 +8569,7 @@
               <w:jc w:val="left"/>
             </w:pPr>
             <w:r>
-              <w:t xml:space="preserve">54.9 %</w:t>
+              <w:t xml:space="preserve">55.0 %</w:t>
             </w:r>
           </w:p>
         </w:tc>
@@ -8601,7 +8693,7 @@
               <w:jc w:val="left"/>
             </w:pPr>
             <w:r>
-              <w:t xml:space="preserve">8,790</w:t>
+              <w:t xml:space="preserve">8,788</w:t>
             </w:r>
           </w:p>
         </w:tc>
@@ -8663,19 +8755,19 @@
               <w:jc w:val="left"/>
             </w:pPr>
             <w:r>
-              <w:t xml:space="preserve">5,928</w:t>
-            </w:r>
-          </w:p>
-        </w:tc>
-        <w:tc>
-          <w:tcPr/>
-          <w:p>
-            <w:pPr>
-              <w:pStyle w:val="Compact"/>
-              <w:jc w:val="left"/>
-            </w:pPr>
-            <w:r>
-              <w:t xml:space="preserve">6,235</w:t>
+              <w:t xml:space="preserve">5,932</w:t>
+            </w:r>
+          </w:p>
+        </w:tc>
+        <w:tc>
+          <w:tcPr/>
+          <w:p>
+            <w:pPr>
+              <w:pStyle w:val="Compact"/>
+              <w:jc w:val="left"/>
+            </w:pPr>
+            <w:r>
+              <w:t xml:space="preserve">6,242</w:t>
             </w:r>
           </w:p>
         </w:tc>
@@ -8725,7 +8817,7 @@
               <w:jc w:val="left"/>
             </w:pPr>
             <w:r>
-              <w:t xml:space="preserve">6</w:t>
+              <w:t xml:space="preserve">3</w:t>
             </w:r>
           </w:p>
         </w:tc>
@@ -8787,19 +8879,19 @@
               <w:jc w:val="left"/>
             </w:pPr>
             <w:r>
-              <w:t xml:space="preserve">95.0</w:t>
-            </w:r>
-          </w:p>
-        </w:tc>
-        <w:tc>
-          <w:tcPr/>
-          <w:p>
-            <w:pPr>
-              <w:pStyle w:val="Compact"/>
-              <w:jc w:val="left"/>
-            </w:pPr>
-            <w:r>
-              <w:t xml:space="preserve">95.8</w:t>
+              <w:t xml:space="preserve">95.1</w:t>
+            </w:r>
+          </w:p>
+        </w:tc>
+        <w:tc>
+          <w:tcPr/>
+          <w:p>
+            <w:pPr>
+              <w:pStyle w:val="Compact"/>
+              <w:jc w:val="left"/>
+            </w:pPr>
+            <w:r>
+              <w:t xml:space="preserve">95.7</w:t>
             </w:r>
           </w:p>
         </w:tc>
@@ -8849,19 +8941,19 @@
               <w:jc w:val="left"/>
             </w:pPr>
             <w:r>
-              <w:t xml:space="preserve">38.8</w:t>
-            </w:r>
-          </w:p>
-        </w:tc>
-        <w:tc>
-          <w:tcPr/>
-          <w:p>
-            <w:pPr>
-              <w:pStyle w:val="Compact"/>
-              <w:jc w:val="left"/>
-            </w:pPr>
-            <w:r>
-              <w:t xml:space="preserve">38.0</w:t>
+              <w:t xml:space="preserve">38.7</w:t>
+            </w:r>
+          </w:p>
+        </w:tc>
+        <w:tc>
+          <w:tcPr/>
+          <w:p>
+            <w:pPr>
+              <w:pStyle w:val="Compact"/>
+              <w:jc w:val="left"/>
+            </w:pPr>
+            <w:r>
+              <w:t xml:space="preserve">38.1</w:t>
             </w:r>
           </w:p>
         </w:tc>
@@ -8973,19 +9065,19 @@
               <w:jc w:val="left"/>
             </w:pPr>
             <w:r>
-              <w:t xml:space="preserve">218.1</w:t>
-            </w:r>
-          </w:p>
-        </w:tc>
-        <w:tc>
-          <w:tcPr/>
-          <w:p>
-            <w:pPr>
-              <w:pStyle w:val="Compact"/>
-              <w:jc w:val="left"/>
-            </w:pPr>
-            <w:r>
-              <w:t xml:space="preserve">216.6</w:t>
+              <w:t xml:space="preserve">217.9</w:t>
+            </w:r>
+          </w:p>
+        </w:tc>
+        <w:tc>
+          <w:tcPr/>
+          <w:p>
+            <w:pPr>
+              <w:pStyle w:val="Compact"/>
+              <w:jc w:val="left"/>
+            </w:pPr>
+            <w:r>
+              <w:t xml:space="preserve">216.7</w:t>
             </w:r>
           </w:p>
         </w:tc>
@@ -9072,43 +9164,43 @@
         <w:pStyle w:val="BodyText"/>
       </w:pPr>
       <w:r>
-        <w:t xml:space="preserve">Flexible scheduling (case 3) reduces CO2 by a further 7.1 kt/yr, 11.0 %</w:t>
-      </w:r>
-      <w:r>
-        <w:t xml:space="preserve"> </w:t>
-      </w:r>
-      <w:r>
-        <w:t xml:space="preserve">relative to case 2, to 57.6 kt, without any loss of production. Fuel use</w:t>
-      </w:r>
-      <w:r>
-        <w:t xml:space="preserve"> </w:t>
-      </w:r>
-      <w:r>
-        <w:t xml:space="preserve">falls by the same 11 %. GT running hours fall from 10,462 to 8,790 unit-h,</w:t>
-      </w:r>
-      <w:r>
-        <w:t xml:space="preserve"> </w:t>
-      </w:r>
-      <w:r>
-        <w:t xml:space="preserve">the low-load unit-hours by 34 % and the GT starts from 149 to 6. Wind covers</w:t>
-      </w:r>
-      <w:r>
-        <w:t xml:space="preserve"> </w:t>
-      </w:r>
-      <w:r>
-        <w:t xml:space="preserve">57.6 % of the demand, curtailment falls by 13 % to 38.8 GWh, and the mean</w:t>
-      </w:r>
-      <w:r>
-        <w:t xml:space="preserve"> </w:t>
-      </w:r>
-      <w:r>
-        <w:t xml:space="preserve">load of the running GTs rises to 37 %. The combined fuel value and CO2 cost</w:t>
-      </w:r>
-      <w:r>
-        <w:t xml:space="preserve"> </w:t>
-      </w:r>
-      <w:r>
-        <w:t xml:space="preserve">falls by 27 MNOK/yr, of which 12.8 MNOK is the value of the fuel saved.</w:t>
+        <w:t xml:space="preserve">Flexible scheduling (case 3) reduces CO2 by a further 7.2 kt/yr, 11.1 %</w:t>
+      </w:r>
+      <w:r>
+        <w:t xml:space="preserve"> </w:t>
+      </w:r>
+      <w:r>
+        <w:t xml:space="preserve">relative to case 2, to 57.5 kt, without any loss of production. Fuel use</w:t>
+      </w:r>
+      <w:r>
+        <w:t xml:space="preserve"> </w:t>
+      </w:r>
+      <w:r>
+        <w:t xml:space="preserve">falls by the same 11 %. GT running hours fall from 10,462 to 8,788 unit-h,</w:t>
+      </w:r>
+      <w:r>
+        <w:t xml:space="preserve"> </w:t>
+      </w:r>
+      <w:r>
+        <w:t xml:space="preserve">the low-load unit-hours by 34 % and the GT starts from 149 to 3. Wind covers</w:t>
+      </w:r>
+      <w:r>
+        <w:t xml:space="preserve"> </w:t>
+      </w:r>
+      <w:r>
+        <w:t xml:space="preserve">57.6 % of the demand, curtailment falls by 13 % to 38.7 GWh, and the mean</w:t>
+      </w:r>
+      <w:r>
+        <w:t xml:space="preserve"> </w:t>
+      </w:r>
+      <w:r>
+        <w:t xml:space="preserve">load of the running GTs rises to 36 %. The combined fuel value and CO2 cost</w:t>
+      </w:r>
+      <w:r>
+        <w:t xml:space="preserve"> </w:t>
+      </w:r>
+      <w:r>
+        <w:t xml:space="preserve">falls by 27 MNOK/yr, of which 12.9 MNOK is the value of the fuel saved.</w:t>
       </w:r>
     </w:p>
     <w:p>
@@ -9116,7 +9208,7 @@
         <w:pStyle w:val="BodyText"/>
       </w:pPr>
       <w:r>
-        <w:t xml:space="preserve">A 4 MW / 4 MWh battery (case 4) adds only 0.4 kt (−0.7 % relative to</w:t>
+        <w:t xml:space="preserve">A 4 MW / 4 MWh battery (case 4) adds only 0.3 kt (−0.6 % relative to</w:t>
       </w:r>
       <w:r>
         <w:t xml:space="preserve"> </w:t>
@@ -9146,7 +9238,7 @@
         <w:t xml:space="preserve"> </w:t>
       </w:r>
       <w:r>
-        <w:t xml:space="preserve">slightly (5,928 to 6,235).</w:t>
+        <w:t xml:space="preserve">slightly (5,932 to 6,242).</w:t>
       </w:r>
     </w:p>
     <w:p>
@@ -9265,13 +9357,13 @@
         <w:t xml:space="preserve"> </w:t>
       </w:r>
       <w:r>
-        <w:t xml:space="preserve">exactly these hours, so a second GT runs in only 30 h of the year instead</w:t>
-      </w:r>
-      <w:r>
-        <w:t xml:space="preserve"> </w:t>
-      </w:r>
-      <w:r>
-        <w:t xml:space="preserve">of 1,702 (Fig. 4, Fig. 5). The 1,672 avoided hours account for most of the</w:t>
+        <w:t xml:space="preserve">exactly these hours, so a second GT runs in only 28 h of the year instead</w:t>
+      </w:r>
+      <w:r>
+        <w:t xml:space="preserve"> </w:t>
+      </w:r>
+      <w:r>
+        <w:t xml:space="preserve">of 1,702 (Fig. 4, Fig. 5). The 1,674 avoided hours account for most of the</w:t>
       </w:r>
       <w:r>
         <w:t xml:space="preserve"> </w:t>
@@ -9289,7 +9381,7 @@
           <wp:inline>
             <wp:extent cx="5334000" cy="4365500"/>
             <wp:effectExtent b="0" l="0" r="0" t="0"/>
-            <wp:docPr descr="Fig. 4. Week 29 (16–22 July 2023), the week with the median fuel saving. Top and middle: power supplied by GTs and wind with fixed (case 2) and flexible (case 3) demand. Bottom: production and injection rates." title="" id="43" name="Picture"/>
+            <wp:docPr descr="Fig. 4. Week 3 (15–21 January 2023), the week with the median fuel saving. Top and middle: power supplied by GTs and wind with fixed (case 2) and flexible (case 3) demand. Bottom: production and injection rates." title="" id="43" name="Picture"/>
             <a:graphic>
               <a:graphicData uri="http://schemas.openxmlformats.org/drawingml/2006/picture">
                 <pic:pic>
@@ -9342,7 +9434,7 @@
         <w:t xml:space="preserve"> </w:t>
       </w:r>
       <w:r>
-        <w:t xml:space="preserve">Week 29 (16–22 July 2023), the week with the median fuel saving. Top and middle: power supplied by GTs and wind with fixed (case 2) and flexible (case 3) demand. Bottom: production and injection rates.</w:t>
+        <w:t xml:space="preserve">Week 3 (15–21 January 2023), the week with the median fuel saving. Top and middle: power supplied by GTs and wind with fixed (case 2) and flexible (case 3) demand. Bottom: production and injection rates.</w:t>
       </w:r>
     </w:p>
     <w:p>
@@ -9439,13 +9531,13 @@
         <w:t xml:space="preserve"> </w:t>
       </w:r>
       <w:r>
-        <w:t xml:space="preserve">(Fig. 6). Its mean rises from 59 % of capacity in the calmest hours to</w:t>
-      </w:r>
-      <w:r>
-        <w:t xml:space="preserve"> </w:t>
-      </w:r>
-      <w:r>
-        <w:t xml:space="preserve">98–99 % when more than 16 MW of wind is available, with a correlation</w:t>
+        <w:t xml:space="preserve">(Fig. 6). Its mean rises from 57 % of capacity in the calmest hours to</w:t>
+      </w:r>
+      <w:r>
+        <w:t xml:space="preserve"> </w:t>
+      </w:r>
+      <w:r>
+        <w:t xml:space="preserve">98–100 % when more than 16 MW of wind is available, with a correlation</w:t>
       </w:r>
       <w:r>
         <w:t xml:space="preserve"> </w:t>
@@ -9457,13 +9549,13 @@
         <w:t xml:space="preserve"> </w:t>
       </w:r>
       <w:r>
-        <w:t xml:space="preserve">below its 85 % target in 2,597 h, stopped completely in 178 h and above the</w:t>
-      </w:r>
-      <w:r>
-        <w:t xml:space="preserve"> </w:t>
-      </w:r>
-      <w:r>
-        <w:t xml:space="preserve">target in 6,048 h, and over the year it averages 84.9 % of capacity, so the</w:t>
+        <w:t xml:space="preserve">below its 85 % target in 2,563 h, stopped completely in 187 h and above the</w:t>
+      </w:r>
+      <w:r>
+        <w:t xml:space="preserve"> </w:t>
+      </w:r>
+      <w:r>
+        <w:t xml:space="preserve">target in 6,129 h, and over the year it averages 84.9 % of capacity, so the</w:t>
       </w:r>
       <w:r>
         <w:t xml:space="preserve"> </w:t>
@@ -9477,19 +9569,19 @@
         <w:pStyle w:val="BodyText"/>
       </w:pPr>
       <w:r>
-        <w:t xml:space="preserve">The deficit remains small compared with the limit. It averages 7.5 h of</w:t>
-      </w:r>
-      <w:r>
-        <w:t xml:space="preserve"> </w:t>
-      </w:r>
-      <w:r>
-        <w:t xml:space="preserve">full-rate injection, never exceeds 25.2 h and is below 24 h in all but a few</w:t>
-      </w:r>
-      <w:r>
-        <w:t xml:space="preserve"> </w:t>
-      </w:r>
-      <w:r>
-        <w:t xml:space="preserve">hours, well within the 72 h allowed. At the end of the year 6.3 h of</w:t>
+        <w:t xml:space="preserve">The deficit remains small compared with the limit. It averages 9.0 h of</w:t>
+      </w:r>
+      <w:r>
+        <w:t xml:space="preserve"> </w:t>
+      </w:r>
+      <w:r>
+        <w:t xml:space="preserve">full-rate injection, never exceeds 27.5 h and is above 24 h in only 149 h of</w:t>
+      </w:r>
+      <w:r>
+        <w:t xml:space="preserve"> </w:t>
+      </w:r>
+      <w:r>
+        <w:t xml:space="preserve">the year, well within the 72 h allowed. At the end of the year 8.2 h of</w:t>
       </w:r>
       <w:r>
         <w:t xml:space="preserve"> </w:t>
@@ -9545,7 +9637,7 @@
         <w:t xml:space="preserve"> </w:t>
       </w:r>
       <w:r>
-        <w:t xml:space="preserve">0.42 and 0.76 kt (Fig. S3). It is largest in June, December and July, months</w:t>
+        <w:t xml:space="preserve">0.43 and 0.77 kt (Fig. S3). It is largest in June, December and July, months</w:t>
       </w:r>
       <w:r>
         <w:t xml:space="preserve"> </w:t>
@@ -9779,7 +9871,7 @@
               <w:jc w:val="left"/>
             </w:pPr>
             <w:r>
-              <w:t xml:space="preserve">72.0 / 57.6 / 53.3 / 50.9</w:t>
+              <w:t xml:space="preserve">71.9 / 57.5 / 53.4 / 50.9</w:t>
             </w:r>
           </w:p>
         </w:tc>
@@ -9833,7 +9925,7 @@
               <w:jc w:val="left"/>
             </w:pPr>
             <w:r>
-              <w:t xml:space="preserve">57.5 / 57.5 / 57.6 / 57.5</w:t>
+              <w:t xml:space="preserve">57.5 / 57.5 / 57.5 / 57.6</w:t>
             </w:r>
           </w:p>
         </w:tc>
@@ -9887,7 +9979,7 @@
               <w:jc w:val="left"/>
             </w:pPr>
             <w:r>
-              <w:t xml:space="preserve">57.5 / 57.6 / 57.5</w:t>
+              <w:t xml:space="preserve">57.5 / 57.5 / 57.5</w:t>
             </w:r>
           </w:p>
         </w:tc>
@@ -9949,7 +10041,7 @@
               <w:jc w:val="left"/>
             </w:pPr>
             <w:r>
-              <w:t xml:space="preserve">57.6 / 57.3 / 57.2 / 56.9 / 56.4</w:t>
+              <w:t xml:space="preserve">57.5 / 57.3 / 57.2 / 56.9 / 56.4</w:t>
             </w:r>
           </w:p>
         </w:tc>
@@ -9995,7 +10087,7 @@
               <w:jc w:val="left"/>
             </w:pPr>
             <w:r>
-              <w:t xml:space="preserve">64.7 / 57.6 / 57.6 / 57.5</w:t>
+              <w:t xml:space="preserve">64.7 / 57.5 / 57.5 / 57.5</w:t>
             </w:r>
           </w:p>
         </w:tc>
@@ -10083,27 +10175,31 @@
               <w:jc w:val="left"/>
             </w:pPr>
             <w:r>
-              <w:t xml:space="preserve">3 main / 2 main + 1 small</w:t>
-            </w:r>
-          </w:p>
-        </w:tc>
-        <w:tc>
-          <w:tcPr/>
-          <w:p>
-            <w:pPr>
-              <w:pStyle w:val="Compact"/>
-            </w:pPr>
-          </w:p>
-        </w:tc>
-        <w:tc>
-          <w:tcPr/>
-          <w:p>
-            <w:pPr>
-              <w:pStyle w:val="Compact"/>
-              <w:jc w:val="left"/>
-            </w:pPr>
-            <w:r>
-              <w:t xml:space="preserve">57.6 / 55.6</w:t>
+              <w:t xml:space="preserve">3 main / 2 main + 1 small / 3 main + 1 small</w:t>
+            </w:r>
+          </w:p>
+        </w:tc>
+        <w:tc>
+          <w:tcPr/>
+          <w:p>
+            <w:pPr>
+              <w:pStyle w:val="Compact"/>
+              <w:jc w:val="left"/>
+            </w:pPr>
+            <w:r>
+              <w:t xml:space="preserve">64.7 / 53.9 / 53.9</w:t>
+            </w:r>
+          </w:p>
+        </w:tc>
+        <w:tc>
+          <w:tcPr/>
+          <w:p>
+            <w:pPr>
+              <w:pStyle w:val="Compact"/>
+              <w:jc w:val="left"/>
+            </w:pPr>
+            <w:r>
+              <w:t xml:space="preserve">57.5 / 47.8 / 47.7</w:t>
             </w:r>
           </w:p>
         </w:tc>
@@ -10254,7 +10350,7 @@
         <w:t xml:space="preserve"> </w:t>
       </w:r>
       <w:r>
-        <w:t xml:space="preserve">full saving, with 12 GT starts instead of 6, and allowing 168 h changes</w:t>
+        <w:t xml:space="preserve">full saving, with 5 GT starts instead of 3, and allowing 168 h changes</w:t>
       </w:r>
       <w:r>
         <w:t xml:space="preserve"> </w:t>
@@ -10290,7 +10386,7 @@
         <w:t xml:space="preserve"> </w:t>
       </w:r>
       <w:r>
-        <w:t xml:space="preserve">60 MW lowers case 3 emissions only from 57.6 to 50.9 kt, while curtailment</w:t>
+        <w:t xml:space="preserve">60 MW lowers case 3 emissions only from 57.5 to 50.9 kt, while curtailment</w:t>
       </w:r>
       <w:r>
         <w:t xml:space="preserve"> </w:t>
@@ -10308,19 +10404,19 @@
         <w:t xml:space="preserve"> </w:t>
       </w:r>
       <w:r>
-        <w:t xml:space="preserve">minus case 3) is largest for the base-case farm (7.1 kt) and smaller for a</w:t>
-      </w:r>
-      <w:r>
-        <w:t xml:space="preserve"> </w:t>
-      </w:r>
-      <w:r>
-        <w:t xml:space="preserve">15 MW farm (5.5 kt), where the wind seldom covers the demand, and for a</w:t>
-      </w:r>
-      <w:r>
-        <w:t xml:space="preserve"> </w:t>
-      </w:r>
-      <w:r>
-        <w:t xml:space="preserve">45–60 MW farm (6.6–6.9 kt).</w:t>
+        <w:t xml:space="preserve">minus case 3) is largest for the base-case farm (7.2 kt) and smaller for a</w:t>
+      </w:r>
+      <w:r>
+        <w:t xml:space="preserve"> </w:t>
+      </w:r>
+      <w:r>
+        <w:t xml:space="preserve">15 MW farm (5.6 kt), where the wind seldom covers the demand, and for a</w:t>
+      </w:r>
+      <w:r>
+        <w:t xml:space="preserve"> </w:t>
+      </w:r>
+      <w:r>
+        <w:t xml:space="preserve">45–60 MW farm (6.7–6.8 kt).</w:t>
       </w:r>
     </w:p>
     <w:p>
@@ -10386,7 +10482,7 @@
         <w:t xml:space="preserve"> </w:t>
       </w:r>
       <w:r>
-        <w:t xml:space="preserve">GTs then run only 3,809 unit-h, wind covers a much larger share of the</w:t>
+        <w:t xml:space="preserve">GTs then run only 3,798 unit-h, wind covers a much larger share of the</w:t>
       </w:r>
       <w:r>
         <w:t xml:space="preserve"> </w:t>
@@ -10452,19 +10548,73 @@
           <w:bCs/>
           <w:b/>
         </w:rPr>
-        <w:t xml:space="preserve">A smaller third GT</w:t>
-      </w:r>
-      <w:r>
-        <w:t xml:space="preserve"> </w:t>
-      </w:r>
-      <w:r>
-        <w:t xml:space="preserve">lowers case 3 emissions by 3.4 % to 55.6 kt, but needs</w:t>
-      </w:r>
-      <w:r>
-        <w:t xml:space="preserve"> </w:t>
-      </w:r>
-      <w:r>
-        <w:t xml:space="preserve">121 starts per year, and the data for the small unit are not verified.</w:t>
+        <w:t xml:space="preserve">A small GT is as valuable as flexibility, and the two add up.</w:t>
+      </w:r>
+      <w:r>
+        <w:t xml:space="preserve"> </w:t>
+      </w:r>
+      <w:r>
+        <w:t xml:space="preserve">Replacing</w:t>
+      </w:r>
+      <w:r>
+        <w:t xml:space="preserve"> </w:t>
+      </w:r>
+      <w:r>
+        <w:t xml:space="preserve">one main unit by a Solar Mars 100 (11.35 MW) lowers emissions from 64.7 to</w:t>
+      </w:r>
+      <w:r>
+        <w:t xml:space="preserve"> </w:t>
+      </w:r>
+      <w:r>
+        <w:t xml:space="preserve">53.9 kt with fixed demand (−17 %) and from 57.5 to 47.8 kt with flexible</w:t>
+      </w:r>
+      <w:r>
+        <w:t xml:space="preserve"> </w:t>
+      </w:r>
+      <w:r>
+        <w:t xml:space="preserve">demand. In windy hours the small unit runs alone: its no-load fuel is about</w:t>
+      </w:r>
+      <w:r>
+        <w:t xml:space="preserve"> </w:t>
+      </w:r>
+      <w:r>
+        <w:t xml:space="preserve">half that of a main unit, and it can carry up to 6.35 MW while holding the</w:t>
+      </w:r>
+      <w:r>
+        <w:t xml:space="preserve"> </w:t>
+      </w:r>
+      <w:r>
+        <w:t xml:space="preserve">5 MW reserve. With the small unit installed, flexibility still saves 6.1 kt</w:t>
+      </w:r>
+      <w:r>
+        <w:t xml:space="preserve"> </w:t>
+      </w:r>
+      <w:r>
+        <w:t xml:space="preserve">(11.3 %), the same share as with the main units only, and it reduces the</w:t>
+      </w:r>
+      <w:r>
+        <w:t xml:space="preserve"> </w:t>
+      </w:r>
+      <w:r>
+        <w:t xml:space="preserve">starts of the small unit from 465 to 262 per year. Together, the small unit</w:t>
+      </w:r>
+      <w:r>
+        <w:t xml:space="preserve"> </w:t>
+      </w:r>
+      <w:r>
+        <w:t xml:space="preserve">and flexibility cut emissions by 26 % compared with case 2. Keeping all three</w:t>
+      </w:r>
+      <w:r>
+        <w:t xml:space="preserve"> </w:t>
+      </w:r>
+      <w:r>
+        <w:t xml:space="preserve">main units in addition to the small one changes nothing (47.7 kt), because</w:t>
+      </w:r>
+      <w:r>
+        <w:t xml:space="preserve"> </w:t>
+      </w:r>
+      <w:r>
+        <w:t xml:space="preserve">the third main unit is never needed.</w:t>
       </w:r>
     </w:p>
     <w:p>
@@ -10643,7 +10793,7 @@
               <w:jc w:val="left"/>
             </w:pPr>
             <w:r>
-              <w:t xml:space="preserve">Platform power, three real oil platforms [23,26]</w:t>
+              <w:t xml:space="preserve">Platform power, three real oil platforms [24,27]</w:t>
             </w:r>
           </w:p>
         </w:tc>
@@ -10743,7 +10893,7 @@
               <w:jc w:val="left"/>
             </w:pPr>
             <w:r>
-              <w:t xml:space="preserve">Platform power, Johan Castberg [27]</w:t>
+              <w:t xml:space="preserve">Platform power, Johan Castberg [28]</w:t>
             </w:r>
           </w:p>
         </w:tc>
@@ -10893,7 +11043,7 @@
               <w:jc w:val="left"/>
             </w:pPr>
             <w:r>
-              <w:t xml:space="preserve">Wind capacity factor, Hywind Tampen Q1 2025 [28]</w:t>
+              <w:t xml:space="preserve">Wind capacity factor, Hywind Tampen Q1 2025 [29]</w:t>
             </w:r>
           </w:p>
         </w:tc>
@@ -11403,7 +11553,7 @@
         <w:t xml:space="preserve"> </w:t>
       </w:r>
       <w:r>
-        <w:t xml:space="preserve">saving comes from 1,672 avoided hours with two GTs online. A deficit</w:t>
+        <w:t xml:space="preserve">saving comes from 1,674 avoided hours with two GTs online. A deficit</w:t>
       </w:r>
       <w:r>
         <w:t xml:space="preserve"> </w:t>
@@ -11534,6 +11684,50 @@
       </w:r>
       <w:r>
         <w:t xml:space="preserve">they reduce the number of GTs that must be online.</w:t>
+      </w:r>
+    </w:p>
+    <w:p>
+      <w:pPr>
+        <w:pStyle w:val="BodyText"/>
+      </w:pPr>
+      <w:r>
+        <w:t xml:space="preserve">A small GT acts on the other part of the same loss: it does not reduce the</w:t>
+      </w:r>
+      <w:r>
+        <w:t xml:space="preserve"> </w:t>
+      </w:r>
+      <w:r>
+        <w:t xml:space="preserve">number of running units, but the no-load fuel of each one. Because the two</w:t>
+      </w:r>
+      <w:r>
+        <w:t xml:space="preserve"> </w:t>
+      </w:r>
+      <w:r>
+        <w:t xml:space="preserve">measures address different parts of the loss, their savings add up almost</w:t>
+      </w:r>
+      <w:r>
+        <w:t xml:space="preserve"> </w:t>
+      </w:r>
+      <w:r>
+        <w:t xml:space="preserve">fully (Section 3.4). This suggests a staged approach for retrofits: first</w:t>
+      </w:r>
+      <w:r>
+        <w:t xml:space="preserve"> </w:t>
+      </w:r>
+      <w:r>
+        <w:t xml:space="preserve">use the flexibility of the existing process, which requires no investment,</w:t>
+      </w:r>
+      <w:r>
+        <w:t xml:space="preserve"> </w:t>
+      </w:r>
+      <w:r>
+        <w:t xml:space="preserve">and then consider replacing one main GT by a smaller unit at its next major</w:t>
+      </w:r>
+      <w:r>
+        <w:t xml:space="preserve"> </w:t>
+      </w:r>
+      <w:r>
+        <w:t xml:space="preserve">overhaul, where the number of starts of the small unit must be acceptable.</w:t>
       </w:r>
     </w:p>
     <w:bookmarkEnd w:id="61"/>
@@ -11753,7 +11947,7 @@
         <w:t xml:space="preserve"> </w:t>
       </w:r>
       <w:r>
-        <w:t xml:space="preserve">about 24 h of injection deferral, averaging 7.5 h, is small compared with the</w:t>
+        <w:t xml:space="preserve">about 24 h of injection deferral, averaging 9.0 h, is small compared with the</w:t>
       </w:r>
       <w:r>
         <w:t xml:space="preserve"> </w:t>
@@ -11789,7 +11983,7 @@
         <w:t xml:space="preserve"> </w:t>
       </w:r>
       <w:r>
-        <w:t xml:space="preserve">In case 3 the number of running injection pumps changes about 720 times per</w:t>
+        <w:t xml:space="preserve">In case 3 the number of running injection pumps changes about 730 times per</w:t>
       </w:r>
       <w:r>
         <w:t xml:space="preserve"> </w:t>
@@ -12199,7 +12393,13 @@
         <w:t xml:space="preserve"> </w:t>
       </w:r>
       <w:r>
-        <w:t xml:space="preserve">in the fleet sensitivity relies on unverified performance data.</w:t>
+        <w:t xml:space="preserve">in the fleet sensitivity is given the same relative part-load curve as the</w:t>
+      </w:r>
+      <w:r>
+        <w:t xml:space="preserve"> </w:t>
+      </w:r>
+      <w:r>
+        <w:t xml:space="preserve">main units, because its manufacturer publishes only the full-load rating.</w:t>
       </w:r>
     </w:p>
     <w:p>
@@ -12310,7 +12510,7 @@
         <w:t xml:space="preserve"> </w:t>
       </w:r>
       <w:r>
-        <w:t xml:space="preserve">(7.1 kt/yr) without lost production. GT low-load hours fall by 34 % and</w:t>
+        <w:t xml:space="preserve">(7.2 kt/yr) without lost production. GT low-load hours fall by 34 % and</w:t>
       </w:r>
       <w:r>
         <w:t xml:space="preserve"> </w:t>
@@ -12382,13 +12582,19 @@
         <w:pStyle w:val="Compact"/>
       </w:pPr>
       <w:r>
-        <w:t xml:space="preserve">Carbon price, gas price and battery size alone have little effect, and</w:t>
-      </w:r>
-      <w:r>
-        <w:t xml:space="preserve"> </w:t>
-      </w:r>
-      <w:r>
-        <w:t xml:space="preserve">the fuel saved pays for the measure without a carbon price.</w:t>
+        <w:t xml:space="preserve">Replacing one main GT by a small unit (11.35 MW) saves a further 17 %,</w:t>
+      </w:r>
+      <w:r>
+        <w:t xml:space="preserve"> </w:t>
+      </w:r>
+      <w:r>
+        <w:t xml:space="preserve">and the saving of flexibility remains 11 % with the small unit installed;</w:t>
+      </w:r>
+      <w:r>
+        <w:t xml:space="preserve"> </w:t>
+      </w:r>
+      <w:r>
+        <w:t xml:space="preserve">the two measures are complementary.</w:t>
       </w:r>
     </w:p>
     <w:p>
@@ -12400,6 +12606,24 @@
         <w:pStyle w:val="Compact"/>
       </w:pPr>
       <w:r>
+        <w:t xml:space="preserve">Carbon price, gas price and battery size alone have little effect, and</w:t>
+      </w:r>
+      <w:r>
+        <w:t xml:space="preserve"> </w:t>
+      </w:r>
+      <w:r>
+        <w:t xml:space="preserve">the fuel saved pays for the measure without a carbon price.</w:t>
+      </w:r>
+    </w:p>
+    <w:p>
+      <w:pPr>
+        <w:numPr>
+          <w:ilvl w:val="0"/>
+          <w:numId w:val="1007"/>
+        </w:numPr>
+        <w:pStyle w:val="Compact"/>
+      </w:pPr>
+      <w:r>
         <w:t xml:space="preserve">The model reproduces the CO2 avoided per MWh of wind reported for Hywind</w:t>
       </w:r>
       <w:r>
@@ -12738,7 +12962,7 @@
         <w:pStyle w:val="BodyText"/>
       </w:pPr>
       <w:r>
-        <w:t xml:space="preserve">[16] Solbraa E. NeqSim – Non-Equilibrium Simulator, an open-source library for thermodynamic and process calculations. https://github.com/equinor/neqsim.</w:t>
+        <w:t xml:space="preserve">[16] Solar Turbines. Mars 100 – oil and gas power generation package: ISO rating 11,350 kWe, heat rate 10,935 kJ/kWe-h. https://www.solarturbines.com/en_US/products/oil-and-gas-power-generation-packages/mars-100.html [accessed DATE].</w:t>
       </w:r>
     </w:p>
     <w:p>
@@ -12746,7 +12970,7 @@
         <w:pStyle w:val="BodyText"/>
       </w:pPr>
       <w:r>
-        <w:t xml:space="preserve">[17] Bynum ML, Hackebeil GA, Hart WE, Laird CD, Nicholson BL, Siirola JD, et al. Pyomo – optimization modeling in Python. 3rd ed. Cham: Springer; 2021.</w:t>
+        <w:t xml:space="preserve">[17] Solbraa E. NeqSim – Non-Equilibrium Simulator, an open-source library for thermodynamic and process calculations. https://github.com/equinor/neqsim.</w:t>
       </w:r>
     </w:p>
     <w:p>
@@ -12754,7 +12978,7 @@
         <w:pStyle w:val="BodyText"/>
       </w:pPr>
       <w:r>
-        <w:t xml:space="preserve">[18] Huangfu Q, Hall JAJ. Parallelizing the dual revised simplex method. Math Program Comput 2018;10:119–42. https://doi.org/10.1007/s12532-017-0130-5.</w:t>
+        <w:t xml:space="preserve">[18] Bynum ML, Hackebeil GA, Hart WE, Laird CD, Nicholson BL, Siirola JD, et al. Pyomo – optimization modeling in Python. 3rd ed. Cham: Springer; 2021.</w:t>
       </w:r>
     </w:p>
     <w:p>
@@ -12762,7 +12986,7 @@
         <w:pStyle w:val="BodyText"/>
       </w:pPr>
       <w:r>
-        <w:t xml:space="preserve">[19] Hersbach H, Bell B, Berrisford P, Hirahara S, Horányi A, Muñoz-Sabater J, et al. The ERA5 global reanalysis. Q J R Meteorol Soc 2020;146:1999–2049. https://doi.org/10.1002/qj.3803.</w:t>
+        <w:t xml:space="preserve">[19] Huangfu Q, Hall JAJ. Parallelizing the dual revised simplex method. Math Program Comput 2018;10:119–42. https://doi.org/10.1007/s12532-017-0130-5.</w:t>
       </w:r>
     </w:p>
     <w:p>
@@ -12770,7 +12994,7 @@
         <w:pStyle w:val="BodyText"/>
       </w:pPr>
       <w:r>
-        <w:t xml:space="preserve">[20] Hsu SA, Meindl EA, Gilhousen DB. Determining the power-law wind-profile exponent under near-neutral stability conditions at sea. J Appl Meteorol 1994;33:757–65.</w:t>
+        <w:t xml:space="preserve">[20] Hersbach H, Bell B, Berrisford P, Hirahara S, Horányi A, Muñoz-Sabater J, et al. The ERA5 global reanalysis. Q J R Meteorol Soc 2020;146:1999–2049. https://doi.org/10.1002/qj.3803.</w:t>
       </w:r>
     </w:p>
     <w:p>
@@ -12778,7 +13002,7 @@
         <w:pStyle w:val="BodyText"/>
       </w:pPr>
       <w:r>
-        <w:t xml:space="preserve">[21] Gaertner E, Rinker J, Sethuraman L, Zahle F, Anderson B, Barter G, et al. Definition of the IEA 15-megawatt offshore reference wind turbine. Technical Report NREL/TP-5000-75698. Golden, CO: National Renewable Energy Laboratory; 2020.</w:t>
+        <w:t xml:space="preserve">[21] Hsu SA, Meindl EA, Gilhousen DB. Determining the power-law wind-profile exponent under near-neutral stability conditions at sea. J Appl Meteorol 1994;33:757–65.</w:t>
       </w:r>
     </w:p>
     <w:p>
@@ -12786,7 +13010,7 @@
         <w:pStyle w:val="BodyText"/>
       </w:pPr>
       <w:r>
-        <w:t xml:space="preserve">[22] ISO 6976:2016. Natural gas – Calculation of calorific values, density, relative density and Wobbe indices from composition. Geneva: International Organization for Standardization; 2016.</w:t>
+        <w:t xml:space="preserve">[22] Gaertner E, Rinker J, Sethuraman L, Zahle F, Anderson B, Barter G, et al. Definition of the IEA 15-megawatt offshore reference wind turbine. Technical Report NREL/TP-5000-75698. Golden, CO: National Renewable Energy Laboratory; 2020.</w:t>
       </w:r>
     </w:p>
     <w:p>
@@ -12794,7 +13018,7 @@
         <w:pStyle w:val="BodyText"/>
       </w:pPr>
       <w:r>
-        <w:t xml:space="preserve">[23] Voldsund M, Nguyen T-V, Elmegaard B, Ertesvåg IS, Røsjorde A, Jøssang K, et al. Exergy destruction and losses on four North Sea offshore platforms: a comparative study of the oil and gas processing plants. Energy 2014;74:45–58. https://doi.org/10.1016/j.energy.2014.02.080.</w:t>
+        <w:t xml:space="preserve">[23] ISO 6976:2016. Natural gas – Calculation of calorific values, density, relative density and Wobbe indices from composition. Geneva: International Organization for Standardization; 2016.</w:t>
       </w:r>
     </w:p>
     <w:p>
@@ -12802,7 +13026,7 @@
         <w:pStyle w:val="BodyText"/>
       </w:pPr>
       <w:r>
-        <w:t xml:space="preserve">[24] Sharqawy MH, Lienhard JH, Zubair SM. Thermophysical properties of seawater: a review of existing correlations and data. Desalin Water Treat 2010;16:354–80. https://doi.org/10.5004/dwt.2010.1079.</w:t>
+        <w:t xml:space="preserve">[24] Voldsund M, Nguyen T-V, Elmegaard B, Ertesvåg IS, Røsjorde A, Jøssang K, et al. Exergy destruction and losses on four North Sea offshore platforms: a comparative study of the oil and gas processing plants. Energy 2014;74:45–58. https://doi.org/10.1016/j.energy.2014.02.080.</w:t>
       </w:r>
     </w:p>
     <w:p>
@@ -12810,7 +13034,7 @@
         <w:pStyle w:val="BodyText"/>
       </w:pPr>
       <w:r>
-        <w:t xml:space="preserve">[25] Norwegian Ministry of Climate and Environment. Meld. St. 13 (2020–2021) Klimaplan for 2021–2030 [Climate plan for 2021–2030]. Oslo; 2021.</w:t>
+        <w:t xml:space="preserve">[25] Sharqawy MH, Lienhard JH, Zubair SM. Thermophysical properties of seawater: a review of existing correlations and data. Desalin Water Treat 2010;16:354–80. https://doi.org/10.5004/dwt.2010.1079.</w:t>
       </w:r>
     </w:p>
     <w:p>
@@ -12818,7 +13042,7 @@
         <w:pStyle w:val="BodyText"/>
       </w:pPr>
       <w:r>
-        <w:t xml:space="preserve">[26] Voldsund M, Ertesvåg IS, He W, Kjelstrup S. Exergy analysis of the oil and gas processing on a North Sea oil platform a real production day. Energy 2013;55:716–27. https://doi.org/10.1016/j.energy.2013.02.038.</w:t>
+        <w:t xml:space="preserve">[26] Norwegian Ministry of Climate and Environment. Meld. St. 13 (2020–2021) Klimaplan for 2021–2030 [Climate plan for 2021–2030]. Oslo; 2021.</w:t>
       </w:r>
     </w:p>
     <w:p>
@@ -12826,7 +13050,7 @@
         <w:pStyle w:val="BodyText"/>
       </w:pPr>
       <w:r>
-        <w:t xml:space="preserve">[27] Statoil. Johan Castberg – plan for utbygging og drift, del II: konsekvensutredning [Plan for development and operation, part II: impact assessment]. Stavanger: Statoil; 2017.</w:t>
+        <w:t xml:space="preserve">[27] Voldsund M, Ertesvåg IS, He W, Kjelstrup S. Exergy analysis of the oil and gas processing on a North Sea oil platform a real production day. Energy 2013;55:716–27. https://doi.org/10.1016/j.energy.2013.02.038.</w:t>
       </w:r>
     </w:p>
     <w:p>
@@ -12834,7 +13058,7 @@
         <w:pStyle w:val="BodyText"/>
       </w:pPr>
       <w:r>
-        <w:t xml:space="preserve">[28] Norwegian Offshore Wind. Hywind Tampen capacity factor, first quarter 2025 [news item]. 2025.</w:t>
+        <w:t xml:space="preserve">[28] Statoil. Johan Castberg – plan for utbygging og drift, del II: konsekvensutredning [Plan for development and operation, part II: impact assessment]. Stavanger: Statoil; 2017.</w:t>
       </w:r>
     </w:p>
     <w:p>
@@ -12842,7 +13066,7 @@
         <w:pStyle w:val="BodyText"/>
       </w:pPr>
       <w:r>
-        <w:t xml:space="preserve">[29] Westwood Global Energy Group. Analysis of electrification and emissions on the Norwegian continental shelf. 2022.</w:t>
+        <w:t xml:space="preserve">[29] Norwegian Offshore Wind. Hywind Tampen capacity factor, first quarter 2025 [news item]. 2025.</w:t>
       </w:r>
     </w:p>
     <w:p>
@@ -12850,7 +13074,7 @@
         <w:pStyle w:val="BodyText"/>
       </w:pPr>
       <w:r>
-        <w:t xml:space="preserve">[30] Norwegian Environment Agency. Norskeutslipp – emissions from Gullfaks, Snorre and Statfjord, 2021–2024. https://www.norskeutslipp.no [accessed DATE].</w:t>
+        <w:t xml:space="preserve">[30] Westwood Global Energy Group. Analysis of electrification and emissions on the Norwegian continental shelf. 2022.</w:t>
       </w:r>
     </w:p>
     <w:p>
@@ -12858,7 +13082,15 @@
         <w:pStyle w:val="BodyText"/>
       </w:pPr>
       <w:r>
-        <w:t xml:space="preserve">[31] Norwegian Offshore Directorate. FactPages – field production, yearly. https://factpages.sodir.no [accessed DATE].</w:t>
+        <w:t xml:space="preserve">[31] Norwegian Environment Agency. Norskeutslipp – emissions from Gullfaks, Snorre and Statfjord, 2021–2024. https://www.norskeutslipp.no [accessed DATE].</w:t>
+      </w:r>
+    </w:p>
+    <w:p>
+      <w:pPr>
+        <w:pStyle w:val="BodyText"/>
+      </w:pPr>
+      <w:r>
+        <w:t xml:space="preserve">[32] Norwegian Offshore Directorate. FactPages – field production, yearly. https://factpages.sodir.no [accessed DATE].</w:t>
       </w:r>
     </w:p>
     <w:bookmarkEnd w:id="69"/>

</xml_diff>

<commit_message>
Economic indicators and --year option for more weather years
Economics (src/topside/economics.py, Table 5, Methods 2.8, Results 3.6):
- Wind farm abatement cost from Hywind Tampen capex (84 MNOK/MW) and floating
  O&M 35-97 EUR/kW/yr (Dighe et al. 2024): 2,180-2,519 NOK/t at 7 %
  (1,347-1,686 at 4 %); with flexibility 1,774-2,078 NOK/t
- Flexibility saves ~1,800 NOK/t before implementation cost; break-even
  investment 137 MNOK (fuel) / 288 MNOK (fuel + CO2); battery and small GT too
- Cost inputs in a new config section 'investment', ignored by the run cache

Weather years:
- python -m topside.wind --download --year 2014-2022
- python -m topside.cases --year 2014-2023 -> per-year outputs tagged _<year>
  and results/cases/multi_year_summary.csv + figures/multi_year.png
</commit_message>
<xml_diff>
--- a/docs/paper/paper.docx
+++ b/docs/paper/paper.docx
@@ -2,7 +2,7 @@
 <file path=word/document.xml><?xml version="1.0" encoding="utf-8"?>
 <w:document xmlns:w="http://schemas.openxmlformats.org/wordprocessingml/2006/main" xmlns:m="http://schemas.openxmlformats.org/officeDocument/2006/math" xmlns:r="http://schemas.openxmlformats.org/officeDocument/2006/relationships" xmlns:o="urn:schemas-microsoft-com:office:office" xmlns:v="urn:schemas-microsoft-com:vml" xmlns:w10="urn:schemas-microsoft-com:office:word" xmlns:a="http://schemas.openxmlformats.org/drawingml/2006/main" xmlns:pic="http://schemas.openxmlformats.org/drawingml/2006/picture" xmlns:wp="http://schemas.openxmlformats.org/drawingml/2006/wordprocessingDrawing">
   <w:body>
-    <w:bookmarkStart w:id="70" w:name="Xd969dbdcee26c3dc49c23a7936207aeb905ae7a"/>
+    <w:bookmarkStart w:id="72" w:name="Xd969dbdcee26c3dc49c23a7936207aeb905ae7a"/>
     <w:p>
       <w:pPr>
         <w:pStyle w:val="Heading1"/>
@@ -2592,7 +2592,7 @@
       </w:r>
     </w:p>
     <w:bookmarkEnd w:id="22"/>
-    <w:bookmarkStart w:id="33" w:name="methods"/>
+    <w:bookmarkStart w:id="34" w:name="methods"/>
     <w:p>
       <w:pPr>
         <w:pStyle w:val="Heading2"/>
@@ -8143,8 +8143,531 @@
       </w:r>
     </w:p>
     <w:bookmarkEnd w:id="32"/>
+    <w:bookmarkStart w:id="33" w:name="economic-indicators"/>
+    <w:p>
+      <w:pPr>
+        <w:pStyle w:val="Heading3"/>
+      </w:pPr>
+      <w:r>
+        <w:t xml:space="preserve">2.8 Economic indicators</w:t>
+      </w:r>
+    </w:p>
+    <w:p>
+      <w:pPr>
+        <w:pStyle w:val="FirstParagraph"/>
+      </w:pPr>
+      <w:r>
+        <w:t xml:space="preserve">Two indicators are derived from the annual results, in real NOK. For the</w:t>
+      </w:r>
+      <w:r>
+        <w:t xml:space="preserve"> </w:t>
+      </w:r>
+      <w:r>
+        <w:t xml:space="preserve">wind farm, whose investment can be estimated, the abatement cost is</w:t>
+      </w:r>
+    </w:p>
+    <w:p>
+      <w:pPr>
+        <w:pStyle w:val="BodyText"/>
+      </w:pPr>
+      <m:oMathPara>
+        <m:oMathParaPr>
+          <m:jc m:val="center"/>
+        </m:oMathParaPr>
+        <m:oMath>
+          <m:sSub>
+            <m:e>
+              <m:r>
+                <m:t>c</m:t>
+              </m:r>
+            </m:e>
+            <m:sub>
+              <m:r>
+                <m:t>a</m:t>
+              </m:r>
+              <m:r>
+                <m:t>b</m:t>
+              </m:r>
+              <m:r>
+                <m:t>a</m:t>
+              </m:r>
+              <m:r>
+                <m:t>t</m:t>
+              </m:r>
+              <m:r>
+                <m:t>e</m:t>
+              </m:r>
+            </m:sub>
+          </m:sSub>
+          <m:r>
+            <m:rPr>
+              <m:sty m:val="p"/>
+            </m:rPr>
+            <m:t>=</m:t>
+          </m:r>
+          <m:f>
+            <m:fPr>
+              <m:type m:val="bar"/>
+            </m:fPr>
+            <m:num>
+              <m:r>
+                <m:t>I</m:t>
+              </m:r>
+              <m:r>
+                <m:t> </m:t>
+              </m:r>
+              <m:r>
+                <m:rPr>
+                  <m:sty m:val="p"/>
+                </m:rPr>
+                <m:t>C</m:t>
+              </m:r>
+              <m:r>
+                <m:rPr>
+                  <m:sty m:val="p"/>
+                </m:rPr>
+                <m:t>R</m:t>
+              </m:r>
+              <m:r>
+                <m:rPr>
+                  <m:sty m:val="p"/>
+                </m:rPr>
+                <m:t>F</m:t>
+              </m:r>
+              <m:d>
+                <m:dPr>
+                  <m:begChr m:val="("/>
+                  <m:endChr m:val=")"/>
+                  <m:sepChr m:val=""/>
+                  <m:grow/>
+                </m:dPr>
+                <m:e>
+                  <m:r>
+                    <m:t>r</m:t>
+                  </m:r>
+                  <m:r>
+                    <m:rPr>
+                      <m:sty m:val="p"/>
+                    </m:rPr>
+                    <m:t>,</m:t>
+                  </m:r>
+                  <m:r>
+                    <m:t>n</m:t>
+                  </m:r>
+                </m:e>
+              </m:d>
+              <m:r>
+                <m:rPr>
+                  <m:sty m:val="p"/>
+                </m:rPr>
+                <m:t>+</m:t>
+              </m:r>
+              <m:sSub>
+                <m:e>
+                  <m:r>
+                    <m:t>C</m:t>
+                  </m:r>
+                </m:e>
+                <m:sub>
+                  <m:r>
+                    <m:t>O</m:t>
+                  </m:r>
+                  <m:r>
+                    <m:rPr>
+                      <m:sty m:val="p"/>
+                    </m:rPr>
+                    <m:t>&amp;</m:t>
+                  </m:r>
+                  <m:r>
+                    <m:t>M</m:t>
+                  </m:r>
+                </m:sub>
+              </m:sSub>
+              <m:r>
+                <m:rPr>
+                  <m:sty m:val="p"/>
+                </m:rPr>
+                <m:t>−</m:t>
+              </m:r>
+              <m:r>
+                <m:t>Δ</m:t>
+              </m:r>
+              <m:sSub>
+                <m:e>
+                  <m:r>
+                    <m:t>C</m:t>
+                  </m:r>
+                </m:e>
+                <m:sub>
+                  <m:r>
+                    <m:t>f</m:t>
+                  </m:r>
+                  <m:r>
+                    <m:t>u</m:t>
+                  </m:r>
+                  <m:r>
+                    <m:t>e</m:t>
+                  </m:r>
+                  <m:r>
+                    <m:t>l</m:t>
+                  </m:r>
+                </m:sub>
+              </m:sSub>
+            </m:num>
+            <m:den>
+              <m:r>
+                <m:t>Δ</m:t>
+              </m:r>
+              <m:sSub>
+                <m:e>
+                  <m:r>
+                    <m:t>m</m:t>
+                  </m:r>
+                </m:e>
+                <m:sub>
+                  <m:r>
+                    <m:t>C</m:t>
+                  </m:r>
+                  <m:r>
+                    <m:t>O</m:t>
+                  </m:r>
+                  <m:r>
+                    <m:t>2</m:t>
+                  </m:r>
+                </m:sub>
+              </m:sSub>
+            </m:den>
+          </m:f>
+          <m:r>
+            <m:rPr>
+              <m:sty m:val="p"/>
+            </m:rPr>
+            <m:t>,</m:t>
+          </m:r>
+          <m:r>
+            <m:t>  </m:t>
+          </m:r>
+          <m:r>
+            <m:rPr>
+              <m:sty m:val="p"/>
+            </m:rPr>
+            <m:t>C</m:t>
+          </m:r>
+          <m:r>
+            <m:rPr>
+              <m:sty m:val="p"/>
+            </m:rPr>
+            <m:t>R</m:t>
+          </m:r>
+          <m:r>
+            <m:rPr>
+              <m:sty m:val="p"/>
+            </m:rPr>
+            <m:t>F</m:t>
+          </m:r>
+          <m:d>
+            <m:dPr>
+              <m:begChr m:val="("/>
+              <m:endChr m:val=")"/>
+              <m:sepChr m:val=""/>
+              <m:grow/>
+            </m:dPr>
+            <m:e>
+              <m:r>
+                <m:t>r</m:t>
+              </m:r>
+              <m:r>
+                <m:rPr>
+                  <m:sty m:val="p"/>
+                </m:rPr>
+                <m:t>,</m:t>
+              </m:r>
+              <m:r>
+                <m:t>n</m:t>
+              </m:r>
+            </m:e>
+          </m:d>
+          <m:r>
+            <m:rPr>
+              <m:sty m:val="p"/>
+            </m:rPr>
+            <m:t>=</m:t>
+          </m:r>
+          <m:f>
+            <m:fPr>
+              <m:type m:val="bar"/>
+            </m:fPr>
+            <m:num>
+              <m:r>
+                <m:t>r</m:t>
+              </m:r>
+            </m:num>
+            <m:den>
+              <m:r>
+                <m:t>1</m:t>
+              </m:r>
+              <m:r>
+                <m:rPr>
+                  <m:sty m:val="p"/>
+                </m:rPr>
+                <m:t>−</m:t>
+              </m:r>
+              <m:sSup>
+                <m:e>
+                  <m:d>
+                    <m:dPr>
+                      <m:begChr m:val="("/>
+                      <m:endChr m:val=")"/>
+                      <m:sepChr m:val=""/>
+                      <m:grow/>
+                    </m:dPr>
+                    <m:e>
+                      <m:r>
+                        <m:t>1</m:t>
+                      </m:r>
+                      <m:r>
+                        <m:rPr>
+                          <m:sty m:val="p"/>
+                        </m:rPr>
+                        <m:t>+</m:t>
+                      </m:r>
+                      <m:r>
+                        <m:t>r</m:t>
+                      </m:r>
+                    </m:e>
+                  </m:d>
+                </m:e>
+                <m:sup>
+                  <m:r>
+                    <m:rPr>
+                      <m:sty m:val="p"/>
+                    </m:rPr>
+                    <m:t>−</m:t>
+                  </m:r>
+                  <m:r>
+                    <m:t>n</m:t>
+                  </m:r>
+                </m:sup>
+              </m:sSup>
+            </m:den>
+          </m:f>
+          <m:r>
+            <m:rPr>
+              <m:sty m:val="p"/>
+            </m:rPr>
+            <m:t>,</m:t>
+          </m:r>
+        </m:oMath>
+      </m:oMathPara>
+    </w:p>
+    <w:p>
+      <w:pPr>
+        <w:pStyle w:val="FirstParagraph"/>
+      </w:pPr>
+      <w:r>
+        <w:t xml:space="preserve">where</w:t>
+      </w:r>
+      <w:r>
+        <w:t xml:space="preserve"> </w:t>
+      </w:r>
+      <m:oMath>
+        <m:r>
+          <m:t>I</m:t>
+        </m:r>
+      </m:oMath>
+      <w:r>
+        <w:t xml:space="preserve"> </w:t>
+      </w:r>
+      <w:r>
+        <w:t xml:space="preserve">is the investment,</w:t>
+      </w:r>
+      <w:r>
+        <w:t xml:space="preserve"> </w:t>
+      </w:r>
+      <m:oMath>
+        <m:sSub>
+          <m:e>
+            <m:r>
+              <m:t>C</m:t>
+            </m:r>
+          </m:e>
+          <m:sub>
+            <m:r>
+              <m:t>O</m:t>
+            </m:r>
+            <m:r>
+              <m:rPr>
+                <m:sty m:val="p"/>
+              </m:rPr>
+              <m:t>&amp;</m:t>
+            </m:r>
+            <m:r>
+              <m:t>M</m:t>
+            </m:r>
+          </m:sub>
+        </m:sSub>
+      </m:oMath>
+      <w:r>
+        <w:t xml:space="preserve"> </w:t>
+      </w:r>
+      <w:r>
+        <w:t xml:space="preserve">the annual operation and maintenance</w:t>
+      </w:r>
+      <w:r>
+        <w:t xml:space="preserve"> </w:t>
+      </w:r>
+      <w:r>
+        <w:t xml:space="preserve">cost,</w:t>
+      </w:r>
+      <w:r>
+        <w:t xml:space="preserve"> </w:t>
+      </w:r>
+      <m:oMath>
+        <m:r>
+          <m:t>Δ</m:t>
+        </m:r>
+        <m:sSub>
+          <m:e>
+            <m:r>
+              <m:t>C</m:t>
+            </m:r>
+          </m:e>
+          <m:sub>
+            <m:r>
+              <m:t>f</m:t>
+            </m:r>
+            <m:r>
+              <m:t>u</m:t>
+            </m:r>
+            <m:r>
+              <m:t>e</m:t>
+            </m:r>
+            <m:r>
+              <m:t>l</m:t>
+            </m:r>
+          </m:sub>
+        </m:sSub>
+      </m:oMath>
+      <w:r>
+        <w:t xml:space="preserve"> </w:t>
+      </w:r>
+      <w:r>
+        <w:t xml:space="preserve">the annual value of the fuel saved and</w:t>
+      </w:r>
+      <w:r>
+        <w:t xml:space="preserve"> </w:t>
+      </w:r>
+      <m:oMath>
+        <m:r>
+          <m:t>Δ</m:t>
+        </m:r>
+        <m:sSub>
+          <m:e>
+            <m:r>
+              <m:t>m</m:t>
+            </m:r>
+          </m:e>
+          <m:sub>
+            <m:r>
+              <m:t>C</m:t>
+            </m:r>
+            <m:r>
+              <m:t>O</m:t>
+            </m:r>
+            <m:r>
+              <m:t>2</m:t>
+            </m:r>
+          </m:sub>
+        </m:sSub>
+      </m:oMath>
+      <w:r>
+        <w:t xml:space="preserve"> </w:t>
+      </w:r>
+      <w:r>
+        <w:t xml:space="preserve">the CO2 avoided per year. The CO2 price is not counted as a</w:t>
+      </w:r>
+      <w:r>
+        <w:t xml:space="preserve"> </w:t>
+      </w:r>
+      <w:r>
+        <w:t xml:space="preserve">saving, because the abatement cost is what is compared with the CO2 price.</w:t>
+      </w:r>
+      <w:r>
+        <w:t xml:space="preserve"> </w:t>
+      </w:r>
+      <w:r>
+        <w:t xml:space="preserve">The investment is scaled from Hywind Tampen, about NOK 7.4 billion for 88 MW</w:t>
+      </w:r>
+      <w:r>
+        <w:t xml:space="preserve"> </w:t>
+      </w:r>
+      <w:r>
+        <w:t xml:space="preserve">before public support [8], which gives 84 MNOK/MW for a</w:t>
+      </w:r>
+      <w:r>
+        <w:t xml:space="preserve"> </w:t>
+      </w:r>
+      <w:r>
+        <w:t xml:space="preserve">first-of-a-kind floating farm. Operation and maintenance cost 35–97 EUR/kW</w:t>
+      </w:r>
+      <w:r>
+        <w:t xml:space="preserve"> </w:t>
+      </w:r>
+      <w:r>
+        <w:t xml:space="preserve">per year, the range between the cheapest and the most expensive repair</w:t>
+      </w:r>
+      <w:r>
+        <w:t xml:space="preserve"> </w:t>
+      </w:r>
+      <w:r>
+        <w:t xml:space="preserve">strategy modelled for floating wind farms [33]. The real discount</w:t>
+      </w:r>
+      <w:r>
+        <w:t xml:space="preserve"> </w:t>
+      </w:r>
+      <w:r>
+        <w:t xml:space="preserve">rate is 7 %, with 4 % as an alternative, the two rates used in Norwegian</w:t>
+      </w:r>
+      <w:r>
+        <w:t xml:space="preserve"> </w:t>
+      </w:r>
+      <w:r>
+        <w:t xml:space="preserve">abatement-cost analyses of power from shore [34], and the economic</w:t>
+      </w:r>
+      <w:r>
+        <w:t xml:space="preserve"> </w:t>
+      </w:r>
+      <w:r>
+        <w:t xml:space="preserve">life is 20 years. For flexibility, the battery and a small GT, whose</w:t>
+      </w:r>
+      <w:r>
+        <w:t xml:space="preserve"> </w:t>
+      </w:r>
+      <w:r>
+        <w:t xml:space="preserve">investment on an existing platform could not be estimated from published</w:t>
+      </w:r>
+      <w:r>
+        <w:t xml:space="preserve"> </w:t>
+      </w:r>
+      <w:r>
+        <w:t xml:space="preserve">data, the break-even investment is given instead: the present value over 20</w:t>
+      </w:r>
+      <w:r>
+        <w:t xml:space="preserve"> </w:t>
+      </w:r>
+      <w:r>
+        <w:t xml:space="preserve">years of the annual saving, for the fuel saved alone and for fuel plus CO2</w:t>
+      </w:r>
+      <w:r>
+        <w:t xml:space="preserve"> </w:t>
+      </w:r>
+      <w:r>
+        <w:t xml:space="preserve">cost.</w:t>
+      </w:r>
+    </w:p>
     <w:bookmarkEnd w:id="33"/>
-    <w:bookmarkStart w:id="60" w:name="results"/>
+    <w:bookmarkEnd w:id="34"/>
+    <w:bookmarkStart w:id="62" w:name="results"/>
     <w:p>
       <w:pPr>
         <w:pStyle w:val="Heading2"/>
@@ -8153,7 +8676,7 @@
         <w:t xml:space="preserve">3 Results</w:t>
       </w:r>
     </w:p>
-    <w:bookmarkStart w:id="37" w:name="demand-map-and-wind-resource"/>
+    <w:bookmarkStart w:id="38" w:name="demand-map-and-wind-resource"/>
     <w:p>
       <w:pPr>
         <w:pStyle w:val="Heading3"/>
@@ -8245,18 +8768,18 @@
           <wp:inline>
             <wp:extent cx="5334000" cy="2191613"/>
             <wp:effectExtent b="0" l="0" r="0" t="0"/>
-            <wp:docPr descr="Fig. 2. Demand map. Left: electric power at design by consumer, coloured by flexibility class. Right: power of the production (sheddable) and injection (flexible) levers against lever position." title="" id="35" name="Picture"/>
+            <wp:docPr descr="Fig. 2. Demand map. Left: electric power at design by consumer, coloured by flexibility class. Right: power of the production (sheddable) and injection (flexible) levers against lever position." title="" id="36" name="Picture"/>
             <a:graphic>
               <a:graphicData uri="http://schemas.openxmlformats.org/drawingml/2006/picture">
                 <pic:pic>
                   <pic:nvPicPr>
-                    <pic:cNvPr descr="results/paper/fig02_demand_map.png" id="36" name="Picture"/>
+                    <pic:cNvPr descr="results/paper/fig02_demand_map.png" id="37" name="Picture"/>
                     <pic:cNvPicPr>
                       <a:picLocks noChangeArrowheads="1" noChangeAspect="1"/>
                     </pic:cNvPicPr>
                   </pic:nvPicPr>
                   <pic:blipFill>
-                    <a:blip r:embed="rId34"/>
+                    <a:blip r:embed="rId35"/>
                     <a:stretch>
                       <a:fillRect/>
                     </a:stretch>
@@ -8351,8 +8874,8 @@
         <w:t xml:space="preserve">but it also leaves frequent and sometimes long gaps that the GTs must fill.</w:t>
       </w:r>
     </w:p>
-    <w:bookmarkEnd w:id="37"/>
-    <w:bookmarkStart w:id="41" w:name="comparison-of-the-four-cases"/>
+    <w:bookmarkEnd w:id="38"/>
+    <w:bookmarkStart w:id="42" w:name="comparison-of-the-four-cases"/>
     <w:p>
       <w:pPr>
         <w:pStyle w:val="Heading3"/>
@@ -9250,18 +9773,18 @@
           <wp:inline>
             <wp:extent cx="5334000" cy="4135962"/>
             <wp:effectExtent b="0" l="0" r="0" t="0"/>
-            <wp:docPr descr="Fig. 3. Annual CO2, fuel gas, GT hours below 50 % load and lost production for cases 1–4." title="" id="39" name="Picture"/>
+            <wp:docPr descr="Fig. 3. Annual CO2, fuel gas, GT hours below 50 % load and lost production for cases 1–4." title="" id="40" name="Picture"/>
             <a:graphic>
               <a:graphicData uri="http://schemas.openxmlformats.org/drawingml/2006/picture">
                 <pic:pic>
                   <pic:nvPicPr>
-                    <pic:cNvPr descr="results/paper/fig04_cases.png" id="40" name="Picture"/>
+                    <pic:cNvPr descr="results/paper/fig04_cases.png" id="41" name="Picture"/>
                     <pic:cNvPicPr>
                       <a:picLocks noChangeArrowheads="1" noChangeAspect="1"/>
                     </pic:cNvPicPr>
                   </pic:nvPicPr>
                   <pic:blipFill>
-                    <a:blip r:embed="rId38"/>
+                    <a:blip r:embed="rId39"/>
                     <a:stretch>
                       <a:fillRect/>
                     </a:stretch>
@@ -9306,8 +9829,8 @@
         <w:t xml:space="preserve">Annual CO2, fuel gas, GT hours below 50 % load and lost production for cases 1–4.</w:t>
       </w:r>
     </w:p>
-    <w:bookmarkEnd w:id="41"/>
-    <w:bookmarkStart w:id="51" w:name="how-flexible-scheduling-saves-fuel"/>
+    <w:bookmarkEnd w:id="42"/>
+    <w:bookmarkStart w:id="52" w:name="how-flexible-scheduling-saves-fuel"/>
     <w:p>
       <w:pPr>
         <w:pStyle w:val="Heading3"/>
@@ -9381,18 +9904,18 @@
           <wp:inline>
             <wp:extent cx="5334000" cy="4365500"/>
             <wp:effectExtent b="0" l="0" r="0" t="0"/>
-            <wp:docPr descr="Fig. 4. Week 3 (15–21 January 2023), the week with the median fuel saving. Top and middle: power supplied by GTs and wind with fixed (case 2) and flexible (case 3) demand. Bottom: production and injection rates." title="" id="43" name="Picture"/>
+            <wp:docPr descr="Fig. 4. Week 3 (15–21 January 2023), the week with the median fuel saving. Top and middle: power supplied by GTs and wind with fixed (case 2) and flexible (case 3) demand. Bottom: production and injection rates." title="" id="44" name="Picture"/>
             <a:graphic>
               <a:graphicData uri="http://schemas.openxmlformats.org/drawingml/2006/picture">
                 <pic:pic>
                   <pic:nvPicPr>
-                    <pic:cNvPr descr="results/paper/fig05_example_week.png" id="44" name="Picture"/>
+                    <pic:cNvPr descr="results/paper/fig05_example_week.png" id="45" name="Picture"/>
                     <pic:cNvPicPr>
                       <a:picLocks noChangeArrowheads="1" noChangeAspect="1"/>
                     </pic:cNvPicPr>
                   </pic:nvPicPr>
                   <pic:blipFill>
-                    <a:blip r:embed="rId42"/>
+                    <a:blip r:embed="rId43"/>
                     <a:stretch>
                       <a:fillRect/>
                     </a:stretch>
@@ -9446,18 +9969,18 @@
           <wp:inline>
             <wp:extent cx="5334000" cy="2037906"/>
             <wp:effectExtent b="0" l="0" r="0" t="0"/>
-            <wp:docPr descr="Fig. 5. Duration curves of GT load per running unit (left; shaded: below 50 %) and of the number of GTs running (right)." title="" id="46" name="Picture"/>
+            <wp:docPr descr="Fig. 5. Duration curves of GT load per running unit (left; shaded: below 50 %) and of the number of GTs running (right)." title="" id="47" name="Picture"/>
             <a:graphic>
               <a:graphicData uri="http://schemas.openxmlformats.org/drawingml/2006/picture">
                 <pic:pic>
                   <pic:nvPicPr>
-                    <pic:cNvPr descr="results/paper/fig06_gt_load_duration.png" id="47" name="Picture"/>
+                    <pic:cNvPr descr="results/paper/fig06_gt_load_duration.png" id="48" name="Picture"/>
                     <pic:cNvPicPr>
                       <a:picLocks noChangeArrowheads="1" noChangeAspect="1"/>
                     </pic:cNvPicPr>
                   </pic:nvPicPr>
                   <pic:blipFill>
-                    <a:blip r:embed="rId45"/>
+                    <a:blip r:embed="rId46"/>
                     <a:stretch>
                       <a:fillRect/>
                     </a:stretch>
@@ -9655,18 +10178,18 @@
           <wp:inline>
             <wp:extent cx="5334000" cy="2037906"/>
             <wp:effectExtent b="0" l="0" r="0" t="0"/>
-            <wp:docPr descr="Fig. 6. Left: water injection rate against available wind in case 3 (mean and 10–90 % range of hours). Right: distribution of the injection deficit (dashed: 72 h limit)." title="" id="49" name="Picture"/>
+            <wp:docPr descr="Fig. 6. Left: water injection rate against available wind in case 3 (mean and 10–90 % range of hours). Right: distribution of the injection deficit (dashed: 72 h limit)." title="" id="50" name="Picture"/>
             <a:graphic>
               <a:graphicData uri="http://schemas.openxmlformats.org/drawingml/2006/picture">
                 <pic:pic>
                   <pic:nvPicPr>
-                    <pic:cNvPr descr="results/paper/fig07_injection_mechanism.png" id="50" name="Picture"/>
+                    <pic:cNvPr descr="results/paper/fig07_injection_mechanism.png" id="51" name="Picture"/>
                     <pic:cNvPicPr>
                       <a:picLocks noChangeArrowheads="1" noChangeAspect="1"/>
                     </pic:cNvPicPr>
                   </pic:nvPicPr>
                   <pic:blipFill>
-                    <a:blip r:embed="rId48"/>
+                    <a:blip r:embed="rId49"/>
                     <a:stretch>
                       <a:fillRect/>
                     </a:stretch>
@@ -9711,8 +10234,8 @@
         <w:t xml:space="preserve">Left: water injection rate against available wind in case 3 (mean and 10–90 % range of hours). Right: distribution of the injection deficit (dashed: 72 h limit).</w:t>
       </w:r>
     </w:p>
-    <w:bookmarkEnd w:id="51"/>
-    <w:bookmarkStart w:id="55" w:name="sensitivity-analysis"/>
+    <w:bookmarkEnd w:id="52"/>
+    <w:bookmarkStart w:id="56" w:name="sensitivity-analysis"/>
     <w:p>
       <w:pPr>
         <w:pStyle w:val="Heading3"/>
@@ -10626,18 +11149,18 @@
           <wp:inline>
             <wp:extent cx="5334000" cy="4492807"/>
             <wp:effectExtent b="0" l="0" r="0" t="0"/>
-            <wp:docPr descr="Fig. 7. Sensitivity of annual CO2 emissions to wind farm size, CO2 and gas price, battery size, injection deficit limit, minimum number of GTs online, GT fleet and operating practice." title="" id="53" name="Picture"/>
+            <wp:docPr descr="Fig. 7. Sensitivity of annual CO2 emissions to wind farm size, CO2 and gas price, battery size, injection deficit limit, minimum number of GTs online, GT fleet and operating practice." title="" id="54" name="Picture"/>
             <a:graphic>
               <a:graphicData uri="http://schemas.openxmlformats.org/drawingml/2006/picture">
                 <pic:pic>
                   <pic:nvPicPr>
-                    <pic:cNvPr descr="results/paper/fig09_sensitivity_overview.png" id="54" name="Picture"/>
+                    <pic:cNvPr descr="results/paper/fig09_sensitivity_overview.png" id="55" name="Picture"/>
                     <pic:cNvPicPr>
                       <a:picLocks noChangeArrowheads="1" noChangeAspect="1"/>
                     </pic:cNvPicPr>
                   </pic:nvPicPr>
                   <pic:blipFill>
-                    <a:blip r:embed="rId52"/>
+                    <a:blip r:embed="rId53"/>
                     <a:stretch>
                       <a:fillRect/>
                     </a:stretch>
@@ -10682,8 +11205,8 @@
         <w:t xml:space="preserve">Sensitivity of annual CO2 emissions to wind farm size, CO2 and gas price, battery size, injection deficit limit, minimum number of GTs online, GT fleet and operating practice.</w:t>
       </w:r>
     </w:p>
-    <w:bookmarkEnd w:id="55"/>
-    <w:bookmarkStart w:id="59" w:name="validation"/>
+    <w:bookmarkEnd w:id="56"/>
+    <w:bookmarkStart w:id="60" w:name="validation"/>
     <w:p>
       <w:pPr>
         <w:pStyle w:val="Heading3"/>
@@ -11436,18 +11959,18 @@
           <wp:inline>
             <wp:extent cx="5334000" cy="3083079"/>
             <wp:effectExtent b="0" l="0" r="0" t="0"/>
-            <wp:docPr descr="Fig. 8. Left: model results divided by published benchmarks (1 = equal; shaded: ±20 %; grey bars: published ranges). Right: CO2 intensity of the Gullfaks, Snorre and Statfjord field centres (grey: GT-powered; teal: receiving Hywind Tampen power) with the model case 1 value (dashed)." title="" id="57" name="Picture"/>
+            <wp:docPr descr="Fig. 8. Left: model results divided by published benchmarks (1 = equal; shaded: ±20 %; grey bars: published ranges). Right: CO2 intensity of the Gullfaks, Snorre and Statfjord field centres (grey: GT-powered; teal: receiving Hywind Tampen power) with the model case 1 value (dashed)." title="" id="58" name="Picture"/>
             <a:graphic>
               <a:graphicData uri="http://schemas.openxmlformats.org/drawingml/2006/picture">
                 <pic:pic>
                   <pic:nvPicPr>
-                    <pic:cNvPr descr="results/paper/fig10_validation.png" id="58" name="Picture"/>
+                    <pic:cNvPr descr="results/paper/fig10_validation.png" id="59" name="Picture"/>
                     <pic:cNvPicPr>
                       <a:picLocks noChangeArrowheads="1" noChangeAspect="1"/>
                     </pic:cNvPicPr>
                   </pic:nvPicPr>
                   <pic:blipFill>
-                    <a:blip r:embed="rId56"/>
+                    <a:blip r:embed="rId57"/>
                     <a:stretch>
                       <a:fillRect/>
                     </a:stretch>
@@ -11492,9 +12015,547 @@
         <w:t xml:space="preserve">Left: model results divided by published benchmarks (1 = equal; shaded: ±20 %; grey bars: published ranges). Right: CO2 intensity of the Gullfaks, Snorre and Statfjord field centres (grey: GT-powered; teal: receiving Hywind Tampen power) with the model case 1 value (dashed).</w:t>
       </w:r>
     </w:p>
-    <w:bookmarkEnd w:id="59"/>
     <w:bookmarkEnd w:id="60"/>
-    <w:bookmarkStart w:id="66" w:name="discussion"/>
+    <w:bookmarkStart w:id="61" w:name="economic-indicators-1"/>
+    <w:p>
+      <w:pPr>
+        <w:pStyle w:val="Heading3"/>
+      </w:pPr>
+      <w:r>
+        <w:t xml:space="preserve">3.6 Economic indicators</w:t>
+      </w:r>
+    </w:p>
+    <w:p>
+      <w:pPr>
+        <w:pStyle w:val="FirstParagraph"/>
+      </w:pPr>
+      <w:r>
+        <w:rPr>
+          <w:bCs/>
+          <w:b/>
+        </w:rPr>
+        <w:t xml:space="preserve">Table 5.</w:t>
+      </w:r>
+      <w:r>
+        <w:t xml:space="preserve"> </w:t>
+      </w:r>
+      <w:r>
+        <w:t xml:space="preserve">Economic indicators (real NOK, 20 years; abatement cost range</w:t>
+      </w:r>
+      <w:r>
+        <w:t xml:space="preserve"> </w:t>
+      </w:r>
+      <w:r>
+        <w:t xml:space="preserve">from the O&amp;M range of floating wind).</w:t>
+      </w:r>
+    </w:p>
+    <w:tbl>
+      <w:tblPr>
+        <w:tblStyle w:val="Table"/>
+        <w:tblW w:type="pct" w:w="5000"/>
+        <w:tblLook w:firstRow="1" w:lastRow="0" w:firstColumn="0" w:lastColumn="0" w:noHBand="0" w:noVBand="0" w:val="0020"/>
+        <w:jc w:val="start"/>
+        <w:tblBorders>
+          <w:top w:val="single" w:sz="4" w:space="0" w:color="808080"/>
+          <w:left w:val="single" w:sz="4" w:space="0" w:color="808080"/>
+          <w:bottom w:val="single" w:sz="4" w:space="0" w:color="808080"/>
+          <w:right w:val="single" w:sz="4" w:space="0" w:color="808080"/>
+          <w:insideH w:val="single" w:sz="4" w:space="0" w:color="808080"/>
+          <w:insideV w:val="single" w:sz="4" w:space="0" w:color="808080"/>
+        </w:tblBorders>
+      </w:tblPr>
+      <w:tblGrid>
+        <w:gridCol w:w="1584"/>
+        <w:gridCol w:w="1584"/>
+        <w:gridCol w:w="1584"/>
+        <w:gridCol w:w="1584"/>
+        <w:gridCol w:w="1584"/>
+      </w:tblGrid>
+      <w:tr>
+        <w:trPr>
+          <w:tblHeader w:val="true"/>
+        </w:trPr>
+        <w:tc>
+          <w:tcPr/>
+          <w:p>
+            <w:pPr>
+              <w:pStyle w:val="Compact"/>
+              <w:jc w:val="left"/>
+            </w:pPr>
+            <w:r>
+              <w:t xml:space="preserve">Measure</w:t>
+            </w:r>
+          </w:p>
+        </w:tc>
+        <w:tc>
+          <w:tcPr/>
+          <w:p>
+            <w:pPr>
+              <w:pStyle w:val="Compact"/>
+              <w:jc w:val="left"/>
+            </w:pPr>
+            <w:r>
+              <w:t xml:space="preserve">CO2 avoided [kt/yr]</w:t>
+            </w:r>
+          </w:p>
+        </w:tc>
+        <w:tc>
+          <w:tcPr/>
+          <w:p>
+            <w:pPr>
+              <w:pStyle w:val="Compact"/>
+              <w:jc w:val="left"/>
+            </w:pPr>
+            <w:r>
+              <w:t xml:space="preserve">Fuel value saved [MNOK/yr]</w:t>
+            </w:r>
+          </w:p>
+        </w:tc>
+        <w:tc>
+          <w:tcPr/>
+          <w:p>
+            <w:pPr>
+              <w:pStyle w:val="Compact"/>
+              <w:jc w:val="left"/>
+            </w:pPr>
+            <w:r>
+              <w:t xml:space="preserve">Abatement cost [NOK/t], 7 % / 4 %</w:t>
+            </w:r>
+          </w:p>
+        </w:tc>
+        <w:tc>
+          <w:tcPr/>
+          <w:p>
+            <w:pPr>
+              <w:pStyle w:val="Compact"/>
+              <w:jc w:val="left"/>
+            </w:pPr>
+            <w:r>
+              <w:t xml:space="preserve">Break-even investment [MNOK], fuel / fuel + CO2</w:t>
+            </w:r>
+          </w:p>
+        </w:tc>
+      </w:tr>
+      <w:tr>
+        <w:tc>
+          <w:tcPr/>
+          <w:p>
+            <w:pPr>
+              <w:pStyle w:val="Compact"/>
+              <w:jc w:val="left"/>
+            </w:pPr>
+            <w:r>
+              <w:t xml:space="preserve">Wind farm, fixed demand (case 2 vs 1)</w:t>
+            </w:r>
+          </w:p>
+        </w:tc>
+        <w:tc>
+          <w:tcPr/>
+          <w:p>
+            <w:pPr>
+              <w:pStyle w:val="Compact"/>
+              <w:jc w:val="left"/>
+            </w:pPr>
+            <w:r>
+              <w:t xml:space="preserve">63.0</w:t>
+            </w:r>
+          </w:p>
+        </w:tc>
+        <w:tc>
+          <w:tcPr/>
+          <w:p>
+            <w:pPr>
+              <w:pStyle w:val="Compact"/>
+              <w:jc w:val="left"/>
+            </w:pPr>
+            <w:r>
+              <w:t xml:space="preserve">112.8</w:t>
+            </w:r>
+          </w:p>
+        </w:tc>
+        <w:tc>
+          <w:tcPr/>
+          <w:p>
+            <w:pPr>
+              <w:pStyle w:val="Compact"/>
+              <w:jc w:val="left"/>
+            </w:pPr>
+            <w:r>
+              <w:t xml:space="preserve">2,180–2,519 / 1,347–1,686</w:t>
+            </w:r>
+          </w:p>
+        </w:tc>
+        <w:tc>
+          <w:tcPr/>
+          <w:p>
+            <w:pPr>
+              <w:pStyle w:val="Compact"/>
+              <w:jc w:val="left"/>
+            </w:pPr>
+            <w:r>
+              <w:t xml:space="preserve">–</w:t>
+            </w:r>
+          </w:p>
+        </w:tc>
+      </w:tr>
+      <w:tr>
+        <w:tc>
+          <w:tcPr/>
+          <w:p>
+            <w:pPr>
+              <w:pStyle w:val="Compact"/>
+              <w:jc w:val="left"/>
+            </w:pPr>
+            <w:r>
+              <w:t xml:space="preserve">Wind farm with flexibility (case 3 vs 1)</w:t>
+            </w:r>
+          </w:p>
+        </w:tc>
+        <w:tc>
+          <w:tcPr/>
+          <w:p>
+            <w:pPr>
+              <w:pStyle w:val="Compact"/>
+              <w:jc w:val="left"/>
+            </w:pPr>
+            <w:r>
+              <w:t xml:space="preserve">70.2</w:t>
+            </w:r>
+          </w:p>
+        </w:tc>
+        <w:tc>
+          <w:tcPr/>
+          <w:p>
+            <w:pPr>
+              <w:pStyle w:val="Compact"/>
+              <w:jc w:val="left"/>
+            </w:pPr>
+            <w:r>
+              <w:t xml:space="preserve">125.7</w:t>
+            </w:r>
+          </w:p>
+        </w:tc>
+        <w:tc>
+          <w:tcPr/>
+          <w:p>
+            <w:pPr>
+              <w:pStyle w:val="Compact"/>
+              <w:jc w:val="left"/>
+            </w:pPr>
+            <w:r>
+              <w:t xml:space="preserve">1,774–2,078 / 1,026–1,330</w:t>
+            </w:r>
+          </w:p>
+        </w:tc>
+        <w:tc>
+          <w:tcPr/>
+          <w:p>
+            <w:pPr>
+              <w:pStyle w:val="Compact"/>
+              <w:jc w:val="left"/>
+            </w:pPr>
+            <w:r>
+              <w:t xml:space="preserve">–</w:t>
+            </w:r>
+          </w:p>
+        </w:tc>
+      </w:tr>
+      <w:tr>
+        <w:tc>
+          <w:tcPr/>
+          <w:p>
+            <w:pPr>
+              <w:pStyle w:val="Compact"/>
+              <w:jc w:val="left"/>
+            </w:pPr>
+            <w:r>
+              <w:t xml:space="preserve">Flexibility (case 3 vs 2)</w:t>
+            </w:r>
+          </w:p>
+        </w:tc>
+        <w:tc>
+          <w:tcPr/>
+          <w:p>
+            <w:pPr>
+              <w:pStyle w:val="Compact"/>
+              <w:jc w:val="left"/>
+            </w:pPr>
+            <w:r>
+              <w:t xml:space="preserve">7.2</w:t>
+            </w:r>
+          </w:p>
+        </w:tc>
+        <w:tc>
+          <w:tcPr/>
+          <w:p>
+            <w:pPr>
+              <w:pStyle w:val="Compact"/>
+              <w:jc w:val="left"/>
+            </w:pPr>
+            <w:r>
+              <w:t xml:space="preserve">12.9</w:t>
+            </w:r>
+          </w:p>
+        </w:tc>
+        <w:tc>
+          <w:tcPr/>
+          <w:p>
+            <w:pPr>
+              <w:pStyle w:val="Compact"/>
+              <w:jc w:val="left"/>
+            </w:pPr>
+            <w:r>
+              <w:t xml:space="preserve">−1,799 before implementation cost</w:t>
+            </w:r>
+          </w:p>
+        </w:tc>
+        <w:tc>
+          <w:tcPr/>
+          <w:p>
+            <w:pPr>
+              <w:pStyle w:val="Compact"/>
+              <w:jc w:val="left"/>
+            </w:pPr>
+            <w:r>
+              <w:t xml:space="preserve">137 / 288</w:t>
+            </w:r>
+          </w:p>
+        </w:tc>
+      </w:tr>
+      <w:tr>
+        <w:tc>
+          <w:tcPr/>
+          <w:p>
+            <w:pPr>
+              <w:pStyle w:val="Compact"/>
+              <w:jc w:val="left"/>
+            </w:pPr>
+            <w:r>
+              <w:t xml:space="preserve">Battery 4 MW / 4 MWh (case 4 vs 3)</w:t>
+            </w:r>
+          </w:p>
+        </w:tc>
+        <w:tc>
+          <w:tcPr/>
+          <w:p>
+            <w:pPr>
+              <w:pStyle w:val="Compact"/>
+              <w:jc w:val="left"/>
+            </w:pPr>
+            <w:r>
+              <w:t xml:space="preserve">0.3</w:t>
+            </w:r>
+          </w:p>
+        </w:tc>
+        <w:tc>
+          <w:tcPr/>
+          <w:p>
+            <w:pPr>
+              <w:pStyle w:val="Compact"/>
+              <w:jc w:val="left"/>
+            </w:pPr>
+            <w:r>
+              <w:t xml:space="preserve">0.5</w:t>
+            </w:r>
+          </w:p>
+        </w:tc>
+        <w:tc>
+          <w:tcPr/>
+          <w:p>
+            <w:pPr>
+              <w:pStyle w:val="Compact"/>
+              <w:jc w:val="left"/>
+            </w:pPr>
+            <w:r>
+              <w:t xml:space="preserve">−1,562 before battery cost</w:t>
+            </w:r>
+          </w:p>
+        </w:tc>
+        <w:tc>
+          <w:tcPr/>
+          <w:p>
+            <w:pPr>
+              <w:pStyle w:val="Compact"/>
+              <w:jc w:val="left"/>
+            </w:pPr>
+            <w:r>
+              <w:t xml:space="preserve">5 / 13</w:t>
+            </w:r>
+          </w:p>
+        </w:tc>
+      </w:tr>
+      <w:tr>
+        <w:tc>
+          <w:tcPr/>
+          <w:p>
+            <w:pPr>
+              <w:pStyle w:val="Compact"/>
+              <w:jc w:val="left"/>
+            </w:pPr>
+            <w:r>
+              <w:t xml:space="preserve">Small GT replacing one main GT (flexible)</w:t>
+            </w:r>
+          </w:p>
+        </w:tc>
+        <w:tc>
+          <w:tcPr/>
+          <w:p>
+            <w:pPr>
+              <w:pStyle w:val="Compact"/>
+              <w:jc w:val="left"/>
+            </w:pPr>
+            <w:r>
+              <w:t xml:space="preserve">9.7</w:t>
+            </w:r>
+          </w:p>
+        </w:tc>
+        <w:tc>
+          <w:tcPr/>
+          <w:p>
+            <w:pPr>
+              <w:pStyle w:val="Compact"/>
+              <w:jc w:val="left"/>
+            </w:pPr>
+            <w:r>
+              <w:t xml:space="preserve">17.4</w:t>
+            </w:r>
+          </w:p>
+        </w:tc>
+        <w:tc>
+          <w:tcPr/>
+          <w:p>
+            <w:pPr>
+              <w:pStyle w:val="Compact"/>
+              <w:jc w:val="left"/>
+            </w:pPr>
+            <w:r>
+              <w:t xml:space="preserve">−1,786 before GT cost</w:t>
+            </w:r>
+          </w:p>
+        </w:tc>
+        <w:tc>
+          <w:tcPr/>
+          <w:p>
+            <w:pPr>
+              <w:pStyle w:val="Compact"/>
+              <w:jc w:val="left"/>
+            </w:pPr>
+            <w:r>
+              <w:t xml:space="preserve">184 / 391</w:t>
+            </w:r>
+          </w:p>
+        </w:tc>
+      </w:tr>
+    </w:tbl>
+    <w:p>
+      <w:pPr>
+        <w:pStyle w:val="BodyText"/>
+      </w:pPr>
+      <w:r>
+        <w:t xml:space="preserve">With an investment of 2.5 billion NOK for 30 MW, the wind farm with fixed</w:t>
+      </w:r>
+      <w:r>
+        <w:t xml:space="preserve"> </w:t>
+      </w:r>
+      <w:r>
+        <w:t xml:space="preserve">demand avoids CO2 at 2,180–2,519 NOK/t at a 7 % discount rate and</w:t>
+      </w:r>
+      <w:r>
+        <w:t xml:space="preserve"> </w:t>
+      </w:r>
+      <w:r>
+        <w:t xml:space="preserve">1,347–1,686 NOK/t at 4 % (Table 5). This is of the same order as the</w:t>
+      </w:r>
+      <w:r>
+        <w:t xml:space="preserve"> </w:t>
+      </w:r>
+      <w:r>
+        <w:t xml:space="preserve">abatement cost of the power-from-shore projects most recently approved on</w:t>
+      </w:r>
+      <w:r>
+        <w:t xml:space="preserve"> </w:t>
+      </w:r>
+      <w:r>
+        <w:t xml:space="preserve">the Norwegian shelf, just under 2,000 NOK/t [35], and close to the</w:t>
+      </w:r>
+      <w:r>
+        <w:t xml:space="preserve"> </w:t>
+      </w:r>
+      <w:r>
+        <w:t xml:space="preserve">2,000 NOK/t CO2 price targeted for 2030 [26]. Scheduling the</w:t>
+      </w:r>
+      <w:r>
+        <w:t xml:space="preserve"> </w:t>
+      </w:r>
+      <w:r>
+        <w:t xml:space="preserve">flexible loads lowers the abatement cost of the same wind farm by about</w:t>
+      </w:r>
+      <w:r>
+        <w:t xml:space="preserve"> </w:t>
+      </w:r>
+      <w:r>
+        <w:t xml:space="preserve">400 NOK/t, to 1,774–2,078 NOK/t at 7 %, because it avoids 11 % more CO2 and</w:t>
+      </w:r>
+      <w:r>
+        <w:t xml:space="preserve"> </w:t>
+      </w:r>
+      <w:r>
+        <w:t xml:space="preserve">saves 11 % more fuel for the same investment.</w:t>
+      </w:r>
+    </w:p>
+    <w:p>
+      <w:pPr>
+        <w:pStyle w:val="BodyText"/>
+      </w:pPr>
+      <w:r>
+        <w:t xml:space="preserve">Flexibility on its own saves money before any implementation cost: the fuel</w:t>
+      </w:r>
+      <w:r>
+        <w:t xml:space="preserve"> </w:t>
+      </w:r>
+      <w:r>
+        <w:t xml:space="preserve">saved is worth about 1,800 NOK per tonne of CO2 avoided. An operator could</w:t>
+      </w:r>
+      <w:r>
+        <w:t xml:space="preserve"> </w:t>
+      </w:r>
+      <w:r>
+        <w:t xml:space="preserve">spend up to 137 MNOK on control systems and process changes and still break</w:t>
+      </w:r>
+      <w:r>
+        <w:t xml:space="preserve"> </w:t>
+      </w:r>
+      <w:r>
+        <w:t xml:space="preserve">even on the fuel saved alone, or 288 MNOK when the avoided CO2 cost is</w:t>
+      </w:r>
+      <w:r>
+        <w:t xml:space="preserve"> </w:t>
+      </w:r>
+      <w:r>
+        <w:t xml:space="preserve">included. A 4 MW / 4 MWh battery breaks even only below 5–13 MNOK, which is</w:t>
+      </w:r>
+      <w:r>
+        <w:t xml:space="preserve"> </w:t>
+      </w:r>
+      <w:r>
+        <w:t xml:space="preserve">low for an offshore installation of that size. A small GT that replaces one</w:t>
+      </w:r>
+      <w:r>
+        <w:t xml:space="preserve"> </w:t>
+      </w:r>
+      <w:r>
+        <w:t xml:space="preserve">main GT breaks even below 184–391 MNOK, before its additional maintenance and</w:t>
+      </w:r>
+      <w:r>
+        <w:t xml:space="preserve"> </w:t>
+      </w:r>
+      <w:r>
+        <w:t xml:space="preserve">its 262 starts per year are accounted for.</w:t>
+      </w:r>
+    </w:p>
+    <w:bookmarkEnd w:id="61"/>
+    <w:bookmarkEnd w:id="62"/>
+    <w:bookmarkStart w:id="68" w:name="discussion"/>
     <w:p>
       <w:pPr>
         <w:pStyle w:val="Heading2"/>
@@ -11503,7 +12564,7 @@
         <w:t xml:space="preserve">4 Discussion</w:t>
       </w:r>
     </w:p>
-    <w:bookmarkStart w:id="61" w:name="why-load-flexibility-works"/>
+    <w:bookmarkStart w:id="63" w:name="why-load-flexibility-works"/>
     <w:p>
       <w:pPr>
         <w:pStyle w:val="Heading3"/>
@@ -11730,8 +12791,8 @@
         <w:t xml:space="preserve">overhaul, where the number of starts of the small unit must be acceptable.</w:t>
       </w:r>
     </w:p>
-    <w:bookmarkEnd w:id="61"/>
-    <w:bookmarkStart w:id="62" w:name="comparison-with-earlier-studies"/>
+    <w:bookmarkEnd w:id="63"/>
+    <w:bookmarkStart w:id="64" w:name="comparison-with-earlier-studies"/>
     <w:p>
       <w:pPr>
         <w:pStyle w:val="Heading3"/>
@@ -11837,25 +12898,37 @@
         <w:t xml:space="preserve"> </w:t>
       </w:r>
       <w:r>
-        <w:t xml:space="preserve">emissions are not priced. The value of the fuel saved is of the same order</w:t>
-      </w:r>
-      <w:r>
-        <w:t xml:space="preserve"> </w:t>
-      </w:r>
-      <w:r>
-        <w:t xml:space="preserve">as the abatement cost threshold used for power-from-shore projects in</w:t>
-      </w:r>
-      <w:r>
-        <w:t xml:space="preserve"> </w:t>
-      </w:r>
-      <w:r>
-        <w:t xml:space="preserve">Norway [3], but power from shore requires large investments while</w:t>
-      </w:r>
-      <w:r>
-        <w:t xml:space="preserve"> </w:t>
-      </w:r>
-      <w:r>
-        <w:t xml:space="preserve">the flexibility studied here requires mainly a change in operation.</w:t>
+        <w:t xml:space="preserve">emissions are not priced. The wind farm, in contrast, needs a CO2 price of</w:t>
+      </w:r>
+      <w:r>
+        <w:t xml:space="preserve"> </w:t>
+      </w:r>
+      <w:r>
+        <w:t xml:space="preserve">about 1,800–2,500 NOK/t to break even at a 7 % discount rate, the same order</w:t>
+      </w:r>
+      <w:r>
+        <w:t xml:space="preserve"> </w:t>
+      </w:r>
+      <w:r>
+        <w:t xml:space="preserve">as power from shore [3,35], and flexibility lowers this</w:t>
+      </w:r>
+      <w:r>
+        <w:t xml:space="preserve"> </w:t>
+      </w:r>
+      <w:r>
+        <w:t xml:space="preserve">threshold by about 400 NOK/t. Power from shore and wind both require large</w:t>
+      </w:r>
+      <w:r>
+        <w:t xml:space="preserve"> </w:t>
+      </w:r>
+      <w:r>
+        <w:t xml:space="preserve">investments, whereas the flexibility studied here requires mainly a change</w:t>
+      </w:r>
+      <w:r>
+        <w:t xml:space="preserve"> </w:t>
+      </w:r>
+      <w:r>
+        <w:t xml:space="preserve">in operation.</w:t>
       </w:r>
     </w:p>
     <w:p>
@@ -11902,8 +12975,8 @@
         <w:t xml:space="preserve">a model of energy shifting alone, is needed to estimate it.</w:t>
       </w:r>
     </w:p>
-    <w:bookmarkEnd w:id="62"/>
-    <w:bookmarkStart w:id="63" w:name="practical-implementation"/>
+    <w:bookmarkEnd w:id="64"/>
+    <w:bookmarkStart w:id="65" w:name="practical-implementation"/>
     <w:p>
       <w:pPr>
         <w:pStyle w:val="Heading3"/>
@@ -12122,8 +13195,8 @@
         <w:t xml:space="preserve">volume, is available.</w:t>
       </w:r>
     </w:p>
-    <w:bookmarkEnd w:id="63"/>
-    <w:bookmarkStart w:id="64" w:name="robustness-of-the-conclusions"/>
+    <w:bookmarkEnd w:id="65"/>
+    <w:bookmarkStart w:id="66" w:name="robustness-of-the-conclusions"/>
     <w:p>
       <w:pPr>
         <w:pStyle w:val="Heading3"/>
@@ -12294,8 +13367,8 @@
         <w:t xml:space="preserve">it.</w:t>
       </w:r>
     </w:p>
-    <w:bookmarkEnd w:id="64"/>
-    <w:bookmarkStart w:id="65" w:name="limitations-and-future-work"/>
+    <w:bookmarkEnd w:id="66"/>
+    <w:bookmarkStart w:id="67" w:name="limitations-and-future-work"/>
     <w:p>
       <w:pPr>
         <w:pStyle w:val="Heading3"/>
@@ -12375,19 +13448,25 @@
         <w:t xml:space="preserve"> </w:t>
       </w:r>
       <w:r>
-        <w:t xml:space="preserve">or export. Investment and operating costs of the wind farm and battery are</w:t>
-      </w:r>
-      <w:r>
-        <w:t xml:space="preserve"> </w:t>
-      </w:r>
-      <w:r>
-        <w:t xml:space="preserve">outside the scope, so the results show the operational value of flexibility</w:t>
-      </w:r>
-      <w:r>
-        <w:t xml:space="preserve"> </w:t>
-      </w:r>
-      <w:r>
-        <w:t xml:space="preserve">but not the cost of CO2 abatement of the whole system. Finally, the small GT</w:t>
+        <w:t xml:space="preserve">or export. The economic indicators rest on the cost of one first-of-a-kind</w:t>
+      </w:r>
+      <w:r>
+        <w:t xml:space="preserve"> </w:t>
+      </w:r>
+      <w:r>
+        <w:t xml:space="preserve">floating wind farm and do not include the cost of implementing flexibility,</w:t>
+      </w:r>
+      <w:r>
+        <w:t xml:space="preserve"> </w:t>
+      </w:r>
+      <w:r>
+        <w:t xml:space="preserve">the battery or the small GT on an existing platform, for which break-even</w:t>
+      </w:r>
+      <w:r>
+        <w:t xml:space="preserve"> </w:t>
+      </w:r>
+      <w:r>
+        <w:t xml:space="preserve">values are given instead. Finally, the small GT</w:t>
       </w:r>
       <w:r>
         <w:t xml:space="preserve"> </w:t>
@@ -12440,9 +13519,9 @@
         <w:t xml:space="preserve">shore becomes necessary.</w:t>
       </w:r>
     </w:p>
-    <w:bookmarkEnd w:id="65"/>
-    <w:bookmarkEnd w:id="66"/>
-    <w:bookmarkStart w:id="67" w:name="conclusions"/>
+    <w:bookmarkEnd w:id="67"/>
+    <w:bookmarkEnd w:id="68"/>
+    <w:bookmarkStart w:id="69" w:name="conclusions"/>
     <w:p>
       <w:pPr>
         <w:pStyle w:val="Heading2"/>
@@ -12612,7 +13691,19 @@
         <w:t xml:space="preserve"> </w:t>
       </w:r>
       <w:r>
-        <w:t xml:space="preserve">the fuel saved pays for the measure without a carbon price.</w:t>
+        <w:t xml:space="preserve">the fuel saved pays for the measure without a carbon price: flexibility</w:t>
+      </w:r>
+      <w:r>
+        <w:t xml:space="preserve"> </w:t>
+      </w:r>
+      <w:r>
+        <w:t xml:space="preserve">breaks even for an implementation cost up to 137 MNOK, and it lowers the</w:t>
+      </w:r>
+      <w:r>
+        <w:t xml:space="preserve"> </w:t>
+      </w:r>
+      <w:r>
+        <w:t xml:space="preserve">abatement cost of the wind farm from 2,180–2,519 to 1,774–2,078 NOK/t.</w:t>
       </w:r>
     </w:p>
     <w:p>
@@ -12653,8 +13744,8 @@
         <w:t xml:space="preserve">and which complements storage and grid-forming technologies.</w:t>
       </w:r>
     </w:p>
-    <w:bookmarkEnd w:id="67"/>
-    <w:bookmarkStart w:id="68" w:name="declarations"/>
+    <w:bookmarkEnd w:id="69"/>
+    <w:bookmarkStart w:id="70" w:name="declarations"/>
     <w:p>
       <w:pPr>
         <w:pStyle w:val="Heading2"/>
@@ -12827,8 +13918,8 @@
         <w:t xml:space="preserve">Service information (2023). [Funding.]</w:t>
       </w:r>
     </w:p>
-    <w:bookmarkEnd w:id="68"/>
-    <w:bookmarkStart w:id="69" w:name="references"/>
+    <w:bookmarkEnd w:id="70"/>
+    <w:bookmarkStart w:id="71" w:name="references"/>
     <w:p>
       <w:pPr>
         <w:pStyle w:val="Heading2"/>
@@ -13093,8 +14184,32 @@
         <w:t xml:space="preserve">[32] Norwegian Offshore Directorate. FactPages – field production, yearly. https://factpages.sodir.no [accessed DATE].</w:t>
       </w:r>
     </w:p>
-    <w:bookmarkEnd w:id="69"/>
-    <w:bookmarkEnd w:id="70"/>
+    <w:p>
+      <w:pPr>
+        <w:pStyle w:val="BodyText"/>
+      </w:pPr>
+      <w:r>
+        <w:t xml:space="preserve">[33] Dighe VV, Huang L-J, Hernandez Montfort J, Serraris J-J. Improving O&amp;M simulations by integrating vessel motions for floating wind farms. J Mar Sci Eng 2024;12(11):1948. https://doi.org/10.3390/jmse12111948.</w:t>
+      </w:r>
+    </w:p>
+    <w:p>
+      <w:pPr>
+        <w:pStyle w:val="BodyText"/>
+      </w:pPr>
+      <w:r>
+        <w:t xml:space="preserve">[34] Norwegian Petroleum Directorate. Estimating abatement cost curves for power from shore [conference abstract]. International Association for Energy Economics (IAEE) conference proceedings. https://iaee.org/en/publications/proceedingsabstractpdf.aspx?id=12947 [accessed DATE].</w:t>
+      </w:r>
+    </w:p>
+    <w:p>
+      <w:pPr>
+        <w:pStyle w:val="BodyText"/>
+      </w:pPr>
+      <w:r>
+        <w:t xml:space="preserve">[35] Norwegian Offshore Directorate. New report about power from shore [news and report]. 2025. https://www.sodir.no/en/whats-new/news/general-news/2025/new-report-about-power-from-shore [accessed DATE].</w:t>
+      </w:r>
+    </w:p>
+    <w:bookmarkEnd w:id="71"/>
+    <w:bookmarkEnd w:id="72"/>
     <w:sectPr/>
   </w:body>
 </w:document>

</xml_diff>

<commit_message>
Ten weather years (2014-2023): multi-year results, Table 6 and Fig. 9
- Cases 1-4 for each ERA5 year; flexibility benefit 10.5-11.7 % (mean 11.0 %,
  5.9-7.7 kt); 2023 is one of the calmer years (CF 50.9 % vs mean 54.2 %)
- Deficit-limit sensitivity for 2016 and 2017 (largest deficits): 24 h still
  captures 98 % of the saving
- multi_year_summary merges new years into an existing summary instead of
  overwriting it; figures.py makes fig11_multi_year and table T6
- Paper: Methods 2.1/2.7, new Results 3.7, abstract, limitations, conclusions
</commit_message>
<xml_diff>
--- a/docs/paper/paper.docx
+++ b/docs/paper/paper.docx
@@ -2,7 +2,7 @@
 <file path=word/document.xml><?xml version="1.0" encoding="utf-8"?>
 <w:document xmlns:w="http://schemas.openxmlformats.org/wordprocessingml/2006/main" xmlns:m="http://schemas.openxmlformats.org/officeDocument/2006/math" xmlns:r="http://schemas.openxmlformats.org/officeDocument/2006/relationships" xmlns:o="urn:schemas-microsoft-com:office:office" xmlns:v="urn:schemas-microsoft-com:vml" xmlns:w10="urn:schemas-microsoft-com:office:word" xmlns:a="http://schemas.openxmlformats.org/drawingml/2006/main" xmlns:pic="http://schemas.openxmlformats.org/drawingml/2006/picture" xmlns:wp="http://schemas.openxmlformats.org/drawingml/2006/wordprocessingDrawing">
   <w:body>
-    <w:bookmarkStart w:id="72" w:name="Xd969dbdcee26c3dc49c23a7936207aeb905ae7a"/>
+    <w:bookmarkStart w:id="76" w:name="Xd969dbdcee26c3dc49c23a7936207aeb905ae7a"/>
     <w:p>
       <w:pPr>
         <w:pStyle w:val="Heading1"/>
@@ -107,13 +107,7 @@
         <w:t xml:space="preserve"> </w:t>
       </w:r>
       <w:r>
-        <w:t xml:space="preserve">wind data. Postponed water injection is represented as a virtual storage</w:t>
-      </w:r>
-      <w:r>
-        <w:t xml:space="preserve"> </w:t>
-      </w:r>
-      <w:r>
-        <w:t xml:space="preserve">that must be caught up. For a 20.3 MW platform with a 30 MW wind farm, wind</w:t>
+        <w:t xml:space="preserve">wind data, with postponed water injection as a virtual storage. For a 20.3 MW platform with a 30 MW wind farm, wind</w:t>
       </w:r>
       <w:r>
         <w:t xml:space="preserve"> </w:t>
@@ -137,19 +131,19 @@
         <w:t xml:space="preserve"> </w:t>
       </w:r>
       <w:r>
-        <w:t xml:space="preserve">turbines online fall from 1,702 to 28. About 24 h of deferrable injection</w:t>
-      </w:r>
-      <w:r>
-        <w:t xml:space="preserve"> </w:t>
-      </w:r>
-      <w:r>
-        <w:t xml:space="preserve">captures the full benefit, and a small added gas turbine saves a similar</w:t>
-      </w:r>
-      <w:r>
-        <w:t xml:space="preserve"> </w:t>
-      </w:r>
-      <w:r>
-        <w:t xml:space="preserve">amount on top. Operating</w:t>
+        <w:t xml:space="preserve">turbines online fall from 1,702 to 28. Over ten weather years the benefit</w:t>
+      </w:r>
+      <w:r>
+        <w:t xml:space="preserve"> </w:t>
+      </w:r>
+      <w:r>
+        <w:t xml:space="preserve">is 10.5–11.7 %. About 24 h of deferrable injection captures it, and a</w:t>
+      </w:r>
+      <w:r>
+        <w:t xml:space="preserve"> </w:t>
+      </w:r>
+      <w:r>
+        <w:t xml:space="preserve">small added gas turbine is complementary. Operating</w:t>
       </w:r>
       <w:r>
         <w:t xml:space="preserve"> </w:t>
@@ -2627,7 +2621,13 @@
         <w:t xml:space="preserve"> </w:t>
       </w:r>
       <w:r>
-        <w:t xml:space="preserve">hourly resolution (Fig. 1). The platform produces oil with associated gas,</w:t>
+        <w:t xml:space="preserve">hourly resolution (Fig. 1), with cases 1–4 repeated for the weather years</w:t>
+      </w:r>
+      <w:r>
+        <w:t xml:space="preserve"> </w:t>
+      </w:r>
+      <w:r>
+        <w:t xml:space="preserve">2014–2022. The platform produces oil with associated gas,</w:t>
       </w:r>
       <w:r>
         <w:t xml:space="preserve"> </w:t>
@@ -7717,18 +7717,44 @@
       </w:r>
     </w:p>
     <w:bookmarkEnd w:id="31"/>
-    <w:bookmarkStart w:id="32" w:name="sensitivity-analysis-and-validation"/>
+    <w:bookmarkStart w:id="32" w:name="X32654d3cd445301b7caaa64f301babd56c5bfd2"/>
     <w:p>
       <w:pPr>
         <w:pStyle w:val="Heading3"/>
       </w:pPr>
       <w:r>
-        <w:t xml:space="preserve">2.7 Sensitivity analysis and validation</w:t>
+        <w:t xml:space="preserve">2.7 Weather years, sensitivity analysis and validation</w:t>
       </w:r>
     </w:p>
     <w:p>
       <w:pPr>
         <w:pStyle w:val="FirstParagraph"/>
+      </w:pPr>
+      <w:r>
+        <w:t xml:space="preserve">To test whether 2023 is representative, cases 1–4 were also run for each</w:t>
+      </w:r>
+      <w:r>
+        <w:t xml:space="preserve"> </w:t>
+      </w:r>
+      <w:r>
+        <w:t xml:space="preserve">weather year from 2014 to 2022 with ERA5 data at the same grid point and all</w:t>
+      </w:r>
+      <w:r>
+        <w:t xml:space="preserve"> </w:t>
+      </w:r>
+      <w:r>
+        <w:t xml:space="preserve">other inputs unchanged. The injection deficit limit was varied for 2016 and</w:t>
+      </w:r>
+      <w:r>
+        <w:t xml:space="preserve"> </w:t>
+      </w:r>
+      <w:r>
+        <w:t xml:space="preserve">2017 as well, the years in which the deficit reached its highest values.</w:t>
+      </w:r>
+    </w:p>
+    <w:p>
+      <w:pPr>
+        <w:pStyle w:val="BodyText"/>
       </w:pPr>
       <w:r>
         <w:t xml:space="preserve">Cases 2–4 were rerun with one input changed at a time:</w:t>
@@ -8667,7 +8693,7 @@
     </w:p>
     <w:bookmarkEnd w:id="33"/>
     <w:bookmarkEnd w:id="34"/>
-    <w:bookmarkStart w:id="62" w:name="results"/>
+    <w:bookmarkStart w:id="66" w:name="results"/>
     <w:p>
       <w:pPr>
         <w:pStyle w:val="Heading2"/>
@@ -12554,8 +12580,626 @@
       </w:r>
     </w:p>
     <w:bookmarkEnd w:id="61"/>
-    <w:bookmarkEnd w:id="62"/>
-    <w:bookmarkStart w:id="68" w:name="discussion"/>
+    <w:bookmarkStart w:id="65" w:name="weather-years"/>
+    <w:p>
+      <w:pPr>
+        <w:pStyle w:val="Heading3"/>
+      </w:pPr>
+      <w:r>
+        <w:t xml:space="preserve">3.7 Weather years</w:t>
+      </w:r>
+    </w:p>
+    <w:p>
+      <w:pPr>
+        <w:pStyle w:val="FirstParagraph"/>
+      </w:pPr>
+      <w:r>
+        <w:rPr>
+          <w:bCs/>
+          <w:b/>
+        </w:rPr>
+        <w:t xml:space="preserve">Table 6.</w:t>
+      </w:r>
+      <w:r>
+        <w:t xml:space="preserve"> </w:t>
+      </w:r>
+      <w:r>
+        <w:t xml:space="preserve">Results for ten weather years (ERA5, 2014–2023).</w:t>
+      </w:r>
+    </w:p>
+    <w:tbl>
+      <w:tblPr>
+        <w:tblStyle w:val="Table"/>
+        <w:tblW w:type="pct" w:w="5000"/>
+        <w:tblLook w:firstRow="1" w:lastRow="0" w:firstColumn="0" w:lastColumn="0" w:noHBand="0" w:noVBand="0" w:val="0020"/>
+        <w:jc w:val="start"/>
+        <w:tblBorders>
+          <w:top w:val="single" w:sz="4" w:space="0" w:color="808080"/>
+          <w:left w:val="single" w:sz="4" w:space="0" w:color="808080"/>
+          <w:bottom w:val="single" w:sz="4" w:space="0" w:color="808080"/>
+          <w:right w:val="single" w:sz="4" w:space="0" w:color="808080"/>
+          <w:insideH w:val="single" w:sz="4" w:space="0" w:color="808080"/>
+          <w:insideV w:val="single" w:sz="4" w:space="0" w:color="808080"/>
+        </w:tblBorders>
+      </w:tblPr>
+      <w:tblGrid>
+        <w:gridCol w:w="1980"/>
+        <w:gridCol w:w="1980"/>
+        <w:gridCol w:w="1980"/>
+        <w:gridCol w:w="1980"/>
+      </w:tblGrid>
+      <w:tr>
+        <w:trPr>
+          <w:tblHeader w:val="true"/>
+        </w:trPr>
+        <w:tc>
+          <w:tcPr/>
+          <w:p>
+            <w:pPr>
+              <w:pStyle w:val="Compact"/>
+            </w:pPr>
+          </w:p>
+        </w:tc>
+        <w:tc>
+          <w:tcPr/>
+          <w:p>
+            <w:pPr>
+              <w:pStyle w:val="Compact"/>
+              <w:jc w:val="left"/>
+            </w:pPr>
+            <w:r>
+              <w:t xml:space="preserve">Mean</w:t>
+            </w:r>
+          </w:p>
+        </w:tc>
+        <w:tc>
+          <w:tcPr/>
+          <w:p>
+            <w:pPr>
+              <w:pStyle w:val="Compact"/>
+              <w:jc w:val="left"/>
+            </w:pPr>
+            <w:r>
+              <w:t xml:space="preserve">Range</w:t>
+            </w:r>
+          </w:p>
+        </w:tc>
+        <w:tc>
+          <w:tcPr/>
+          <w:p>
+            <w:pPr>
+              <w:pStyle w:val="Compact"/>
+              <w:jc w:val="left"/>
+            </w:pPr>
+            <w:r>
+              <w:t xml:space="preserve">2023</w:t>
+            </w:r>
+          </w:p>
+        </w:tc>
+      </w:tr>
+      <w:tr>
+        <w:tc>
+          <w:tcPr/>
+          <w:p>
+            <w:pPr>
+              <w:pStyle w:val="Compact"/>
+              <w:jc w:val="left"/>
+            </w:pPr>
+            <w:r>
+              <w:t xml:space="preserve">Wind capacity factor</w:t>
+            </w:r>
+          </w:p>
+        </w:tc>
+        <w:tc>
+          <w:tcPr/>
+          <w:p>
+            <w:pPr>
+              <w:pStyle w:val="Compact"/>
+              <w:jc w:val="left"/>
+            </w:pPr>
+            <w:r>
+              <w:t xml:space="preserve">54.2 %</w:t>
+            </w:r>
+          </w:p>
+        </w:tc>
+        <w:tc>
+          <w:tcPr/>
+          <w:p>
+            <w:pPr>
+              <w:pStyle w:val="Compact"/>
+              <w:jc w:val="left"/>
+            </w:pPr>
+            <w:r>
+              <w:t xml:space="preserve">50.3–59.8 %</w:t>
+            </w:r>
+          </w:p>
+        </w:tc>
+        <w:tc>
+          <w:tcPr/>
+          <w:p>
+            <w:pPr>
+              <w:pStyle w:val="Compact"/>
+              <w:jc w:val="left"/>
+            </w:pPr>
+            <w:r>
+              <w:t xml:space="preserve">50.9 %</w:t>
+            </w:r>
+          </w:p>
+        </w:tc>
+      </w:tr>
+      <w:tr>
+        <w:tc>
+          <w:tcPr/>
+          <w:p>
+            <w:pPr>
+              <w:pStyle w:val="Compact"/>
+              <w:jc w:val="left"/>
+            </w:pPr>
+            <w:r>
+              <w:t xml:space="preserve">CO2 reduction, case 2 vs 1</w:t>
+            </w:r>
+          </w:p>
+        </w:tc>
+        <w:tc>
+          <w:tcPr/>
+          <w:p>
+            <w:pPr>
+              <w:pStyle w:val="Compact"/>
+              <w:jc w:val="left"/>
+            </w:pPr>
+            <w:r>
+              <w:t xml:space="preserve">51.8 %</w:t>
+            </w:r>
+          </w:p>
+        </w:tc>
+        <w:tc>
+          <w:tcPr/>
+          <w:p>
+            <w:pPr>
+              <w:pStyle w:val="Compact"/>
+              <w:jc w:val="left"/>
+            </w:pPr>
+            <w:r>
+              <w:t xml:space="preserve">48.5–55.6 %</w:t>
+            </w:r>
+          </w:p>
+        </w:tc>
+        <w:tc>
+          <w:tcPr/>
+          <w:p>
+            <w:pPr>
+              <w:pStyle w:val="Compact"/>
+              <w:jc w:val="left"/>
+            </w:pPr>
+            <w:r>
+              <w:t xml:space="preserve">49.4 %</w:t>
+            </w:r>
+          </w:p>
+        </w:tc>
+      </w:tr>
+      <w:tr>
+        <w:tc>
+          <w:tcPr/>
+          <w:p>
+            <w:pPr>
+              <w:pStyle w:val="Compact"/>
+              <w:jc w:val="left"/>
+            </w:pPr>
+            <w:r>
+              <w:t xml:space="preserve">CO2 reduction, case 3 vs 1</w:t>
+            </w:r>
+          </w:p>
+        </w:tc>
+        <w:tc>
+          <w:tcPr/>
+          <w:p>
+            <w:pPr>
+              <w:pStyle w:val="Compact"/>
+              <w:jc w:val="left"/>
+            </w:pPr>
+            <w:r>
+              <w:t xml:space="preserve">57.1 %</w:t>
+            </w:r>
+          </w:p>
+        </w:tc>
+        <w:tc>
+          <w:tcPr/>
+          <w:p>
+            <w:pPr>
+              <w:pStyle w:val="Compact"/>
+              <w:jc w:val="left"/>
+            </w:pPr>
+            <w:r>
+              <w:t xml:space="preserve">54.5–60.3 %</w:t>
+            </w:r>
+          </w:p>
+        </w:tc>
+        <w:tc>
+          <w:tcPr/>
+          <w:p>
+            <w:pPr>
+              <w:pStyle w:val="Compact"/>
+              <w:jc w:val="left"/>
+            </w:pPr>
+            <w:r>
+              <w:t xml:space="preserve">55.0 %</w:t>
+            </w:r>
+          </w:p>
+        </w:tc>
+      </w:tr>
+      <w:tr>
+        <w:tc>
+          <w:tcPr/>
+          <w:p>
+            <w:pPr>
+              <w:pStyle w:val="Compact"/>
+              <w:jc w:val="left"/>
+            </w:pPr>
+            <w:r>
+              <w:t xml:space="preserve">Flexibility benefit, case 2 − 3</w:t>
+            </w:r>
+          </w:p>
+        </w:tc>
+        <w:tc>
+          <w:tcPr/>
+          <w:p>
+            <w:pPr>
+              <w:pStyle w:val="Compact"/>
+              <w:jc w:val="left"/>
+            </w:pPr>
+            <w:r>
+              <w:t xml:space="preserve">6.8 kt (11.0 %)</w:t>
+            </w:r>
+          </w:p>
+        </w:tc>
+        <w:tc>
+          <w:tcPr/>
+          <w:p>
+            <w:pPr>
+              <w:pStyle w:val="Compact"/>
+              <w:jc w:val="left"/>
+            </w:pPr>
+            <w:r>
+              <w:t xml:space="preserve">5.9–7.7 kt (10.5–11.7 %)</w:t>
+            </w:r>
+          </w:p>
+        </w:tc>
+        <w:tc>
+          <w:tcPr/>
+          <w:p>
+            <w:pPr>
+              <w:pStyle w:val="Compact"/>
+              <w:jc w:val="left"/>
+            </w:pPr>
+            <w:r>
+              <w:t xml:space="preserve">7.2 kt (11.1 %)</w:t>
+            </w:r>
+          </w:p>
+        </w:tc>
+      </w:tr>
+      <w:tr>
+        <w:tc>
+          <w:tcPr/>
+          <w:p>
+            <w:pPr>
+              <w:pStyle w:val="Compact"/>
+              <w:jc w:val="left"/>
+            </w:pPr>
+            <w:r>
+              <w:t xml:space="preserve">Hours with two GTs, case 2 / case 3</w:t>
+            </w:r>
+          </w:p>
+        </w:tc>
+        <w:tc>
+          <w:tcPr/>
+          <w:p>
+            <w:pPr>
+              <w:pStyle w:val="Compact"/>
+            </w:pPr>
+          </w:p>
+        </w:tc>
+        <w:tc>
+          <w:tcPr/>
+          <w:p>
+            <w:pPr>
+              <w:pStyle w:val="Compact"/>
+              <w:jc w:val="left"/>
+            </w:pPr>
+            <w:r>
+              <w:t xml:space="preserve">1,082–1,889 / 4–66</w:t>
+            </w:r>
+          </w:p>
+        </w:tc>
+        <w:tc>
+          <w:tcPr/>
+          <w:p>
+            <w:pPr>
+              <w:pStyle w:val="Compact"/>
+              <w:jc w:val="left"/>
+            </w:pPr>
+            <w:r>
+              <w:t xml:space="preserve">1,702 / 28</w:t>
+            </w:r>
+          </w:p>
+        </w:tc>
+      </w:tr>
+      <w:tr>
+        <w:tc>
+          <w:tcPr/>
+          <w:p>
+            <w:pPr>
+              <w:pStyle w:val="Compact"/>
+              <w:jc w:val="left"/>
+            </w:pPr>
+            <w:r>
+              <w:t xml:space="preserve">Battery benefit, case 3 − 4</w:t>
+            </w:r>
+          </w:p>
+        </w:tc>
+        <w:tc>
+          <w:tcPr/>
+          <w:p>
+            <w:pPr>
+              <w:pStyle w:val="Compact"/>
+              <w:jc w:val="left"/>
+            </w:pPr>
+            <w:r>
+              <w:t xml:space="preserve">0.3 kt</w:t>
+            </w:r>
+          </w:p>
+        </w:tc>
+        <w:tc>
+          <w:tcPr/>
+          <w:p>
+            <w:pPr>
+              <w:pStyle w:val="Compact"/>
+              <w:jc w:val="left"/>
+            </w:pPr>
+            <w:r>
+              <w:t xml:space="preserve">0.25–0.42 kt</w:t>
+            </w:r>
+          </w:p>
+        </w:tc>
+        <w:tc>
+          <w:tcPr/>
+          <w:p>
+            <w:pPr>
+              <w:pStyle w:val="Compact"/>
+              <w:jc w:val="left"/>
+            </w:pPr>
+            <w:r>
+              <w:t xml:space="preserve">0.3 kt</w:t>
+            </w:r>
+          </w:p>
+        </w:tc>
+      </w:tr>
+      <w:tr>
+        <w:tc>
+          <w:tcPr/>
+          <w:p>
+            <w:pPr>
+              <w:pStyle w:val="Compact"/>
+              <w:jc w:val="left"/>
+            </w:pPr>
+            <w:r>
+              <w:t xml:space="preserve">Maximum injection deficit</w:t>
+            </w:r>
+          </w:p>
+        </w:tc>
+        <w:tc>
+          <w:tcPr/>
+          <w:p>
+            <w:pPr>
+              <w:pStyle w:val="Compact"/>
+            </w:pPr>
+          </w:p>
+        </w:tc>
+        <w:tc>
+          <w:tcPr/>
+          <w:p>
+            <w:pPr>
+              <w:pStyle w:val="Compact"/>
+              <w:jc w:val="left"/>
+            </w:pPr>
+            <w:r>
+              <w:t xml:space="preserve">25.8–59.3 h</w:t>
+            </w:r>
+          </w:p>
+        </w:tc>
+        <w:tc>
+          <w:tcPr/>
+          <w:p>
+            <w:pPr>
+              <w:pStyle w:val="Compact"/>
+              <w:jc w:val="left"/>
+            </w:pPr>
+            <w:r>
+              <w:t xml:space="preserve">27.5 h</w:t>
+            </w:r>
+          </w:p>
+        </w:tc>
+      </w:tr>
+    </w:tbl>
+    <w:p>
+      <w:pPr>
+        <w:pStyle w:val="BodyText"/>
+      </w:pPr>
+      <w:r>
+        <w:t xml:space="preserve">The weather year changes the benefit of wind more than the benefit of</w:t>
+      </w:r>
+      <w:r>
+        <w:t xml:space="preserve"> </w:t>
+      </w:r>
+      <w:r>
+        <w:t xml:space="preserve">flexibility (Table 6, Fig. 9). Over the ten years the capacity factor of the</w:t>
+      </w:r>
+      <w:r>
+        <w:t xml:space="preserve"> </w:t>
+      </w:r>
+      <w:r>
+        <w:t xml:space="preserve">wind farm ranges from 50.3 % to 59.8 %, and 2023 is one of the calmer years.</w:t>
+      </w:r>
+      <w:r>
+        <w:t xml:space="preserve"> </w:t>
+      </w:r>
+      <w:r>
+        <w:t xml:space="preserve">The reduction with fixed demand (case 2) ranges from 48.5 % to 55.6 %. The</w:t>
+      </w:r>
+      <w:r>
+        <w:t xml:space="preserve"> </w:t>
+      </w:r>
+      <w:r>
+        <w:t xml:space="preserve">additional saving from flexibility is remarkably stable at 10.5–11.7 % of</w:t>
+      </w:r>
+      <w:r>
+        <w:t xml:space="preserve"> </w:t>
+      </w:r>
+      <w:r>
+        <w:t xml:space="preserve">case 2 emissions, or 5.9–7.7 kt/yr, and averages 11.0 %, almost exactly the</w:t>
+      </w:r>
+      <w:r>
+        <w:t xml:space="preserve"> </w:t>
+      </w:r>
+      <w:r>
+        <w:t xml:space="preserve">2023 value. In absolute terms it is largest in the calm years 2016, 2021 and</w:t>
+      </w:r>
+      <w:r>
+        <w:t xml:space="preserve"> </w:t>
+      </w:r>
+      <w:r>
+        <w:t xml:space="preserve">2023, in which a second GT is needed most often with fixed demand, and</w:t>
+      </w:r>
+      <w:r>
+        <w:t xml:space="preserve"> </w:t>
+      </w:r>
+      <w:r>
+        <w:t xml:space="preserve">smallest in the windy year 2022. Flexibility removes 96–100 % of the hours</w:t>
+      </w:r>
+      <w:r>
+        <w:t xml:space="preserve"> </w:t>
+      </w:r>
+      <w:r>
+        <w:t xml:space="preserve">with two GTs online in every year, and no year loses production or leaves</w:t>
+      </w:r>
+      <w:r>
+        <w:t xml:space="preserve"> </w:t>
+      </w:r>
+      <w:r>
+        <w:t xml:space="preserve">demand unmet.</w:t>
+      </w:r>
+    </w:p>
+    <w:p>
+      <w:pPr>
+        <w:pStyle w:val="BodyText"/>
+      </w:pPr>
+      <w:r>
+        <w:t xml:space="preserve">The injection deficit varies more between years than the saving does. Its</w:t>
+      </w:r>
+      <w:r>
+        <w:t xml:space="preserve"> </w:t>
+      </w:r>
+      <w:r>
+        <w:t xml:space="preserve">maximum ranges from 26 to 59 h, below the 72 h limit in every year, and up</w:t>
+      </w:r>
+      <w:r>
+        <w:t xml:space="preserve"> </w:t>
+      </w:r>
+      <w:r>
+        <w:t xml:space="preserve">to 28 h remain to be caught up at the end of a year. In 2016 and 2017, the</w:t>
+      </w:r>
+      <w:r>
+        <w:t xml:space="preserve"> </w:t>
+      </w:r>
+      <w:r>
+        <w:t xml:space="preserve">years with the largest deficits, a limit of 24 h still captures 98 % of the</w:t>
+      </w:r>
+      <w:r>
+        <w:t xml:space="preserve"> </w:t>
+      </w:r>
+      <w:r>
+        <w:t xml:space="preserve">saving obtained with 72 h (58.4 against 58.3 kt in 2016, 52.7 against</w:t>
+      </w:r>
+      <w:r>
+        <w:t xml:space="preserve"> </w:t>
+      </w:r>
+      <w:r>
+        <w:t xml:space="preserve">52.6 kt in 2017). The conclusion that about one day of deferral is enough</w:t>
+      </w:r>
+      <w:r>
+        <w:t xml:space="preserve"> </w:t>
+      </w:r>
+      <w:r>
+        <w:t xml:space="preserve">therefore holds for all weather years tested.</w:t>
+      </w:r>
+    </w:p>
+    <w:p>
+      <w:pPr>
+        <w:pStyle w:val="CaptionedFigure"/>
+      </w:pPr>
+      <w:r>
+        <w:drawing>
+          <wp:inline>
+            <wp:extent cx="5334000" cy="2584515"/>
+            <wp:effectExtent b="0" l="0" r="0" t="0"/>
+            <wp:docPr descr="Fig. 9. Flexibility benefit (case 2 − case 3, bars) and wind capacity factor (line) for the weather years 2014–2023." title="" id="63" name="Picture"/>
+            <a:graphic>
+              <a:graphicData uri="http://schemas.openxmlformats.org/drawingml/2006/picture">
+                <pic:pic>
+                  <pic:nvPicPr>
+                    <pic:cNvPr descr="results/paper/fig11_multi_year.png" id="64" name="Picture"/>
+                    <pic:cNvPicPr>
+                      <a:picLocks noChangeArrowheads="1" noChangeAspect="1"/>
+                    </pic:cNvPicPr>
+                  </pic:nvPicPr>
+                  <pic:blipFill>
+                    <a:blip r:embed="rId62"/>
+                    <a:stretch>
+                      <a:fillRect/>
+                    </a:stretch>
+                  </pic:blipFill>
+                  <pic:spPr bwMode="auto">
+                    <a:xfrm>
+                      <a:off x="0" y="0"/>
+                      <a:ext cx="5334000" cy="2584515"/>
+                    </a:xfrm>
+                    <a:prstGeom prst="rect">
+                      <a:avLst/>
+                    </a:prstGeom>
+                    <a:noFill/>
+                    <a:ln w="9525">
+                      <a:noFill/>
+                      <a:headEnd/>
+                      <a:tailEnd/>
+                    </a:ln>
+                  </pic:spPr>
+                </pic:pic>
+              </a:graphicData>
+            </a:graphic>
+          </wp:inline>
+        </w:drawing>
+      </w:r>
+    </w:p>
+    <w:p>
+      <w:pPr>
+        <w:pStyle w:val="ImageCaption"/>
+      </w:pPr>
+      <w:r>
+        <w:rPr>
+          <w:bCs/>
+          <w:b/>
+        </w:rPr>
+        <w:t xml:space="preserve">Fig. 9.</w:t>
+      </w:r>
+      <w:r>
+        <w:t xml:space="preserve"> </w:t>
+      </w:r>
+      <w:r>
+        <w:t xml:space="preserve">Flexibility benefit (case 2 − case 3, bars) and wind capacity factor (line) for the weather years 2014–2023.</w:t>
+      </w:r>
+    </w:p>
+    <w:bookmarkEnd w:id="65"/>
+    <w:bookmarkEnd w:id="66"/>
+    <w:bookmarkStart w:id="72" w:name="discussion"/>
     <w:p>
       <w:pPr>
         <w:pStyle w:val="Heading2"/>
@@ -12564,7 +13208,7 @@
         <w:t xml:space="preserve">4 Discussion</w:t>
       </w:r>
     </w:p>
-    <w:bookmarkStart w:id="63" w:name="why-load-flexibility-works"/>
+    <w:bookmarkStart w:id="67" w:name="why-load-flexibility-works"/>
     <w:p>
       <w:pPr>
         <w:pStyle w:val="Heading3"/>
@@ -12791,8 +13435,8 @@
         <w:t xml:space="preserve">overhaul, where the number of starts of the small unit must be acceptable.</w:t>
       </w:r>
     </w:p>
-    <w:bookmarkEnd w:id="63"/>
-    <w:bookmarkStart w:id="64" w:name="comparison-with-earlier-studies"/>
+    <w:bookmarkEnd w:id="67"/>
+    <w:bookmarkStart w:id="68" w:name="comparison-with-earlier-studies"/>
     <w:p>
       <w:pPr>
         <w:pStyle w:val="Heading3"/>
@@ -12975,8 +13619,8 @@
         <w:t xml:space="preserve">a model of energy shifting alone, is needed to estimate it.</w:t>
       </w:r>
     </w:p>
-    <w:bookmarkEnd w:id="64"/>
-    <w:bookmarkStart w:id="65" w:name="practical-implementation"/>
+    <w:bookmarkEnd w:id="68"/>
+    <w:bookmarkStart w:id="69" w:name="practical-implementation"/>
     <w:p>
       <w:pPr>
         <w:pStyle w:val="Heading3"/>
@@ -13195,8 +13839,8 @@
         <w:t xml:space="preserve">volume, is available.</w:t>
       </w:r>
     </w:p>
-    <w:bookmarkEnd w:id="65"/>
-    <w:bookmarkStart w:id="66" w:name="robustness-of-the-conclusions"/>
+    <w:bookmarkEnd w:id="69"/>
+    <w:bookmarkStart w:id="70" w:name="robustness-of-the-conclusions"/>
     <w:p>
       <w:pPr>
         <w:pStyle w:val="Heading3"/>
@@ -13367,8 +14011,8 @@
         <w:t xml:space="preserve">it.</w:t>
       </w:r>
     </w:p>
-    <w:bookmarkEnd w:id="66"/>
-    <w:bookmarkStart w:id="67" w:name="limitations-and-future-work"/>
+    <w:bookmarkEnd w:id="70"/>
+    <w:bookmarkStart w:id="71" w:name="limitations-and-future-work"/>
     <w:p>
       <w:pPr>
         <w:pStyle w:val="Heading3"/>
@@ -13442,13 +14086,13 @@
         <w:t xml:space="preserve"> </w:t>
       </w:r>
       <w:r>
-        <w:t xml:space="preserve">analysis covers one weather year and a single platform without power import</w:t>
-      </w:r>
-      <w:r>
-        <w:t xml:space="preserve"> </w:t>
-      </w:r>
-      <w:r>
-        <w:t xml:space="preserve">or export. The economic indicators rest on the cost of one first-of-a-kind</w:t>
+        <w:t xml:space="preserve">analysis covers ten weather years at one site and a single platform without</w:t>
+      </w:r>
+      <w:r>
+        <w:t xml:space="preserve"> </w:t>
+      </w:r>
+      <w:r>
+        <w:t xml:space="preserve">power import or export. The economic indicators rest on the cost of one first-of-a-kind</w:t>
       </w:r>
       <w:r>
         <w:t xml:space="preserve"> </w:t>
@@ -13486,13 +14130,13 @@
         <w:pStyle w:val="BodyText"/>
       </w:pPr>
       <w:r>
-        <w:t xml:space="preserve">Future work should test the approach with wind forecast errors and several</w:t>
-      </w:r>
-      <w:r>
-        <w:t xml:space="preserve"> </w:t>
-      </w:r>
-      <w:r>
-        <w:t xml:space="preserve">weather years, add pump start costs and a reservoir model for the injection</w:t>
+        <w:t xml:space="preserve">Future work should test the approach with wind forecast errors, add pump</w:t>
+      </w:r>
+      <w:r>
+        <w:t xml:space="preserve"> </w:t>
+      </w:r>
+      <w:r>
+        <w:t xml:space="preserve">start costs and a reservoir model for the injection</w:t>
       </w:r>
       <w:r>
         <w:t xml:space="preserve"> </w:t>
@@ -13519,9 +14163,9 @@
         <w:t xml:space="preserve">shore becomes necessary.</w:t>
       </w:r>
     </w:p>
-    <w:bookmarkEnd w:id="67"/>
-    <w:bookmarkEnd w:id="68"/>
-    <w:bookmarkStart w:id="69" w:name="conclusions"/>
+    <w:bookmarkEnd w:id="71"/>
+    <w:bookmarkEnd w:id="72"/>
+    <w:bookmarkStart w:id="73" w:name="conclusions"/>
     <w:p>
       <w:pPr>
         <w:pStyle w:val="Heading2"/>
@@ -13589,7 +14233,13 @@
         <w:t xml:space="preserve"> </w:t>
       </w:r>
       <w:r>
-        <w:t xml:space="preserve">(7.2 kt/yr) without lost production. GT low-load hours fall by 34 % and</w:t>
+        <w:t xml:space="preserve">(7.2 kt/yr) without lost production, and by 10.5–11.7 % in each of ten</w:t>
+      </w:r>
+      <w:r>
+        <w:t xml:space="preserve"> </w:t>
+      </w:r>
+      <w:r>
+        <w:t xml:space="preserve">weather years. GT low-load hours fall by 34 % and</w:t>
       </w:r>
       <w:r>
         <w:t xml:space="preserve"> </w:t>
@@ -13744,8 +14394,8 @@
         <w:t xml:space="preserve">and which complements storage and grid-forming technologies.</w:t>
       </w:r>
     </w:p>
-    <w:bookmarkEnd w:id="69"/>
-    <w:bookmarkStart w:id="70" w:name="declarations"/>
+    <w:bookmarkEnd w:id="73"/>
+    <w:bookmarkStart w:id="74" w:name="declarations"/>
     <w:p>
       <w:pPr>
         <w:pStyle w:val="Heading2"/>
@@ -13918,8 +14568,8 @@
         <w:t xml:space="preserve">Service information (2023). [Funding.]</w:t>
       </w:r>
     </w:p>
-    <w:bookmarkEnd w:id="70"/>
-    <w:bookmarkStart w:id="71" w:name="references"/>
+    <w:bookmarkEnd w:id="74"/>
+    <w:bookmarkStart w:id="75" w:name="references"/>
     <w:p>
       <w:pPr>
         <w:pStyle w:val="Heading2"/>
@@ -14208,8 +14858,8 @@
         <w:t xml:space="preserve">[35] Norwegian Offshore Directorate. New report about power from shore [news and report]. 2025. https://www.sodir.no/en/whats-new/news/general-news/2025/new-report-about-power-from-shore [accessed DATE].</w:t>
       </w:r>
     </w:p>
-    <w:bookmarkEnd w:id="71"/>
-    <w:bookmarkEnd w:id="72"/>
+    <w:bookmarkEnd w:id="75"/>
+    <w:bookmarkEnd w:id="76"/>
     <w:sectPr/>
   </w:body>
 </w:document>

</xml_diff>

<commit_message>
Paper: consistency pass against results, ERA5 acknowledgement, cover letter
- Fixed: ERA5 years (2.2, acknowledgement), contribution 4, parameter count
  (31 of 109), base-year wording for sensitivities, Table 6 battery values,
  two-GT emission increase (40 % / 53 %), conclusions intro (ten weather years)
- All other numbers checked against cases, sensitivity, validation, economics
  and multi-year result files
- cover_letter.md (+ .docx via build.py) with suggested reviewers to confirm
</commit_message>
<xml_diff>
--- a/docs/paper/paper.docx
+++ b/docs/paper/paper.docx
@@ -2550,13 +2550,19 @@
         <w:t xml:space="preserve"> </w:t>
       </w:r>
       <w:r>
-        <w:t xml:space="preserve">a battery, with sensitivity analysis on the assumptions that drive the</w:t>
-      </w:r>
-      <w:r>
-        <w:t xml:space="preserve"> </w:t>
-      </w:r>
-      <w:r>
-        <w:t xml:space="preserve">result, and validation against Hywind Tampen and reported field data.</w:t>
+        <w:t xml:space="preserve">a battery, over ten weather years, with sensitivity analysis on the</w:t>
+      </w:r>
+      <w:r>
+        <w:t xml:space="preserve"> </w:t>
+      </w:r>
+      <w:r>
+        <w:t xml:space="preserve">assumptions that drive the result, validation against Hywind Tampen and</w:t>
+      </w:r>
+      <w:r>
+        <w:t xml:space="preserve"> </w:t>
+      </w:r>
+      <w:r>
+        <w:t xml:space="preserve">reported field data, and economic indicators.</w:t>
       </w:r>
     </w:p>
     <w:p>
@@ -2892,7 +2898,7 @@
         <w:t xml:space="preserve"> </w:t>
       </w:r>
       <w:r>
-        <w:t xml:space="preserve">configuration file with its unit and source; 29 of 101 parameters are marked</w:t>
+        <w:t xml:space="preserve">configuration file with its unit and source; 31 of 109 parameters are marked</w:t>
       </w:r>
       <w:r>
         <w:t xml:space="preserve"> </w:t>
@@ -3045,7 +3051,7 @@
         <w:t xml:space="preserve"> </w:t>
       </w:r>
       <w:r>
-        <w:t xml:space="preserve">2023 were taken from the ERA5 reanalysis [20] at the grid point</w:t>
+        <w:t xml:space="preserve">2014–2023 were taken from the ERA5 reanalysis [20] at the grid point</w:t>
       </w:r>
       <w:r>
         <w:t xml:space="preserve"> </w:t>
@@ -7757,7 +7763,13 @@
         <w:pStyle w:val="BodyText"/>
       </w:pPr>
       <w:r>
-        <w:t xml:space="preserve">Cases 2–4 were rerun with one input changed at a time:</w:t>
+        <w:t xml:space="preserve">For the base year 2023, cases 2–4 were rerun with one input changed at a</w:t>
+      </w:r>
+      <w:r>
+        <w:t xml:space="preserve"> </w:t>
+      </w:r>
+      <w:r>
+        <w:t xml:space="preserve">time:</w:t>
       </w:r>
     </w:p>
     <w:p>
@@ -12944,7 +12956,7 @@
               <w:jc w:val="left"/>
             </w:pPr>
             <w:r>
-              <w:t xml:space="preserve">0.3 kt</w:t>
+              <w:t xml:space="preserve">0.35 kt</w:t>
             </w:r>
           </w:p>
         </w:tc>
@@ -12968,7 +12980,7 @@
               <w:jc w:val="left"/>
             </w:pPr>
             <w:r>
-              <w:t xml:space="preserve">0.3 kt</w:t>
+              <w:t xml:space="preserve">0.32 kt</w:t>
             </w:r>
           </w:p>
         </w:tc>
@@ -13264,7 +13276,7 @@
         <w:t xml:space="preserve"> </w:t>
       </w:r>
       <w:r>
-        <w:t xml:space="preserve">capacity of about one day captures it all, because these hours occur in</w:t>
+        <w:t xml:space="preserve">capacity of about one day captures almost all of it, because these hours occur in</w:t>
       </w:r>
       <w:r>
         <w:t xml:space="preserve"> </w:t>
@@ -13750,7 +13762,13 @@
         <w:t xml:space="preserve"> </w:t>
       </w:r>
       <w:r>
-        <w:t xml:space="preserve">increase emissions by 40–50 % compared with the optimised schedules, and</w:t>
+        <w:t xml:space="preserve">increase emissions by 40 % with fixed demand and by 53 % with flexible</w:t>
+      </w:r>
+      <w:r>
+        <w:t xml:space="preserve"> </w:t>
+      </w:r>
+      <w:r>
+        <w:t xml:space="preserve">demand compared with the optimised schedules, and</w:t>
       </w:r>
       <w:r>
         <w:t xml:space="preserve"> </w:t>
@@ -14191,13 +14209,13 @@
         <w:t xml:space="preserve"> </w:t>
       </w:r>
       <w:r>
-        <w:t xml:space="preserve">them together with the gas turbines and a wind farm for one year at hourly</w:t>
-      </w:r>
-      <w:r>
-        <w:t xml:space="preserve"> </w:t>
-      </w:r>
-      <w:r>
-        <w:t xml:space="preserve">resolution. The main conclusions are:</w:t>
+        <w:t xml:space="preserve">them together with the gas turbines and a wind farm at hourly resolution</w:t>
+      </w:r>
+      <w:r>
+        <w:t xml:space="preserve"> </w:t>
+      </w:r>
+      <w:r>
+        <w:t xml:space="preserve">for ten weather years. The main conclusions are:</w:t>
       </w:r>
     </w:p>
     <w:p>
@@ -14565,7 +14583,7 @@
         <w:t xml:space="preserve"> </w:t>
       </w:r>
       <w:r>
-        <w:t xml:space="preserve">Service information (2023). [Funding.]</w:t>
+        <w:t xml:space="preserve">Service information (2014–2023). [Funding.]</w:t>
       </w:r>
     </w:p>
     <w:bookmarkEnd w:id="74"/>

</xml_diff>

<commit_message>
Paper prose revision (part 1): introduction and Section 3.4
- Introduction rewritten with varied sentences; citation claims narrowed to what
  the sources support (He et al. 2010 'assessed the potential', Marvik et al.
  2013 'studied transient stability', industrial DR reviews)
- Section 3.4: bold-lead paragraph template replaced by plain prose, numbers unchanged
</commit_message>
<xml_diff>
--- a/docs/paper/paper.docx
+++ b/docs/paper/paper.docx
@@ -1980,79 +1980,73 @@
         <w:pStyle w:val="FirstParagraph"/>
       </w:pPr>
       <w:r>
-        <w:t xml:space="preserve">The petroleum industry accounts for about a quarter of Norway’s greenhouse</w:t>
-      </w:r>
-      <w:r>
-        <w:t xml:space="preserve"> </w:t>
-      </w:r>
-      <w:r>
-        <w:t xml:space="preserve">gas emissions [1], and most of these emissions come from</w:t>
-      </w:r>
-      <w:r>
-        <w:t xml:space="preserve"> </w:t>
-      </w:r>
-      <w:r>
-        <w:t xml:space="preserve">gas turbines (GTs) that generate power and drive compressors on the offshore</w:t>
-      </w:r>
-      <w:r>
-        <w:t xml:space="preserve"> </w:t>
-      </w:r>
-      <w:r>
-        <w:t xml:space="preserve">installations [2]. Power from shore removes them</w:t>
-      </w:r>
-      <w:r>
-        <w:t xml:space="preserve"> </w:t>
-      </w:r>
-      <w:r>
-        <w:t xml:space="preserve">where a grid connection is feasible. A Norwegian government study found that</w:t>
-      </w:r>
-      <w:r>
-        <w:t xml:space="preserve"> </w:t>
-      </w:r>
-      <w:r>
-        <w:t xml:space="preserve">the electrification projects then planned would cut emissions at less than</w:t>
-      </w:r>
-      <w:r>
-        <w:t xml:space="preserve"> </w:t>
-      </w:r>
-      <w:r>
-        <w:t xml:space="preserve">NOK 1,500 per tonne of CO2 [3], and the CO2 cost faced by operators</w:t>
-      </w:r>
-      <w:r>
-        <w:t xml:space="preserve"> </w:t>
-      </w:r>
-      <w:r>
-        <w:t xml:space="preserve">has since risen from about NOK 860 per tonne in 2020 to NOK 1,860 in 2025</w:t>
-      </w:r>
-      <w:r>
-        <w:t xml:space="preserve"> </w:t>
-      </w:r>
-      <w:r>
-        <w:t xml:space="preserve">[4]. Many installations, however, are far from shore, too small to</w:t>
-      </w:r>
-      <w:r>
-        <w:t xml:space="preserve"> </w:t>
-      </w:r>
-      <w:r>
-        <w:t xml:space="preserve">justify a cable, or connected to a grid whose capacity is needed onshore.</w:t>
-      </w:r>
-      <w:r>
-        <w:t xml:space="preserve"> </w:t>
-      </w:r>
-      <w:r>
-        <w:t xml:space="preserve">The operators’ own assessments found the alternatives to power from shore</w:t>
-      </w:r>
-      <w:r>
-        <w:t xml:space="preserve"> </w:t>
-      </w:r>
-      <w:r>
-        <w:t xml:space="preserve">more costly or less effective [4], which is why improving the</w:t>
-      </w:r>
-      <w:r>
-        <w:t xml:space="preserve"> </w:t>
-      </w:r>
-      <w:r>
-        <w:t xml:space="preserve">efficiency of the remaining offshore power plants matters.</w:t>
+        <w:t xml:space="preserve">Petroleum activities account for about a quarter of Norway’s greenhouse gas</w:t>
+      </w:r>
+      <w:r>
+        <w:t xml:space="preserve"> </w:t>
+      </w:r>
+      <w:r>
+        <w:t xml:space="preserve">emissions [1]. Most of these emissions come from gas</w:t>
+      </w:r>
+      <w:r>
+        <w:t xml:space="preserve"> </w:t>
+      </w:r>
+      <w:r>
+        <w:t xml:space="preserve">turbines (GTs) that generate power and drive compressors offshore</w:t>
+      </w:r>
+      <w:r>
+        <w:t xml:space="preserve"> </w:t>
+      </w:r>
+      <w:r>
+        <w:t xml:space="preserve">[2]. Power from shore removes them where a cable is</w:t>
+      </w:r>
+      <w:r>
+        <w:t xml:space="preserve"> </w:t>
+      </w:r>
+      <w:r>
+        <w:t xml:space="preserve">feasible; the electrification projects planned in 2020 had abatement costs</w:t>
+      </w:r>
+      <w:r>
+        <w:t xml:space="preserve"> </w:t>
+      </w:r>
+      <w:r>
+        <w:t xml:space="preserve">below NOK 1,500 per tonne of CO2 [3], and the CO2 cost paid by</w:t>
+      </w:r>
+      <w:r>
+        <w:t xml:space="preserve"> </w:t>
+      </w:r>
+      <w:r>
+        <w:t xml:space="preserve">operators has since risen from about NOK 860 to NOK 1,860 per tonne</w:t>
+      </w:r>
+      <w:r>
+        <w:t xml:space="preserve"> </w:t>
+      </w:r>
+      <w:r>
+        <w:t xml:space="preserve">[4]. Many installations are too far from shore or too small for a</w:t>
+      </w:r>
+      <w:r>
+        <w:t xml:space="preserve"> </w:t>
+      </w:r>
+      <w:r>
+        <w:t xml:space="preserve">cable, however, or depend on onshore grid capacity that is needed elsewhere.</w:t>
+      </w:r>
+      <w:r>
+        <w:t xml:space="preserve"> </w:t>
+      </w:r>
+      <w:r>
+        <w:t xml:space="preserve">Operators have judged the alternatives to power from shore to be more costly</w:t>
+      </w:r>
+      <w:r>
+        <w:t xml:space="preserve"> </w:t>
+      </w:r>
+      <w:r>
+        <w:t xml:space="preserve">or less effective [4]. For those installations, the efficiency of</w:t>
+      </w:r>
+      <w:r>
+        <w:t xml:space="preserve"> </w:t>
+      </w:r>
+      <w:r>
+        <w:t xml:space="preserve">the offshore power plant still decides the emissions.</w:t>
       </w:r>
     </w:p>
     <w:p>
@@ -2060,73 +2054,61 @@
         <w:pStyle w:val="BodyText"/>
       </w:pPr>
       <w:r>
-        <w:t xml:space="preserve">Offshore wind connected directly to a platform’s power system is the most</w:t>
-      </w:r>
-      <w:r>
-        <w:t xml:space="preserve"> </w:t>
-      </w:r>
-      <w:r>
-        <w:t xml:space="preserve">studied alternative. He et al. [5] showed more than a decade ago that</w:t>
-      </w:r>
-      <w:r>
-        <w:t xml:space="preserve"> </w:t>
-      </w:r>
-      <w:r>
-        <w:t xml:space="preserve">wind could supply part of the demand of North Sea platforms and reduce</w:t>
-      </w:r>
-      <w:r>
-        <w:t xml:space="preserve"> </w:t>
-      </w:r>
-      <w:r>
-        <w:t xml:space="preserve">their emissions, and Marvik et al. [6] found that a cluster of</w:t>
-      </w:r>
-      <w:r>
-        <w:t xml:space="preserve"> </w:t>
-      </w:r>
-      <w:r>
-        <w:t xml:space="preserve">platforms with an integrated wind farm can be operated with acceptable</w:t>
-      </w:r>
-      <w:r>
-        <w:t xml:space="preserve"> </w:t>
-      </w:r>
-      <w:r>
-        <w:t xml:space="preserve">transient stability. Riboldi and Nord [7] optimised the design of</w:t>
-      </w:r>
-      <w:r>
-        <w:t xml:space="preserve"> </w:t>
-      </w:r>
-      <w:r>
-        <w:t xml:space="preserve">an offshore combined-cycle plant with a wind farm and concluded that the</w:t>
-      </w:r>
-      <w:r>
-        <w:t xml:space="preserve"> </w:t>
-      </w:r>
-      <w:r>
-        <w:t xml:space="preserve">economic case depends on favourable gas and CO2 prices. The concept has now</w:t>
-      </w:r>
-      <w:r>
-        <w:t xml:space="preserve"> </w:t>
-      </w:r>
-      <w:r>
-        <w:t xml:space="preserve">been realised: Hywind Tampen, an 88 MW floating wind farm supplying five</w:t>
-      </w:r>
-      <w:r>
-        <w:t xml:space="preserve"> </w:t>
-      </w:r>
-      <w:r>
-        <w:t xml:space="preserve">platforms in the Norwegian North Sea, has operated since 2023 and is</w:t>
-      </w:r>
-      <w:r>
-        <w:t xml:space="preserve"> </w:t>
-      </w:r>
-      <w:r>
-        <w:t xml:space="preserve">expected to cover about 35 % of their electricity demand and avoid about</w:t>
-      </w:r>
-      <w:r>
-        <w:t xml:space="preserve"> </w:t>
-      </w:r>
-      <w:r>
-        <w:t xml:space="preserve">200 kt of CO2 per year [8].</w:t>
+        <w:t xml:space="preserve">Wind power connected directly to the platform grid has been studied for more</w:t>
+      </w:r>
+      <w:r>
+        <w:t xml:space="preserve"> </w:t>
+      </w:r>
+      <w:r>
+        <w:t xml:space="preserve">than a decade. He et al. [5] assessed the potential of integrating wind</w:t>
+      </w:r>
+      <w:r>
+        <w:t xml:space="preserve"> </w:t>
+      </w:r>
+      <w:r>
+        <w:t xml:space="preserve">power with offshore oil and gas platforms, and Marvik et al. [6]</w:t>
+      </w:r>
+      <w:r>
+        <w:t xml:space="preserve"> </w:t>
+      </w:r>
+      <w:r>
+        <w:t xml:space="preserve">studied the transient stability of a cluster of North Sea installations with</w:t>
+      </w:r>
+      <w:r>
+        <w:t xml:space="preserve"> </w:t>
+      </w:r>
+      <w:r>
+        <w:t xml:space="preserve">an integrated wind farm. Riboldi and Nord [7] optimised an</w:t>
+      </w:r>
+      <w:r>
+        <w:t xml:space="preserve"> </w:t>
+      </w:r>
+      <w:r>
+        <w:t xml:space="preserve">offshore combined-cycle plant with a wind farm and found that its economics</w:t>
+      </w:r>
+      <w:r>
+        <w:t xml:space="preserve"> </w:t>
+      </w:r>
+      <w:r>
+        <w:t xml:space="preserve">depend on gas and CO2 prices. Hywind Tampen, an 88 MW floating wind farm that</w:t>
+      </w:r>
+      <w:r>
+        <w:t xml:space="preserve"> </w:t>
+      </w:r>
+      <w:r>
+        <w:t xml:space="preserve">supplies five platforms, has operated since 2023; it is expected to cover</w:t>
+      </w:r>
+      <w:r>
+        <w:t xml:space="preserve"> </w:t>
+      </w:r>
+      <w:r>
+        <w:t xml:space="preserve">about 35 % of their electricity demand and to avoid about 200 kt of CO2 per</w:t>
+      </w:r>
+      <w:r>
+        <w:t xml:space="preserve"> </w:t>
+      </w:r>
+      <w:r>
+        <w:t xml:space="preserve">year [8].</w:t>
       </w:r>
     </w:p>
     <w:p>
@@ -2134,79 +2116,55 @@
         <w:pStyle w:val="BodyText"/>
       </w:pPr>
       <w:r>
-        <w:t xml:space="preserve">On an off-grid platform, wind power saves less fuel than its energy</w:t>
-      </w:r>
-      <w:r>
-        <w:t xml:space="preserve"> </w:t>
-      </w:r>
-      <w:r>
-        <w:t xml:space="preserve">suggests. The wind turbines are usually grid-following, so at least one GT</w:t>
-      </w:r>
-      <w:r>
-        <w:t xml:space="preserve"> </w:t>
-      </w:r>
-      <w:r>
-        <w:t xml:space="preserve">must stay online for frequency and voltage control, and enough GT capacity</w:t>
-      </w:r>
-      <w:r>
-        <w:t xml:space="preserve"> </w:t>
-      </w:r>
-      <w:r>
-        <w:t xml:space="preserve">must run to cover a sudden loss of wind or of a generator. When wind</w:t>
-      </w:r>
-      <w:r>
-        <w:t xml:space="preserve"> </w:t>
-      </w:r>
-      <w:r>
-        <w:t xml:space="preserve">supplies part of the demand, the GTs therefore run at low load, where their</w:t>
-      </w:r>
-      <w:r>
-        <w:t xml:space="preserve"> </w:t>
-      </w:r>
-      <w:r>
-        <w:t xml:space="preserve">efficiency falls steeply: the reference turbine of the LEOGO platform drops</w:t>
-      </w:r>
-      <w:r>
-        <w:t xml:space="preserve"> </w:t>
-      </w:r>
-      <w:r>
-        <w:t xml:space="preserve">from about 35 % electric efficiency at full load to below 20 % near minimum</w:t>
-      </w:r>
-      <w:r>
-        <w:t xml:space="preserve"> </w:t>
-      </w:r>
-      <w:r>
-        <w:t xml:space="preserve">stable load [9]. Exergy analyses of North Sea platforms have</w:t>
-      </w:r>
-      <w:r>
-        <w:t xml:space="preserve"> </w:t>
-      </w:r>
-      <w:r>
-        <w:t xml:space="preserve">found that the gas turbines account for 62–65 % of the exergy destroyed on a</w:t>
-      </w:r>
-      <w:r>
-        <w:t xml:space="preserve"> </w:t>
-      </w:r>
-      <w:r>
-        <w:t xml:space="preserve">platform, more than the whole processing plant [10]. The fuel saved</w:t>
-      </w:r>
-      <w:r>
-        <w:t xml:space="preserve"> </w:t>
-      </w:r>
-      <w:r>
-        <w:t xml:space="preserve">per MWh of wind is thus limited by how the remaining GT capacity must be</w:t>
-      </w:r>
-      <w:r>
-        <w:t xml:space="preserve"> </w:t>
-      </w:r>
-      <w:r>
-        <w:t xml:space="preserve">operated, and a large part of the wind energy is curtailed when it exceeds</w:t>
-      </w:r>
-      <w:r>
-        <w:t xml:space="preserve"> </w:t>
-      </w:r>
-      <w:r>
-        <w:t xml:space="preserve">what the platform can absorb.</w:t>
+        <w:t xml:space="preserve">The fuel saved per MWh of wind is smaller on such a platform than on a large</w:t>
+      </w:r>
+      <w:r>
+        <w:t xml:space="preserve"> </w:t>
+      </w:r>
+      <w:r>
+        <w:t xml:space="preserve">grid. The wind turbines follow the grid frequency rather than set it, so at</w:t>
+      </w:r>
+      <w:r>
+        <w:t xml:space="preserve"> </w:t>
+      </w:r>
+      <w:r>
+        <w:t xml:space="preserve">least one GT must stay online, and the running GTs must hold enough spare</w:t>
+      </w:r>
+      <w:r>
+        <w:t xml:space="preserve"> </w:t>
+      </w:r>
+      <w:r>
+        <w:t xml:space="preserve">capacity to cover the loss of wind or of a generator. When wind supplies part</w:t>
+      </w:r>
+      <w:r>
+        <w:t xml:space="preserve"> </w:t>
+      </w:r>
+      <w:r>
+        <w:t xml:space="preserve">of the demand, the GTs run at part load. That is where they are least</w:t>
+      </w:r>
+      <w:r>
+        <w:t xml:space="preserve"> </w:t>
+      </w:r>
+      <w:r>
+        <w:t xml:space="preserve">efficient: the LEOGO reference turbine falls from about 35 % electric</w:t>
+      </w:r>
+      <w:r>
+        <w:t xml:space="preserve"> </w:t>
+      </w:r>
+      <w:r>
+        <w:t xml:space="preserve">efficiency at full load to below 20 % near its minimum stable load</w:t>
+      </w:r>
+      <w:r>
+        <w:t xml:space="preserve"> </w:t>
+      </w:r>
+      <w:r>
+        <w:t xml:space="preserve">[9]. Exergy analyses of North Sea platforms attribute 62–65 % of</w:t>
+      </w:r>
+      <w:r>
+        <w:t xml:space="preserve"> </w:t>
+      </w:r>
+      <w:r>
+        <w:t xml:space="preserve">the exergy destroyed on a platform to the gas turbines [10].</w:t>
       </w:r>
     </w:p>
     <w:p>
@@ -2214,79 +2172,61 @@
         <w:pStyle w:val="BodyText"/>
       </w:pPr>
       <w:r>
-        <w:t xml:space="preserve">Operational optimisation can recover part of this loss. The open-source</w:t>
-      </w:r>
-      <w:r>
-        <w:t xml:space="preserve"> </w:t>
-      </w:r>
-      <w:r>
-        <w:t xml:space="preserve">tool Oogeso optimises GT commitment, wind use and storage on platforms, and</w:t>
-      </w:r>
-      <w:r>
-        <w:t xml:space="preserve"> </w:t>
-      </w:r>
-      <w:r>
-        <w:t xml:space="preserve">shows that a battery that provides reserve lets one turbine be switched off</w:t>
-      </w:r>
-      <w:r>
-        <w:t xml:space="preserve"> </w:t>
-      </w:r>
-      <w:r>
-        <w:t xml:space="preserve">and the remaining turbines run more efficiently [11]. The Low</w:t>
-      </w:r>
-      <w:r>
-        <w:t xml:space="preserve"> </w:t>
-      </w:r>
-      <w:r>
-        <w:t xml:space="preserve">Emission Oil and Gas Open (LEOGO) reference platform provides a common data</w:t>
-      </w:r>
-      <w:r>
-        <w:t xml:space="preserve"> </w:t>
-      </w:r>
-      <w:r>
-        <w:t xml:space="preserve">set for such studies [9]. Planning models for offshore energy</w:t>
-      </w:r>
-      <w:r>
-        <w:t xml:space="preserve"> </w:t>
-      </w:r>
-      <w:r>
-        <w:t xml:space="preserve">hubs choose investments in wind, storage and cables to meet emission targets</w:t>
-      </w:r>
-      <w:r>
-        <w:t xml:space="preserve"> </w:t>
-      </w:r>
-      <w:r>
-        <w:t xml:space="preserve">[12], and power-system studies have examined how relaxing GT</w:t>
-      </w:r>
-      <w:r>
-        <w:t xml:space="preserve"> </w:t>
-      </w:r>
-      <w:r>
-        <w:t xml:space="preserve">operating constraints lets the platform absorb more wind [13]. In</w:t>
-      </w:r>
-      <w:r>
-        <w:t xml:space="preserve"> </w:t>
-      </w:r>
-      <w:r>
-        <w:t xml:space="preserve">these studies, however, the platform load is a given time series or a fixed</w:t>
-      </w:r>
-      <w:r>
-        <w:t xml:space="preserve"> </w:t>
-      </w:r>
-      <w:r>
-        <w:t xml:space="preserve">demand. Svendsen [11] identifies demand-side flexibility as</w:t>
-      </w:r>
-      <w:r>
-        <w:t xml:space="preserve"> </w:t>
-      </w:r>
-      <w:r>
-        <w:t xml:space="preserve">important for reducing the need for costly storage, and leaves its</w:t>
-      </w:r>
-      <w:r>
-        <w:t xml:space="preserve"> </w:t>
-      </w:r>
-      <w:r>
-        <w:t xml:space="preserve">representation in operational optimisation to future work.</w:t>
+        <w:t xml:space="preserve">Operational optimisation recovers part of this loss. The open-source tool</w:t>
+      </w:r>
+      <w:r>
+        <w:t xml:space="preserve"> </w:t>
+      </w:r>
+      <w:r>
+        <w:t xml:space="preserve">Oogeso optimises GT commitment, wind use and storage; with a battery</w:t>
+      </w:r>
+      <w:r>
+        <w:t xml:space="preserve"> </w:t>
+      </w:r>
+      <w:r>
+        <w:t xml:space="preserve">providing reserve, one turbine can be switched off and the others run at</w:t>
+      </w:r>
+      <w:r>
+        <w:t xml:space="preserve"> </w:t>
+      </w:r>
+      <w:r>
+        <w:t xml:space="preserve">higher load [11]. The LEOGO reference platform gives a common data</w:t>
+      </w:r>
+      <w:r>
+        <w:t xml:space="preserve"> </w:t>
+      </w:r>
+      <w:r>
+        <w:t xml:space="preserve">set for such studies [9]. Zhang et al. [12] plan</w:t>
+      </w:r>
+      <w:r>
+        <w:t xml:space="preserve"> </w:t>
+      </w:r>
+      <w:r>
+        <w:t xml:space="preserve">investments in offshore energy hubs under emission targets, and Khan et al.</w:t>
+      </w:r>
+      <w:r>
+        <w:t xml:space="preserve"> </w:t>
+      </w:r>
+      <w:r>
+        <w:t xml:space="preserve">[13] show that relaxing GT operating constraints lets a platform grid</w:t>
+      </w:r>
+      <w:r>
+        <w:t xml:space="preserve"> </w:t>
+      </w:r>
+      <w:r>
+        <w:t xml:space="preserve">absorb more wind. In all of these, the platform load is an input. Svendsen</w:t>
+      </w:r>
+      <w:r>
+        <w:t xml:space="preserve"> </w:t>
+      </w:r>
+      <w:r>
+        <w:t xml:space="preserve">[11] names demand-side flexibility as a way to reduce the need for</w:t>
+      </w:r>
+      <w:r>
+        <w:t xml:space="preserve"> </w:t>
+      </w:r>
+      <w:r>
+        <w:t xml:space="preserve">storage but leaves it for future work.</w:t>
       </w:r>
     </w:p>
     <w:p>
@@ -2294,61 +2234,49 @@
         <w:pStyle w:val="BodyText"/>
       </w:pPr>
       <w:r>
-        <w:t xml:space="preserve">Demand-side flexibility is well established in onshore process industries.</w:t>
-      </w:r>
-      <w:r>
-        <w:t xml:space="preserve"> </w:t>
-      </w:r>
-      <w:r>
-        <w:t xml:space="preserve">Scheduling of energy-intensive production, such as steel, cement, aluminium</w:t>
-      </w:r>
-      <w:r>
-        <w:t xml:space="preserve"> </w:t>
-      </w:r>
-      <w:r>
-        <w:t xml:space="preserve">or air separation, around electricity prices has been studied extensively</w:t>
-      </w:r>
-      <w:r>
-        <w:t xml:space="preserve"> </w:t>
-      </w:r>
-      <w:r>
-        <w:t xml:space="preserve">[14,15]. Those studies exploit time-varying</w:t>
-      </w:r>
-      <w:r>
-        <w:t xml:space="preserve"> </w:t>
-      </w:r>
-      <w:r>
-        <w:t xml:space="preserve">prices in a large grid. An off-grid platform is different: there is no</w:t>
-      </w:r>
-      <w:r>
-        <w:t xml:space="preserve"> </w:t>
-      </w:r>
-      <w:r>
-        <w:t xml:space="preserve">price signal, and the value of moving a load lies in the fuel and emissions</w:t>
-      </w:r>
-      <w:r>
-        <w:t xml:space="preserve"> </w:t>
-      </w:r>
-      <w:r>
-        <w:t xml:space="preserve">of its own power plant. That value is strongly non-linear, because it</w:t>
-      </w:r>
-      <w:r>
-        <w:t xml:space="preserve"> </w:t>
-      </w:r>
-      <w:r>
-        <w:t xml:space="preserve">depends on whether a load change allows a GT to be stopped or avoids</w:t>
-      </w:r>
-      <w:r>
-        <w:t xml:space="preserve"> </w:t>
-      </w:r>
-      <w:r>
-        <w:t xml:space="preserve">starting one, and it is limited by process constraints that are specific</w:t>
-      </w:r>
-      <w:r>
-        <w:t xml:space="preserve"> </w:t>
-      </w:r>
-      <w:r>
-        <w:t xml:space="preserve">to oil and gas production.</w:t>
+        <w:t xml:space="preserve">Onshore, moving industrial loads in time is an established subject. Zhang and</w:t>
+      </w:r>
+      <w:r>
+        <w:t xml:space="preserve"> </w:t>
+      </w:r>
+      <w:r>
+        <w:t xml:space="preserve">Grossmann [14] review how energy-intensive production can</w:t>
+      </w:r>
+      <w:r>
+        <w:t xml:space="preserve"> </w:t>
+      </w:r>
+      <w:r>
+        <w:t xml:space="preserve">be scheduled around electricity prices, and Golmohamadi [15]</w:t>
+      </w:r>
+      <w:r>
+        <w:t xml:space="preserve"> </w:t>
+      </w:r>
+      <w:r>
+        <w:t xml:space="preserve">reviews demand-side management in heavy industries such as cement and</w:t>
+      </w:r>
+      <w:r>
+        <w:t xml:space="preserve"> </w:t>
+      </w:r>
+      <w:r>
+        <w:t xml:space="preserve">aluminium. These studies respond to price signals in a large grid. An</w:t>
+      </w:r>
+      <w:r>
+        <w:t xml:space="preserve"> </w:t>
+      </w:r>
+      <w:r>
+        <w:t xml:space="preserve">off-grid platform has no price signal. Moving a load is worth something only</w:t>
+      </w:r>
+      <w:r>
+        <w:t xml:space="preserve"> </w:t>
+      </w:r>
+      <w:r>
+        <w:t xml:space="preserve">through the platform’s own power plant, and the value is highly non-linear:</w:t>
+      </w:r>
+      <w:r>
+        <w:t xml:space="preserve"> </w:t>
+      </w:r>
+      <w:r>
+        <w:t xml:space="preserve">it depends on whether the change lets a GT stop, or avoids starting one.</w:t>
       </w:r>
     </w:p>
     <w:p>
@@ -2356,67 +2284,55 @@
         <w:pStyle w:val="BodyText"/>
       </w:pPr>
       <w:r>
-        <w:t xml:space="preserve">The process plant on an oil platform is not a fixed load. Water injection</w:t>
-      </w:r>
-      <w:r>
-        <w:t xml:space="preserve"> </w:t>
-      </w:r>
-      <w:r>
-        <w:t xml:space="preserve">for pressure support is one of the largest electric consumers, second only</w:t>
-      </w:r>
-      <w:r>
-        <w:t xml:space="preserve"> </w:t>
-      </w:r>
-      <w:r>
-        <w:t xml:space="preserve">to gas compression on the platforms studied by Nguyen et al. [10].</w:t>
-      </w:r>
-      <w:r>
-        <w:t xml:space="preserve"> </w:t>
-      </w:r>
-      <w:r>
-        <w:t xml:space="preserve">It can be postponed for hours as long as the cumulative injection meets the</w:t>
-      </w:r>
-      <w:r>
-        <w:t xml:space="preserve"> </w:t>
-      </w:r>
-      <w:r>
-        <w:t xml:space="preserve">reservoir’s needs, because reservoir pressure responds slowly. Production</w:t>
-      </w:r>
-      <w:r>
-        <w:t xml:space="preserve"> </w:t>
-      </w:r>
-      <w:r>
-        <w:t xml:space="preserve">can be reduced, at the cost of lost revenue. Other loads, such as utilities</w:t>
-      </w:r>
-      <w:r>
-        <w:t xml:space="preserve"> </w:t>
-      </w:r>
-      <w:r>
-        <w:t xml:space="preserve">and safety systems, must run at all times. How much flexibility these</w:t>
-      </w:r>
-      <w:r>
-        <w:t xml:space="preserve"> </w:t>
-      </w:r>
-      <w:r>
-        <w:t xml:space="preserve">consumers offer, and what it is worth, depends on equipment limits that a</w:t>
-      </w:r>
-      <w:r>
-        <w:t xml:space="preserve"> </w:t>
-      </w:r>
-      <w:r>
-        <w:t xml:space="preserve">fixed load profile hides: parallel trains, minimum-flow recycle on</w:t>
-      </w:r>
-      <w:r>
-        <w:t xml:space="preserve"> </w:t>
-      </w:r>
-      <w:r>
-        <w:t xml:space="preserve">compressors and pumps, ramp limits, and the requirement to catch up</w:t>
-      </w:r>
-      <w:r>
-        <w:t xml:space="preserve"> </w:t>
-      </w:r>
-      <w:r>
-        <w:t xml:space="preserve">postponed injection.</w:t>
+        <w:t xml:space="preserve">Platform loads are not fixed either. Water injection is one of the largest</w:t>
+      </w:r>
+      <w:r>
+        <w:t xml:space="preserve"> </w:t>
+      </w:r>
+      <w:r>
+        <w:t xml:space="preserve">consumers; on the platforms studied by Nguyen et al. [10] only gas</w:t>
+      </w:r>
+      <w:r>
+        <w:t xml:space="preserve"> </w:t>
+      </w:r>
+      <w:r>
+        <w:t xml:space="preserve">compression used more power. Injection can be postponed for hours as long as</w:t>
+      </w:r>
+      <w:r>
+        <w:t xml:space="preserve"> </w:t>
+      </w:r>
+      <w:r>
+        <w:t xml:space="preserve">the cumulative volume meets the reservoir’s needs, because reservoir pressure</w:t>
+      </w:r>
+      <w:r>
+        <w:t xml:space="preserve"> </w:t>
+      </w:r>
+      <w:r>
+        <w:t xml:space="preserve">responds slowly. Production can also be cut, but the lost revenue is large.</w:t>
+      </w:r>
+      <w:r>
+        <w:t xml:space="preserve"> </w:t>
+      </w:r>
+      <w:r>
+        <w:t xml:space="preserve">Utilities and safety systems must run at all times. How much of this</w:t>
+      </w:r>
+      <w:r>
+        <w:t xml:space="preserve"> </w:t>
+      </w:r>
+      <w:r>
+        <w:t xml:space="preserve">flexibility is usable depends on details that a fixed load profile hides:</w:t>
+      </w:r>
+      <w:r>
+        <w:t xml:space="preserve"> </w:t>
+      </w:r>
+      <w:r>
+        <w:t xml:space="preserve">parallel trains, minimum-flow recycle on compressors and pumps, ramp limits,</w:t>
+      </w:r>
+      <w:r>
+        <w:t xml:space="preserve"> </w:t>
+      </w:r>
+      <w:r>
+        <w:t xml:space="preserve">and the need to catch up postponed injection.</w:t>
       </w:r>
     </w:p>
     <w:p>
@@ -2424,37 +2340,19 @@
         <w:pStyle w:val="BodyText"/>
       </w:pPr>
       <w:r>
-        <w:t xml:space="preserve">This paper therefore asks three questions. How much fuel and CO2 can be</w:t>
-      </w:r>
-      <w:r>
-        <w:t xml:space="preserve"> </w:t>
-      </w:r>
-      <w:r>
-        <w:t xml:space="preserve">saved by scheduling the flexible topside consumers of a wind-powered oil</w:t>
-      </w:r>
-      <w:r>
-        <w:t xml:space="preserve"> </w:t>
-      </w:r>
-      <w:r>
-        <w:t xml:space="preserve">platform, compared with operating the same platform at fixed demand? Which</w:t>
-      </w:r>
-      <w:r>
-        <w:t xml:space="preserve"> </w:t>
-      </w:r>
-      <w:r>
-        <w:t xml:space="preserve">consumers provide the flexibility, and through which mechanism does it save</w:t>
-      </w:r>
-      <w:r>
-        <w:t xml:space="preserve"> </w:t>
-      </w:r>
-      <w:r>
-        <w:t xml:space="preserve">fuel? And which technical and operational assumptions decide the size of the</w:t>
-      </w:r>
-      <w:r>
-        <w:t xml:space="preserve"> </w:t>
-      </w:r>
-      <w:r>
-        <w:t xml:space="preserve">saving? Its contributions are:</w:t>
+        <w:t xml:space="preserve">This paper asks how much fuel and CO2 a wind-powered oil platform can save by</w:t>
+      </w:r>
+      <w:r>
+        <w:t xml:space="preserve"> </w:t>
+      </w:r>
+      <w:r>
+        <w:t xml:space="preserve">scheduling these loads, which consumers provide the saving and through which</w:t>
+      </w:r>
+      <w:r>
+        <w:t xml:space="preserve"> </w:t>
+      </w:r>
+      <w:r>
+        <w:t xml:space="preserve">mechanism, and which assumptions decide its size. It contributes:</w:t>
       </w:r>
     </w:p>
     <w:p>
@@ -2466,25 +2364,19 @@
         <w:pStyle w:val="Compact"/>
       </w:pPr>
       <w:r>
-        <w:t xml:space="preserve">A demand map of a generic North Sea oil platform derived from a</w:t>
-      </w:r>
-      <w:r>
-        <w:t xml:space="preserve"> </w:t>
-      </w:r>
-      <w:r>
-        <w:t xml:space="preserve">steady-state process model, which gives the power of each consumer as a</w:t>
-      </w:r>
-      <w:r>
-        <w:t xml:space="preserve"> </w:t>
-      </w:r>
-      <w:r>
-        <w:t xml:space="preserve">function of its operating lever, including train switching and</w:t>
-      </w:r>
-      <w:r>
-        <w:t xml:space="preserve"> </w:t>
-      </w:r>
-      <w:r>
-        <w:t xml:space="preserve">minimum-flow recycle.</w:t>
+        <w:t xml:space="preserve">a demand map of a generic North Sea oil platform from a steady-state</w:t>
+      </w:r>
+      <w:r>
+        <w:t xml:space="preserve"> </w:t>
+      </w:r>
+      <w:r>
+        <w:t xml:space="preserve">process model, with the power of each consumer as a function of its</w:t>
+      </w:r>
+      <w:r>
+        <w:t xml:space="preserve"> </w:t>
+      </w:r>
+      <w:r>
+        <w:t xml:space="preserve">operating lever, including train switching and minimum-flow recycle;</w:t>
       </w:r>
     </w:p>
     <w:p>
@@ -2496,19 +2388,19 @@
         <w:pStyle w:val="Compact"/>
       </w:pPr>
       <w:r>
-        <w:t xml:space="preserve">A classification of the consumers as must-run, flexible (deferrable) or</w:t>
-      </w:r>
-      <w:r>
-        <w:t xml:space="preserve"> </w:t>
-      </w:r>
-      <w:r>
-        <w:t xml:space="preserve">sheddable, with water injection represented as a virtual storage that must</w:t>
-      </w:r>
-      <w:r>
-        <w:t xml:space="preserve"> </w:t>
-      </w:r>
-      <w:r>
-        <w:t xml:space="preserve">be caught up.</w:t>
+        <w:t xml:space="preserve">a classification of the consumers as must-run, flexible (deferrable) or</w:t>
+      </w:r>
+      <w:r>
+        <w:t xml:space="preserve"> </w:t>
+      </w:r>
+      <w:r>
+        <w:t xml:space="preserve">sheddable, in which postponed water injection is a virtual storage that</w:t>
+      </w:r>
+      <w:r>
+        <w:t xml:space="preserve"> </w:t>
+      </w:r>
+      <w:r>
+        <w:t xml:space="preserve">must be emptied again;</w:t>
       </w:r>
     </w:p>
     <w:p>
@@ -2520,19 +2412,19 @@
         <w:pStyle w:val="Compact"/>
       </w:pPr>
       <w:r>
-        <w:t xml:space="preserve">A mixed-integer linear scheduling model that optimises the flexible</w:t>
-      </w:r>
-      <w:r>
-        <w:t xml:space="preserve"> </w:t>
-      </w:r>
-      <w:r>
-        <w:t xml:space="preserve">consumers together with GT commitment, wind use and an optional battery</w:t>
-      </w:r>
-      <w:r>
-        <w:t xml:space="preserve"> </w:t>
-      </w:r>
-      <w:r>
-        <w:t xml:space="preserve">for a full year at hourly resolution.</w:t>
+        <w:t xml:space="preserve">a mixed-integer linear program that schedules the flexible consumers</w:t>
+      </w:r>
+      <w:r>
+        <w:t xml:space="preserve"> </w:t>
+      </w:r>
+      <w:r>
+        <w:t xml:space="preserve">together with GT commitment, wind use and an optional battery, hour by hour</w:t>
+      </w:r>
+      <w:r>
+        <w:t xml:space="preserve"> </w:t>
+      </w:r>
+      <w:r>
+        <w:t xml:space="preserve">over full years;</w:t>
       </w:r>
     </w:p>
     <w:p>
@@ -2544,25 +2436,13 @@
         <w:pStyle w:val="Compact"/>
       </w:pPr>
       <w:r>
-        <w:t xml:space="preserve">A comparison of four cases, from GTs only to wind with flexible demand and</w:t>
-      </w:r>
-      <w:r>
-        <w:t xml:space="preserve"> </w:t>
-      </w:r>
-      <w:r>
-        <w:t xml:space="preserve">a battery, over ten weather years, with sensitivity analysis on the</w:t>
-      </w:r>
-      <w:r>
-        <w:t xml:space="preserve"> </w:t>
-      </w:r>
-      <w:r>
-        <w:t xml:space="preserve">assumptions that drive the result, validation against Hywind Tampen and</w:t>
-      </w:r>
-      <w:r>
-        <w:t xml:space="preserve"> </w:t>
-      </w:r>
-      <w:r>
-        <w:t xml:space="preserve">reported field data, and economic indicators.</w:t>
+        <w:t xml:space="preserve">results for four cases and ten weather years, with sensitivity analysis,</w:t>
+      </w:r>
+      <w:r>
+        <w:t xml:space="preserve"> </w:t>
+      </w:r>
+      <w:r>
+        <w:t xml:space="preserve">validation against Hywind Tampen and field data, and economic indicators.</w:t>
       </w:r>
     </w:p>
     <w:p>
@@ -2570,25 +2450,25 @@
         <w:pStyle w:val="FirstParagraph"/>
       </w:pPr>
       <w:r>
-        <w:t xml:space="preserve">Section 2 describes the platform, models and cases. Section 3 presents the</w:t>
-      </w:r>
-      <w:r>
-        <w:t xml:space="preserve"> </w:t>
-      </w:r>
-      <w:r>
-        <w:t xml:space="preserve">results, Section 4 discusses the mechanism, implications and limitations,</w:t>
-      </w:r>
-      <w:r>
-        <w:t xml:space="preserve"> </w:t>
-      </w:r>
-      <w:r>
-        <w:t xml:space="preserve">and Section 5 concludes. The model code, input data and all parameters with</w:t>
-      </w:r>
-      <w:r>
-        <w:t xml:space="preserve"> </w:t>
-      </w:r>
-      <w:r>
-        <w:t xml:space="preserve">their sources are openly available (see Data availability).</w:t>
+        <w:t xml:space="preserve">Section 2 describes the platform, models and cases, and Section 3 the</w:t>
+      </w:r>
+      <w:r>
+        <w:t xml:space="preserve"> </w:t>
+      </w:r>
+      <w:r>
+        <w:t xml:space="preserve">results. Section 4 discusses the mechanism, its practical use and the</w:t>
+      </w:r>
+      <w:r>
+        <w:t xml:space="preserve"> </w:t>
+      </w:r>
+      <w:r>
+        <w:t xml:space="preserve">limitations, and Section 5 concludes. The code, input data and all</w:t>
+      </w:r>
+      <w:r>
+        <w:t xml:space="preserve"> </w:t>
+      </w:r>
+      <w:r>
+        <w:t xml:space="preserve">parameters with their sources are openly available (see Data availability).</w:t>
       </w:r>
     </w:p>
     <w:bookmarkEnd w:id="22"/>
@@ -10833,7 +10713,37 @@
         <w:pStyle w:val="BodyText"/>
       </w:pPr>
       <w:r>
-        <w:t xml:space="preserve">Table 3 and Fig. 7 show which inputs matter.</w:t>
+        <w:t xml:space="preserve">Table 3 and Fig. 7 show which inputs matter, and several do not. Across CO2</w:t>
+      </w:r>
+      <w:r>
+        <w:t xml:space="preserve"> </w:t>
+      </w:r>
+      <w:r>
+        <w:t xml:space="preserve">prices of 0.5–3 NOK/kg and gas prices of 2–8 NOK/Sm³, emissions change by less</w:t>
+      </w:r>
+      <w:r>
+        <w:t xml:space="preserve"> </w:t>
+      </w:r>
+      <w:r>
+        <w:t xml:space="preserve">than 0.1 %. Prices scale the cost of every option alike, so the cheapest</w:t>
+      </w:r>
+      <w:r>
+        <w:t xml:space="preserve"> </w:t>
+      </w:r>
+      <w:r>
+        <w:t xml:space="preserve">schedule stays the cheapest. Deferring injection saves fuel at any price, and</w:t>
+      </w:r>
+      <w:r>
+        <w:t xml:space="preserve"> </w:t>
+      </w:r>
+      <w:r>
+        <w:t xml:space="preserve">shedding production never pays: lost oil and gas are worth about a hundred</w:t>
+      </w:r>
+      <w:r>
+        <w:t xml:space="preserve"> </w:t>
+      </w:r>
+      <w:r>
+        <w:t xml:space="preserve">times more than the fuel saved.</w:t>
       </w:r>
     </w:p>
     <w:p>
@@ -10841,47 +10751,25 @@
         <w:pStyle w:val="BodyText"/>
       </w:pPr>
       <w:r>
-        <w:rPr>
-          <w:bCs/>
-          <w:b/>
-        </w:rPr>
-        <w:t xml:space="preserve">Prices do not change the schedule.</w:t>
-      </w:r>
-      <w:r>
-        <w:t xml:space="preserve"> </w:t>
-      </w:r>
-      <w:r>
-        <w:t xml:space="preserve">Across CO2 prices of 0.5–3 NOK/kg and</w:t>
-      </w:r>
-      <w:r>
-        <w:t xml:space="preserve"> </w:t>
-      </w:r>
-      <w:r>
-        <w:t xml:space="preserve">gas prices of 2–8 NOK/Sm³, emissions change by less than 0.1 %. Prices change</w:t>
-      </w:r>
-      <w:r>
-        <w:t xml:space="preserve"> </w:t>
-      </w:r>
-      <w:r>
-        <w:t xml:space="preserve">the cost of every option in proportion, so the cheapest schedule stays the</w:t>
-      </w:r>
-      <w:r>
-        <w:t xml:space="preserve"> </w:t>
-      </w:r>
-      <w:r>
-        <w:t xml:space="preserve">cheapest. The injection schedule is driven by fuel savings that are</w:t>
-      </w:r>
-      <w:r>
-        <w:t xml:space="preserve"> </w:t>
-      </w:r>
-      <w:r>
-        <w:t xml:space="preserve">worthwhile at any price, and production is never shed, because its value is</w:t>
-      </w:r>
-      <w:r>
-        <w:t xml:space="preserve"> </w:t>
-      </w:r>
-      <w:r>
-        <w:t xml:space="preserve">two orders of magnitude higher than the fuel saved.</w:t>
+        <w:t xml:space="preserve">The deferral capacity needed is small. With no deferral allowed, case 3 is</w:t>
+      </w:r>
+      <w:r>
+        <w:t xml:space="preserve"> </w:t>
+      </w:r>
+      <w:r>
+        <w:t xml:space="preserve">identical to case 2 (64.7 kt). A limit of 24 h already gives the full saving,</w:t>
+      </w:r>
+      <w:r>
+        <w:t xml:space="preserve"> </w:t>
+      </w:r>
+      <w:r>
+        <w:t xml:space="preserve">with 5 GT starts instead of 3; 168 h changes nothing. A conservative reservoir</w:t>
+      </w:r>
+      <w:r>
+        <w:t xml:space="preserve"> </w:t>
+      </w:r>
+      <w:r>
+        <w:t xml:space="preserve">constraint would still capture the benefit.</w:t>
       </w:r>
     </w:p>
     <w:p>
@@ -10889,41 +10777,49 @@
         <w:pStyle w:val="BodyText"/>
       </w:pPr>
       <w:r>
-        <w:rPr>
-          <w:bCs/>
-          <w:b/>
-        </w:rPr>
-        <w:t xml:space="preserve">A small deferral capacity is enough.</w:t>
-      </w:r>
-      <w:r>
-        <w:t xml:space="preserve"> </w:t>
-      </w:r>
-      <w:r>
-        <w:t xml:space="preserve">With no deferral allowed, case 3 is</w:t>
-      </w:r>
-      <w:r>
-        <w:t xml:space="preserve"> </w:t>
-      </w:r>
-      <w:r>
-        <w:t xml:space="preserve">identical to case 2 (64.7 kt). A deficit limit of 24 h already gives the</w:t>
-      </w:r>
-      <w:r>
-        <w:t xml:space="preserve"> </w:t>
-      </w:r>
-      <w:r>
-        <w:t xml:space="preserve">full saving, with 5 GT starts instead of 3, and allowing 168 h changes</w:t>
-      </w:r>
-      <w:r>
-        <w:t xml:space="preserve"> </w:t>
-      </w:r>
-      <w:r>
-        <w:t xml:space="preserve">nothing more. Even a conservative reservoir constraint would therefore</w:t>
-      </w:r>
-      <w:r>
-        <w:t xml:space="preserve"> </w:t>
-      </w:r>
-      <w:r>
-        <w:t xml:space="preserve">capture the benefit.</w:t>
+        <w:t xml:space="preserve">A larger wind farm helps less than its size suggests. Doubling the farm from</w:t>
+      </w:r>
+      <w:r>
+        <w:t xml:space="preserve"> </w:t>
+      </w:r>
+      <w:r>
+        <w:t xml:space="preserve">30 to 60 MW lowers case 3 emissions only from 57.5 to 50.9 kt, while</w:t>
+      </w:r>
+      <w:r>
+        <w:t xml:space="preserve"> </w:t>
+      </w:r>
+      <w:r>
+        <w:t xml:space="preserve">curtailment grows from 39 to 160 GWh: one GT must stay online, and in windy</w:t>
+      </w:r>
+      <w:r>
+        <w:t xml:space="preserve"> </w:t>
+      </w:r>
+      <w:r>
+        <w:t xml:space="preserve">hours the platform cannot use more wind. The value of flexibility (case 2</w:t>
+      </w:r>
+      <w:r>
+        <w:t xml:space="preserve"> </w:t>
+      </w:r>
+      <w:r>
+        <w:t xml:space="preserve">minus case 3) peaks at the base-case size (7.2 kt). It is 5.6 kt for a 15 MW</w:t>
+      </w:r>
+      <w:r>
+        <w:t xml:space="preserve"> </w:t>
+      </w:r>
+      <w:r>
+        <w:t xml:space="preserve">farm, where the wind seldom covers the demand, and 6.7–6.8 kt for 45–60 MW.</w:t>
+      </w:r>
+      <w:r>
+        <w:t xml:space="preserve"> </w:t>
+      </w:r>
+      <w:r>
+        <w:t xml:space="preserve">Batteries add little as long as one GT must stay online. The largest one</w:t>
+      </w:r>
+      <w:r>
+        <w:t xml:space="preserve"> </w:t>
+      </w:r>
+      <w:r>
+        <w:t xml:space="preserve">tested, 8 MW / 16 MWh, saves 1.1 kt (2 %).</w:t>
       </w:r>
     </w:p>
     <w:p>
@@ -10931,53 +10827,55 @@
         <w:pStyle w:val="BodyText"/>
       </w:pPr>
       <w:r>
-        <w:rPr>
-          <w:bCs/>
-          <w:b/>
-        </w:rPr>
-        <w:t xml:space="preserve">Wind farm size has diminishing returns.</w:t>
-      </w:r>
-      <w:r>
-        <w:t xml:space="preserve"> </w:t>
-      </w:r>
-      <w:r>
-        <w:t xml:space="preserve">Doubling the farm from 30 to</w:t>
-      </w:r>
-      <w:r>
-        <w:t xml:space="preserve"> </w:t>
-      </w:r>
-      <w:r>
-        <w:t xml:space="preserve">60 MW lowers case 3 emissions only from 57.5 to 50.9 kt, while curtailment</w:t>
-      </w:r>
-      <w:r>
-        <w:t xml:space="preserve"> </w:t>
-      </w:r>
-      <w:r>
-        <w:t xml:space="preserve">grows from 39 to 160 GWh, because one GT must stay online and the platform</w:t>
-      </w:r>
-      <w:r>
-        <w:t xml:space="preserve"> </w:t>
-      </w:r>
-      <w:r>
-        <w:t xml:space="preserve">cannot absorb more wind in windy hours. The value of flexibility (case 2</w:t>
-      </w:r>
-      <w:r>
-        <w:t xml:space="preserve"> </w:t>
-      </w:r>
-      <w:r>
-        <w:t xml:space="preserve">minus case 3) is largest for the base-case farm (7.2 kt) and smaller for a</w:t>
-      </w:r>
-      <w:r>
-        <w:t xml:space="preserve"> </w:t>
-      </w:r>
-      <w:r>
-        <w:t xml:space="preserve">15 MW farm (5.6 kt), where the wind seldom covers the demand, and for a</w:t>
-      </w:r>
-      <w:r>
-        <w:t xml:space="preserve"> </w:t>
-      </w:r>
-      <w:r>
-        <w:t xml:space="preserve">45–60 MW farm (6.7–6.8 kt).</w:t>
+        <w:t xml:space="preserve">Two assumptions about GT operation matter more than any of these. If an</w:t>
+      </w:r>
+      <w:r>
+        <w:t xml:space="preserve"> </w:t>
+      </w:r>
+      <w:r>
+        <w:t xml:space="preserve">8 MW / 8 MWh battery could provide reserve and grid stability, so that all</w:t>
+      </w:r>
+      <w:r>
+        <w:t xml:space="preserve"> </w:t>
+      </w:r>
+      <w:r>
+        <w:t xml:space="preserve">GTs may stop, emissions would fall to 38.7 kt, 32 % below the same case with</w:t>
+      </w:r>
+      <w:r>
+        <w:t xml:space="preserve"> </w:t>
+      </w:r>
+      <w:r>
+        <w:t xml:space="preserve">one GT online. The GTs would then run only 3,798 unit-h and start 184 times a</w:t>
+      </w:r>
+      <w:r>
+        <w:t xml:space="preserve"> </w:t>
+      </w:r>
+      <w:r>
+        <w:t xml:space="preserve">year; only 11 GWh of wind would be curtailed, and the electric heater would</w:t>
+      </w:r>
+      <w:r>
+        <w:t xml:space="preserve"> </w:t>
+      </w:r>
+      <w:r>
+        <w:t xml:space="preserve">supply 15 GWh of heat in hours with no GT running. The opposite rule, two GTs</w:t>
+      </w:r>
+      <w:r>
+        <w:t xml:space="preserve"> </w:t>
+      </w:r>
+      <w:r>
+        <w:t xml:space="preserve">online whatever the wind, raises emissions to 90.7 kt in case 2 and 87.7 kt</w:t>
+      </w:r>
+      <w:r>
+        <w:t xml:space="preserve"> </w:t>
+      </w:r>
+      <w:r>
+        <w:t xml:space="preserve">in case 3. Flexibility then saves only 3.1 kt, all of it from lower</w:t>
+      </w:r>
+      <w:r>
+        <w:t xml:space="preserve"> </w:t>
+      </w:r>
+      <w:r>
+        <w:t xml:space="preserve">curtailment, because there is no second GT left to avoid.</w:t>
       </w:r>
     </w:p>
     <w:p>
@@ -10985,197 +10883,55 @@
         <w:pStyle w:val="BodyText"/>
       </w:pPr>
       <w:r>
-        <w:rPr>
-          <w:bCs/>
-          <w:b/>
-        </w:rPr>
-        <w:t xml:space="preserve">Batteries add little on their own.</w:t>
-      </w:r>
-      <w:r>
-        <w:t xml:space="preserve"> </w:t>
-      </w:r>
-      <w:r>
-        <w:t xml:space="preserve">The largest battery tested</w:t>
-      </w:r>
-      <w:r>
-        <w:t xml:space="preserve"> </w:t>
-      </w:r>
-      <w:r>
-        <w:t xml:space="preserve">(8 MW / 16 MWh) reduces case 3 emissions by 1.1 kt, or 2 %, as long as one</w:t>
-      </w:r>
-      <w:r>
-        <w:t xml:space="preserve"> </w:t>
-      </w:r>
-      <w:r>
-        <w:t xml:space="preserve">GT must remain online.</w:t>
-      </w:r>
-    </w:p>
-    <w:p>
-      <w:pPr>
-        <w:pStyle w:val="BodyText"/>
-      </w:pPr>
-      <w:r>
-        <w:rPr>
-          <w:bCs/>
-          <w:b/>
-        </w:rPr>
-        <w:t xml:space="preserve">The minimum number of GTs online dominates.</w:t>
-      </w:r>
-      <w:r>
-        <w:t xml:space="preserve"> </w:t>
-      </w:r>
-      <w:r>
-        <w:t xml:space="preserve">If an 8 MW / 8 MWh battery</w:t>
-      </w:r>
-      <w:r>
-        <w:t xml:space="preserve"> </w:t>
-      </w:r>
-      <w:r>
-        <w:t xml:space="preserve">can provide the reserve and grid stability so that all GTs may stop,</w:t>
-      </w:r>
-      <w:r>
-        <w:t xml:space="preserve"> </w:t>
-      </w:r>
-      <w:r>
-        <w:t xml:space="preserve">emissions fall to 38.7 kt, 32 % below the same case with one GT online. The</w:t>
-      </w:r>
-      <w:r>
-        <w:t xml:space="preserve"> </w:t>
-      </w:r>
-      <w:r>
-        <w:t xml:space="preserve">GTs then run only 3,798 unit-h, wind covers a much larger share of the</w:t>
-      </w:r>
-      <w:r>
-        <w:t xml:space="preserve"> </w:t>
-      </w:r>
-      <w:r>
-        <w:t xml:space="preserve">demand with only 11 GWh curtailed, and 15 GWh of heat is supplied by the</w:t>
-      </w:r>
-      <w:r>
-        <w:t xml:space="preserve"> </w:t>
-      </w:r>
-      <w:r>
-        <w:t xml:space="preserve">electric heater when no GT runs. The price is 184 GT starts per year.</w:t>
-      </w:r>
-    </w:p>
-    <w:p>
-      <w:pPr>
-        <w:pStyle w:val="BodyText"/>
-      </w:pPr>
-      <w:r>
-        <w:rPr>
-          <w:bCs/>
-          <w:b/>
-        </w:rPr>
-        <w:t xml:space="preserve">Operating practice matters as much as hardware.</w:t>
-      </w:r>
-      <w:r>
-        <w:t xml:space="preserve"> </w:t>
-      </w:r>
-      <w:r>
-        <w:t xml:space="preserve">If two GTs are kept</w:t>
-      </w:r>
-      <w:r>
-        <w:t xml:space="preserve"> </w:t>
-      </w:r>
-      <w:r>
-        <w:t xml:space="preserve">online whatever the wind, emissions rise to 90.7 kt in case 2 and 87.7 kt in</w:t>
-      </w:r>
-      <w:r>
-        <w:t xml:space="preserve"> </w:t>
-      </w:r>
-      <w:r>
-        <w:t xml:space="preserve">case 3. Flexibility then saves only 3.1 kt, because its main mechanism,</w:t>
-      </w:r>
-      <w:r>
-        <w:t xml:space="preserve"> </w:t>
-      </w:r>
-      <w:r>
-        <w:t xml:space="preserve">avoiding the second GT, is no longer available; the remaining saving comes</w:t>
-      </w:r>
-      <w:r>
-        <w:t xml:space="preserve"> </w:t>
-      </w:r>
-      <w:r>
-        <w:t xml:space="preserve">from lower curtailment.</w:t>
-      </w:r>
-    </w:p>
-    <w:p>
-      <w:pPr>
-        <w:pStyle w:val="BodyText"/>
-      </w:pPr>
-      <w:r>
-        <w:rPr>
-          <w:bCs/>
-          <w:b/>
-        </w:rPr>
-        <w:t xml:space="preserve">A small GT is as valuable as flexibility, and the two add up.</w:t>
-      </w:r>
-      <w:r>
-        <w:t xml:space="preserve"> </w:t>
-      </w:r>
-      <w:r>
-        <w:t xml:space="preserve">Replacing</w:t>
-      </w:r>
-      <w:r>
-        <w:t xml:space="preserve"> </w:t>
-      </w:r>
-      <w:r>
-        <w:t xml:space="preserve">one main unit by a Solar Mars 100 (11.35 MW) lowers emissions from 64.7 to</w:t>
-      </w:r>
-      <w:r>
-        <w:t xml:space="preserve"> </w:t>
-      </w:r>
-      <w:r>
-        <w:t xml:space="preserve">53.9 kt with fixed demand (−17 %) and from 57.5 to 47.8 kt with flexible</w:t>
-      </w:r>
-      <w:r>
-        <w:t xml:space="preserve"> </w:t>
-      </w:r>
-      <w:r>
-        <w:t xml:space="preserve">demand. In windy hours the small unit runs alone: its no-load fuel is about</w:t>
-      </w:r>
-      <w:r>
-        <w:t xml:space="preserve"> </w:t>
-      </w:r>
-      <w:r>
-        <w:t xml:space="preserve">half that of a main unit, and it can carry up to 6.35 MW while holding the</w:t>
-      </w:r>
-      <w:r>
-        <w:t xml:space="preserve"> </w:t>
-      </w:r>
-      <w:r>
-        <w:t xml:space="preserve">5 MW reserve. With the small unit installed, flexibility still saves 6.1 kt</w:t>
-      </w:r>
-      <w:r>
-        <w:t xml:space="preserve"> </w:t>
-      </w:r>
-      <w:r>
-        <w:t xml:space="preserve">(11.3 %), the same share as with the main units only, and it reduces the</w:t>
-      </w:r>
-      <w:r>
-        <w:t xml:space="preserve"> </w:t>
-      </w:r>
-      <w:r>
-        <w:t xml:space="preserve">starts of the small unit from 465 to 262 per year. Together, the small unit</w:t>
-      </w:r>
-      <w:r>
-        <w:t xml:space="preserve"> </w:t>
-      </w:r>
-      <w:r>
-        <w:t xml:space="preserve">and flexibility cut emissions by 26 % compared with case 2. Keeping all three</w:t>
-      </w:r>
-      <w:r>
-        <w:t xml:space="preserve"> </w:t>
-      </w:r>
-      <w:r>
-        <w:t xml:space="preserve">main units in addition to the small one changes nothing (47.7 kt), because</w:t>
-      </w:r>
-      <w:r>
-        <w:t xml:space="preserve"> </w:t>
-      </w:r>
-      <w:r>
-        <w:t xml:space="preserve">the third main unit is never needed.</w:t>
+        <w:t xml:space="preserve">The fleet itself matters too. Replacing one main unit by a Solar Mars 100</w:t>
+      </w:r>
+      <w:r>
+        <w:t xml:space="preserve"> </w:t>
+      </w:r>
+      <w:r>
+        <w:t xml:space="preserve">(11.35 MW) lowers emissions from 64.7 to 53.9 kt with fixed demand (−17 %)</w:t>
+      </w:r>
+      <w:r>
+        <w:t xml:space="preserve"> </w:t>
+      </w:r>
+      <w:r>
+        <w:t xml:space="preserve">and from 57.5 to 47.8 kt with flexible demand. In windy hours the small unit</w:t>
+      </w:r>
+      <w:r>
+        <w:t xml:space="preserve"> </w:t>
+      </w:r>
+      <w:r>
+        <w:t xml:space="preserve">runs alone. Its no-load fuel is about half that of a main unit, and it can</w:t>
+      </w:r>
+      <w:r>
+        <w:t xml:space="preserve"> </w:t>
+      </w:r>
+      <w:r>
+        <w:t xml:space="preserve">carry up to 6.35 MW while holding the 5 MW reserve. Flexibility still saves</w:t>
+      </w:r>
+      <w:r>
+        <w:t xml:space="preserve"> </w:t>
+      </w:r>
+      <w:r>
+        <w:t xml:space="preserve">6.1 kt (11.3 %) with the small unit installed, and it cuts the small unit’s</w:t>
+      </w:r>
+      <w:r>
+        <w:t xml:space="preserve"> </w:t>
+      </w:r>
+      <w:r>
+        <w:t xml:space="preserve">starts from 465 to 262 per year. Combined, the small unit and flexibility</w:t>
+      </w:r>
+      <w:r>
+        <w:t xml:space="preserve"> </w:t>
+      </w:r>
+      <w:r>
+        <w:t xml:space="preserve">reduce emissions by 26 % relative to case 2. Adding the small unit to all</w:t>
+      </w:r>
+      <w:r>
+        <w:t xml:space="preserve"> </w:t>
+      </w:r>
+      <w:r>
+        <w:t xml:space="preserve">three main units instead gives 47.7 kt; the third main unit is never used.</w:t>
       </w:r>
     </w:p>
     <w:p>

</xml_diff>

<commit_message>
Paper prose revision (part 2): discussion and conclusions
- Discussion 4.1-4.5 rewritten: varied sentence length, no 'First/Second/Third'
  template, more critical points (untested pump-start effect, Willans part-load
  curve, forecast-based scheduling still to be shown); one unverified claim
  about the literature removed
- Conclusions: list items of varied form; vague closing sentence replaced by
  three concrete open questions
- Fewer 'therefore/thus' in Methods and Results; numbers unchanged
</commit_message>
<xml_diff>
--- a/docs/paper/paper.docx
+++ b/docs/paper/paper.docx
@@ -3496,7 +3496,7 @@
         <w:t xml:space="preserve"> </w:t>
       </w:r>
       <w:r>
-        <w:t xml:space="preserve">LEOGO fuel coefficients. A running GT thus burns 18.4 % of its full-load</w:t>
+        <w:t xml:space="preserve">LEOGO fuel coefficients. A running GT burns 18.4 % of its full-load</w:t>
       </w:r>
       <w:r>
         <w:t xml:space="preserve"> </w:t>
@@ -4355,7 +4355,7 @@
         <w:t xml:space="preserve"> </w:t>
       </w:r>
       <w:r>
-        <w:t xml:space="preserve">perfectly flexible. Real equipment is not. Each consumer is therefore</w:t>
+        <w:t xml:space="preserve">perfectly flexible. Real equipment is not, so each consumer is</w:t>
       </w:r>
       <w:r>
         <w:t xml:space="preserve"> </w:t>
@@ -7587,7 +7587,7 @@
         <w:t xml:space="preserve"> </w:t>
       </w:r>
       <w:r>
-        <w:t xml:space="preserve">is arbitrary. GT load is therefore reported as shared in proportion to</w:t>
+        <w:t xml:space="preserve">is arbitrary. GT load is reported instead as shared in proportion to</w:t>
       </w:r>
       <w:r>
         <w:t xml:space="preserve"> </w:t>
@@ -8783,7 +8783,7 @@
         <w:t xml:space="preserve"> </w:t>
       </w:r>
       <w:r>
-        <w:t xml:space="preserve">4,017 h. The farm can therefore cover the whole platform for long periods,</w:t>
+        <w:t xml:space="preserve">4,017 h. The farm can cover the whole platform for long periods,</w:t>
       </w:r>
       <w:r>
         <w:t xml:space="preserve"> </w:t>
@@ -12897,7 +12897,7 @@
         <w:t xml:space="preserve"> </w:t>
       </w:r>
       <w:r>
-        <w:t xml:space="preserve">therefore holds for all weather years tested.</w:t>
+        <w:t xml:space="preserve">holds for all weather years tested.</w:t>
       </w:r>
     </w:p>
     <w:p>
@@ -12990,61 +12990,55 @@
         <w:pStyle w:val="FirstParagraph"/>
       </w:pPr>
       <w:r>
-        <w:t xml:space="preserve">The value of flexible demand on a wind-powered platform lies in unit</w:t>
-      </w:r>
-      <w:r>
-        <w:t xml:space="preserve"> </w:t>
-      </w:r>
-      <w:r>
-        <w:t xml:space="preserve">commitment, not in energy shifting. A GT that runs at low load to provide</w:t>
-      </w:r>
-      <w:r>
-        <w:t xml:space="preserve"> </w:t>
-      </w:r>
-      <w:r>
-        <w:t xml:space="preserve">reserve burns a large share of its full-load fuel, so the expensive hours</w:t>
-      </w:r>
-      <w:r>
-        <w:t xml:space="preserve"> </w:t>
-      </w:r>
-      <w:r>
-        <w:t xml:space="preserve">are those in which the wind is just too weak for one turbine to carry the</w:t>
-      </w:r>
-      <w:r>
-        <w:t xml:space="preserve"> </w:t>
-      </w:r>
-      <w:r>
-        <w:t xml:space="preserve">load with reserve. Deferring water injection in these hours keeps the</w:t>
-      </w:r>
-      <w:r>
-        <w:t xml:space="preserve"> </w:t>
-      </w:r>
-      <w:r>
-        <w:t xml:space="preserve">second turbine off. This explains three results of Section 3. Most of the</w:t>
-      </w:r>
-      <w:r>
-        <w:t xml:space="preserve"> </w:t>
-      </w:r>
-      <w:r>
-        <w:t xml:space="preserve">saving comes from 1,674 avoided hours with two GTs online. A deficit</w:t>
-      </w:r>
-      <w:r>
-        <w:t xml:space="preserve"> </w:t>
-      </w:r>
-      <w:r>
-        <w:t xml:space="preserve">capacity of about one day captures almost all of it, because these hours occur in</w:t>
-      </w:r>
-      <w:r>
-        <w:t xml:space="preserve"> </w:t>
-      </w:r>
-      <w:r>
-        <w:t xml:space="preserve">short spells between windy periods. And the saving largely disappears when</w:t>
-      </w:r>
-      <w:r>
-        <w:t xml:space="preserve"> </w:t>
-      </w:r>
-      <w:r>
-        <w:t xml:space="preserve">operating rules keep two GTs online anyway.</w:t>
+        <w:t xml:space="preserve">Flexible demand saves fuel through unit commitment, not through energy</w:t>
+      </w:r>
+      <w:r>
+        <w:t xml:space="preserve"> </w:t>
+      </w:r>
+      <w:r>
+        <w:t xml:space="preserve">shifting. A GT held at low load for reserve still burns a large share of its</w:t>
+      </w:r>
+      <w:r>
+        <w:t xml:space="preserve"> </w:t>
+      </w:r>
+      <w:r>
+        <w:t xml:space="preserve">full-load fuel, so the costly hours are those in which the wind is just too</w:t>
+      </w:r>
+      <w:r>
+        <w:t xml:space="preserve"> </w:t>
+      </w:r>
+      <w:r>
+        <w:t xml:space="preserve">weak for one turbine to carry the load with 5 MW in reserve. Deferring</w:t>
+      </w:r>
+      <w:r>
+        <w:t xml:space="preserve"> </w:t>
+      </w:r>
+      <w:r>
+        <w:t xml:space="preserve">injection in those hours keeps the second turbine off. Three results of</w:t>
+      </w:r>
+      <w:r>
+        <w:t xml:space="preserve"> </w:t>
+      </w:r>
+      <w:r>
+        <w:t xml:space="preserve">Section 3 follow from this. Most of the saving comes from the 1,674 avoided</w:t>
+      </w:r>
+      <w:r>
+        <w:t xml:space="preserve"> </w:t>
+      </w:r>
+      <w:r>
+        <w:t xml:space="preserve">hours with two GTs online. About one day of deficit capacity captures almost</w:t>
+      </w:r>
+      <w:r>
+        <w:t xml:space="preserve"> </w:t>
+      </w:r>
+      <w:r>
+        <w:t xml:space="preserve">all of it, since these hours come in short spells between windy periods. And</w:t>
+      </w:r>
+      <w:r>
+        <w:t xml:space="preserve"> </w:t>
+      </w:r>
+      <w:r>
+        <w:t xml:space="preserve">the saving largely disappears under rules that keep two GTs online anyway.</w:t>
       </w:r>
     </w:p>
     <w:p>
@@ -13052,55 +13046,49 @@
         <w:pStyle w:val="BodyText"/>
       </w:pPr>
       <w:r>
-        <w:t xml:space="preserve">Energy shifting alone, by contrast, achieves little. Curtailment falls by</w:t>
-      </w:r>
-      <w:r>
-        <w:t xml:space="preserve"> </w:t>
-      </w:r>
-      <w:r>
-        <w:t xml:space="preserve">only 13 %, because one GT must stay online and a 30 MW wind farm often</w:t>
-      </w:r>
-      <w:r>
-        <w:t xml:space="preserve"> </w:t>
-      </w:r>
-      <w:r>
-        <w:t xml:space="preserve">exceeds what the platform can use even with injection at full rate. This</w:t>
-      </w:r>
-      <w:r>
-        <w:t xml:space="preserve"> </w:t>
-      </w:r>
-      <w:r>
-        <w:t xml:space="preserve">also explains why the value of flexibility does not grow with the wind farm:</w:t>
-      </w:r>
-      <w:r>
-        <w:t xml:space="preserve"> </w:t>
-      </w:r>
-      <w:r>
-        <w:t xml:space="preserve">a larger farm covers the demand more often, which reduces the number of</w:t>
-      </w:r>
-      <w:r>
-        <w:t xml:space="preserve"> </w:t>
-      </w:r>
-      <w:r>
-        <w:t xml:space="preserve">hours in which a second GT is needed, while the additional wind in windy</w:t>
-      </w:r>
-      <w:r>
-        <w:t xml:space="preserve"> </w:t>
-      </w:r>
-      <w:r>
-        <w:t xml:space="preserve">hours cannot be used. The flexibility is most valuable when the wind farm is</w:t>
-      </w:r>
-      <w:r>
-        <w:t xml:space="preserve"> </w:t>
-      </w:r>
-      <w:r>
-        <w:t xml:space="preserve">of the same order as the platform demand, as in the base case and at Hywind</w:t>
-      </w:r>
-      <w:r>
-        <w:t xml:space="preserve"> </w:t>
-      </w:r>
-      <w:r>
-        <w:t xml:space="preserve">Tampen.</w:t>
+        <w:t xml:space="preserve">Shifting energy alone does little. Curtailment falls by only 13 %: one GT</w:t>
+      </w:r>
+      <w:r>
+        <w:t xml:space="preserve"> </w:t>
+      </w:r>
+      <w:r>
+        <w:t xml:space="preserve">must stay online, and a 30 MW farm often produces more than the platform can</w:t>
+      </w:r>
+      <w:r>
+        <w:t xml:space="preserve"> </w:t>
+      </w:r>
+      <w:r>
+        <w:t xml:space="preserve">use even with injection at full rate. The same reason explains why the value</w:t>
+      </w:r>
+      <w:r>
+        <w:t xml:space="preserve"> </w:t>
+      </w:r>
+      <w:r>
+        <w:t xml:space="preserve">of flexibility does not grow with the wind farm. A larger farm covers the</w:t>
+      </w:r>
+      <w:r>
+        <w:t xml:space="preserve"> </w:t>
+      </w:r>
+      <w:r>
+        <w:t xml:space="preserve">demand more often, so a second GT is needed in fewer hours, and the extra</w:t>
+      </w:r>
+      <w:r>
+        <w:t xml:space="preserve"> </w:t>
+      </w:r>
+      <w:r>
+        <w:t xml:space="preserve">wind in windy hours cannot be absorbed. Flexibility is worth most when the</w:t>
+      </w:r>
+      <w:r>
+        <w:t xml:space="preserve"> </w:t>
+      </w:r>
+      <w:r>
+        <w:t xml:space="preserve">wind farm is of the same order as the platform demand, as in the base case</w:t>
+      </w:r>
+      <w:r>
+        <w:t xml:space="preserve"> </w:t>
+      </w:r>
+      <w:r>
+        <w:t xml:space="preserve">and at Hywind Tampen.</w:t>
       </w:r>
     </w:p>
     <w:p>
@@ -13108,55 +13096,49 @@
         <w:pStyle w:val="BodyText"/>
       </w:pPr>
       <w:r>
-        <w:t xml:space="preserve">The same reasoning explains why a battery adds little in case 4. With at</w:t>
-      </w:r>
-      <w:r>
-        <w:t xml:space="preserve"> </w:t>
-      </w:r>
-      <w:r>
-        <w:t xml:space="preserve">least one GT online, the battery cannot remove the main remaining loss, one</w:t>
-      </w:r>
-      <w:r>
-        <w:t xml:space="preserve"> </w:t>
-      </w:r>
-      <w:r>
-        <w:t xml:space="preserve">turbine idling near minimum load. A large saving appears only when the</w:t>
-      </w:r>
-      <w:r>
-        <w:t xml:space="preserve"> </w:t>
-      </w:r>
-      <w:r>
-        <w:t xml:space="preserve">battery, or grid-forming wind turbines, can take over the role of the last</w:t>
-      </w:r>
-      <w:r>
-        <w:t xml:space="preserve"> </w:t>
-      </w:r>
-      <w:r>
-        <w:t xml:space="preserve">running GT (38.7 kt, −32 %). This agrees with the finding that a battery</w:t>
-      </w:r>
-      <w:r>
-        <w:t xml:space="preserve"> </w:t>
-      </w:r>
-      <w:r>
-        <w:t xml:space="preserve">providing reserve lets platform GTs be switched off [11]. The</w:t>
-      </w:r>
-      <w:r>
-        <w:t xml:space="preserve"> </w:t>
-      </w:r>
-      <w:r>
-        <w:t xml:space="preserve">present results add that process flexibility gives much of the same benefit</w:t>
-      </w:r>
-      <w:r>
-        <w:t xml:space="preserve"> </w:t>
-      </w:r>
-      <w:r>
-        <w:t xml:space="preserve">without new equipment, and that both measures act on the same mechanism:</w:t>
-      </w:r>
-      <w:r>
-        <w:t xml:space="preserve"> </w:t>
-      </w:r>
-      <w:r>
-        <w:t xml:space="preserve">they reduce the number of GTs that must be online.</w:t>
+        <w:t xml:space="preserve">The small effect of the battery in case 4 has the same cause. With one GT</w:t>
+      </w:r>
+      <w:r>
+        <w:t xml:space="preserve"> </w:t>
+      </w:r>
+      <w:r>
+        <w:t xml:space="preserve">always online, a battery cannot remove the main remaining loss, a turbine</w:t>
+      </w:r>
+      <w:r>
+        <w:t xml:space="preserve"> </w:t>
+      </w:r>
+      <w:r>
+        <w:t xml:space="preserve">idling near minimum load. The large saving (38.7 kt, −32 %) appears only</w:t>
+      </w:r>
+      <w:r>
+        <w:t xml:space="preserve"> </w:t>
+      </w:r>
+      <w:r>
+        <w:t xml:space="preserve">when the battery, or grid-forming wind turbines, can replace the last running</w:t>
+      </w:r>
+      <w:r>
+        <w:t xml:space="preserve"> </w:t>
+      </w:r>
+      <w:r>
+        <w:t xml:space="preserve">GT. Svendsen [11] found the same for a battery that provides</w:t>
+      </w:r>
+      <w:r>
+        <w:t xml:space="preserve"> </w:t>
+      </w:r>
+      <w:r>
+        <w:t xml:space="preserve">reserve. What the present results add is that process flexibility gives much</w:t>
+      </w:r>
+      <w:r>
+        <w:t xml:space="preserve"> </w:t>
+      </w:r>
+      <w:r>
+        <w:t xml:space="preserve">of this benefit without new equipment, because both measures reduce the</w:t>
+      </w:r>
+      <w:r>
+        <w:t xml:space="preserve"> </w:t>
+      </w:r>
+      <w:r>
+        <w:t xml:space="preserve">number of GTs that must be online.</w:t>
       </w:r>
     </w:p>
     <w:p>
@@ -13164,43 +13146,43 @@
         <w:pStyle w:val="BodyText"/>
       </w:pPr>
       <w:r>
-        <w:t xml:space="preserve">A small GT acts on the other part of the same loss: it does not reduce the</w:t>
-      </w:r>
-      <w:r>
-        <w:t xml:space="preserve"> </w:t>
-      </w:r>
-      <w:r>
-        <w:t xml:space="preserve">number of running units, but the no-load fuel of each one. Because the two</w:t>
-      </w:r>
-      <w:r>
-        <w:t xml:space="preserve"> </w:t>
-      </w:r>
-      <w:r>
-        <w:t xml:space="preserve">measures address different parts of the loss, their savings add up almost</w:t>
-      </w:r>
-      <w:r>
-        <w:t xml:space="preserve"> </w:t>
-      </w:r>
-      <w:r>
-        <w:t xml:space="preserve">fully (Section 3.4). This suggests a staged approach for retrofits: first</w:t>
-      </w:r>
-      <w:r>
-        <w:t xml:space="preserve"> </w:t>
-      </w:r>
-      <w:r>
-        <w:t xml:space="preserve">use the flexibility of the existing process, which requires no investment,</w:t>
-      </w:r>
-      <w:r>
-        <w:t xml:space="preserve"> </w:t>
-      </w:r>
-      <w:r>
-        <w:t xml:space="preserve">and then consider replacing one main GT by a smaller unit at its next major</w:t>
-      </w:r>
-      <w:r>
-        <w:t xml:space="preserve"> </w:t>
-      </w:r>
-      <w:r>
-        <w:t xml:space="preserve">overhaul, where the number of starts of the small unit must be acceptable.</w:t>
+        <w:t xml:space="preserve">A small GT works on a different part of the loss. It does not reduce the</w:t>
+      </w:r>
+      <w:r>
+        <w:t xml:space="preserve"> </w:t>
+      </w:r>
+      <w:r>
+        <w:t xml:space="preserve">number of running units; it reduces the no-load fuel of the one that runs.</w:t>
+      </w:r>
+      <w:r>
+        <w:t xml:space="preserve"> </w:t>
+      </w:r>
+      <w:r>
+        <w:t xml:space="preserve">That is why its saving adds almost fully to that of flexibility (Section 3.4).</w:t>
+      </w:r>
+      <w:r>
+        <w:t xml:space="preserve"> </w:t>
+      </w:r>
+      <w:r>
+        <w:t xml:space="preserve">A retrofit could proceed in stages: use the flexibility of the existing</w:t>
+      </w:r>
+      <w:r>
+        <w:t xml:space="preserve"> </w:t>
+      </w:r>
+      <w:r>
+        <w:t xml:space="preserve">process first, at no investment, and consider replacing one main GT by a</w:t>
+      </w:r>
+      <w:r>
+        <w:t xml:space="preserve"> </w:t>
+      </w:r>
+      <w:r>
+        <w:t xml:space="preserve">smaller unit at its next major overhaul, if the small unit tolerates about</w:t>
+      </w:r>
+      <w:r>
+        <w:t xml:space="preserve"> </w:t>
+      </w:r>
+      <w:r>
+        <w:t xml:space="preserve">260 starts a year.</w:t>
       </w:r>
     </w:p>
     <w:bookmarkEnd w:id="67"/>
@@ -13218,55 +13200,49 @@
         <w:pStyle w:val="FirstParagraph"/>
       </w:pPr>
       <w:r>
-        <w:t xml:space="preserve">Studies of wind-powered platforms usually report the benefit of wind with</w:t>
-      </w:r>
-      <w:r>
-        <w:t xml:space="preserve"> </w:t>
-      </w:r>
-      <w:r>
-        <w:t xml:space="preserve">fixed demand, which corresponds to case 2. The present results show that</w:t>
-      </w:r>
-      <w:r>
-        <w:t xml:space="preserve"> </w:t>
-      </w:r>
-      <w:r>
-        <w:t xml:space="preserve">this case underestimates what the same wind farm can achieve: with fixed</w:t>
-      </w:r>
-      <w:r>
-        <w:t xml:space="preserve"> </w:t>
-      </w:r>
-      <w:r>
-        <w:t xml:space="preserve">demand, the emissions of the wind-powered platform are 12 % higher than when</w:t>
-      </w:r>
-      <w:r>
-        <w:t xml:space="preserve"> </w:t>
-      </w:r>
-      <w:r>
-        <w:t xml:space="preserve">the same platform schedules its flexible loads. The CO2 avoided per MWh of wind, a</w:t>
-      </w:r>
-      <w:r>
-        <w:t xml:space="preserve"> </w:t>
-      </w:r>
-      <w:r>
-        <w:t xml:space="preserve">common metric for wind integration, rises from 0.71 t/MWh in case 2 to</w:t>
-      </w:r>
-      <w:r>
-        <w:t xml:space="preserve"> </w:t>
-      </w:r>
-      <w:r>
-        <w:t xml:space="preserve">0.74 t/MWh in case 3 and is 0.51 t/MWh if two GTs are kept online. Published</w:t>
-      </w:r>
-      <w:r>
-        <w:t xml:space="preserve"> </w:t>
-      </w:r>
-      <w:r>
-        <w:t xml:space="preserve">values for different platforms are therefore comparable only if the</w:t>
-      </w:r>
-      <w:r>
-        <w:t xml:space="preserve"> </w:t>
-      </w:r>
-      <w:r>
-        <w:t xml:space="preserve">operating practice of the GTs is stated.</w:t>
+        <w:t xml:space="preserve">Most studies of wind-powered platforms report the benefit of wind at fixed</w:t>
+      </w:r>
+      <w:r>
+        <w:t xml:space="preserve"> </w:t>
+      </w:r>
+      <w:r>
+        <w:t xml:space="preserve">demand, which is case 2 here. That understates what the same wind farm can</w:t>
+      </w:r>
+      <w:r>
+        <w:t xml:space="preserve"> </w:t>
+      </w:r>
+      <w:r>
+        <w:t xml:space="preserve">do: with fixed demand, emissions are 12 % higher than when the platform</w:t>
+      </w:r>
+      <w:r>
+        <w:t xml:space="preserve"> </w:t>
+      </w:r>
+      <w:r>
+        <w:t xml:space="preserve">schedules its flexible loads. The CO2 avoided per MWh of wind, the usual</w:t>
+      </w:r>
+      <w:r>
+        <w:t xml:space="preserve"> </w:t>
+      </w:r>
+      <w:r>
+        <w:t xml:space="preserve">metric for wind integration, is 0.71 t/MWh in case 2, 0.74 t/MWh in case 3,</w:t>
+      </w:r>
+      <w:r>
+        <w:t xml:space="preserve"> </w:t>
+      </w:r>
+      <w:r>
+        <w:t xml:space="preserve">and 0.51 t/MWh if two GTs are kept online. Values reported for different</w:t>
+      </w:r>
+      <w:r>
+        <w:t xml:space="preserve"> </w:t>
+      </w:r>
+      <w:r>
+        <w:t xml:space="preserve">platforms can only be compared if the GT operating practice behind them is</w:t>
+      </w:r>
+      <w:r>
+        <w:t xml:space="preserve"> </w:t>
+      </w:r>
+      <w:r>
+        <w:t xml:space="preserve">stated.</w:t>
       </w:r>
     </w:p>
     <w:p>
@@ -13274,73 +13250,55 @@
         <w:pStyle w:val="BodyText"/>
       </w:pPr>
       <w:r>
-        <w:t xml:space="preserve">Riboldi and Nord [7] found that the economic case for integrating</w:t>
-      </w:r>
-      <w:r>
-        <w:t xml:space="preserve"> </w:t>
-      </w:r>
-      <w:r>
-        <w:t xml:space="preserve">wind depends on gas and CO2 prices. Demand flexibility behaves differently:</w:t>
-      </w:r>
-      <w:r>
-        <w:t xml:space="preserve"> </w:t>
-      </w:r>
-      <w:r>
-        <w:t xml:space="preserve">it requires no investment in power generation, its schedule does not depend</w:t>
-      </w:r>
-      <w:r>
-        <w:t xml:space="preserve"> </w:t>
-      </w:r>
-      <w:r>
-        <w:t xml:space="preserve">on prices, and the fuel it saves is worth about 1,800 NOK per tonne of CO2</w:t>
-      </w:r>
-      <w:r>
-        <w:t xml:space="preserve"> </w:t>
-      </w:r>
-      <w:r>
-        <w:t xml:space="preserve">avoided at the base-case gas price alone. It therefore pays for itself</w:t>
-      </w:r>
-      <w:r>
-        <w:t xml:space="preserve"> </w:t>
-      </w:r>
-      <w:r>
-        <w:t xml:space="preserve">without a carbon price, which makes it attractive also in regions where</w:t>
-      </w:r>
-      <w:r>
-        <w:t xml:space="preserve"> </w:t>
-      </w:r>
-      <w:r>
-        <w:t xml:space="preserve">emissions are not priced. The wind farm, in contrast, needs a CO2 price of</w:t>
-      </w:r>
-      <w:r>
-        <w:t xml:space="preserve"> </w:t>
-      </w:r>
-      <w:r>
-        <w:t xml:space="preserve">about 1,800–2,500 NOK/t to break even at a 7 % discount rate, the same order</w:t>
-      </w:r>
-      <w:r>
-        <w:t xml:space="preserve"> </w:t>
-      </w:r>
-      <w:r>
-        <w:t xml:space="preserve">as power from shore [3,35], and flexibility lowers this</w:t>
-      </w:r>
-      <w:r>
-        <w:t xml:space="preserve"> </w:t>
-      </w:r>
-      <w:r>
-        <w:t xml:space="preserve">threshold by about 400 NOK/t. Power from shore and wind both require large</w:t>
-      </w:r>
-      <w:r>
-        <w:t xml:space="preserve"> </w:t>
-      </w:r>
-      <w:r>
-        <w:t xml:space="preserve">investments, whereas the flexibility studied here requires mainly a change</w:t>
-      </w:r>
-      <w:r>
-        <w:t xml:space="preserve"> </w:t>
-      </w:r>
-      <w:r>
-        <w:t xml:space="preserve">in operation.</w:t>
+        <w:t xml:space="preserve">The economics also differ from those of wind. Riboldi and Nord</w:t>
+      </w:r>
+      <w:r>
+        <w:t xml:space="preserve"> </w:t>
+      </w:r>
+      <w:r>
+        <w:t xml:space="preserve">[7] found that integrating wind pays only with favourable gas and</w:t>
+      </w:r>
+      <w:r>
+        <w:t xml:space="preserve"> </w:t>
+      </w:r>
+      <w:r>
+        <w:t xml:space="preserve">CO2 prices. Flexibility needs no investment in power generation, its schedule</w:t>
+      </w:r>
+      <w:r>
+        <w:t xml:space="preserve"> </w:t>
+      </w:r>
+      <w:r>
+        <w:t xml:space="preserve">does not depend on prices, and the fuel it saves is worth about 1,800 NOK per</w:t>
+      </w:r>
+      <w:r>
+        <w:t xml:space="preserve"> </w:t>
+      </w:r>
+      <w:r>
+        <w:t xml:space="preserve">tonne of CO2 avoided at the base-case gas price alone. It pays without any</w:t>
+      </w:r>
+      <w:r>
+        <w:t xml:space="preserve"> </w:t>
+      </w:r>
+      <w:r>
+        <w:t xml:space="preserve">carbon price, which matters in regions where emissions are not priced. The</w:t>
+      </w:r>
+      <w:r>
+        <w:t xml:space="preserve"> </w:t>
+      </w:r>
+      <w:r>
+        <w:t xml:space="preserve">wind farm, by comparison, needs about 1,800–2,500 NOK/t at a 7 % discount</w:t>
+      </w:r>
+      <w:r>
+        <w:t xml:space="preserve"> </w:t>
+      </w:r>
+      <w:r>
+        <w:t xml:space="preserve">rate to break even, the same order as power from shore</w:t>
+      </w:r>
+      <w:r>
+        <w:t xml:space="preserve"> </w:t>
+      </w:r>
+      <w:r>
+        <w:t xml:space="preserve">[3,35]; flexibility lowers this by about 400 NOK/t.</w:t>
       </w:r>
     </w:p>
     <w:p>
@@ -13348,43 +13306,43 @@
         <w:pStyle w:val="BodyText"/>
       </w:pPr>
       <w:r>
-        <w:t xml:space="preserve">Demand-side management in onshore industry is usually motivated by</w:t>
-      </w:r>
-      <w:r>
-        <w:t xml:space="preserve"> </w:t>
-      </w:r>
-      <w:r>
-        <w:t xml:space="preserve">electricity prices [14,15]. On an off-grid</w:t>
-      </w:r>
-      <w:r>
-        <w:t xml:space="preserve"> </w:t>
-      </w:r>
-      <w:r>
-        <w:t xml:space="preserve">platform, the value of moving a load comes instead from the discrete</w:t>
-      </w:r>
-      <w:r>
-        <w:t xml:space="preserve"> </w:t>
-      </w:r>
-      <w:r>
-        <w:t xml:space="preserve">decisions of the platform’s own power plant: whether a GT must be started</w:t>
-      </w:r>
-      <w:r>
-        <w:t xml:space="preserve"> </w:t>
-      </w:r>
-      <w:r>
-        <w:t xml:space="preserve">or can be stopped. This makes the value of flexibility strongly</w:t>
-      </w:r>
-      <w:r>
-        <w:t xml:space="preserve"> </w:t>
-      </w:r>
-      <w:r>
-        <w:t xml:space="preserve">state-dependent, and it is why an hourly unit commitment model, rather than</w:t>
-      </w:r>
-      <w:r>
-        <w:t xml:space="preserve"> </w:t>
-      </w:r>
-      <w:r>
-        <w:t xml:space="preserve">a model of energy shifting alone, is needed to estimate it.</w:t>
+        <w:t xml:space="preserve">The comparison with onshore demand response is less direct than it may seem.</w:t>
+      </w:r>
+      <w:r>
+        <w:t xml:space="preserve"> </w:t>
+      </w:r>
+      <w:r>
+        <w:t xml:space="preserve">Industrial studies respond to electricity prices</w:t>
+      </w:r>
+      <w:r>
+        <w:t xml:space="preserve"> </w:t>
+      </w:r>
+      <w:r>
+        <w:t xml:space="preserve">[14,15]. On an off-grid platform the value of</w:t>
+      </w:r>
+      <w:r>
+        <w:t xml:space="preserve"> </w:t>
+      </w:r>
+      <w:r>
+        <w:t xml:space="preserve">a load shift comes from discrete decisions of the platform’s own power</w:t>
+      </w:r>
+      <w:r>
+        <w:t xml:space="preserve"> </w:t>
+      </w:r>
+      <w:r>
+        <w:t xml:space="preserve">plant, whether a GT must start or can stop. The value therefore depends on</w:t>
+      </w:r>
+      <w:r>
+        <w:t xml:space="preserve"> </w:t>
+      </w:r>
+      <w:r>
+        <w:t xml:space="preserve">the state of the system hour by hour, and a model of energy shifting alone,</w:t>
+      </w:r>
+      <w:r>
+        <w:t xml:space="preserve"> </w:t>
+      </w:r>
+      <w:r>
+        <w:t xml:space="preserve">without unit commitment, would miss most of it.</w:t>
       </w:r>
     </w:p>
     <w:bookmarkEnd w:id="68"/>
@@ -13402,91 +13360,25 @@
         <w:pStyle w:val="FirstParagraph"/>
       </w:pPr>
       <w:r>
-        <w:t xml:space="preserve">Three implications follow for operators. First, the flexibility already</w:t>
-      </w:r>
-      <w:r>
-        <w:t xml:space="preserve"> </w:t>
-      </w:r>
-      <w:r>
-        <w:t xml:space="preserve">exists on most oil platforms with water injection and can be used without</w:t>
-      </w:r>
-      <w:r>
-        <w:t xml:space="preserve"> </w:t>
-      </w:r>
-      <w:r>
-        <w:t xml:space="preserve">new equipment. It does, however, require the power management system to</w:t>
-      </w:r>
-      <w:r>
-        <w:t xml:space="preserve"> </w:t>
-      </w:r>
-      <w:r>
-        <w:t xml:space="preserve">coordinate injection with the GTs and the wind forecast, which today are</w:t>
-      </w:r>
-      <w:r>
-        <w:t xml:space="preserve"> </w:t>
-      </w:r>
-      <w:r>
-        <w:t xml:space="preserve">usually controlled separately. Second, the reservoir requirement is modest:</w:t>
-      </w:r>
-      <w:r>
-        <w:t xml:space="preserve"> </w:t>
-      </w:r>
-      <w:r>
-        <w:t xml:space="preserve">about 24 h of injection deferral, averaging 9.0 h, is small compared with the</w:t>
-      </w:r>
-      <w:r>
-        <w:t xml:space="preserve"> </w:t>
-      </w:r>
-      <w:r>
-        <w:t xml:space="preserve">time scale of reservoir pressure support, which is managed on the basis of</w:t>
-      </w:r>
-      <w:r>
-        <w:t xml:space="preserve"> </w:t>
-      </w:r>
-      <w:r>
-        <w:t xml:space="preserve">cumulative voidage replacement over months. It should nevertheless be</w:t>
-      </w:r>
-      <w:r>
-        <w:t xml:space="preserve"> </w:t>
-      </w:r>
-      <w:r>
-        <w:t xml:space="preserve">confirmed with reservoir engineers for each field, because some reservoirs,</w:t>
-      </w:r>
-      <w:r>
-        <w:t xml:space="preserve"> </w:t>
-      </w:r>
-      <w:r>
-        <w:t xml:space="preserve">for example those close to the bubble point, may be sensitive to short</w:t>
-      </w:r>
-      <w:r>
-        <w:t xml:space="preserve"> </w:t>
-      </w:r>
-      <w:r>
-        <w:t xml:space="preserve">pressure drops. Third, the schedule changes the duty of the injection pumps.</w:t>
-      </w:r>
-      <w:r>
-        <w:t xml:space="preserve"> </w:t>
-      </w:r>
-      <w:r>
-        <w:t xml:space="preserve">In case 3 the number of running injection pumps changes about 730 times per</w:t>
-      </w:r>
-      <w:r>
-        <w:t xml:space="preserve"> </w:t>
-      </w:r>
-      <w:r>
-        <w:t xml:space="preserve">year, or about two pump starts per day. The model does not penalise pump</w:t>
-      </w:r>
-      <w:r>
-        <w:t xml:space="preserve"> </w:t>
-      </w:r>
-      <w:r>
-        <w:t xml:space="preserve">starts; a start cost or a minimum run time for the pumps could be added at</w:t>
-      </w:r>
-      <w:r>
-        <w:t xml:space="preserve"> </w:t>
-      </w:r>
-      <w:r>
-        <w:t xml:space="preserve">little cost to the saving, since the deficit limit is rarely active.</w:t>
+        <w:t xml:space="preserve">For operators, the first point is that this flexibility already exists on</w:t>
+      </w:r>
+      <w:r>
+        <w:t xml:space="preserve"> </w:t>
+      </w:r>
+      <w:r>
+        <w:t xml:space="preserve">most oil platforms with water injection. Using it needs no new equipment, but</w:t>
+      </w:r>
+      <w:r>
+        <w:t xml:space="preserve"> </w:t>
+      </w:r>
+      <w:r>
+        <w:t xml:space="preserve">it does need a power management system that coordinates injection with the</w:t>
+      </w:r>
+      <w:r>
+        <w:t xml:space="preserve"> </w:t>
+      </w:r>
+      <w:r>
+        <w:t xml:space="preserve">GTs and a wind forecast; today these are usually controlled separately.</w:t>
       </w:r>
     </w:p>
     <w:p>
@@ -13494,73 +13386,25 @@
         <w:pStyle w:val="BodyText"/>
       </w:pPr>
       <w:r>
-        <w:t xml:space="preserve">The result does not depend on the carbon price, because the fuel saved has</w:t>
-      </w:r>
-      <w:r>
-        <w:t xml:space="preserve"> </w:t>
-      </w:r>
-      <w:r>
-        <w:t xml:space="preserve">value on its own. Operating practice, and in particular how many GTs must be</w:t>
-      </w:r>
-      <w:r>
-        <w:t xml:space="preserve"> </w:t>
-      </w:r>
-      <w:r>
-        <w:t xml:space="preserve">online and what counts as reserve, has a larger effect on emissions than any</w:t>
-      </w:r>
-      <w:r>
-        <w:t xml:space="preserve"> </w:t>
-      </w:r>
-      <w:r>
-        <w:t xml:space="preserve">price or the battery size. Rules that keep two GTs online for redundancy</w:t>
-      </w:r>
-      <w:r>
-        <w:t xml:space="preserve"> </w:t>
-      </w:r>
-      <w:r>
-        <w:t xml:space="preserve">increase emissions by 40 % with fixed demand and by 53 % with flexible</w:t>
-      </w:r>
-      <w:r>
-        <w:t xml:space="preserve"> </w:t>
-      </w:r>
-      <w:r>
-        <w:t xml:space="preserve">demand compared with the optimised schedules, and</w:t>
-      </w:r>
-      <w:r>
-        <w:t xml:space="preserve"> </w:t>
-      </w:r>
-      <w:r>
-        <w:t xml:space="preserve">they remove most of the value of flexibility. Such rules are set for good</w:t>
-      </w:r>
-      <w:r>
-        <w:t xml:space="preserve"> </w:t>
-      </w:r>
-      <w:r>
-        <w:t xml:space="preserve">reasons of safety and regularity, but the results suggest that they deserve</w:t>
-      </w:r>
-      <w:r>
-        <w:t xml:space="preserve"> </w:t>
-      </w:r>
-      <w:r>
-        <w:t xml:space="preserve">the same attention as the choice of wind farm when emissions are to be</w:t>
-      </w:r>
-      <w:r>
-        <w:t xml:space="preserve"> </w:t>
-      </w:r>
-      <w:r>
-        <w:t xml:space="preserve">reduced, and that technologies that can provide reserve and stability</w:t>
-      </w:r>
-      <w:r>
-        <w:t xml:space="preserve"> </w:t>
-      </w:r>
-      <w:r>
-        <w:t xml:space="preserve">without a running GT, such as grid-forming batteries, are the next step after</w:t>
-      </w:r>
-      <w:r>
-        <w:t xml:space="preserve"> </w:t>
-      </w:r>
-      <w:r>
-        <w:t xml:space="preserve">demand flexibility.</w:t>
+        <w:t xml:space="preserve">The reservoir requirement is modest. About 24 h of deferral, averaging 9.0 h,</w:t>
+      </w:r>
+      <w:r>
+        <w:t xml:space="preserve"> </w:t>
+      </w:r>
+      <w:r>
+        <w:t xml:space="preserve">is short compared with the months over which voidage replacement is normally</w:t>
+      </w:r>
+      <w:r>
+        <w:t xml:space="preserve"> </w:t>
+      </w:r>
+      <w:r>
+        <w:t xml:space="preserve">managed. It still has to be confirmed for each field. A reservoir close to</w:t>
+      </w:r>
+      <w:r>
+        <w:t xml:space="preserve"> </w:t>
+      </w:r>
+      <w:r>
+        <w:t xml:space="preserve">its bubble point, for example, may not accept even short pressure drops.</w:t>
       </w:r>
     </w:p>
     <w:p>
@@ -13568,49 +13412,131 @@
         <w:pStyle w:val="BodyText"/>
       </w:pPr>
       <w:r>
-        <w:t xml:space="preserve">The approach can be transferred to other installations. A platform benefits</w:t>
-      </w:r>
-      <w:r>
-        <w:t xml:space="preserve"> </w:t>
-      </w:r>
-      <w:r>
-        <w:t xml:space="preserve">most from load flexibility when it has a large deferrable consumer, when its</w:t>
-      </w:r>
-      <w:r>
-        <w:t xml:space="preserve"> </w:t>
-      </w:r>
-      <w:r>
-        <w:t xml:space="preserve">average demand lies close to the capacity of one GT minus the reserve, and</w:t>
-      </w:r>
-      <w:r>
-        <w:t xml:space="preserve"> </w:t>
-      </w:r>
-      <w:r>
-        <w:t xml:space="preserve">when its wind supply is of the same order as its demand. Gas compression on</w:t>
-      </w:r>
-      <w:r>
-        <w:t xml:space="preserve"> </w:t>
-      </w:r>
-      <w:r>
-        <w:t xml:space="preserve">gas export platforms, electric heating, and the regeneration of glycol or</w:t>
-      </w:r>
-      <w:r>
-        <w:t xml:space="preserve"> </w:t>
-      </w:r>
-      <w:r>
-        <w:t xml:space="preserve">other process chemicals are candidates for deferrable loads on other types</w:t>
-      </w:r>
-      <w:r>
-        <w:t xml:space="preserve"> </w:t>
-      </w:r>
-      <w:r>
-        <w:t xml:space="preserve">of installation, provided that buffer storage, such as line pack or tank</w:t>
-      </w:r>
-      <w:r>
-        <w:t xml:space="preserve"> </w:t>
-      </w:r>
-      <w:r>
-        <w:t xml:space="preserve">volume, is available.</w:t>
+        <w:t xml:space="preserve">The schedule also changes the duty of the injection pumps. In case 3 the</w:t>
+      </w:r>
+      <w:r>
+        <w:t xml:space="preserve"> </w:t>
+      </w:r>
+      <w:r>
+        <w:t xml:space="preserve">number of running pumps changes about 730 times a year, roughly two starts</w:t>
+      </w:r>
+      <w:r>
+        <w:t xml:space="preserve"> </w:t>
+      </w:r>
+      <w:r>
+        <w:t xml:space="preserve">per day, and the model does not penalise this. A start cost or a minimum run</w:t>
+      </w:r>
+      <w:r>
+        <w:t xml:space="preserve"> </w:t>
+      </w:r>
+      <w:r>
+        <w:t xml:space="preserve">time would probably cost little of the saving, because the deficit limit is</w:t>
+      </w:r>
+      <w:r>
+        <w:t xml:space="preserve"> </w:t>
+      </w:r>
+      <w:r>
+        <w:t xml:space="preserve">rarely reached; this has not been tested.</w:t>
+      </w:r>
+    </w:p>
+    <w:p>
+      <w:pPr>
+        <w:pStyle w:val="BodyText"/>
+      </w:pPr>
+      <w:r>
+        <w:t xml:space="preserve">Operating practice deserves at least as much attention as hardware. How many</w:t>
+      </w:r>
+      <w:r>
+        <w:t xml:space="preserve"> </w:t>
+      </w:r>
+      <w:r>
+        <w:t xml:space="preserve">GTs must be online, and what counts as reserve, affects emissions more than</w:t>
+      </w:r>
+      <w:r>
+        <w:t xml:space="preserve"> </w:t>
+      </w:r>
+      <w:r>
+        <w:t xml:space="preserve">any price or the battery size. Rules that keep two GTs online for redundancy</w:t>
+      </w:r>
+      <w:r>
+        <w:t xml:space="preserve"> </w:t>
+      </w:r>
+      <w:r>
+        <w:t xml:space="preserve">raise emissions by 40 % with fixed demand and by 53 % with flexible demand,</w:t>
+      </w:r>
+      <w:r>
+        <w:t xml:space="preserve"> </w:t>
+      </w:r>
+      <w:r>
+        <w:t xml:space="preserve">and they remove most of the value of flexibility. Such rules exist for good</w:t>
+      </w:r>
+      <w:r>
+        <w:t xml:space="preserve"> </w:t>
+      </w:r>
+      <w:r>
+        <w:t xml:space="preserve">reasons of safety and regularity. Changing them requires a technical case,</w:t>
+      </w:r>
+      <w:r>
+        <w:t xml:space="preserve"> </w:t>
+      </w:r>
+      <w:r>
+        <w:t xml:space="preserve">for instance grid-forming batteries that can provide reserve and stability</w:t>
+      </w:r>
+      <w:r>
+        <w:t xml:space="preserve"> </w:t>
+      </w:r>
+      <w:r>
+        <w:t xml:space="preserve">without a running GT, and that is the logical next step after demand</w:t>
+      </w:r>
+      <w:r>
+        <w:t xml:space="preserve"> </w:t>
+      </w:r>
+      <w:r>
+        <w:t xml:space="preserve">flexibility.</w:t>
+      </w:r>
+    </w:p>
+    <w:p>
+      <w:pPr>
+        <w:pStyle w:val="BodyText"/>
+      </w:pPr>
+      <w:r>
+        <w:t xml:space="preserve">The approach should transfer to other installations, with caveats. A</w:t>
+      </w:r>
+      <w:r>
+        <w:t xml:space="preserve"> </w:t>
+      </w:r>
+      <w:r>
+        <w:t xml:space="preserve">platform gains most when it has a large deferrable consumer, an average</w:t>
+      </w:r>
+      <w:r>
+        <w:t xml:space="preserve"> </w:t>
+      </w:r>
+      <w:r>
+        <w:t xml:space="preserve">demand close to the capacity of one GT minus the reserve, and a wind supply</w:t>
+      </w:r>
+      <w:r>
+        <w:t xml:space="preserve"> </w:t>
+      </w:r>
+      <w:r>
+        <w:t xml:space="preserve">of the same order as its demand. On other installation types, gas export</w:t>
+      </w:r>
+      <w:r>
+        <w:t xml:space="preserve"> </w:t>
+      </w:r>
+      <w:r>
+        <w:t xml:space="preserve">compression, electric heating and the regeneration of glycol or other</w:t>
+      </w:r>
+      <w:r>
+        <w:t xml:space="preserve"> </w:t>
+      </w:r>
+      <w:r>
+        <w:t xml:space="preserve">process chemicals could be deferrable, but only where buffer storage such as</w:t>
+      </w:r>
+      <w:r>
+        <w:t xml:space="preserve"> </w:t>
+      </w:r>
+      <w:r>
+        <w:t xml:space="preserve">line pack or tank volume exists.</w:t>
       </w:r>
     </w:p>
     <w:bookmarkEnd w:id="69"/>
@@ -13628,67 +13554,55 @@
         <w:pStyle w:val="FirstParagraph"/>
       </w:pPr>
       <w:r>
-        <w:t xml:space="preserve">The size of the saving depends on assumptions that were not all varied, and</w:t>
-      </w:r>
-      <w:r>
-        <w:t xml:space="preserve"> </w:t>
-      </w:r>
-      <w:r>
-        <w:t xml:space="preserve">it is useful to consider how they act through the mechanism identified</w:t>
-      </w:r>
-      <w:r>
-        <w:t xml:space="preserve"> </w:t>
-      </w:r>
-      <w:r>
-        <w:t xml:space="preserve">above. The decisive quantity is the number of hours in which, with fixed</w:t>
-      </w:r>
-      <w:r>
-        <w:t xml:space="preserve"> </w:t>
-      </w:r>
-      <w:r>
-        <w:t xml:space="preserve">demand, the platform needs one GT more than its load requires. This number</w:t>
-      </w:r>
-      <w:r>
-        <w:t xml:space="preserve"> </w:t>
-      </w:r>
-      <w:r>
-        <w:t xml:space="preserve">grows with the reserve requirement, with the average demand relative to</w:t>
-      </w:r>
-      <w:r>
-        <w:t xml:space="preserve"> </w:t>
-      </w:r>
-      <w:r>
-        <w:t xml:space="preserve">the capacity of one GT, and with the time the wind spends just below the</w:t>
-      </w:r>
-      <w:r>
-        <w:t xml:space="preserve"> </w:t>
-      </w:r>
-      <w:r>
-        <w:t xml:space="preserve">demand. A larger reserve than the 5 MW used here, or a platform whose</w:t>
-      </w:r>
-      <w:r>
-        <w:t xml:space="preserve"> </w:t>
-      </w:r>
-      <w:r>
-        <w:t xml:space="preserve">demand lies closer to the rating of one GT, would therefore increase the</w:t>
-      </w:r>
-      <w:r>
-        <w:t xml:space="preserve"> </w:t>
-      </w:r>
-      <w:r>
-        <w:t xml:space="preserve">value of flexibility, while a platform with much spare GT capacity, or a</w:t>
-      </w:r>
-      <w:r>
-        <w:t xml:space="preserve"> </w:t>
-      </w:r>
-      <w:r>
-        <w:t xml:space="preserve">wind farm much larger than the demand, would reduce it, as the wind farm</w:t>
-      </w:r>
-      <w:r>
-        <w:t xml:space="preserve"> </w:t>
-      </w:r>
-      <w:r>
-        <w:t xml:space="preserve">sensitivity confirms.</w:t>
+        <w:t xml:space="preserve">Not every assumption was varied, so it helps to trace how the untested ones</w:t>
+      </w:r>
+      <w:r>
+        <w:t xml:space="preserve"> </w:t>
+      </w:r>
+      <w:r>
+        <w:t xml:space="preserve">act through the mechanism above. What decides the saving is the number of</w:t>
+      </w:r>
+      <w:r>
+        <w:t xml:space="preserve"> </w:t>
+      </w:r>
+      <w:r>
+        <w:t xml:space="preserve">hours in which, at fixed demand, the platform runs one GT more than its load</w:t>
+      </w:r>
+      <w:r>
+        <w:t xml:space="preserve"> </w:t>
+      </w:r>
+      <w:r>
+        <w:t xml:space="preserve">requires. That number rises with the reserve requirement, with the demand</w:t>
+      </w:r>
+      <w:r>
+        <w:t xml:space="preserve"> </w:t>
+      </w:r>
+      <w:r>
+        <w:t xml:space="preserve">relative to the capacity of one GT, and with the time the wind spends just</w:t>
+      </w:r>
+      <w:r>
+        <w:t xml:space="preserve"> </w:t>
+      </w:r>
+      <w:r>
+        <w:t xml:space="preserve">below the demand. A reserve larger than 5 MW, or a platform whose demand is</w:t>
+      </w:r>
+      <w:r>
+        <w:t xml:space="preserve"> </w:t>
+      </w:r>
+      <w:r>
+        <w:t xml:space="preserve">closer to one GT’s rating, should make flexibility more valuable. Much spare</w:t>
+      </w:r>
+      <w:r>
+        <w:t xml:space="preserve"> </w:t>
+      </w:r>
+      <w:r>
+        <w:t xml:space="preserve">GT capacity, or a wind farm far larger than the demand, should make it less</w:t>
+      </w:r>
+      <w:r>
+        <w:t xml:space="preserve"> </w:t>
+      </w:r>
+      <w:r>
+        <w:t xml:space="preserve">valuable; the wind farm sensitivity shows the latter.</w:t>
       </w:r>
     </w:p>
     <w:p>
@@ -13696,67 +13610,55 @@
         <w:pStyle w:val="BodyText"/>
       </w:pPr>
       <w:r>
-        <w:t xml:space="preserve">The flexible load itself matters less than its size suggests. Injection is</w:t>
-      </w:r>
-      <w:r>
-        <w:t xml:space="preserve"> </w:t>
-      </w:r>
-      <w:r>
-        <w:t xml:space="preserve">deferred by stopping whole pumps, so the assumed minimum flow of the pumps</w:t>
-      </w:r>
-      <w:r>
-        <w:t xml:space="preserve"> </w:t>
-      </w:r>
-      <w:r>
-        <w:t xml:space="preserve">affects the cost of running one pump at low rate but hardly the saving,</w:t>
-      </w:r>
-      <w:r>
-        <w:t xml:space="preserve"> </w:t>
-      </w:r>
-      <w:r>
-        <w:t xml:space="preserve">which comes from the hours in which injection is cut. A lower injection</w:t>
-      </w:r>
-      <w:r>
-        <w:t xml:space="preserve"> </w:t>
-      </w:r>
-      <w:r>
-        <w:t xml:space="preserve">target would leave more room above the target for catching up, and a higher</w:t>
-      </w:r>
-      <w:r>
-        <w:t xml:space="preserve"> </w:t>
-      </w:r>
-      <w:r>
-        <w:t xml:space="preserve">target less; at the extreme of a 100 % target, deferred injection could</w:t>
-      </w:r>
-      <w:r>
-        <w:t xml:space="preserve"> </w:t>
-      </w:r>
-      <w:r>
-        <w:t xml:space="preserve">never be caught up and flexibility would be lost. The heat balance was never</w:t>
-      </w:r>
-      <w:r>
-        <w:t xml:space="preserve"> </w:t>
-      </w:r>
-      <w:r>
-        <w:t xml:space="preserve">binding in the base cases: the electric heater was not used, because the</w:t>
-      </w:r>
-      <w:r>
-        <w:t xml:space="preserve"> </w:t>
-      </w:r>
-      <w:r>
-        <w:t xml:space="preserve">waste heat of the running GT always covered the 3 MW demand. Platforms with</w:t>
-      </w:r>
-      <w:r>
-        <w:t xml:space="preserve"> </w:t>
-      </w:r>
-      <w:r>
-        <w:t xml:space="preserve">a higher heat demand, or with heat supplied by the GTs that are to be</w:t>
-      </w:r>
-      <w:r>
-        <w:t xml:space="preserve"> </w:t>
-      </w:r>
-      <w:r>
-        <w:t xml:space="preserve">stopped, would see a smaller saving unless the heat can also be scheduled.</w:t>
+        <w:t xml:space="preserve">The flexible load matters less than its size suggests. Injection is cut by</w:t>
+      </w:r>
+      <w:r>
+        <w:t xml:space="preserve"> </w:t>
+      </w:r>
+      <w:r>
+        <w:t xml:space="preserve">stopping whole pumps, so the assumed minimum pump flow changes the cost of</w:t>
+      </w:r>
+      <w:r>
+        <w:t xml:space="preserve"> </w:t>
+      </w:r>
+      <w:r>
+        <w:t xml:space="preserve">running one pump at low rate but hardly the saving. The injection target</w:t>
+      </w:r>
+      <w:r>
+        <w:t xml:space="preserve"> </w:t>
+      </w:r>
+      <w:r>
+        <w:t xml:space="preserve">matters more. A lower target leaves more room for catching up; at a 100 %</w:t>
+      </w:r>
+      <w:r>
+        <w:t xml:space="preserve"> </w:t>
+      </w:r>
+      <w:r>
+        <w:t xml:space="preserve">target, deferred injection could never be caught up and the flexibility</w:t>
+      </w:r>
+      <w:r>
+        <w:t xml:space="preserve"> </w:t>
+      </w:r>
+      <w:r>
+        <w:t xml:space="preserve">would vanish. The heat balance never bound in the base cases, since the waste</w:t>
+      </w:r>
+      <w:r>
+        <w:t xml:space="preserve"> </w:t>
+      </w:r>
+      <w:r>
+        <w:t xml:space="preserve">heat of the running GT always covered the 3 MW demand. A platform with a</w:t>
+      </w:r>
+      <w:r>
+        <w:t xml:space="preserve"> </w:t>
+      </w:r>
+      <w:r>
+        <w:t xml:space="preserve">larger heat demand, or one that relies on the heat of the GTs to be stopped,</w:t>
+      </w:r>
+      <w:r>
+        <w:t xml:space="preserve"> </w:t>
+      </w:r>
+      <w:r>
+        <w:t xml:space="preserve">would save less unless its heat can be scheduled too.</w:t>
       </w:r>
     </w:p>
     <w:p>
@@ -13764,25 +13666,19 @@
         <w:pStyle w:val="BodyText"/>
       </w:pPr>
       <w:r>
-        <w:t xml:space="preserve">The conclusion that production should never be shed is robust. The value of</w:t>
-      </w:r>
-      <w:r>
-        <w:t xml:space="preserve"> </w:t>
-      </w:r>
-      <w:r>
-        <w:t xml:space="preserve">lost oil and gas exceeds the value of the fuel saved by about two orders of</w:t>
-      </w:r>
-      <w:r>
-        <w:t xml:space="preserve"> </w:t>
-      </w:r>
-      <w:r>
-        <w:t xml:space="preserve">magnitude, so even large changes in prices or efficiencies would not change</w:t>
-      </w:r>
-      <w:r>
-        <w:t xml:space="preserve"> </w:t>
-      </w:r>
-      <w:r>
-        <w:t xml:space="preserve">it.</w:t>
+        <w:t xml:space="preserve">That production should never be shed is the most robust result. Lost oil and</w:t>
+      </w:r>
+      <w:r>
+        <w:t xml:space="preserve"> </w:t>
+      </w:r>
+      <w:r>
+        <w:t xml:space="preserve">gas are worth about a hundred times more than the fuel saved; no plausible</w:t>
+      </w:r>
+      <w:r>
+        <w:t xml:space="preserve"> </w:t>
+      </w:r>
+      <w:r>
+        <w:t xml:space="preserve">change in prices or efficiencies reverses that.</w:t>
       </w:r>
     </w:p>
     <w:bookmarkEnd w:id="70"/>
@@ -13800,103 +13696,49 @@
         <w:pStyle w:val="FirstParagraph"/>
       </w:pPr>
       <w:r>
-        <w:t xml:space="preserve">The platform is generic. Its fluid composition, minimum-flow limits,</w:t>
-      </w:r>
-      <w:r>
-        <w:t xml:space="preserve"> </w:t>
-      </w:r>
-      <w:r>
-        <w:t xml:space="preserve">injection target and deficit limit are assumptions, although the</w:t>
-      </w:r>
-      <w:r>
-        <w:t xml:space="preserve"> </w:t>
-      </w:r>
-      <w:r>
-        <w:t xml:space="preserve">sensitivity analysis shows that the result is robust to the deficit limit,</w:t>
-      </w:r>
-      <w:r>
-        <w:t xml:space="preserve"> </w:t>
-      </w:r>
-      <w:r>
-        <w:t xml:space="preserve">the prices and the battery size. The process is represented by steady</w:t>
-      </w:r>
-      <w:r>
-        <w:t xml:space="preserve"> </w:t>
-      </w:r>
-      <w:r>
-        <w:t xml:space="preserve">states: transient compressor behaviour, the start-up times of pumps and GTs</w:t>
-      </w:r>
-      <w:r>
-        <w:t xml:space="preserve"> </w:t>
-      </w:r>
-      <w:r>
-        <w:t xml:space="preserve">beyond the start cost, and the reservoir response to deferred injection are</w:t>
-      </w:r>
-      <w:r>
-        <w:t xml:space="preserve"> </w:t>
-      </w:r>
-      <w:r>
-        <w:t xml:space="preserve">not modelled. The scheduler has perfect foresight of wind within each week,</w:t>
-      </w:r>
-      <w:r>
-        <w:t xml:space="preserve"> </w:t>
-      </w:r>
-      <w:r>
-        <w:t xml:space="preserve">so the savings are an upper bound for real operation with forecast errors;</w:t>
-      </w:r>
-      <w:r>
-        <w:t xml:space="preserve"> </w:t>
-      </w:r>
-      <w:r>
-        <w:t xml:space="preserve">because the deficit limit is rarely active, a forecast-based schedule with a</w:t>
-      </w:r>
-      <w:r>
-        <w:t xml:space="preserve"> </w:t>
-      </w:r>
-      <w:r>
-        <w:t xml:space="preserve">safety margin on the deficit is expected to retain most of the saving. The</w:t>
-      </w:r>
-      <w:r>
-        <w:t xml:space="preserve"> </w:t>
-      </w:r>
-      <w:r>
-        <w:t xml:space="preserve">analysis covers ten weather years at one site and a single platform without</w:t>
-      </w:r>
-      <w:r>
-        <w:t xml:space="preserve"> </w:t>
-      </w:r>
-      <w:r>
-        <w:t xml:space="preserve">power import or export. The economic indicators rest on the cost of one first-of-a-kind</w:t>
-      </w:r>
-      <w:r>
-        <w:t xml:space="preserve"> </w:t>
-      </w:r>
-      <w:r>
-        <w:t xml:space="preserve">floating wind farm and do not include the cost of implementing flexibility,</w:t>
-      </w:r>
-      <w:r>
-        <w:t xml:space="preserve"> </w:t>
-      </w:r>
-      <w:r>
-        <w:t xml:space="preserve">the battery or the small GT on an existing platform, for which break-even</w:t>
-      </w:r>
-      <w:r>
-        <w:t xml:space="preserve"> </w:t>
-      </w:r>
-      <w:r>
-        <w:t xml:space="preserve">values are given instead. Finally, the small GT</w:t>
-      </w:r>
-      <w:r>
-        <w:t xml:space="preserve"> </w:t>
-      </w:r>
-      <w:r>
-        <w:t xml:space="preserve">in the fleet sensitivity is given the same relative part-load curve as the</w:t>
-      </w:r>
-      <w:r>
-        <w:t xml:space="preserve"> </w:t>
-      </w:r>
-      <w:r>
-        <w:t xml:space="preserve">main units, because its manufacturer publishes only the full-load rating.</w:t>
+        <w:t xml:space="preserve">The platform is generic: fluid composition, minimum-flow limits, injection</w:t>
+      </w:r>
+      <w:r>
+        <w:t xml:space="preserve"> </w:t>
+      </w:r>
+      <w:r>
+        <w:t xml:space="preserve">target and deficit limit are assumed, although the result is insensitive to</w:t>
+      </w:r>
+      <w:r>
+        <w:t xml:space="preserve"> </w:t>
+      </w:r>
+      <w:r>
+        <w:t xml:space="preserve">the deficit limit, the prices and the battery size. The process is</w:t>
+      </w:r>
+      <w:r>
+        <w:t xml:space="preserve"> </w:t>
+      </w:r>
+      <w:r>
+        <w:t xml:space="preserve">represented by steady states. Transient compressor behaviour, start-up times</w:t>
+      </w:r>
+      <w:r>
+        <w:t xml:space="preserve"> </w:t>
+      </w:r>
+      <w:r>
+        <w:t xml:space="preserve">of pumps and GTs beyond a start cost, and the reservoir response to deferred</w:t>
+      </w:r>
+      <w:r>
+        <w:t xml:space="preserve"> </w:t>
+      </w:r>
+      <w:r>
+        <w:t xml:space="preserve">injection are not modelled. The GT part-load curve is a Willans line from</w:t>
+      </w:r>
+      <w:r>
+        <w:t xml:space="preserve"> </w:t>
+      </w:r>
+      <w:r>
+        <w:t xml:space="preserve">LEOGO; a real machine’s curve, including its emissions at very low load, may</w:t>
+      </w:r>
+      <w:r>
+        <w:t xml:space="preserve"> </w:t>
+      </w:r>
+      <w:r>
+        <w:t xml:space="preserve">differ.</w:t>
       </w:r>
     </w:p>
     <w:p>
@@ -13904,37 +13746,105 @@
         <w:pStyle w:val="BodyText"/>
       </w:pPr>
       <w:r>
-        <w:t xml:space="preserve">Future work should test the approach with wind forecast errors, add pump</w:t>
-      </w:r>
-      <w:r>
-        <w:t xml:space="preserve"> </w:t>
-      </w:r>
-      <w:r>
-        <w:t xml:space="preserve">start costs and a reservoir model for the injection</w:t>
-      </w:r>
-      <w:r>
-        <w:t xml:space="preserve"> </w:t>
-      </w:r>
-      <w:r>
-        <w:t xml:space="preserve">deficit, and apply it to real platform data. Combining load flexibility with</w:t>
-      </w:r>
-      <w:r>
-        <w:t xml:space="preserve"> </w:t>
-      </w:r>
-      <w:r>
-        <w:t xml:space="preserve">grid-forming storage, and evaluating the investment cost of the whole system,</w:t>
-      </w:r>
-      <w:r>
-        <w:t xml:space="preserve"> </w:t>
-      </w:r>
-      <w:r>
-        <w:t xml:space="preserve">would show how far an off-grid platform can be decarbonised before power from</w:t>
-      </w:r>
-      <w:r>
-        <w:t xml:space="preserve"> </w:t>
-      </w:r>
-      <w:r>
-        <w:t xml:space="preserve">shore becomes necessary.</w:t>
+        <w:t xml:space="preserve">The scheduler knows the wind a week ahead, so the savings are an upper bound.</w:t>
+      </w:r>
+      <w:r>
+        <w:t xml:space="preserve"> </w:t>
+      </w:r>
+      <w:r>
+        <w:t xml:space="preserve">Because the deficit limit is rarely reached, a forecast-based schedule that</w:t>
+      </w:r>
+      <w:r>
+        <w:t xml:space="preserve"> </w:t>
+      </w:r>
+      <w:r>
+        <w:t xml:space="preserve">keeps a margin on the deficit should retain most of them, but that remains</w:t>
+      </w:r>
+      <w:r>
+        <w:t xml:space="preserve"> </w:t>
+      </w:r>
+      <w:r>
+        <w:t xml:space="preserve">to be shown. The ten weather years cover one site and one platform, without</w:t>
+      </w:r>
+      <w:r>
+        <w:t xml:space="preserve"> </w:t>
+      </w:r>
+      <w:r>
+        <w:t xml:space="preserve">power import or export. The economic indicators rest on the cost of a single</w:t>
+      </w:r>
+      <w:r>
+        <w:t xml:space="preserve"> </w:t>
+      </w:r>
+      <w:r>
+        <w:t xml:space="preserve">first-of-a-kind floating wind farm and leave out the cost of implementing</w:t>
+      </w:r>
+      <w:r>
+        <w:t xml:space="preserve"> </w:t>
+      </w:r>
+      <w:r>
+        <w:t xml:space="preserve">flexibility, the battery or the small GT, for which only break-even values</w:t>
+      </w:r>
+      <w:r>
+        <w:t xml:space="preserve"> </w:t>
+      </w:r>
+      <w:r>
+        <w:t xml:space="preserve">are given. The small GT uses the main units’ relative part-load curve,</w:t>
+      </w:r>
+      <w:r>
+        <w:t xml:space="preserve"> </w:t>
+      </w:r>
+      <w:r>
+        <w:t xml:space="preserve">because its manufacturer publishes only the full-load rating.</w:t>
+      </w:r>
+    </w:p>
+    <w:p>
+      <w:pPr>
+        <w:pStyle w:val="BodyText"/>
+      </w:pPr>
+      <w:r>
+        <w:t xml:space="preserve">The next steps are concrete. Rolling schedules with forecast errors would</w:t>
+      </w:r>
+      <w:r>
+        <w:t xml:space="preserve"> </w:t>
+      </w:r>
+      <w:r>
+        <w:t xml:space="preserve">show how much of the saving survives without perfect foresight. Pump start</w:t>
+      </w:r>
+      <w:r>
+        <w:t xml:space="preserve"> </w:t>
+      </w:r>
+      <w:r>
+        <w:t xml:space="preserve">costs and a simple reservoir pressure model would test the injection</w:t>
+      </w:r>
+      <w:r>
+        <w:t xml:space="preserve"> </w:t>
+      </w:r>
+      <w:r>
+        <w:t xml:space="preserve">schedule against operational limits. Data from a platform with wind supply,</w:t>
+      </w:r>
+      <w:r>
+        <w:t xml:space="preserve"> </w:t>
+      </w:r>
+      <w:r>
+        <w:t xml:space="preserve">such as those served by Hywind Tampen, would allow the model to be</w:t>
+      </w:r>
+      <w:r>
+        <w:t xml:space="preserve"> </w:t>
+      </w:r>
+      <w:r>
+        <w:t xml:space="preserve">calibrated. Finally, combining load flexibility with grid-forming storage and</w:t>
+      </w:r>
+      <w:r>
+        <w:t xml:space="preserve"> </w:t>
+      </w:r>
+      <w:r>
+        <w:t xml:space="preserve">the investment cost of the whole system would show how far an off-grid</w:t>
+      </w:r>
+      <w:r>
+        <w:t xml:space="preserve"> </w:t>
+      </w:r>
+      <w:r>
+        <w:t xml:space="preserve">platform can be decarbonised before power from shore is needed.</w:t>
       </w:r>
     </w:p>
     <w:bookmarkEnd w:id="71"/>
@@ -13953,25 +13863,25 @@
         <w:pStyle w:val="FirstParagraph"/>
       </w:pPr>
       <w:r>
-        <w:t xml:space="preserve">This paper mapped the electric demand of a generic North Sea oil platform</w:t>
-      </w:r>
-      <w:r>
-        <w:t xml:space="preserve"> </w:t>
-      </w:r>
-      <w:r>
-        <w:t xml:space="preserve">from a process model, classified the consumers by flexibility, and scheduled</w:t>
-      </w:r>
-      <w:r>
-        <w:t xml:space="preserve"> </w:t>
-      </w:r>
-      <w:r>
-        <w:t xml:space="preserve">them together with the gas turbines and a wind farm at hourly resolution</w:t>
-      </w:r>
-      <w:r>
-        <w:t xml:space="preserve"> </w:t>
-      </w:r>
-      <w:r>
-        <w:t xml:space="preserve">for ten weather years. The main conclusions are:</w:t>
+        <w:t xml:space="preserve">The electric demand of a generic North Sea oil platform was mapped from a</w:t>
+      </w:r>
+      <w:r>
+        <w:t xml:space="preserve"> </w:t>
+      </w:r>
+      <w:r>
+        <w:t xml:space="preserve">process model, the consumers were classified by flexibility, and the</w:t>
+      </w:r>
+      <w:r>
+        <w:t xml:space="preserve"> </w:t>
+      </w:r>
+      <w:r>
+        <w:t xml:space="preserve">flexible ones were scheduled together with the gas turbines and a 30 MW wind</w:t>
+      </w:r>
+      <w:r>
+        <w:t xml:space="preserve"> </w:t>
+      </w:r>
+      <w:r>
+        <w:t xml:space="preserve">farm, hour by hour, for ten weather years. The main conclusions are:</w:t>
       </w:r>
     </w:p>
     <w:p>
@@ -13983,13 +13893,13 @@
         <w:pStyle w:val="Compact"/>
       </w:pPr>
       <w:r>
-        <w:t xml:space="preserve">A 30 MW wind farm halves the CO2 emissions of the 20 MW platform (−49 %)</w:t>
-      </w:r>
-      <w:r>
-        <w:t xml:space="preserve"> </w:t>
-      </w:r>
-      <w:r>
-        <w:t xml:space="preserve">with fixed demand.</w:t>
+        <w:t xml:space="preserve">With fixed demand, the wind farm halves the CO2 emissions of the 20 MW</w:t>
+      </w:r>
+      <w:r>
+        <w:t xml:space="preserve"> </w:t>
+      </w:r>
+      <w:r>
+        <w:t xml:space="preserve">platform (−49 %).</w:t>
       </w:r>
     </w:p>
     <w:p>
@@ -14001,25 +13911,25 @@
         <w:pStyle w:val="Compact"/>
       </w:pPr>
       <w:r>
-        <w:t xml:space="preserve">Scheduling flexible topside consumers reduces emissions by a further 11 %</w:t>
-      </w:r>
-      <w:r>
-        <w:t xml:space="preserve"> </w:t>
-      </w:r>
-      <w:r>
-        <w:t xml:space="preserve">(7.2 kt/yr) without lost production, and by 10.5–11.7 % in each of ten</w:t>
-      </w:r>
-      <w:r>
-        <w:t xml:space="preserve"> </w:t>
-      </w:r>
-      <w:r>
-        <w:t xml:space="preserve">weather years. GT low-load hours fall by 34 % and</w:t>
-      </w:r>
-      <w:r>
-        <w:t xml:space="preserve"> </w:t>
-      </w:r>
-      <w:r>
-        <w:t xml:space="preserve">GT starts nearly disappear.</w:t>
+        <w:t xml:space="preserve">Scheduling the flexible consumers cuts emissions by a further 11 %</w:t>
+      </w:r>
+      <w:r>
+        <w:t xml:space="preserve"> </w:t>
+      </w:r>
+      <w:r>
+        <w:t xml:space="preserve">(7.2 kt/yr), without lost production. Across the ten weather years the</w:t>
+      </w:r>
+      <w:r>
+        <w:t xml:space="preserve"> </w:t>
+      </w:r>
+      <w:r>
+        <w:t xml:space="preserve">saving stays between 10.5 % and 11.7 %. GT low-load hours fall by 34 %,</w:t>
+      </w:r>
+      <w:r>
+        <w:t xml:space="preserve"> </w:t>
+      </w:r>
+      <w:r>
+        <w:t xml:space="preserve">and GT starts nearly disappear.</w:t>
       </w:r>
     </w:p>
     <w:p>
@@ -14031,19 +13941,13 @@
         <w:pStyle w:val="Compact"/>
       </w:pPr>
       <w:r>
-        <w:t xml:space="preserve">Water injection provides all of the useful flexibility; shedding</w:t>
-      </w:r>
-      <w:r>
-        <w:t xml:space="preserve"> </w:t>
-      </w:r>
-      <w:r>
-        <w:t xml:space="preserve">production is never worthwhile. A deferral capacity of about 24 h of</w:t>
-      </w:r>
-      <w:r>
-        <w:t xml:space="preserve"> </w:t>
-      </w:r>
-      <w:r>
-        <w:t xml:space="preserve">injection is enough.</w:t>
+        <w:t xml:space="preserve">All of the useful flexibility comes from water injection. Shedding</w:t>
+      </w:r>
+      <w:r>
+        <w:t xml:space="preserve"> </w:t>
+      </w:r>
+      <w:r>
+        <w:t xml:space="preserve">production never pays, and about 24 h of deferral is enough.</w:t>
       </w:r>
     </w:p>
     <w:p>
@@ -14055,25 +13959,25 @@
         <w:pStyle w:val="Compact"/>
       </w:pPr>
       <w:r>
-        <w:t xml:space="preserve">The saving comes from avoiding a second running gas turbine, not from</w:t>
-      </w:r>
-      <w:r>
-        <w:t xml:space="preserve"> </w:t>
-      </w:r>
-      <w:r>
-        <w:t xml:space="preserve">shifting energy. It therefore depends on operating practice: keeping two</w:t>
-      </w:r>
-      <w:r>
-        <w:t xml:space="preserve"> </w:t>
-      </w:r>
-      <w:r>
-        <w:t xml:space="preserve">GTs online removes most of it, while allowing all GTs to stop, with a</w:t>
-      </w:r>
-      <w:r>
-        <w:t xml:space="preserve"> </w:t>
-      </w:r>
-      <w:r>
-        <w:t xml:space="preserve">battery providing reserve, would reduce emissions by a further third.</w:t>
+        <w:t xml:space="preserve">The saving comes from avoiding a second running GT, not from shifting</w:t>
+      </w:r>
+      <w:r>
+        <w:t xml:space="preserve"> </w:t>
+      </w:r>
+      <w:r>
+        <w:t xml:space="preserve">energy. Rules that keep two GTs online remove most of it; allowing all GTs</w:t>
+      </w:r>
+      <w:r>
+        <w:t xml:space="preserve"> </w:t>
+      </w:r>
+      <w:r>
+        <w:t xml:space="preserve">to stop, with a battery for reserve, would cut emissions by a further</w:t>
+      </w:r>
+      <w:r>
+        <w:t xml:space="preserve"> </w:t>
+      </w:r>
+      <w:r>
+        <w:t xml:space="preserve">third.</w:t>
       </w:r>
     </w:p>
     <w:p>
@@ -14085,19 +13989,13 @@
         <w:pStyle w:val="Compact"/>
       </w:pPr>
       <w:r>
-        <w:t xml:space="preserve">Replacing one main GT by a small unit (11.35 MW) saves a further 17 %,</w:t>
-      </w:r>
-      <w:r>
-        <w:t xml:space="preserve"> </w:t>
-      </w:r>
-      <w:r>
-        <w:t xml:space="preserve">and the saving of flexibility remains 11 % with the small unit installed;</w:t>
-      </w:r>
-      <w:r>
-        <w:t xml:space="preserve"> </w:t>
-      </w:r>
-      <w:r>
-        <w:t xml:space="preserve">the two measures are complementary.</w:t>
+        <w:t xml:space="preserve">A small GT (11.35 MW) replacing one main unit saves another 17 %, and</w:t>
+      </w:r>
+      <w:r>
+        <w:t xml:space="preserve"> </w:t>
+      </w:r>
+      <w:r>
+        <w:t xml:space="preserve">flexibility still saves 11 % with it installed.</w:t>
       </w:r>
     </w:p>
     <w:p>
@@ -14109,25 +14007,25 @@
         <w:pStyle w:val="Compact"/>
       </w:pPr>
       <w:r>
-        <w:t xml:space="preserve">Carbon price, gas price and battery size alone have little effect, and</w:t>
-      </w:r>
-      <w:r>
-        <w:t xml:space="preserve"> </w:t>
-      </w:r>
-      <w:r>
-        <w:t xml:space="preserve">the fuel saved pays for the measure without a carbon price: flexibility</w:t>
-      </w:r>
-      <w:r>
-        <w:t xml:space="preserve"> </w:t>
-      </w:r>
-      <w:r>
-        <w:t xml:space="preserve">breaks even for an implementation cost up to 137 MNOK, and it lowers the</w:t>
-      </w:r>
-      <w:r>
-        <w:t xml:space="preserve"> </w:t>
-      </w:r>
-      <w:r>
-        <w:t xml:space="preserve">abatement cost of the wind farm from 2,180–2,519 to 1,774–2,078 NOK/t.</w:t>
+        <w:t xml:space="preserve">Prices and battery size alone change little. Flexibility pays for itself</w:t>
+      </w:r>
+      <w:r>
+        <w:t xml:space="preserve"> </w:t>
+      </w:r>
+      <w:r>
+        <w:t xml:space="preserve">from fuel savings, breaks even for an implementation cost of up to</w:t>
+      </w:r>
+      <w:r>
+        <w:t xml:space="preserve"> </w:t>
+      </w:r>
+      <w:r>
+        <w:t xml:space="preserve">137 MNOK, and lowers the abatement cost of the wind farm from 2,180–2,519</w:t>
+      </w:r>
+      <w:r>
+        <w:t xml:space="preserve"> </w:t>
+      </w:r>
+      <w:r>
+        <w:t xml:space="preserve">to 1,774–2,078 NOK/t.</w:t>
       </w:r>
     </w:p>
     <w:p>
@@ -14153,19 +14051,25 @@
         <w:pStyle w:val="FirstParagraph"/>
       </w:pPr>
       <w:r>
-        <w:t xml:space="preserve">Load flexibility is thus a low-cost first step for reducing emissions from</w:t>
-      </w:r>
-      <w:r>
-        <w:t xml:space="preserve"> </w:t>
-      </w:r>
-      <w:r>
-        <w:t xml:space="preserve">wind-powered platforms, which can be implemented on existing installations</w:t>
-      </w:r>
-      <w:r>
-        <w:t xml:space="preserve"> </w:t>
-      </w:r>
-      <w:r>
-        <w:t xml:space="preserve">and which complements storage and grid-forming technologies.</w:t>
+        <w:t xml:space="preserve">Three questions remain open: how much of the saving survives realistic wind</w:t>
+      </w:r>
+      <w:r>
+        <w:t xml:space="preserve"> </w:t>
+      </w:r>
+      <w:r>
+        <w:t xml:space="preserve">forecasts, what limits pump starts and reservoir pressure place on the</w:t>
+      </w:r>
+      <w:r>
+        <w:t xml:space="preserve"> </w:t>
+      </w:r>
+      <w:r>
+        <w:t xml:space="preserve">injection schedule, and whether grid-forming storage can remove the last</w:t>
+      </w:r>
+      <w:r>
+        <w:t xml:space="preserve"> </w:t>
+      </w:r>
+      <w:r>
+        <w:t xml:space="preserve">running GT safely.</w:t>
       </w:r>
     </w:p>
     <w:bookmarkEnd w:id="73"/>

</xml_diff>

<commit_message>
Readable black figure text, no rule under equations, space after tables
* all figure text pure black; no label prints below 8 pt at the 16 cm figure width
* fixed overlaps (system diagram, demand map legend, part-load legend, monthly
  legend) and redrew the validation figure with values in the tick labels
* capitalised Case labels in figures
* equation tables: header-row formatting off and cell borders cleared, which
  removes the line the default table style drew under each equation
* space between each table and the following paragraph
</commit_message>
<xml_diff>
--- a/docs/paper/paper.docx
+++ b/docs/paper/paper.docx
@@ -1236,7 +1236,7 @@
       <w:r>
         <w:drawing>
           <wp:inline>
-            <wp:extent cx="5399999" cy="2671337"/>
+            <wp:extent cx="5759999" cy="2849426"/>
             <wp:effectExtent b="0" l="0" r="0" t="0"/>
             <wp:docPr descr="" title="" id="22" name="Picture"/>
             <a:graphic>
@@ -1257,7 +1257,7 @@
                   <pic:spPr bwMode="auto">
                     <a:xfrm>
                       <a:off x="0" y="0"/>
-                      <a:ext cx="5399999" cy="2671337"/>
+                      <a:ext cx="5759999" cy="2849426"/>
                     </a:xfrm>
                     <a:prstGeom prst="rect">
                       <a:avLst/>
@@ -1379,7 +1379,7 @@
     <w:tbl>
       <w:tblPr>
         <w:tblW w:type="auto" w:w="0"/>
-        <w:tblLook w:firstColumn="1" w:firstRow="1" w:lastColumn="0" w:lastRow="0" w:noHBand="0" w:noVBand="1" w:val="04A0"/>
+        <w:tblLook w:firstColumn="0" w:firstRow="0" w:lastColumn="0" w:lastRow="0" w:noHBand="0" w:noVBand="1" w:val="0000"/>
         <w:tblBorders>
           <w:top w:val="nil" w:sz="4" w:space="0" w:color="000000"/>
           <w:left w:val="nil" w:sz="4" w:space="0" w:color="000000"/>
@@ -1390,20 +1390,32 @@
         </w:tblBorders>
       </w:tblPr>
       <w:tblGrid>
-        <w:gridCol w:w="3120"/>
-        <w:gridCol w:w="3120"/>
-        <w:gridCol w:w="3120"/>
+        <w:gridCol w:w="680"/>
+        <w:gridCol w:w="7540"/>
+        <w:gridCol w:w="850"/>
       </w:tblGrid>
       <w:tr>
         <w:tc>
           <w:tcPr>
             <w:tcW w:type="dxa" w:w="680"/>
+            <w:tcBorders>
+              <w:top w:val="nil" w:sz="4" w:space="0" w:color="000000"/>
+              <w:left w:val="nil" w:sz="4" w:space="0" w:color="000000"/>
+              <w:bottom w:val="nil" w:sz="4" w:space="0" w:color="000000"/>
+              <w:right w:val="nil" w:sz="4" w:space="0" w:color="000000"/>
+            </w:tcBorders>
           </w:tcPr>
           <w:p/>
         </w:tc>
         <w:tc>
           <w:tcPr>
             <w:tcW w:type="dxa" w:w="7540"/>
+            <w:tcBorders>
+              <w:top w:val="nil" w:sz="4" w:space="0" w:color="000000"/>
+              <w:left w:val="nil" w:sz="4" w:space="0" w:color="000000"/>
+              <w:bottom w:val="nil" w:sz="4" w:space="0" w:color="000000"/>
+              <w:right w:val="nil" w:sz="4" w:space="0" w:color="000000"/>
+            </w:tcBorders>
           </w:tcPr>
           <w:p>
             <w:pPr>
@@ -1543,6 +1555,12 @@
         <w:tc>
           <w:tcPr>
             <w:tcW w:type="dxa" w:w="850"/>
+            <w:tcBorders>
+              <w:top w:val="nil" w:sz="4" w:space="0" w:color="000000"/>
+              <w:left w:val="nil" w:sz="4" w:space="0" w:color="000000"/>
+              <w:bottom w:val="nil" w:sz="4" w:space="0" w:color="000000"/>
+              <w:right w:val="nil" w:sz="4" w:space="0" w:color="000000"/>
+            </w:tcBorders>
           </w:tcPr>
           <w:p>
             <w:pPr>
@@ -1648,7 +1666,7 @@
     <w:tbl>
       <w:tblPr>
         <w:tblW w:type="auto" w:w="0"/>
-        <w:tblLook w:firstColumn="1" w:firstRow="1" w:lastColumn="0" w:lastRow="0" w:noHBand="0" w:noVBand="1" w:val="04A0"/>
+        <w:tblLook w:firstColumn="0" w:firstRow="0" w:lastColumn="0" w:lastRow="0" w:noHBand="0" w:noVBand="1" w:val="0000"/>
         <w:tblBorders>
           <w:top w:val="nil" w:sz="4" w:space="0" w:color="000000"/>
           <w:left w:val="nil" w:sz="4" w:space="0" w:color="000000"/>
@@ -1659,20 +1677,32 @@
         </w:tblBorders>
       </w:tblPr>
       <w:tblGrid>
-        <w:gridCol w:w="3120"/>
-        <w:gridCol w:w="3120"/>
-        <w:gridCol w:w="3120"/>
+        <w:gridCol w:w="680"/>
+        <w:gridCol w:w="7540"/>
+        <w:gridCol w:w="850"/>
       </w:tblGrid>
       <w:tr>
         <w:tc>
           <w:tcPr>
             <w:tcW w:type="dxa" w:w="680"/>
+            <w:tcBorders>
+              <w:top w:val="nil" w:sz="4" w:space="0" w:color="000000"/>
+              <w:left w:val="nil" w:sz="4" w:space="0" w:color="000000"/>
+              <w:bottom w:val="nil" w:sz="4" w:space="0" w:color="000000"/>
+              <w:right w:val="nil" w:sz="4" w:space="0" w:color="000000"/>
+            </w:tcBorders>
           </w:tcPr>
           <w:p/>
         </w:tc>
         <w:tc>
           <w:tcPr>
             <w:tcW w:type="dxa" w:w="7540"/>
+            <w:tcBorders>
+              <w:top w:val="nil" w:sz="4" w:space="0" w:color="000000"/>
+              <w:left w:val="nil" w:sz="4" w:space="0" w:color="000000"/>
+              <w:bottom w:val="nil" w:sz="4" w:space="0" w:color="000000"/>
+              <w:right w:val="nil" w:sz="4" w:space="0" w:color="000000"/>
+            </w:tcBorders>
           </w:tcPr>
           <w:p>
             <w:pPr>
@@ -1900,6 +1930,12 @@
         <w:tc>
           <w:tcPr>
             <w:tcW w:type="dxa" w:w="850"/>
+            <w:tcBorders>
+              <w:top w:val="nil" w:sz="4" w:space="0" w:color="000000"/>
+              <w:left w:val="nil" w:sz="4" w:space="0" w:color="000000"/>
+              <w:bottom w:val="nil" w:sz="4" w:space="0" w:color="000000"/>
+              <w:right w:val="nil" w:sz="4" w:space="0" w:color="000000"/>
+            </w:tcBorders>
           </w:tcPr>
           <w:p>
             <w:pPr>
@@ -3046,6 +3082,7 @@
     <w:p>
       <w:pPr>
         <w:pStyle w:val="BodyText"/>
+        <w:spacing w:before="200"/>
       </w:pPr>
       <w:r>
         <w:t xml:space="preserve">At fixed pressures and efficiencies, steady-state power is proportional to</w:t>
@@ -3138,7 +3175,7 @@
     <w:tbl>
       <w:tblPr>
         <w:tblW w:type="auto" w:w="0"/>
-        <w:tblLook w:firstColumn="1" w:firstRow="1" w:lastColumn="0" w:lastRow="0" w:noHBand="0" w:noVBand="1" w:val="04A0"/>
+        <w:tblLook w:firstColumn="0" w:firstRow="0" w:lastColumn="0" w:lastRow="0" w:noHBand="0" w:noVBand="1" w:val="0000"/>
         <w:tblBorders>
           <w:top w:val="nil" w:sz="4" w:space="0" w:color="000000"/>
           <w:left w:val="nil" w:sz="4" w:space="0" w:color="000000"/>
@@ -3149,20 +3186,32 @@
         </w:tblBorders>
       </w:tblPr>
       <w:tblGrid>
-        <w:gridCol w:w="3120"/>
-        <w:gridCol w:w="3120"/>
-        <w:gridCol w:w="3120"/>
+        <w:gridCol w:w="680"/>
+        <w:gridCol w:w="7540"/>
+        <w:gridCol w:w="850"/>
       </w:tblGrid>
       <w:tr>
         <w:tc>
           <w:tcPr>
             <w:tcW w:type="dxa" w:w="680"/>
+            <w:tcBorders>
+              <w:top w:val="nil" w:sz="4" w:space="0" w:color="000000"/>
+              <w:left w:val="nil" w:sz="4" w:space="0" w:color="000000"/>
+              <w:bottom w:val="nil" w:sz="4" w:space="0" w:color="000000"/>
+              <w:right w:val="nil" w:sz="4" w:space="0" w:color="000000"/>
+            </w:tcBorders>
           </w:tcPr>
           <w:p/>
         </w:tc>
         <w:tc>
           <w:tcPr>
             <w:tcW w:type="dxa" w:w="7540"/>
+            <w:tcBorders>
+              <w:top w:val="nil" w:sz="4" w:space="0" w:color="000000"/>
+              <w:left w:val="nil" w:sz="4" w:space="0" w:color="000000"/>
+              <w:bottom w:val="nil" w:sz="4" w:space="0" w:color="000000"/>
+              <w:right w:val="nil" w:sz="4" w:space="0" w:color="000000"/>
+            </w:tcBorders>
           </w:tcPr>
           <w:p>
             <w:pPr>
@@ -3406,6 +3455,12 @@
         <w:tc>
           <w:tcPr>
             <w:tcW w:type="dxa" w:w="850"/>
+            <w:tcBorders>
+              <w:top w:val="nil" w:sz="4" w:space="0" w:color="000000"/>
+              <w:left w:val="nil" w:sz="4" w:space="0" w:color="000000"/>
+              <w:bottom w:val="nil" w:sz="4" w:space="0" w:color="000000"/>
+              <w:right w:val="nil" w:sz="4" w:space="0" w:color="000000"/>
+            </w:tcBorders>
           </w:tcPr>
           <w:p>
             <w:pPr>
@@ -3760,7 +3815,7 @@
     <w:tbl>
       <w:tblPr>
         <w:tblW w:type="auto" w:w="0"/>
-        <w:tblLook w:firstColumn="1" w:firstRow="1" w:lastColumn="0" w:lastRow="0" w:noHBand="0" w:noVBand="1" w:val="04A0"/>
+        <w:tblLook w:firstColumn="0" w:firstRow="0" w:lastColumn="0" w:lastRow="0" w:noHBand="0" w:noVBand="1" w:val="0000"/>
         <w:tblBorders>
           <w:top w:val="nil" w:sz="4" w:space="0" w:color="000000"/>
           <w:left w:val="nil" w:sz="4" w:space="0" w:color="000000"/>
@@ -3771,20 +3826,32 @@
         </w:tblBorders>
       </w:tblPr>
       <w:tblGrid>
-        <w:gridCol w:w="3120"/>
-        <w:gridCol w:w="3120"/>
-        <w:gridCol w:w="3120"/>
+        <w:gridCol w:w="680"/>
+        <w:gridCol w:w="7540"/>
+        <w:gridCol w:w="850"/>
       </w:tblGrid>
       <w:tr>
         <w:tc>
           <w:tcPr>
             <w:tcW w:type="dxa" w:w="680"/>
+            <w:tcBorders>
+              <w:top w:val="nil" w:sz="4" w:space="0" w:color="000000"/>
+              <w:left w:val="nil" w:sz="4" w:space="0" w:color="000000"/>
+              <w:bottom w:val="nil" w:sz="4" w:space="0" w:color="000000"/>
+              <w:right w:val="nil" w:sz="4" w:space="0" w:color="000000"/>
+            </w:tcBorders>
           </w:tcPr>
           <w:p/>
         </w:tc>
         <w:tc>
           <w:tcPr>
             <w:tcW w:type="dxa" w:w="7540"/>
+            <w:tcBorders>
+              <w:top w:val="nil" w:sz="4" w:space="0" w:color="000000"/>
+              <w:left w:val="nil" w:sz="4" w:space="0" w:color="000000"/>
+              <w:bottom w:val="nil" w:sz="4" w:space="0" w:color="000000"/>
+              <w:right w:val="nil" w:sz="4" w:space="0" w:color="000000"/>
+            </w:tcBorders>
           </w:tcPr>
           <w:p>
             <w:pPr>
@@ -3989,6 +4056,12 @@
         <w:tc>
           <w:tcPr>
             <w:tcW w:type="dxa" w:w="850"/>
+            <w:tcBorders>
+              <w:top w:val="nil" w:sz="4" w:space="0" w:color="000000"/>
+              <w:left w:val="nil" w:sz="4" w:space="0" w:color="000000"/>
+              <w:bottom w:val="nil" w:sz="4" w:space="0" w:color="000000"/>
+              <w:right w:val="nil" w:sz="4" w:space="0" w:color="000000"/>
+            </w:tcBorders>
           </w:tcPr>
           <w:p>
             <w:pPr>
@@ -4139,7 +4212,7 @@
     <w:tbl>
       <w:tblPr>
         <w:tblW w:type="auto" w:w="0"/>
-        <w:tblLook w:firstColumn="1" w:firstRow="1" w:lastColumn="0" w:lastRow="0" w:noHBand="0" w:noVBand="1" w:val="04A0"/>
+        <w:tblLook w:firstColumn="0" w:firstRow="0" w:lastColumn="0" w:lastRow="0" w:noHBand="0" w:noVBand="1" w:val="0000"/>
         <w:tblBorders>
           <w:top w:val="nil" w:sz="4" w:space="0" w:color="000000"/>
           <w:left w:val="nil" w:sz="4" w:space="0" w:color="000000"/>
@@ -4150,20 +4223,32 @@
         </w:tblBorders>
       </w:tblPr>
       <w:tblGrid>
-        <w:gridCol w:w="3120"/>
-        <w:gridCol w:w="3120"/>
-        <w:gridCol w:w="3120"/>
+        <w:gridCol w:w="680"/>
+        <w:gridCol w:w="7540"/>
+        <w:gridCol w:w="850"/>
       </w:tblGrid>
       <w:tr>
         <w:tc>
           <w:tcPr>
             <w:tcW w:type="dxa" w:w="680"/>
+            <w:tcBorders>
+              <w:top w:val="nil" w:sz="4" w:space="0" w:color="000000"/>
+              <w:left w:val="nil" w:sz="4" w:space="0" w:color="000000"/>
+              <w:bottom w:val="nil" w:sz="4" w:space="0" w:color="000000"/>
+              <w:right w:val="nil" w:sz="4" w:space="0" w:color="000000"/>
+            </w:tcBorders>
           </w:tcPr>
           <w:p/>
         </w:tc>
         <w:tc>
           <w:tcPr>
             <w:tcW w:type="dxa" w:w="7540"/>
+            <w:tcBorders>
+              <w:top w:val="nil" w:sz="4" w:space="0" w:color="000000"/>
+              <w:left w:val="nil" w:sz="4" w:space="0" w:color="000000"/>
+              <w:bottom w:val="nil" w:sz="4" w:space="0" w:color="000000"/>
+              <w:right w:val="nil" w:sz="4" w:space="0" w:color="000000"/>
+            </w:tcBorders>
           </w:tcPr>
           <w:p>
             <w:pPr>
@@ -4589,6 +4674,12 @@
         <w:tc>
           <w:tcPr>
             <w:tcW w:type="dxa" w:w="850"/>
+            <w:tcBorders>
+              <w:top w:val="nil" w:sz="4" w:space="0" w:color="000000"/>
+              <w:left w:val="nil" w:sz="4" w:space="0" w:color="000000"/>
+              <w:bottom w:val="nil" w:sz="4" w:space="0" w:color="000000"/>
+              <w:right w:val="nil" w:sz="4" w:space="0" w:color="000000"/>
+            </w:tcBorders>
           </w:tcPr>
           <w:p>
             <w:pPr>
@@ -4953,7 +5044,7 @@
     <w:tbl>
       <w:tblPr>
         <w:tblW w:type="auto" w:w="0"/>
-        <w:tblLook w:firstColumn="1" w:firstRow="1" w:lastColumn="0" w:lastRow="0" w:noHBand="0" w:noVBand="1" w:val="04A0"/>
+        <w:tblLook w:firstColumn="0" w:firstRow="0" w:lastColumn="0" w:lastRow="0" w:noHBand="0" w:noVBand="1" w:val="0000"/>
         <w:tblBorders>
           <w:top w:val="nil" w:sz="4" w:space="0" w:color="000000"/>
           <w:left w:val="nil" w:sz="4" w:space="0" w:color="000000"/>
@@ -4964,20 +5055,32 @@
         </w:tblBorders>
       </w:tblPr>
       <w:tblGrid>
-        <w:gridCol w:w="3120"/>
-        <w:gridCol w:w="3120"/>
-        <w:gridCol w:w="3120"/>
+        <w:gridCol w:w="680"/>
+        <w:gridCol w:w="7540"/>
+        <w:gridCol w:w="850"/>
       </w:tblGrid>
       <w:tr>
         <w:tc>
           <w:tcPr>
             <w:tcW w:type="dxa" w:w="680"/>
+            <w:tcBorders>
+              <w:top w:val="nil" w:sz="4" w:space="0" w:color="000000"/>
+              <w:left w:val="nil" w:sz="4" w:space="0" w:color="000000"/>
+              <w:bottom w:val="nil" w:sz="4" w:space="0" w:color="000000"/>
+              <w:right w:val="nil" w:sz="4" w:space="0" w:color="000000"/>
+            </w:tcBorders>
           </w:tcPr>
           <w:p/>
         </w:tc>
         <w:tc>
           <w:tcPr>
             <w:tcW w:type="dxa" w:w="7540"/>
+            <w:tcBorders>
+              <w:top w:val="nil" w:sz="4" w:space="0" w:color="000000"/>
+              <w:left w:val="nil" w:sz="4" w:space="0" w:color="000000"/>
+              <w:bottom w:val="nil" w:sz="4" w:space="0" w:color="000000"/>
+              <w:right w:val="nil" w:sz="4" w:space="0" w:color="000000"/>
+            </w:tcBorders>
           </w:tcPr>
           <w:p>
             <w:pPr>
@@ -5257,6 +5360,12 @@
         <w:tc>
           <w:tcPr>
             <w:tcW w:type="dxa" w:w="850"/>
+            <w:tcBorders>
+              <w:top w:val="nil" w:sz="4" w:space="0" w:color="000000"/>
+              <w:left w:val="nil" w:sz="4" w:space="0" w:color="000000"/>
+              <w:bottom w:val="nil" w:sz="4" w:space="0" w:color="000000"/>
+              <w:right w:val="nil" w:sz="4" w:space="0" w:color="000000"/>
+            </w:tcBorders>
           </w:tcPr>
           <w:p>
             <w:pPr>
@@ -5276,7 +5385,7 @@
     <w:tbl>
       <w:tblPr>
         <w:tblW w:type="auto" w:w="0"/>
-        <w:tblLook w:firstColumn="1" w:firstRow="1" w:lastColumn="0" w:lastRow="0" w:noHBand="0" w:noVBand="1" w:val="04A0"/>
+        <w:tblLook w:firstColumn="0" w:firstRow="0" w:lastColumn="0" w:lastRow="0" w:noHBand="0" w:noVBand="1" w:val="0000"/>
         <w:tblBorders>
           <w:top w:val="nil" w:sz="4" w:space="0" w:color="000000"/>
           <w:left w:val="nil" w:sz="4" w:space="0" w:color="000000"/>
@@ -5287,20 +5396,32 @@
         </w:tblBorders>
       </w:tblPr>
       <w:tblGrid>
-        <w:gridCol w:w="3120"/>
-        <w:gridCol w:w="3120"/>
-        <w:gridCol w:w="3120"/>
+        <w:gridCol w:w="680"/>
+        <w:gridCol w:w="7540"/>
+        <w:gridCol w:w="850"/>
       </w:tblGrid>
       <w:tr>
         <w:tc>
           <w:tcPr>
             <w:tcW w:type="dxa" w:w="680"/>
+            <w:tcBorders>
+              <w:top w:val="nil" w:sz="4" w:space="0" w:color="000000"/>
+              <w:left w:val="nil" w:sz="4" w:space="0" w:color="000000"/>
+              <w:bottom w:val="nil" w:sz="4" w:space="0" w:color="000000"/>
+              <w:right w:val="nil" w:sz="4" w:space="0" w:color="000000"/>
+            </w:tcBorders>
           </w:tcPr>
           <w:p/>
         </w:tc>
         <w:tc>
           <w:tcPr>
             <w:tcW w:type="dxa" w:w="7540"/>
+            <w:tcBorders>
+              <w:top w:val="nil" w:sz="4" w:space="0" w:color="000000"/>
+              <w:left w:val="nil" w:sz="4" w:space="0" w:color="000000"/>
+              <w:bottom w:val="nil" w:sz="4" w:space="0" w:color="000000"/>
+              <w:right w:val="nil" w:sz="4" w:space="0" w:color="000000"/>
+            </w:tcBorders>
           </w:tcPr>
           <w:p>
             <w:pPr>
@@ -5400,6 +5521,12 @@
         <w:tc>
           <w:tcPr>
             <w:tcW w:type="dxa" w:w="850"/>
+            <w:tcBorders>
+              <w:top w:val="nil" w:sz="4" w:space="0" w:color="000000"/>
+              <w:left w:val="nil" w:sz="4" w:space="0" w:color="000000"/>
+              <w:bottom w:val="nil" w:sz="4" w:space="0" w:color="000000"/>
+              <w:right w:val="nil" w:sz="4" w:space="0" w:color="000000"/>
+            </w:tcBorders>
           </w:tcPr>
           <w:p>
             <w:pPr>
@@ -5419,7 +5546,7 @@
     <w:tbl>
       <w:tblPr>
         <w:tblW w:type="auto" w:w="0"/>
-        <w:tblLook w:firstColumn="1" w:firstRow="1" w:lastColumn="0" w:lastRow="0" w:noHBand="0" w:noVBand="1" w:val="04A0"/>
+        <w:tblLook w:firstColumn="0" w:firstRow="0" w:lastColumn="0" w:lastRow="0" w:noHBand="0" w:noVBand="1" w:val="0000"/>
         <w:tblBorders>
           <w:top w:val="nil" w:sz="4" w:space="0" w:color="000000"/>
           <w:left w:val="nil" w:sz="4" w:space="0" w:color="000000"/>
@@ -5430,20 +5557,32 @@
         </w:tblBorders>
       </w:tblPr>
       <w:tblGrid>
-        <w:gridCol w:w="3120"/>
-        <w:gridCol w:w="3120"/>
-        <w:gridCol w:w="3120"/>
+        <w:gridCol w:w="680"/>
+        <w:gridCol w:w="7540"/>
+        <w:gridCol w:w="850"/>
       </w:tblGrid>
       <w:tr>
         <w:tc>
           <w:tcPr>
             <w:tcW w:type="dxa" w:w="680"/>
+            <w:tcBorders>
+              <w:top w:val="nil" w:sz="4" w:space="0" w:color="000000"/>
+              <w:left w:val="nil" w:sz="4" w:space="0" w:color="000000"/>
+              <w:bottom w:val="nil" w:sz="4" w:space="0" w:color="000000"/>
+              <w:right w:val="nil" w:sz="4" w:space="0" w:color="000000"/>
+            </w:tcBorders>
           </w:tcPr>
           <w:p/>
         </w:tc>
         <w:tc>
           <w:tcPr>
             <w:tcW w:type="dxa" w:w="7540"/>
+            <w:tcBorders>
+              <w:top w:val="nil" w:sz="4" w:space="0" w:color="000000"/>
+              <w:left w:val="nil" w:sz="4" w:space="0" w:color="000000"/>
+              <w:bottom w:val="nil" w:sz="4" w:space="0" w:color="000000"/>
+              <w:right w:val="nil" w:sz="4" w:space="0" w:color="000000"/>
+            </w:tcBorders>
           </w:tcPr>
           <w:p>
             <w:pPr>
@@ -5593,6 +5732,12 @@
         <w:tc>
           <w:tcPr>
             <w:tcW w:type="dxa" w:w="850"/>
+            <w:tcBorders>
+              <w:top w:val="nil" w:sz="4" w:space="0" w:color="000000"/>
+              <w:left w:val="nil" w:sz="4" w:space="0" w:color="000000"/>
+              <w:bottom w:val="nil" w:sz="4" w:space="0" w:color="000000"/>
+              <w:right w:val="nil" w:sz="4" w:space="0" w:color="000000"/>
+            </w:tcBorders>
           </w:tcPr>
           <w:p>
             <w:pPr>
@@ -5612,7 +5757,7 @@
     <w:tbl>
       <w:tblPr>
         <w:tblW w:type="auto" w:w="0"/>
-        <w:tblLook w:firstColumn="1" w:firstRow="1" w:lastColumn="0" w:lastRow="0" w:noHBand="0" w:noVBand="1" w:val="04A0"/>
+        <w:tblLook w:firstColumn="0" w:firstRow="0" w:lastColumn="0" w:lastRow="0" w:noHBand="0" w:noVBand="1" w:val="0000"/>
         <w:tblBorders>
           <w:top w:val="nil" w:sz="4" w:space="0" w:color="000000"/>
           <w:left w:val="nil" w:sz="4" w:space="0" w:color="000000"/>
@@ -5623,20 +5768,32 @@
         </w:tblBorders>
       </w:tblPr>
       <w:tblGrid>
-        <w:gridCol w:w="3120"/>
-        <w:gridCol w:w="3120"/>
-        <w:gridCol w:w="3120"/>
+        <w:gridCol w:w="680"/>
+        <w:gridCol w:w="7540"/>
+        <w:gridCol w:w="850"/>
       </w:tblGrid>
       <w:tr>
         <w:tc>
           <w:tcPr>
             <w:tcW w:type="dxa" w:w="680"/>
+            <w:tcBorders>
+              <w:top w:val="nil" w:sz="4" w:space="0" w:color="000000"/>
+              <w:left w:val="nil" w:sz="4" w:space="0" w:color="000000"/>
+              <w:bottom w:val="nil" w:sz="4" w:space="0" w:color="000000"/>
+              <w:right w:val="nil" w:sz="4" w:space="0" w:color="000000"/>
+            </w:tcBorders>
           </w:tcPr>
           <w:p/>
         </w:tc>
         <w:tc>
           <w:tcPr>
             <w:tcW w:type="dxa" w:w="7540"/>
+            <w:tcBorders>
+              <w:top w:val="nil" w:sz="4" w:space="0" w:color="000000"/>
+              <w:left w:val="nil" w:sz="4" w:space="0" w:color="000000"/>
+              <w:bottom w:val="nil" w:sz="4" w:space="0" w:color="000000"/>
+              <w:right w:val="nil" w:sz="4" w:space="0" w:color="000000"/>
+            </w:tcBorders>
           </w:tcPr>
           <w:p>
             <w:pPr>
@@ -5877,6 +6034,12 @@
         <w:tc>
           <w:tcPr>
             <w:tcW w:type="dxa" w:w="850"/>
+            <w:tcBorders>
+              <w:top w:val="nil" w:sz="4" w:space="0" w:color="000000"/>
+              <w:left w:val="nil" w:sz="4" w:space="0" w:color="000000"/>
+              <w:bottom w:val="nil" w:sz="4" w:space="0" w:color="000000"/>
+              <w:right w:val="nil" w:sz="4" w:space="0" w:color="000000"/>
+            </w:tcBorders>
           </w:tcPr>
           <w:p>
             <w:pPr>
@@ -5896,7 +6059,7 @@
     <w:tbl>
       <w:tblPr>
         <w:tblW w:type="auto" w:w="0"/>
-        <w:tblLook w:firstColumn="1" w:firstRow="1" w:lastColumn="0" w:lastRow="0" w:noHBand="0" w:noVBand="1" w:val="04A0"/>
+        <w:tblLook w:firstColumn="0" w:firstRow="0" w:lastColumn="0" w:lastRow="0" w:noHBand="0" w:noVBand="1" w:val="0000"/>
         <w:tblBorders>
           <w:top w:val="nil" w:sz="4" w:space="0" w:color="000000"/>
           <w:left w:val="nil" w:sz="4" w:space="0" w:color="000000"/>
@@ -5907,20 +6070,32 @@
         </w:tblBorders>
       </w:tblPr>
       <w:tblGrid>
-        <w:gridCol w:w="3120"/>
-        <w:gridCol w:w="3120"/>
-        <w:gridCol w:w="3120"/>
+        <w:gridCol w:w="680"/>
+        <w:gridCol w:w="7540"/>
+        <w:gridCol w:w="850"/>
       </w:tblGrid>
       <w:tr>
         <w:tc>
           <w:tcPr>
             <w:tcW w:type="dxa" w:w="680"/>
+            <w:tcBorders>
+              <w:top w:val="nil" w:sz="4" w:space="0" w:color="000000"/>
+              <w:left w:val="nil" w:sz="4" w:space="0" w:color="000000"/>
+              <w:bottom w:val="nil" w:sz="4" w:space="0" w:color="000000"/>
+              <w:right w:val="nil" w:sz="4" w:space="0" w:color="000000"/>
+            </w:tcBorders>
           </w:tcPr>
           <w:p/>
         </w:tc>
         <w:tc>
           <w:tcPr>
             <w:tcW w:type="dxa" w:w="7540"/>
+            <w:tcBorders>
+              <w:top w:val="nil" w:sz="4" w:space="0" w:color="000000"/>
+              <w:left w:val="nil" w:sz="4" w:space="0" w:color="000000"/>
+              <w:bottom w:val="nil" w:sz="4" w:space="0" w:color="000000"/>
+              <w:right w:val="nil" w:sz="4" w:space="0" w:color="000000"/>
+            </w:tcBorders>
           </w:tcPr>
           <w:p>
             <w:pPr>
@@ -6170,6 +6345,12 @@
         <w:tc>
           <w:tcPr>
             <w:tcW w:type="dxa" w:w="850"/>
+            <w:tcBorders>
+              <w:top w:val="nil" w:sz="4" w:space="0" w:color="000000"/>
+              <w:left w:val="nil" w:sz="4" w:space="0" w:color="000000"/>
+              <w:bottom w:val="nil" w:sz="4" w:space="0" w:color="000000"/>
+              <w:right w:val="nil" w:sz="4" w:space="0" w:color="000000"/>
+            </w:tcBorders>
           </w:tcPr>
           <w:p>
             <w:pPr>
@@ -6189,7 +6370,7 @@
     <w:tbl>
       <w:tblPr>
         <w:tblW w:type="auto" w:w="0"/>
-        <w:tblLook w:firstColumn="1" w:firstRow="1" w:lastColumn="0" w:lastRow="0" w:noHBand="0" w:noVBand="1" w:val="04A0"/>
+        <w:tblLook w:firstColumn="0" w:firstRow="0" w:lastColumn="0" w:lastRow="0" w:noHBand="0" w:noVBand="1" w:val="0000"/>
         <w:tblBorders>
           <w:top w:val="nil" w:sz="4" w:space="0" w:color="000000"/>
           <w:left w:val="nil" w:sz="4" w:space="0" w:color="000000"/>
@@ -6200,20 +6381,32 @@
         </w:tblBorders>
       </w:tblPr>
       <w:tblGrid>
-        <w:gridCol w:w="3120"/>
-        <w:gridCol w:w="3120"/>
-        <w:gridCol w:w="3120"/>
+        <w:gridCol w:w="680"/>
+        <w:gridCol w:w="7540"/>
+        <w:gridCol w:w="850"/>
       </w:tblGrid>
       <w:tr>
         <w:tc>
           <w:tcPr>
             <w:tcW w:type="dxa" w:w="680"/>
+            <w:tcBorders>
+              <w:top w:val="nil" w:sz="4" w:space="0" w:color="000000"/>
+              <w:left w:val="nil" w:sz="4" w:space="0" w:color="000000"/>
+              <w:bottom w:val="nil" w:sz="4" w:space="0" w:color="000000"/>
+              <w:right w:val="nil" w:sz="4" w:space="0" w:color="000000"/>
+            </w:tcBorders>
           </w:tcPr>
           <w:p/>
         </w:tc>
         <w:tc>
           <w:tcPr>
             <w:tcW w:type="dxa" w:w="7540"/>
+            <w:tcBorders>
+              <w:top w:val="nil" w:sz="4" w:space="0" w:color="000000"/>
+              <w:left w:val="nil" w:sz="4" w:space="0" w:color="000000"/>
+              <w:bottom w:val="nil" w:sz="4" w:space="0" w:color="000000"/>
+              <w:right w:val="nil" w:sz="4" w:space="0" w:color="000000"/>
+            </w:tcBorders>
           </w:tcPr>
           <w:p>
             <w:pPr>
@@ -6378,6 +6571,12 @@
         <w:tc>
           <w:tcPr>
             <w:tcW w:type="dxa" w:w="850"/>
+            <w:tcBorders>
+              <w:top w:val="nil" w:sz="4" w:space="0" w:color="000000"/>
+              <w:left w:val="nil" w:sz="4" w:space="0" w:color="000000"/>
+              <w:bottom w:val="nil" w:sz="4" w:space="0" w:color="000000"/>
+              <w:right w:val="nil" w:sz="4" w:space="0" w:color="000000"/>
+            </w:tcBorders>
           </w:tcPr>
           <w:p>
             <w:pPr>
@@ -7242,7 +7441,7 @@
     <w:tbl>
       <w:tblPr>
         <w:tblW w:type="auto" w:w="0"/>
-        <w:tblLook w:firstColumn="1" w:firstRow="1" w:lastColumn="0" w:lastRow="0" w:noHBand="0" w:noVBand="1" w:val="04A0"/>
+        <w:tblLook w:firstColumn="0" w:firstRow="0" w:lastColumn="0" w:lastRow="0" w:noHBand="0" w:noVBand="1" w:val="0000"/>
         <w:tblBorders>
           <w:top w:val="nil" w:sz="4" w:space="0" w:color="000000"/>
           <w:left w:val="nil" w:sz="4" w:space="0" w:color="000000"/>
@@ -7253,20 +7452,32 @@
         </w:tblBorders>
       </w:tblPr>
       <w:tblGrid>
-        <w:gridCol w:w="3120"/>
-        <w:gridCol w:w="3120"/>
-        <w:gridCol w:w="3120"/>
+        <w:gridCol w:w="680"/>
+        <w:gridCol w:w="7540"/>
+        <w:gridCol w:w="850"/>
       </w:tblGrid>
       <w:tr>
         <w:tc>
           <w:tcPr>
             <w:tcW w:type="dxa" w:w="680"/>
+            <w:tcBorders>
+              <w:top w:val="nil" w:sz="4" w:space="0" w:color="000000"/>
+              <w:left w:val="nil" w:sz="4" w:space="0" w:color="000000"/>
+              <w:bottom w:val="nil" w:sz="4" w:space="0" w:color="000000"/>
+              <w:right w:val="nil" w:sz="4" w:space="0" w:color="000000"/>
+            </w:tcBorders>
           </w:tcPr>
           <w:p/>
         </w:tc>
         <w:tc>
           <w:tcPr>
             <w:tcW w:type="dxa" w:w="7540"/>
+            <w:tcBorders>
+              <w:top w:val="nil" w:sz="4" w:space="0" w:color="000000"/>
+              <w:left w:val="nil" w:sz="4" w:space="0" w:color="000000"/>
+              <w:bottom w:val="nil" w:sz="4" w:space="0" w:color="000000"/>
+              <w:right w:val="nil" w:sz="4" w:space="0" w:color="000000"/>
+            </w:tcBorders>
           </w:tcPr>
           <w:p>
             <w:pPr>
@@ -7567,6 +7778,12 @@
         <w:tc>
           <w:tcPr>
             <w:tcW w:type="dxa" w:w="850"/>
+            <w:tcBorders>
+              <w:top w:val="nil" w:sz="4" w:space="0" w:color="000000"/>
+              <w:left w:val="nil" w:sz="4" w:space="0" w:color="000000"/>
+              <w:bottom w:val="nil" w:sz="4" w:space="0" w:color="000000"/>
+              <w:right w:val="nil" w:sz="4" w:space="0" w:color="000000"/>
+            </w:tcBorders>
           </w:tcPr>
           <w:p>
             <w:pPr>
@@ -7901,7 +8118,7 @@
       <w:r>
         <w:drawing>
           <wp:inline>
-            <wp:extent cx="5399999" cy="2218731"/>
+            <wp:extent cx="5759999" cy="2368386"/>
             <wp:effectExtent b="0" l="0" r="0" t="0"/>
             <wp:docPr descr="" title="" id="34" name="Picture"/>
             <a:graphic>
@@ -7922,7 +8139,7 @@
                   <pic:spPr bwMode="auto">
                     <a:xfrm>
                       <a:off x="0" y="0"/>
-                      <a:ext cx="5399999" cy="2218731"/>
+                      <a:ext cx="5759999" cy="2368386"/>
                     </a:xfrm>
                     <a:prstGeom prst="rect">
                       <a:avLst/>
@@ -8992,6 +9209,7 @@
     <w:p>
       <w:pPr>
         <w:pStyle w:val="BodyText"/>
+        <w:spacing w:before="200"/>
       </w:pPr>
       <w:r>
         <w:t xml:space="preserve">The annual results of the four cases are summarised in Table 2 and Figure 3.</w:t>
@@ -9172,7 +9390,7 @@
       <w:r>
         <w:drawing>
           <wp:inline>
-            <wp:extent cx="5399999" cy="4187138"/>
+            <wp:extent cx="5759999" cy="4442818"/>
             <wp:effectExtent b="0" l="0" r="0" t="0"/>
             <wp:docPr descr="" title="" id="38" name="Picture"/>
             <a:graphic>
@@ -9193,7 +9411,7 @@
                   <pic:spPr bwMode="auto">
                     <a:xfrm>
                       <a:off x="0" y="0"/>
-                      <a:ext cx="5399999" cy="4187138"/>
+                      <a:ext cx="5759999" cy="4442818"/>
                     </a:xfrm>
                     <a:prstGeom prst="rect">
                       <a:avLst/>
@@ -9303,7 +9521,7 @@
       <w:r>
         <w:drawing>
           <wp:inline>
-            <wp:extent cx="5399999" cy="4419516"/>
+            <wp:extent cx="5759999" cy="4715891"/>
             <wp:effectExtent b="0" l="0" r="0" t="0"/>
             <wp:docPr descr="" title="" id="42" name="Picture"/>
             <a:graphic>
@@ -9324,7 +9542,7 @@
                   <pic:spPr bwMode="auto">
                     <a:xfrm>
                       <a:off x="0" y="0"/>
-                      <a:ext cx="5399999" cy="4419516"/>
+                      <a:ext cx="5759999" cy="4715891"/>
                     </a:xfrm>
                     <a:prstGeom prst="rect">
                       <a:avLst/>
@@ -9368,7 +9586,7 @@
       <w:r>
         <w:drawing>
           <wp:inline>
-            <wp:extent cx="5399999" cy="2063122"/>
+            <wp:extent cx="5759999" cy="2200664"/>
             <wp:effectExtent b="0" l="0" r="0" t="0"/>
             <wp:docPr descr="" title="" id="45" name="Picture"/>
             <a:graphic>
@@ -9389,7 +9607,7 @@
                   <pic:spPr bwMode="auto">
                     <a:xfrm>
                       <a:off x="0" y="0"/>
-                      <a:ext cx="5399999" cy="2063122"/>
+                      <a:ext cx="5759999" cy="2200664"/>
                     </a:xfrm>
                     <a:prstGeom prst="rect">
                       <a:avLst/>
@@ -9589,7 +9807,7 @@
       <w:r>
         <w:drawing>
           <wp:inline>
-            <wp:extent cx="5399999" cy="2063122"/>
+            <wp:extent cx="5759999" cy="2200664"/>
             <wp:effectExtent b="0" l="0" r="0" t="0"/>
             <wp:docPr descr="" title="" id="48" name="Picture"/>
             <a:graphic>
@@ -9610,7 +9828,7 @@
                   <pic:spPr bwMode="auto">
                     <a:xfrm>
                       <a:off x="0" y="0"/>
-                      <a:ext cx="5399999" cy="2063122"/>
+                      <a:ext cx="5759999" cy="2200664"/>
                     </a:xfrm>
                     <a:prstGeom prst="rect">
                       <a:avLst/>
@@ -10383,6 +10601,7 @@
     <w:p>
       <w:pPr>
         <w:pStyle w:val="BodyText"/>
+        <w:spacing w:before="200"/>
       </w:pPr>
       <w:r>
         <w:t xml:space="preserve">The results of the sensitivity runs are given in Table 3 and Figure 7. Several</w:t>
@@ -10637,7 +10856,7 @@
       <w:r>
         <w:drawing>
           <wp:inline>
-            <wp:extent cx="5399999" cy="4548398"/>
+            <wp:extent cx="5759999" cy="4851625"/>
             <wp:effectExtent b="0" l="0" r="0" t="0"/>
             <wp:docPr descr="" title="" id="52" name="Picture"/>
             <a:graphic>
@@ -10658,7 +10877,7 @@
                   <pic:spPr bwMode="auto">
                     <a:xfrm>
                       <a:off x="0" y="0"/>
-                      <a:ext cx="5399999" cy="4548398"/>
+                      <a:ext cx="5759999" cy="4851625"/>
                     </a:xfrm>
                     <a:prstGeom prst="rect">
                       <a:avLst/>
@@ -11431,6 +11650,7 @@
     <w:p>
       <w:pPr>
         <w:pStyle w:val="BodyText"/>
+        <w:spacing w:before="200"/>
       </w:pPr>
       <w:r>
         <w:t xml:space="preserve">The model results are compared with the published benchmarks in Table 4 and</w:t>
@@ -11645,7 +11865,7 @@
       <w:r>
         <w:drawing>
           <wp:inline>
-            <wp:extent cx="5399999" cy="3121227"/>
+            <wp:extent cx="5759999" cy="4741971"/>
             <wp:effectExtent b="0" l="0" r="0" t="0"/>
             <wp:docPr descr="" title="" id="56" name="Picture"/>
             <a:graphic>
@@ -11666,7 +11886,7 @@
                   <pic:spPr bwMode="auto">
                     <a:xfrm>
                       <a:off x="0" y="0"/>
-                      <a:ext cx="5399999" cy="3121227"/>
+                      <a:ext cx="5759999" cy="4741971"/>
                     </a:xfrm>
                     <a:prstGeom prst="rect">
                       <a:avLst/>
@@ -12283,6 +12503,7 @@
     <w:p>
       <w:pPr>
         <w:pStyle w:val="BodyText"/>
+        <w:spacing w:before="200"/>
       </w:pPr>
       <w:r>
         <w:t xml:space="preserve">The economic indicators are given in Table 5. With an investment of 2.5</w:t>
@@ -12977,6 +13198,7 @@
     <w:p>
       <w:pPr>
         <w:pStyle w:val="BodyText"/>
+        <w:spacing w:before="200"/>
       </w:pPr>
       <w:r>
         <w:t xml:space="preserve">The results for the ten weather years are summarised in Table 6 and Figure 9.</w:t>
@@ -13099,7 +13321,7 @@
       <w:r>
         <w:drawing>
           <wp:inline>
-            <wp:extent cx="5399999" cy="2616494"/>
+            <wp:extent cx="5759999" cy="2790927"/>
             <wp:effectExtent b="0" l="0" r="0" t="0"/>
             <wp:docPr descr="" title="" id="61" name="Picture"/>
             <a:graphic>
@@ -13120,7 +13342,7 @@
                   <pic:spPr bwMode="auto">
                     <a:xfrm>
                       <a:off x="0" y="0"/>
-                      <a:ext cx="5399999" cy="2616494"/>
+                      <a:ext cx="5759999" cy="2790927"/>
                     </a:xfrm>
                     <a:prstGeom prst="rect">
                       <a:avLst/>

</xml_diff>

<commit_message>
New title: Flexible topside load scheduling on a wind-powered offshore oil platform: effects on gas turbine fuel use and CO2 emissions
</commit_message>
<xml_diff>
--- a/docs/paper/paper.docx
+++ b/docs/paper/paper.docx
@@ -7,13 +7,7 @@
         <w:pStyle w:val="Title"/>
       </w:pPr>
       <w:r>
-        <w:t xml:space="preserve">Scheduling</w:t>
-      </w:r>
-      <w:r>
-        <w:t xml:space="preserve"> </w:t>
-      </w:r>
-      <w:r>
-        <w:t xml:space="preserve">flexible</w:t>
+        <w:t xml:space="preserve">Flexible</w:t>
       </w:r>
       <w:r>
         <w:t xml:space="preserve"> </w:t>
@@ -25,19 +19,61 @@
         <w:t xml:space="preserve"> </w:t>
       </w:r>
       <w:r>
-        <w:t xml:space="preserve">loads</w:t>
-      </w:r>
-      <w:r>
-        <w:t xml:space="preserve"> </w:t>
-      </w:r>
-      <w:r>
-        <w:t xml:space="preserve">to</w:t>
-      </w:r>
-      <w:r>
-        <w:t xml:space="preserve"> </w:t>
-      </w:r>
-      <w:r>
-        <w:t xml:space="preserve">reduce</w:t>
+        <w:t xml:space="preserve">load</w:t>
+      </w:r>
+      <w:r>
+        <w:t xml:space="preserve"> </w:t>
+      </w:r>
+      <w:r>
+        <w:t xml:space="preserve">scheduling</w:t>
+      </w:r>
+      <w:r>
+        <w:t xml:space="preserve"> </w:t>
+      </w:r>
+      <w:r>
+        <w:t xml:space="preserve">on</w:t>
+      </w:r>
+      <w:r>
+        <w:t xml:space="preserve"> </w:t>
+      </w:r>
+      <w:r>
+        <w:t xml:space="preserve">a</w:t>
+      </w:r>
+      <w:r>
+        <w:t xml:space="preserve"> </w:t>
+      </w:r>
+      <w:r>
+        <w:t xml:space="preserve">wind-powered</w:t>
+      </w:r>
+      <w:r>
+        <w:t xml:space="preserve"> </w:t>
+      </w:r>
+      <w:r>
+        <w:t xml:space="preserve">offshore</w:t>
+      </w:r>
+      <w:r>
+        <w:t xml:space="preserve"> </w:t>
+      </w:r>
+      <w:r>
+        <w:t xml:space="preserve">oil</w:t>
+      </w:r>
+      <w:r>
+        <w:t xml:space="preserve"> </w:t>
+      </w:r>
+      <w:r>
+        <w:t xml:space="preserve">platform:</w:t>
+      </w:r>
+      <w:r>
+        <w:t xml:space="preserve"> </w:t>
+      </w:r>
+      <w:r>
+        <w:t xml:space="preserve">effects</w:t>
+      </w:r>
+      <w:r>
+        <w:t xml:space="preserve"> </w:t>
+      </w:r>
+      <w:r>
+        <w:t xml:space="preserve">on</w:t>
       </w:r>
       <w:r>
         <w:t xml:space="preserve"> </w:t>
@@ -55,50 +91,31 @@
         <w:t xml:space="preserve"> </w:t>
       </w:r>
       <w:r>
+        <w:t xml:space="preserve">fuel</w:t>
+      </w:r>
+      <w:r>
+        <w:t xml:space="preserve"> </w:t>
+      </w:r>
+      <w:r>
+        <w:t xml:space="preserve">use</w:t>
+      </w:r>
+      <w:r>
+        <w:t xml:space="preserve"> </w:t>
+      </w:r>
+      <w:r>
+        <w:t xml:space="preserve">and</w:t>
+      </w:r>
+      <w:r>
+        <w:t xml:space="preserve"> </w:t>
+      </w:r>
+      <w:r>
+        <w:t xml:space="preserve">CO2</w:t>
+      </w:r>
+      <w:r>
+        <w:t xml:space="preserve"> </w:t>
+      </w:r>
+      <w:r>
         <w:t xml:space="preserve">emissions</w:t>
-      </w:r>
-      <w:r>
-        <w:t xml:space="preserve"> </w:t>
-      </w:r>
-      <w:r>
-        <w:t xml:space="preserve">on</w:t>
-      </w:r>
-      <w:r>
-        <w:t xml:space="preserve"> </w:t>
-      </w:r>
-      <w:r>
-        <w:t xml:space="preserve">a</w:t>
-      </w:r>
-      <w:r>
-        <w:t xml:space="preserve"> </w:t>
-      </w:r>
-      <w:r>
-        <w:t xml:space="preserve">wind-powered</w:t>
-      </w:r>
-      <w:r>
-        <w:t xml:space="preserve"> </w:t>
-      </w:r>
-      <w:r>
-        <w:t xml:space="preserve">offshore</w:t>
-      </w:r>
-      <w:r>
-        <w:t xml:space="preserve"> </w:t>
-      </w:r>
-      <w:r>
-        <w:t xml:space="preserve">oil</w:t>
-      </w:r>
-      <w:r>
-        <w:t xml:space="preserve"> </w:t>
-      </w:r>
-      <w:r>
-        <w:t xml:space="preserve">platform</w:t>
-      </w:r>
-    </w:p>
-    <w:p>
-      <w:r>
-        <w:pict>
-          <v:rect style="width:0;height:1.5pt" o:hralign="center" o:hrstd="t" o:hr="t"/>
-        </w:pict>
       </w:r>
     </w:p>
     <w:p>

</xml_diff>

<commit_message>
Figure 5 right panel: stacked bars of hours with two and one GT per case
</commit_message>
<xml_diff>
--- a/docs/paper/paper.docx
+++ b/docs/paper/paper.docx
@@ -9603,7 +9603,7 @@
       <w:r>
         <w:drawing>
           <wp:inline>
-            <wp:extent cx="5759999" cy="2200664"/>
+            <wp:extent cx="5759999" cy="2202578"/>
             <wp:effectExtent b="0" l="0" r="0" t="0"/>
             <wp:docPr descr="" title="" id="45" name="Picture"/>
             <a:graphic>
@@ -9624,7 +9624,7 @@
                   <pic:spPr bwMode="auto">
                     <a:xfrm>
                       <a:off x="0" y="0"/>
-                      <a:ext cx="5759999" cy="2200664"/>
+                      <a:ext cx="5759999" cy="2202578"/>
                     </a:xfrm>
                     <a:prstGeom prst="rect">
                       <a:avLst/>
@@ -9658,7 +9658,7 @@
         <w:t xml:space="preserve"> </w:t>
       </w:r>
       <w:r>
-        <w:t xml:space="preserve">Left: duration curves of GT load per running unit (shaded: below 50 %). Right: hours per year with one and with two GTs running.</w:t>
+        <w:t xml:space="preserve">Left: duration curves of GT load per running unit (shaded: below 50 %). Right: hours per year with two and with one GT running.</w:t>
       </w:r>
     </w:p>
     <w:p>

</xml_diff>

<commit_message>
Rebuild manuscript; abstract trimmed to the 250-word limit
</commit_message>
<xml_diff>
--- a/docs/paper/paper.docx
+++ b/docs/paper/paper.docx
@@ -223,19 +223,19 @@
         <w:t xml:space="preserve"> </w:t>
       </w:r>
       <w:r>
-        <w:t xml:space="preserve">usually consider the topside load as fixed. In this study, the electric demand</w:t>
-      </w:r>
-      <w:r>
-        <w:t xml:space="preserve"> </w:t>
-      </w:r>
-      <w:r>
-        <w:t xml:space="preserve">of a generic North Sea oil platform was mapped with a steady-state process</w:t>
-      </w:r>
-      <w:r>
-        <w:t xml:space="preserve"> </w:t>
-      </w:r>
-      <w:r>
-        <w:t xml:space="preserve">model, and each consumer was classified as must-run, flexible or sheddable. A</w:t>
+        <w:t xml:space="preserve">usually consider the topside load as fixed. Here, the electric demand of a</w:t>
+      </w:r>
+      <w:r>
+        <w:t xml:space="preserve"> </w:t>
+      </w:r>
+      <w:r>
+        <w:t xml:space="preserve">generic North Sea oil platform was mapped with a steady-state process model,</w:t>
+      </w:r>
+      <w:r>
+        <w:t xml:space="preserve"> </w:t>
+      </w:r>
+      <w:r>
+        <w:t xml:space="preserve">and each consumer was classified as must-run, flexible or sheddable. A</w:t>
       </w:r>
       <w:r>
         <w:t xml:space="preserve"> </w:t>
@@ -277,49 +277,49 @@
         <w:t xml:space="preserve"> </w:t>
       </w:r>
       <w:r>
-        <w:t xml:space="preserve">emissions by</w:t>
-      </w:r>
-      <w:r>
-        <w:t xml:space="preserve"> </w:t>
-      </w:r>
-      <w:r>
-        <w:t xml:space="preserve">49 %. Flexible scheduling cuts them by a further 11 % (7.2 kt/yr) without lost</w:t>
-      </w:r>
-      <w:r>
-        <w:t xml:space="preserve"> </w:t>
-      </w:r>
-      <w:r>
-        <w:t xml:space="preserve">production, mainly because the operation of a second gas turbine is avoided:</w:t>
-      </w:r>
-      <w:r>
-        <w:t xml:space="preserve"> </w:t>
-      </w:r>
-      <w:r>
-        <w:t xml:space="preserve">the hours with two turbines online fall from 1,702 to 28. Over ten weather</w:t>
-      </w:r>
-      <w:r>
-        <w:t xml:space="preserve"> </w:t>
-      </w:r>
-      <w:r>
-        <w:t xml:space="preserve">years the benefit ranges from 10.5 to 11.7 %. About 24 h of deferrable</w:t>
-      </w:r>
-      <w:r>
-        <w:t xml:space="preserve"> </w:t>
-      </w:r>
-      <w:r>
-        <w:t xml:space="preserve">injection captures it, and a small added gas turbine is complementary, whereas</w:t>
-      </w:r>
-      <w:r>
-        <w:t xml:space="preserve"> </w:t>
-      </w:r>
-      <w:r>
-        <w:t xml:space="preserve">operating rules that keep two gas turbines online remove most of the gain. The</w:t>
-      </w:r>
-      <w:r>
-        <w:t xml:space="preserve"> </w:t>
-      </w:r>
-      <w:r>
-        <w:t xml:space="preserve">model reproduces the CO</w:t>
+        <w:t xml:space="preserve">emissions</w:t>
+      </w:r>
+      <w:r>
+        <w:t xml:space="preserve"> </w:t>
+      </w:r>
+      <w:r>
+        <w:t xml:space="preserve">by 49 %. Flexible scheduling cuts them by a further 11 % (7.2 kt/yr) without</w:t>
+      </w:r>
+      <w:r>
+        <w:t xml:space="preserve"> </w:t>
+      </w:r>
+      <w:r>
+        <w:t xml:space="preserve">lost production, mostly because a second gas turbine is avoided: the hours</w:t>
+      </w:r>
+      <w:r>
+        <w:t xml:space="preserve"> </w:t>
+      </w:r>
+      <w:r>
+        <w:t xml:space="preserve">with two turbines online fall from 1,702 to 28. Over ten weather years it</w:t>
+      </w:r>
+      <w:r>
+        <w:t xml:space="preserve"> </w:t>
+      </w:r>
+      <w:r>
+        <w:t xml:space="preserve">ranges from 10.5 to 11.7 %. About 24 h of deferrable injection captures it,</w:t>
+      </w:r>
+      <w:r>
+        <w:t xml:space="preserve"> </w:t>
+      </w:r>
+      <w:r>
+        <w:t xml:space="preserve">and a small added gas turbine is complementary, whereas operating rules that</w:t>
+      </w:r>
+      <w:r>
+        <w:t xml:space="preserve"> </w:t>
+      </w:r>
+      <w:r>
+        <w:t xml:space="preserve">keep two gas turbines online remove most of the gain. With two gas turbines</w:t>
+      </w:r>
+      <w:r>
+        <w:t xml:space="preserve"> </w:t>
+      </w:r>
+      <w:r>
+        <w:t xml:space="preserve">online, as the operator’s estimate assumes, the model matches the CO</w:t>
       </w:r>
       <w:r>
         <w:rPr>
@@ -331,13 +331,7 @@
         <w:t xml:space="preserve"> </w:t>
       </w:r>
       <w:r>
-        <w:t xml:space="preserve">avoided per MWh of wind reported for Hywind Tampen</w:t>
-      </w:r>
-      <w:r>
-        <w:t xml:space="preserve"> </w:t>
-      </w:r>
-      <w:r>
-        <w:t xml:space="preserve">within 2 %.</w:t>
+        <w:t xml:space="preserve">avoided per MWh of wind expected for Hywind Tampen.</w:t>
       </w:r>
     </w:p>
     <w:p>
@@ -512,7 +506,7 @@
         <w:t xml:space="preserve"> </w:t>
       </w:r>
       <w:r>
-        <w:t xml:space="preserve">connected to a wind farm. Riboldi and Nord (2018) optimised an</w:t>
+        <w:t xml:space="preserve">connected to a wind farm. Riboldi and Nord (2018) optimized an</w:t>
       </w:r>
       <w:r>
         <w:t xml:space="preserve"> </w:t>
@@ -642,13 +636,13 @@
         <w:pStyle w:val="BodyText"/>
       </w:pPr>
       <w:r>
-        <w:t xml:space="preserve">Part of this loss can be recovered by operational optimisation. The</w:t>
-      </w:r>
-      <w:r>
-        <w:t xml:space="preserve"> </w:t>
-      </w:r>
-      <w:r>
-        <w:t xml:space="preserve">open-source tool Oogeso optimises the GT commitment, the wind use and the</w:t>
+        <w:t xml:space="preserve">Part of this loss can be recovered by operational optimization. The</w:t>
+      </w:r>
+      <w:r>
+        <w:t xml:space="preserve"> </w:t>
+      </w:r>
+      <w:r>
+        <w:t xml:space="preserve">open-source tool Oogeso optimizes the GT commitment, the wind use and the</w:t>
       </w:r>
       <w:r>
         <w:t xml:space="preserve"> </w:t>
@@ -734,7 +728,7 @@
         <w:t xml:space="preserve"> </w:t>
       </w:r>
       <w:r>
-        <w:t xml:space="preserve">cement and aluminium production. These studies consider the response to price</w:t>
+        <w:t xml:space="preserve">cement and aluminum production. These studies consider the response to price</w:t>
       </w:r>
       <w:r>
         <w:t xml:space="preserve"> </w:t>
@@ -828,19 +822,99 @@
         <w:pStyle w:val="BodyText"/>
       </w:pPr>
       <w:r>
-        <w:t xml:space="preserve">To the authors’ knowledge, no study of wind-powered platforms has scheduled</w:t>
-      </w:r>
-      <w:r>
-        <w:t xml:space="preserve"> </w:t>
-      </w:r>
-      <w:r>
-        <w:t xml:space="preserve">the topside consumers together with the power plant. The goal of this study is</w:t>
-      </w:r>
-      <w:r>
-        <w:t xml:space="preserve"> </w:t>
-      </w:r>
-      <w:r>
-        <w:t xml:space="preserve">to help address this gap, by quantifying how much fuel and CO</w:t>
+        <w:t xml:space="preserve">Water injection has already been proposed as a controllable load for</w:t>
+      </w:r>
+      <w:r>
+        <w:t xml:space="preserve"> </w:t>
+      </w:r>
+      <w:r>
+        <w:t xml:space="preserve">wind-powered platforms. Sanchez et al. (2017) used variable-speed</w:t>
+      </w:r>
+      <w:r>
+        <w:t xml:space="preserve"> </w:t>
+      </w:r>
+      <w:r>
+        <w:t xml:space="preserve">injection pumps to smooth short-term wind power fluctuations and to damp</w:t>
+      </w:r>
+      <w:r>
+        <w:t xml:space="preserve"> </w:t>
+      </w:r>
+      <w:r>
+        <w:t xml:space="preserve">low-frequency oscillations of the platform grid, and Alves et al. (2019)</w:t>
+      </w:r>
+      <w:r>
+        <w:t xml:space="preserve"> </w:t>
+      </w:r>
+      <w:r>
+        <w:t xml:space="preserve">combined such load management with energy storage to improve power quality.</w:t>
+      </w:r>
+      <w:r>
+        <w:t xml:space="preserve"> </w:t>
+      </w:r>
+      <w:r>
+        <w:t xml:space="preserve">The WIN WIN joint industry project found a stand-alone floating wind turbine</w:t>
+      </w:r>
+      <w:r>
+        <w:t xml:space="preserve"> </w:t>
+      </w:r>
+      <w:r>
+        <w:t xml:space="preserve">that drives water injection directly to be technically feasible (DNV 2016).</w:t>
+      </w:r>
+      <w:r>
+        <w:t xml:space="preserve"> </w:t>
+      </w:r>
+      <w:r>
+        <w:t xml:space="preserve">On the reservoir side, Nilsen et al. (Nilsen et al. 2025b, 2025a) optimized</w:t>
+      </w:r>
+      <w:r>
+        <w:t xml:space="preserve"> </w:t>
+      </w:r>
+      <w:r>
+        <w:t xml:space="preserve">the well controls of a field supplied by offshore wind, so that the power</w:t>
+      </w:r>
+      <w:r>
+        <w:t xml:space="preserve"> </w:t>
+      </w:r>
+      <w:r>
+        <w:t xml:space="preserve">demand follows the wind, and studied the trade-off between profit and</w:t>
+      </w:r>
+      <w:r>
+        <w:t xml:space="preserve"> </w:t>
+      </w:r>
+      <w:r>
+        <w:t xml:space="preserve">emissions. These studies address either the dynamics of the electrical system</w:t>
+      </w:r>
+      <w:r>
+        <w:t xml:space="preserve"> </w:t>
+      </w:r>
+      <w:r>
+        <w:t xml:space="preserve">over seconds to minutes or the response of the reservoir over months to years.</w:t>
+      </w:r>
+      <w:r>
+        <w:t xml:space="preserve"> </w:t>
+      </w:r>
+      <w:r>
+        <w:t xml:space="preserve">The hour-by-hour interaction between deferrable topside loads and the</w:t>
+      </w:r>
+      <w:r>
+        <w:t xml:space="preserve"> </w:t>
+      </w:r>
+      <w:r>
+        <w:t xml:space="preserve">commitment of the gas turbines, which determines how much fuel is actually</w:t>
+      </w:r>
+      <w:r>
+        <w:t xml:space="preserve"> </w:t>
+      </w:r>
+      <w:r>
+        <w:t xml:space="preserve">saved, has not been quantified over full years.</w:t>
+      </w:r>
+    </w:p>
+    <w:p>
+      <w:pPr>
+        <w:pStyle w:val="BodyText"/>
+      </w:pPr>
+      <w:r>
+        <w:t xml:space="preserve">The goal of this study is to quantify this interaction: how much fuel and CO</w:t>
       </w:r>
       <w:r>
         <w:rPr>
@@ -852,25 +926,37 @@
         <w:t xml:space="preserve"> </w:t>
       </w:r>
       <w:r>
-        <w:t xml:space="preserve">a wind-powered</w:t>
-      </w:r>
-      <w:r>
-        <w:t xml:space="preserve"> </w:t>
-      </w:r>
-      <w:r>
-        <w:t xml:space="preserve">oil platform can save by scheduling its flexible loads, which consumers</w:t>
-      </w:r>
-      <w:r>
-        <w:t xml:space="preserve"> </w:t>
-      </w:r>
-      <w:r>
-        <w:t xml:space="preserve">provide the saving and through which mechanism, and which assumptions</w:t>
-      </w:r>
-      <w:r>
-        <w:t xml:space="preserve"> </w:t>
-      </w:r>
-      <w:r>
-        <w:t xml:space="preserve">determine its magnitude. Four main steps were followed in this study:</w:t>
+        <w:t xml:space="preserve">a wind-powered oil platform can save by scheduling its flexible loads, which</w:t>
+      </w:r>
+      <w:r>
+        <w:t xml:space="preserve"> </w:t>
+      </w:r>
+      <w:r>
+        <w:t xml:space="preserve">consumers provide the saving and through which mechanism, and which</w:t>
+      </w:r>
+      <w:r>
+        <w:t xml:space="preserve"> </w:t>
+      </w:r>
+      <w:r>
+        <w:t xml:space="preserve">assumptions determine its magnitude. To the authors’ knowledge, it is the</w:t>
+      </w:r>
+      <w:r>
+        <w:t xml:space="preserve"> </w:t>
+      </w:r>
+      <w:r>
+        <w:t xml:space="preserve">first study that schedules deferrable topside loads together with gas turbine</w:t>
+      </w:r>
+      <w:r>
+        <w:t xml:space="preserve"> </w:t>
+      </w:r>
+      <w:r>
+        <w:t xml:space="preserve">unit commitment over full years at hourly resolution, with consumer power</w:t>
+      </w:r>
+      <w:r>
+        <w:t xml:space="preserve"> </w:t>
+      </w:r>
+      <w:r>
+        <w:t xml:space="preserve">curves derived from a process model. Four main steps were followed in this study:</w:t>
       </w:r>
     </w:p>
     <w:p>
@@ -960,7 +1046,13 @@
         <w:t xml:space="preserve"> </w:t>
       </w:r>
       <w:r>
-        <w:t xml:space="preserve">validation against Hywind Tampen and field data, and economic indicators.</w:t>
+        <w:t xml:space="preserve">benchmark checks against Hywind Tampen and field data, and economic</w:t>
+      </w:r>
+      <w:r>
+        <w:t xml:space="preserve"> </w:t>
+      </w:r>
+      <w:r>
+        <w:t xml:space="preserve">indicators.</w:t>
       </w:r>
     </w:p>
     <w:p>
@@ -1025,7 +1117,7 @@
         <w:t xml:space="preserve"> </w:t>
       </w:r>
       <w:r>
-        <w:t xml:space="preserve">(Tampen area, 61.0° N, 2.0° E) was modelled for the year 2023 at hourly</w:t>
+        <w:t xml:space="preserve">(Tampen area, 61.0° N, 2.0° E) was modeled for the year 2023 at hourly</w:t>
       </w:r>
       <w:r>
         <w:t xml:space="preserve"> </w:t>
@@ -1160,7 +1252,7 @@
         <w:t xml:space="preserve"> </w:t>
       </w:r>
       <w:r>
-        <w:t xml:space="preserve">optimiser decides how many run in each hour. Case 2 corresponds to the</w:t>
+        <w:t xml:space="preserve">optimizer decides how many run in each hour. Case 2 corresponds to the</w:t>
       </w:r>
       <w:r>
         <w:t xml:space="preserve"> </w:t>
@@ -1272,7 +1364,7 @@
         <w:pStyle w:val="BodyText"/>
       </w:pPr>
       <w:r>
-        <w:t xml:space="preserve">Process behaviour is represented by steady-state operating points with ramp</w:t>
+        <w:t xml:space="preserve">Process behavior is represented by steady-state operating points with ramp</w:t>
       </w:r>
       <w:r>
         <w:t xml:space="preserve"> </w:t>
@@ -1290,7 +1382,7 @@
         <w:t xml:space="preserve"> </w:t>
       </w:r>
       <w:r>
-        <w:t xml:space="preserve">(Solbraa n.d.) and Pyomo with the HiGHS solver for optimisation</w:t>
+        <w:t xml:space="preserve">(Solbraa n.d.) and Pyomo with the HiGHS solver for optimization</w:t>
       </w:r>
       <w:r>
         <w:t xml:space="preserve"> </w:t>
@@ -1385,7 +1477,7 @@
         <w:t xml:space="preserve"> </w:t>
       </w:r>
       <w:r>
-        <w:t xml:space="preserve">The platform power system. Supply (left) and topside consumers coloured by flexibility class (middle) are connected to one AC bus. The scheduler sets the production rate</w:t>
+        <w:t xml:space="preserve">The platform power system. Supply (left) and topside consumers colored by flexibility class (middle) are connected to one AC bus. The scheduler sets the production rate</w:t>
       </w:r>
       <w:r>
         <w:t xml:space="preserve"> </w:t>
@@ -2265,7 +2357,7 @@
         <w:t xml:space="preserve"> </w:t>
       </w:r>
       <w:r>
-        <w:t xml:space="preserve">gives 2.27 kg/Sm³, and the factor reported for the Gullfaks field centre lies</w:t>
+        <w:t xml:space="preserve">gives 2.27 kg/Sm³, and the factor reported for the Gullfaks field center lies</w:t>
       </w:r>
       <w:r>
         <w:t xml:space="preserve"> </w:t>
@@ -2289,7 +2381,7 @@
         <w:pStyle w:val="FirstParagraph"/>
       </w:pPr>
       <w:r>
-        <w:t xml:space="preserve">The topside process was modelled in NeqSim with the Peng–Robinson equation</w:t>
+        <w:t xml:space="preserve">The topside process was modeled in NeqSim with the Peng–Robinson equation</w:t>
       </w:r>
       <w:r>
         <w:t xml:space="preserve"> </w:t>
@@ -3996,7 +4088,7 @@
         <w:t xml:space="preserve"> </w:t>
       </w:r>
       <w:r>
-        <w:t xml:space="preserve">85 % of capacity. This is modelled as a virtual storage: postponing</w:t>
+        <w:t xml:space="preserve">85 % of capacity. This is modeled as a virtual storage: postponing</w:t>
       </w:r>
       <w:r>
         <w:t xml:space="preserve"> </w:t>
@@ -4399,7 +4491,7 @@
         </m:r>
       </m:oMath>
       <w:r>
-        <w:t xml:space="preserve">. The objective minimises the operating cost in NOK,</w:t>
+        <w:t xml:space="preserve">. The objective minimizes the operating cost in NOK,</w:t>
       </w:r>
     </w:p>
     <w:tbl>
@@ -7102,7 +7194,7 @@
         <w:t xml:space="preserve"> </w:t>
       </w:r>
       <w:r>
-        <w:t xml:space="preserve">start of the window, which prevents the optimiser from emptying the virtual</w:t>
+        <w:t xml:space="preserve">start of the window, which prevents the optimizer from emptying the virtual</w:t>
       </w:r>
       <w:r>
         <w:t xml:space="preserve"> </w:t>
@@ -7162,13 +7254,13 @@
       </w:r>
     </w:p>
     <w:bookmarkEnd w:id="29"/>
-    <w:bookmarkStart w:id="30" w:name="X32654d3cd445301b7caaa64f301babd56c5bfd2"/>
+    <w:bookmarkStart w:id="30" w:name="Xaa908d93524e5850992bde4ff5ab044ac0fa324"/>
     <w:p>
       <w:pPr>
         <w:pStyle w:val="Heading2"/>
       </w:pPr>
       <w:r>
-        <w:t xml:space="preserve">2.7 Weather years, sensitivity analysis and validation</w:t>
+        <w:t xml:space="preserve">2.7 Weather years, sensitivity analysis and benchmark checks</w:t>
       </w:r>
     </w:p>
     <w:p>
@@ -7370,7 +7462,7 @@
         <w:t xml:space="preserve"> </w:t>
       </w:r>
       <w:r>
-        <w:t xml:space="preserve">(Voldsund et al. 2013, 2014), six modelled platforms (Nguyen et al. 2013), the</w:t>
+        <w:t xml:space="preserve">(Voldsund et al. 2013, 2014), six modeled platforms (Nguyen et al. 2013), the</w:t>
       </w:r>
       <w:r>
         <w:t xml:space="preserve"> </w:t>
@@ -7542,7 +7634,7 @@
         <w:t xml:space="preserve"> </w:t>
       </w:r>
       <w:r>
-        <w:t xml:space="preserve">for the Gullfaks, Snorre and Statfjord field centres,</w:t>
+        <w:t xml:space="preserve">for the Gullfaks, Snorre and Statfjord field centers,</w:t>
       </w:r>
       <w:r>
         <w:t xml:space="preserve"> </w:t>
@@ -7578,7 +7670,7 @@
         <w:t xml:space="preserve"> </w:t>
       </w:r>
       <w:r>
-        <w:t xml:space="preserve">centre.</w:t>
+        <w:t xml:space="preserve">center.</w:t>
       </w:r>
     </w:p>
     <w:p>
@@ -7684,13 +7776,13 @@
         <w:t xml:space="preserve"> </w:t>
       </w:r>
       <w:r>
-        <w:t xml:space="preserve">reported oil volumes of the fields assigned to each centre with the</w:t>
-      </w:r>
-      <w:r>
-        <w:t xml:space="preserve"> </w:t>
-      </w:r>
-      <w:r>
-        <w:t xml:space="preserve">centre’s processing; they agree within 2 %. A single published value counts</w:t>
+        <w:t xml:space="preserve">reported oil volumes of the fields assigned to each center with the</w:t>
+      </w:r>
+      <w:r>
+        <w:t xml:space="preserve"> </w:t>
+      </w:r>
+      <w:r>
+        <w:t xml:space="preserve">center’s processing; they agree within 2 %. A single published value counts</w:t>
       </w:r>
       <w:r>
         <w:t xml:space="preserve"> </w:t>
@@ -8287,7 +8379,7 @@
         <w:t xml:space="preserve"> </w:t>
       </w:r>
       <w:r>
-        <w:t xml:space="preserve">strategy modelled for floating wind farms (Dighe et al. 2024). The real discount</w:t>
+        <w:t xml:space="preserve">strategy modeled for floating wind farms (Dighe et al. 2024). The real discount</w:t>
       </w:r>
       <w:r>
         <w:t xml:space="preserve"> </w:t>
@@ -8506,7 +8598,7 @@
         <w:t xml:space="preserve"> </w:t>
       </w:r>
       <w:r>
-        <w:t xml:space="preserve">Demand map. Left: electric power at design by consumer, coloured by flexibility class. Right: power of the production (sheddable) and injection (flexible) levers against lever position.</w:t>
+        <w:t xml:space="preserve">Demand map. Left: electric power at design by consumer, colored by flexibility class. Right: power of the production (sheddable) and injection (flexible) levers against lever position.</w:t>
       </w:r>
     </w:p>
     <w:p>
@@ -9688,7 +9780,7 @@
         <w:spacing w:before="200"/>
       </w:pPr>
       <w:r>
-        <w:t xml:space="preserve">The annual results of the four cases are summarised in Table 2 and Figure 3.</w:t>
+        <w:t xml:space="preserve">The annual results of the four cases are summarized in Table 2 and Figure 3.</w:t>
       </w:r>
       <w:r>
         <w:t xml:space="preserve"> </w:t>
@@ -9984,60 +10076,450 @@
         <w:pStyle w:val="FirstParagraph"/>
       </w:pPr>
       <w:r>
-        <w:t xml:space="preserve">Results indicate that the saving is obtained almost entirely by avoiding the</w:t>
-      </w:r>
-      <w:r>
-        <w:t xml:space="preserve"> </w:t>
-      </w:r>
-      <w:r>
-        <w:t xml:space="preserve">operation of a second GT. With fixed demand, a second turbine must be started</w:t>
-      </w:r>
-      <w:r>
-        <w:t xml:space="preserve"> </w:t>
-      </w:r>
-      <w:r>
-        <w:t xml:space="preserve">whenever the wind drops and one GT cannot carry the load while holding 5 MW in</w:t>
-      </w:r>
-      <w:r>
-        <w:t xml:space="preserve"> </w:t>
-      </w:r>
-      <w:r>
-        <w:t xml:space="preserve">reserve, i.e. whenever the wind supplies less than about 2 MW at the average</w:t>
-      </w:r>
-      <w:r>
-        <w:t xml:space="preserve"> </w:t>
-      </w:r>
-      <w:r>
-        <w:t xml:space="preserve">demand of 18.8 MW. Each such hour costs the no-load fuel of a whole additional</w:t>
-      </w:r>
-      <w:r>
-        <w:t xml:space="preserve"> </w:t>
-      </w:r>
-      <w:r>
-        <w:t xml:space="preserve">turbine, which amounts to 18.4 % of its full-load fuel. In Case 3 the</w:t>
-      </w:r>
-      <w:r>
-        <w:t xml:space="preserve"> </w:t>
-      </w:r>
-      <w:r>
-        <w:t xml:space="preserve">optimiser postpones water injection in exactly these hours, so that a second</w:t>
-      </w:r>
-      <w:r>
-        <w:t xml:space="preserve"> </w:t>
-      </w:r>
-      <w:r>
-        <w:t xml:space="preserve">GT runs in only 28 h of the year instead of 1,702 h (Figure 4, Figure 5). The</w:t>
-      </w:r>
-      <w:r>
-        <w:t xml:space="preserve"> </w:t>
-      </w:r>
-      <w:r>
-        <w:t xml:space="preserve">1,674 avoided hours account for most of the 3.0 MSm³ of fuel saved.</w:t>
-      </w:r>
-    </w:p>
+        <w:t xml:space="preserve">The saving is obtained by deferring water injection out of the hours in which</w:t>
+      </w:r>
+      <w:r>
+        <w:t xml:space="preserve"> </w:t>
+      </w:r>
+      <w:r>
+        <w:t xml:space="preserve">a second GT would otherwise be needed. With fixed demand, a second turbine</w:t>
+      </w:r>
+      <w:r>
+        <w:t xml:space="preserve"> </w:t>
+      </w:r>
+      <w:r>
+        <w:t xml:space="preserve">must be started whenever the wind drops and one GT cannot carry the load while</w:t>
+      </w:r>
+      <w:r>
+        <w:t xml:space="preserve"> </w:t>
+      </w:r>
+      <w:r>
+        <w:t xml:space="preserve">holding 5 MW in reserve, i.e. whenever the wind supplies less than about 2 MW</w:t>
+      </w:r>
+      <w:r>
+        <w:t xml:space="preserve"> </w:t>
+      </w:r>
+      <w:r>
+        <w:t xml:space="preserve">at the average demand of 18.8 MW. Each such hour costs the no-load fuel of a</w:t>
+      </w:r>
+      <w:r>
+        <w:t xml:space="preserve"> </w:t>
+      </w:r>
+      <w:r>
+        <w:t xml:space="preserve">whole additional turbine, which amounts to 18.4 % of its full-load fuel. In</w:t>
+      </w:r>
+      <w:r>
+        <w:t xml:space="preserve"> </w:t>
+      </w:r>
+      <w:r>
+        <w:t xml:space="preserve">Case 3 the optimizer postpones water injection in exactly these hours, so that</w:t>
+      </w:r>
+      <w:r>
+        <w:t xml:space="preserve"> </w:t>
+      </w:r>
+      <w:r>
+        <w:t xml:space="preserve">a second GT runs in only 28 h of the year instead of 1,702 h (Figure 4, Figure 5).</w:t>
+      </w:r>
+      <w:r>
+        <w:t xml:space="preserve"> </w:t>
+      </w:r>
+      <w:r>
+        <w:t xml:space="preserve">Since fuel is linear in GT power, the saving splits exactly into two parts</w:t>
+      </w:r>
+      <w:r>
+        <w:t xml:space="preserve"> </w:t>
+      </w:r>
+      <w:r>
+        <w:t xml:space="preserve">(Table 3). The 1,674 avoided GT unit-hours, at a no-load fuel of 1,068 Sm³ per</w:t>
+      </w:r>
+      <w:r>
+        <w:t xml:space="preserve"> </w:t>
+      </w:r>
+      <w:r>
+        <w:t xml:space="preserve">unit-hour, save 1.79 MSm³ (58 % of the 3.07 MSm³ saved). The injection that is</w:t>
+      </w:r>
+      <w:r>
+        <w:t xml:space="preserve"> </w:t>
+      </w:r>
+      <w:r>
+        <w:t xml:space="preserve">moved out of these hours, 5.4 GWh, is caught up in windy hours and absorbs 5.8</w:t>
+      </w:r>
+      <w:r>
+        <w:t xml:space="preserve"> </w:t>
+      </w:r>
+      <w:r>
+        <w:t xml:space="preserve">GWh of wind that would otherwise be curtailed; at the marginal fuel use of 217</w:t>
+      </w:r>
+      <w:r>
+        <w:t xml:space="preserve"> </w:t>
+      </w:r>
+      <w:r>
+        <w:t xml:space="preserve">Sm³/MWh this saves the remaining 1.28 MSm³ (42 %). Both parts therefore result</w:t>
+      </w:r>
+      <w:r>
+        <w:t xml:space="preserve"> </w:t>
+      </w:r>
+      <w:r>
+        <w:t xml:space="preserve">from the same deferral of injection: the commitment part from the hours it</w:t>
+      </w:r>
+      <w:r>
+        <w:t xml:space="preserve"> </w:t>
+      </w:r>
+      <w:r>
+        <w:t xml:space="preserve">leaves, and the energy part from the hours it moves to.</w:t>
+      </w:r>
+    </w:p>
+    <w:p>
+      <w:pPr>
+        <w:pStyle w:val="BodyText"/>
+      </w:pPr>
+      <w:r>
+        <w:rPr>
+          <w:bCs/>
+          <w:b/>
+        </w:rPr>
+        <w:t xml:space="preserve">Table 3.</w:t>
+      </w:r>
+      <w:r>
+        <w:t xml:space="preserve"> </w:t>
+      </w:r>
+      <w:r>
+        <w:t xml:space="preserve">Split of the fuel saved by flexible scheduling (Case 2 to Case 3, 2023).</w:t>
+      </w:r>
+    </w:p>
+    <w:tbl>
+      <w:tblPr>
+        <w:tblStyle w:val="Table"/>
+        <w:tblW w:type="pct" w:w="5000"/>
+        <w:tblLook w:firstRow="1" w:lastRow="0" w:firstColumn="0" w:lastColumn="0" w:noHBand="0" w:noVBand="0" w:val="0020"/>
+        <w:jc w:val="start"/>
+        <w:tblBorders>
+          <w:top w:val="single" w:sz="4" w:space="0" w:color="000000"/>
+          <w:bottom w:val="single" w:sz="4" w:space="0" w:color="000000"/>
+          <w:left w:val="nil" w:sz="4" w:space="0" w:color="000000"/>
+          <w:right w:val="nil" w:sz="4" w:space="0" w:color="000000"/>
+          <w:insideH w:val="nil" w:sz="4" w:space="0" w:color="000000"/>
+          <w:insideV w:val="nil" w:sz="4" w:space="0" w:color="000000"/>
+        </w:tblBorders>
+      </w:tblPr>
+      <w:tblGrid>
+        <w:gridCol w:w="1724"/>
+        <w:gridCol w:w="4599"/>
+        <w:gridCol w:w="2299"/>
+        <w:gridCol w:w="735"/>
+      </w:tblGrid>
+      <w:tr>
+        <w:trPr>
+          <w:tblHeader w:val="true"/>
+        </w:trPr>
+        <w:tc>
+          <w:tcPr>
+            <w:tcW w:type="dxa" w:w="1724"/>
+            <w:tcBorders>
+              <w:bottom w:val="single" w:sz="4" w:space="0" w:color="000000"/>
+            </w:tcBorders>
+          </w:tcPr>
+          <w:p>
+            <w:pPr>
+              <w:pStyle w:val="Compact"/>
+              <w:spacing w:line="240" w:lineRule="auto" w:after="20"/>
+              <w:jc w:val="left"/>
+            </w:pPr>
+            <w:r>
+              <w:rPr>
+                <w:b/>
+                <w:sz w:val="20"/>
+              </w:rPr>
+              <w:t xml:space="preserve">Part</w:t>
+            </w:r>
+          </w:p>
+        </w:tc>
+        <w:tc>
+          <w:tcPr>
+            <w:tcW w:type="dxa" w:w="4599"/>
+            <w:tcBorders>
+              <w:bottom w:val="single" w:sz="4" w:space="0" w:color="000000"/>
+            </w:tcBorders>
+          </w:tcPr>
+          <w:p>
+            <w:pPr>
+              <w:pStyle w:val="Compact"/>
+              <w:spacing w:line="240" w:lineRule="auto" w:after="20"/>
+              <w:jc w:val="left"/>
+            </w:pPr>
+            <w:r>
+              <w:rPr>
+                <w:b/>
+                <w:sz w:val="20"/>
+              </w:rPr>
+              <w:t xml:space="preserve">Driver</w:t>
+            </w:r>
+          </w:p>
+        </w:tc>
+        <w:tc>
+          <w:tcPr>
+            <w:tcW w:type="dxa" w:w="2299"/>
+            <w:tcBorders>
+              <w:bottom w:val="single" w:sz="4" w:space="0" w:color="000000"/>
+            </w:tcBorders>
+          </w:tcPr>
+          <w:p>
+            <w:pPr>
+              <w:pStyle w:val="Compact"/>
+              <w:spacing w:line="240" w:lineRule="auto" w:after="20"/>
+              <w:jc w:val="left"/>
+            </w:pPr>
+            <w:r>
+              <w:rPr>
+                <w:b/>
+                <w:sz w:val="20"/>
+              </w:rPr>
+              <w:t xml:space="preserve">Fuel saved [MSm³/yr]</w:t>
+            </w:r>
+          </w:p>
+        </w:tc>
+        <w:tc>
+          <w:tcPr>
+            <w:tcW w:type="dxa" w:w="735"/>
+            <w:tcBorders>
+              <w:bottom w:val="single" w:sz="4" w:space="0" w:color="000000"/>
+            </w:tcBorders>
+          </w:tcPr>
+          <w:p>
+            <w:pPr>
+              <w:pStyle w:val="Compact"/>
+              <w:spacing w:line="240" w:lineRule="auto" w:after="20"/>
+              <w:jc w:val="left"/>
+            </w:pPr>
+            <w:r>
+              <w:rPr>
+                <w:b/>
+                <w:sz w:val="20"/>
+              </w:rPr>
+              <w:t xml:space="preserve">Share</w:t>
+            </w:r>
+          </w:p>
+        </w:tc>
+      </w:tr>
+      <w:tr>
+        <w:tc>
+          <w:tcPr>
+            <w:tcW w:type="dxa" w:w="1724"/>
+          </w:tcPr>
+          <w:p>
+            <w:pPr>
+              <w:pStyle w:val="Compact"/>
+              <w:spacing w:line="240" w:lineRule="auto" w:after="20"/>
+              <w:jc w:val="left"/>
+            </w:pPr>
+            <w:r>
+              <w:rPr>
+                <w:sz w:val="20"/>
+              </w:rPr>
+              <w:t xml:space="preserve">Commitment</w:t>
+            </w:r>
+          </w:p>
+        </w:tc>
+        <w:tc>
+          <w:tcPr>
+            <w:tcW w:type="dxa" w:w="4599"/>
+          </w:tcPr>
+          <w:p>
+            <w:pPr>
+              <w:pStyle w:val="Compact"/>
+              <w:spacing w:line="240" w:lineRule="auto" w:after="20"/>
+              <w:jc w:val="left"/>
+            </w:pPr>
+            <w:r>
+              <w:rPr>
+                <w:sz w:val="20"/>
+              </w:rPr>
+              <w:t xml:space="preserve">1,674 GT unit-hours avoided × 1,068 Sm³ no-load fuel</w:t>
+            </w:r>
+          </w:p>
+        </w:tc>
+        <w:tc>
+          <w:tcPr>
+            <w:tcW w:type="dxa" w:w="2299"/>
+          </w:tcPr>
+          <w:p>
+            <w:pPr>
+              <w:pStyle w:val="Compact"/>
+              <w:spacing w:line="240" w:lineRule="auto" w:after="20"/>
+              <w:jc w:val="left"/>
+            </w:pPr>
+            <w:r>
+              <w:rPr>
+                <w:sz w:val="20"/>
+              </w:rPr>
+              <w:t xml:space="preserve">1.79</w:t>
+            </w:r>
+          </w:p>
+        </w:tc>
+        <w:tc>
+          <w:tcPr>
+            <w:tcW w:type="dxa" w:w="735"/>
+          </w:tcPr>
+          <w:p>
+            <w:pPr>
+              <w:pStyle w:val="Compact"/>
+              <w:spacing w:line="240" w:lineRule="auto" w:after="20"/>
+              <w:jc w:val="left"/>
+            </w:pPr>
+            <w:r>
+              <w:rPr>
+                <w:sz w:val="20"/>
+              </w:rPr>
+              <w:t xml:space="preserve">58 %</w:t>
+            </w:r>
+          </w:p>
+        </w:tc>
+      </w:tr>
+      <w:tr>
+        <w:tc>
+          <w:tcPr>
+            <w:tcW w:type="dxa" w:w="1724"/>
+          </w:tcPr>
+          <w:p>
+            <w:pPr>
+              <w:pStyle w:val="Compact"/>
+              <w:spacing w:line="240" w:lineRule="auto" w:after="20"/>
+              <w:jc w:val="left"/>
+            </w:pPr>
+            <w:r>
+              <w:rPr>
+                <w:sz w:val="20"/>
+              </w:rPr>
+              <w:t xml:space="preserve">Energy shifting</w:t>
+            </w:r>
+          </w:p>
+        </w:tc>
+        <w:tc>
+          <w:tcPr>
+            <w:tcW w:type="dxa" w:w="4599"/>
+          </w:tcPr>
+          <w:p>
+            <w:pPr>
+              <w:pStyle w:val="Compact"/>
+              <w:spacing w:line="240" w:lineRule="auto" w:after="20"/>
+              <w:jc w:val="left"/>
+            </w:pPr>
+            <w:r>
+              <w:rPr>
+                <w:sz w:val="20"/>
+              </w:rPr>
+              <w:t xml:space="preserve">5.8 GWh more wind used × 217 Sm³/MWh marginal fuel</w:t>
+            </w:r>
+          </w:p>
+        </w:tc>
+        <w:tc>
+          <w:tcPr>
+            <w:tcW w:type="dxa" w:w="2299"/>
+          </w:tcPr>
+          <w:p>
+            <w:pPr>
+              <w:pStyle w:val="Compact"/>
+              <w:spacing w:line="240" w:lineRule="auto" w:after="20"/>
+              <w:jc w:val="left"/>
+            </w:pPr>
+            <w:r>
+              <w:rPr>
+                <w:sz w:val="20"/>
+              </w:rPr>
+              <w:t xml:space="preserve">1.28</w:t>
+            </w:r>
+          </w:p>
+        </w:tc>
+        <w:tc>
+          <w:tcPr>
+            <w:tcW w:type="dxa" w:w="735"/>
+          </w:tcPr>
+          <w:p>
+            <w:pPr>
+              <w:pStyle w:val="Compact"/>
+              <w:spacing w:line="240" w:lineRule="auto" w:after="20"/>
+              <w:jc w:val="left"/>
+            </w:pPr>
+            <w:r>
+              <w:rPr>
+                <w:sz w:val="20"/>
+              </w:rPr>
+              <w:t xml:space="preserve">42 %</w:t>
+            </w:r>
+          </w:p>
+        </w:tc>
+      </w:tr>
+      <w:tr>
+        <w:tc>
+          <w:tcPr>
+            <w:tcW w:type="dxa" w:w="1724"/>
+          </w:tcPr>
+          <w:p>
+            <w:pPr>
+              <w:pStyle w:val="Compact"/>
+              <w:spacing w:line="240" w:lineRule="auto" w:after="20"/>
+              <w:jc w:val="left"/>
+            </w:pPr>
+            <w:r>
+              <w:rPr>
+                <w:bCs/>
+                <w:b/>
+                <w:sz w:val="20"/>
+              </w:rPr>
+              <w:t xml:space="preserve">Total</w:t>
+            </w:r>
+          </w:p>
+        </w:tc>
+        <w:tc>
+          <w:tcPr>
+            <w:tcW w:type="dxa" w:w="4599"/>
+          </w:tcPr>
+          <w:p>
+            <w:pPr>
+              <w:pStyle w:val="Compact"/>
+              <w:spacing w:line="240" w:lineRule="auto" w:after="20"/>
+              <w:jc w:val="left"/>
+            </w:pPr>
+          </w:p>
+        </w:tc>
+        <w:tc>
+          <w:tcPr>
+            <w:tcW w:type="dxa" w:w="2299"/>
+          </w:tcPr>
+          <w:p>
+            <w:pPr>
+              <w:pStyle w:val="Compact"/>
+              <w:spacing w:line="240" w:lineRule="auto" w:after="20"/>
+              <w:jc w:val="left"/>
+            </w:pPr>
+            <w:r>
+              <w:rPr>
+                <w:bCs/>
+                <w:b/>
+                <w:sz w:val="20"/>
+              </w:rPr>
+              <w:t xml:space="preserve">3.07</w:t>
+            </w:r>
+          </w:p>
+        </w:tc>
+        <w:tc>
+          <w:tcPr>
+            <w:tcW w:type="dxa" w:w="735"/>
+          </w:tcPr>
+          <w:p>
+            <w:pPr>
+              <w:pStyle w:val="Compact"/>
+              <w:spacing w:line="240" w:lineRule="auto" w:after="20"/>
+              <w:jc w:val="left"/>
+            </w:pPr>
+          </w:p>
+        </w:tc>
+      </w:tr>
+    </w:tbl>
     <w:p>
       <w:pPr>
         <w:pStyle w:val="Figure"/>
+        <w:spacing w:before="200"/>
       </w:pPr>
       <w:r>
         <w:drawing>
@@ -10306,7 +10788,7 @@
         <w:t xml:space="preserve"> </w:t>
       </w:r>
       <w:r>
-        <w:t xml:space="preserve">that hour are worth a few thousand NOK, and the optimiser therefore always</w:t>
+        <w:t xml:space="preserve">that hour are worth a few thousand NOK, and the optimizer therefore always</w:t>
       </w:r>
       <w:r>
         <w:t xml:space="preserve"> </w:t>
@@ -10417,7 +10899,7 @@
           <w:bCs/>
           <w:b/>
         </w:rPr>
-        <w:t xml:space="preserve">Table 3.</w:t>
+        <w:t xml:space="preserve">Table 4.</w:t>
       </w:r>
       <w:r>
         <w:t xml:space="preserve"> </w:t>
@@ -11253,7 +11735,7 @@
         <w:spacing w:before="200"/>
       </w:pPr>
       <w:r>
-        <w:t xml:space="preserve">The results of the sensitivity runs are given in Table 3 and Figure 7. Several</w:t>
+        <w:t xml:space="preserve">The results of the sensitivity runs are given in Table 4 and Figure 7. Several</w:t>
       </w:r>
       <w:r>
         <w:t xml:space="preserve"> </w:t>
@@ -11600,13 +12082,13 @@
       </w:r>
     </w:p>
     <w:bookmarkEnd w:id="54"/>
-    <w:bookmarkStart w:id="58" w:name="validation"/>
+    <w:bookmarkStart w:id="58" w:name="benchmark-checks"/>
     <w:p>
       <w:pPr>
         <w:pStyle w:val="Heading2"/>
       </w:pPr>
       <w:r>
-        <w:t xml:space="preserve">3.5 Validation</w:t>
+        <w:t xml:space="preserve">3.5 Benchmark checks</w:t>
       </w:r>
     </w:p>
     <w:p>
@@ -11618,7 +12100,7 @@
           <w:bCs/>
           <w:b/>
         </w:rPr>
-        <w:t xml:space="preserve">Table 4.</w:t>
+        <w:t xml:space="preserve">Table 5.</w:t>
       </w:r>
       <w:r>
         <w:t xml:space="preserve"> </w:t>
@@ -11830,7 +12312,7 @@
               <w:rPr>
                 <w:sz w:val="20"/>
               </w:rPr>
-              <w:t xml:space="preserve">Platform power, six modelled platforms (Nguyen et al. 2013)</w:t>
+              <w:t xml:space="preserve">Platform power, six modeled platforms (Nguyen et al. 2013)</w:t>
             </w:r>
           </w:p>
         </w:tc>
@@ -12452,7 +12934,7 @@
         <w:spacing w:before="200"/>
       </w:pPr>
       <w:r>
-        <w:t xml:space="preserve">The model results are compared with the published benchmarks in Table 4 and</w:t>
+        <w:t xml:space="preserve">The model results are compared with the published benchmarks in Table 5 and</w:t>
       </w:r>
       <w:r>
         <w:t xml:space="preserve"> </w:t>
@@ -12482,7 +12964,7 @@
         <w:t xml:space="preserve"> </w:t>
       </w:r>
       <w:r>
-        <w:t xml:space="preserve">modelled by Nguyen et al. (2013), in which gas compression alone</w:t>
+        <w:t xml:space="preserve">modeled by Nguyen et al. (2013), in which gas compression alone</w:t>
       </w:r>
       <w:r>
         <w:t xml:space="preserve"> </w:t>
@@ -12574,13 +13056,55 @@
         <w:t xml:space="preserve"> </w:t>
       </w:r>
       <w:r>
-        <w:t xml:space="preserve">saved as well. The difference shows to what extent the benefit of wind depends</w:t>
-      </w:r>
-      <w:r>
-        <w:t xml:space="preserve"> </w:t>
-      </w:r>
-      <w:r>
-        <w:t xml:space="preserve">on the operating practice rather than on the wind farm itself.</w:t>
+        <w:t xml:space="preserve">saved as well. The published value is derived from the expected annual figures of the wind</w:t>
+      </w:r>
+      <w:r>
+        <w:t xml:space="preserve"> </w:t>
+      </w:r>
+      <w:r>
+        <w:t xml:space="preserve">farm, about 200 kt of CO</w:t>
+      </w:r>
+      <w:r>
+        <w:rPr>
+          <w:vertAlign w:val="subscript"/>
+        </w:rPr>
+        <w:t xml:space="preserve">2</w:t>
+      </w:r>
+      <w:r>
+        <w:t xml:space="preserve"> </w:t>
+      </w:r>
+      <w:r>
+        <w:t xml:space="preserve">avoided per year (Equinor 2023), and not from</w:t>
+      </w:r>
+      <w:r>
+        <w:t xml:space="preserve"> </w:t>
+      </w:r>
+      <w:r>
+        <w:t xml:space="preserve">measurements, so this comparison is a check of consistency rather than a</w:t>
+      </w:r>
+      <w:r>
+        <w:t xml:space="preserve"> </w:t>
+      </w:r>
+      <w:r>
+        <w:t xml:space="preserve">validation. The model agrees with it only when it is operated as assumed in</w:t>
+      </w:r>
+      <w:r>
+        <w:t xml:space="preserve"> </w:t>
+      </w:r>
+      <w:r>
+        <w:t xml:space="preserve">that estimate; with a GT allowed to stop, as in Case 2, the model value is 36</w:t>
+      </w:r>
+      <w:r>
+        <w:t xml:space="preserve"> </w:t>
+      </w:r>
+      <w:r>
+        <w:t xml:space="preserve">% higher. The difference shows to what extent the benefit of wind depends on</w:t>
+      </w:r>
+      <w:r>
+        <w:t xml:space="preserve"> </w:t>
+      </w:r>
+      <w:r>
+        <w:t xml:space="preserve">the operating practice rather than on the wind farm itself.</w:t>
       </w:r>
     </w:p>
     <w:p>
@@ -12594,7 +13118,7 @@
         <w:t xml:space="preserve"> </w:t>
       </w:r>
       <w:r>
-        <w:t xml:space="preserve">Gullfaks field centre emitted 2.32–2.40 kg CO</w:t>
+        <w:t xml:space="preserve">Gullfaks field center emitted 2.32–2.40 kg CO</w:t>
       </w:r>
       <w:r>
         <w:rPr>
@@ -12779,7 +13303,7 @@
         <w:t xml:space="preserve"> </w:t>
       </w:r>
       <w:r>
-        <w:t xml:space="preserve">Left: model results divided by published benchmarks (1 = equal; shaded: ±20 %; grey bars: published ranges). Right: CO</w:t>
+        <w:t xml:space="preserve">Left: model results divided by published benchmarks (1 = equal; shaded: ±20 %; gray bars: published ranges). Right: CO</w:t>
       </w:r>
       <w:r>
         <w:rPr>
@@ -12791,7 +13315,7 @@
         <w:t xml:space="preserve"> </w:t>
       </w:r>
       <w:r>
-        <w:t xml:space="preserve">intensity of the Gullfaks, Snorre and Statfjord field centres (grey: GT-powered; teal: receiving Hywind Tampen power) with the model Case 1 value (dashed).</w:t>
+        <w:t xml:space="preserve">intensity of the Gullfaks, Snorre and Statfjord field centers (gray: GT-powered; teal: receiving Hywind Tampen power) with the model Case 1 value (dashed).</w:t>
       </w:r>
     </w:p>
     <w:bookmarkEnd w:id="58"/>
@@ -12813,7 +13337,7 @@
           <w:bCs/>
           <w:b/>
         </w:rPr>
-        <w:t xml:space="preserve">Table 5.</w:t>
+        <w:t xml:space="preserve">Table 6.</w:t>
       </w:r>
       <w:r>
         <w:t xml:space="preserve"> </w:t>
@@ -13462,7 +13986,7 @@
         <w:spacing w:before="200"/>
       </w:pPr>
       <w:r>
-        <w:t xml:space="preserve">The economic indicators are given in Table 5. With an investment of 2.5</w:t>
+        <w:t xml:space="preserve">The economic indicators are given in Table 6. With an investment of 2.5</w:t>
       </w:r>
       <w:r>
         <w:t xml:space="preserve"> </w:t>
@@ -13648,7 +14172,7 @@
           <w:bCs/>
           <w:b/>
         </w:rPr>
-        <w:t xml:space="preserve">Table 6.</w:t>
+        <w:t xml:space="preserve">Table 7.</w:t>
       </w:r>
       <w:r>
         <w:t xml:space="preserve"> </w:t>
@@ -14315,7 +14839,7 @@
         <w:spacing w:before="200"/>
       </w:pPr>
       <w:r>
-        <w:t xml:space="preserve">The results for the ten weather years are summarised in Table 6 and Figure 9.</w:t>
+        <w:t xml:space="preserve">The results for the ten weather years are summarized in Table 7 and Figure 9.</w:t>
       </w:r>
       <w:r>
         <w:t xml:space="preserve"> </w:t>
@@ -14550,61 +15074,61 @@
         <w:pStyle w:val="FirstParagraph"/>
       </w:pPr>
       <w:r>
-        <w:t xml:space="preserve">Flexible demand saves fuel through the unit commitment of the GTs rather than</w:t>
-      </w:r>
-      <w:r>
-        <w:t xml:space="preserve"> </w:t>
-      </w:r>
-      <w:r>
-        <w:t xml:space="preserve">through energy shifting. A GT held at low load for reserve still burns a large</w:t>
-      </w:r>
-      <w:r>
-        <w:t xml:space="preserve"> </w:t>
-      </w:r>
-      <w:r>
-        <w:t xml:space="preserve">share of its full-load fuel, and the costly hours are therefore those in which</w:t>
-      </w:r>
-      <w:r>
-        <w:t xml:space="preserve"> </w:t>
-      </w:r>
-      <w:r>
-        <w:t xml:space="preserve">the wind is just too weak for one turbine to carry the load with 5 MW in</w:t>
-      </w:r>
-      <w:r>
-        <w:t xml:space="preserve"> </w:t>
-      </w:r>
-      <w:r>
-        <w:t xml:space="preserve">reserve. Deferring injection in these hours keeps the second turbine off.</w:t>
-      </w:r>
-      <w:r>
-        <w:t xml:space="preserve"> </w:t>
-      </w:r>
-      <w:r>
-        <w:t xml:space="preserve">Three of the results of Section 3 follow from this mechanism: most of the</w:t>
-      </w:r>
-      <w:r>
-        <w:t xml:space="preserve"> </w:t>
-      </w:r>
-      <w:r>
-        <w:t xml:space="preserve">saving comes from the 1,674 avoided hours with two GTs online; about one day</w:t>
-      </w:r>
-      <w:r>
-        <w:t xml:space="preserve"> </w:t>
-      </w:r>
-      <w:r>
-        <w:t xml:space="preserve">of deficit capacity captures almost all of it, since these hours occur in</w:t>
-      </w:r>
-      <w:r>
-        <w:t xml:space="preserve"> </w:t>
-      </w:r>
-      <w:r>
-        <w:t xml:space="preserve">short spells between windy periods; and the saving largely disappears under</w:t>
-      </w:r>
-      <w:r>
-        <w:t xml:space="preserve"> </w:t>
-      </w:r>
-      <w:r>
-        <w:t xml:space="preserve">operating rules that keep two GTs online in any case.</w:t>
+        <w:t xml:space="preserve">Flexible demand saves fuel through two linked effects. Deferring injection in</w:t>
+      </w:r>
+      <w:r>
+        <w:t xml:space="preserve"> </w:t>
+      </w:r>
+      <w:r>
+        <w:t xml:space="preserve">the hours in which the wind is just too weak for one turbine to carry the load</w:t>
+      </w:r>
+      <w:r>
+        <w:t xml:space="preserve"> </w:t>
+      </w:r>
+      <w:r>
+        <w:t xml:space="preserve">with 5 MW in reserve keeps the second turbine off, which saves its no-load</w:t>
+      </w:r>
+      <w:r>
+        <w:t xml:space="preserve"> </w:t>
+      </w:r>
+      <w:r>
+        <w:t xml:space="preserve">fuel, and the deferred injection then uses wind that would otherwise be</w:t>
+      </w:r>
+      <w:r>
+        <w:t xml:space="preserve"> </w:t>
+      </w:r>
+      <w:r>
+        <w:t xml:space="preserve">curtailed. The commitment effect is the larger one (58 % of the saving), and</w:t>
+      </w:r>
+      <w:r>
+        <w:t xml:space="preserve"> </w:t>
+      </w:r>
+      <w:r>
+        <w:t xml:space="preserve">it explains three of the results of Section 3: almost all of the 1,702 hours</w:t>
+      </w:r>
+      <w:r>
+        <w:t xml:space="preserve"> </w:t>
+      </w:r>
+      <w:r>
+        <w:t xml:space="preserve">with two GTs online are avoided; about one day of deficit capacity is</w:t>
+      </w:r>
+      <w:r>
+        <w:t xml:space="preserve"> </w:t>
+      </w:r>
+      <w:r>
+        <w:t xml:space="preserve">sufficient, since these hours occur in short spells between windy periods; and</w:t>
+      </w:r>
+      <w:r>
+        <w:t xml:space="preserve"> </w:t>
+      </w:r>
+      <w:r>
+        <w:t xml:space="preserve">the saving is reduced to the energy part alone under operating rules that keep</w:t>
+      </w:r>
+      <w:r>
+        <w:t xml:space="preserve"> </w:t>
+      </w:r>
+      <w:r>
+        <w:t xml:space="preserve">two GTs online in any case (3.1 kt instead of 7.2 kt).</w:t>
       </w:r>
     </w:p>
     <w:p>
@@ -14612,55 +15136,55 @@
         <w:pStyle w:val="BodyText"/>
       </w:pPr>
       <w:r>
-        <w:t xml:space="preserve">Energy shifting alone has a small effect. The curtailment decreases by only 13</w:t>
-      </w:r>
-      <w:r>
-        <w:t xml:space="preserve"> </w:t>
-      </w:r>
-      <w:r>
-        <w:t xml:space="preserve">%, since one GT must remain online and a 30 MW farm often produces more power</w:t>
-      </w:r>
-      <w:r>
-        <w:t xml:space="preserve"> </w:t>
-      </w:r>
-      <w:r>
-        <w:t xml:space="preserve">than the platform can use, even with injection at full rate. For the same</w:t>
-      </w:r>
-      <w:r>
-        <w:t xml:space="preserve"> </w:t>
-      </w:r>
-      <w:r>
-        <w:t xml:space="preserve">reason, the value of flexibility does not increase with the size of the wind</w:t>
-      </w:r>
-      <w:r>
-        <w:t xml:space="preserve"> </w:t>
-      </w:r>
-      <w:r>
-        <w:t xml:space="preserve">farm: a larger farm covers the demand more often, so that a second GT is</w:t>
-      </w:r>
-      <w:r>
-        <w:t xml:space="preserve"> </w:t>
-      </w:r>
-      <w:r>
-        <w:t xml:space="preserve">needed in fewer hours, and the additional wind in windy hours cannot be</w:t>
-      </w:r>
-      <w:r>
-        <w:t xml:space="preserve"> </w:t>
-      </w:r>
-      <w:r>
-        <w:t xml:space="preserve">absorbed. Flexibility is thus most valuable when the wind farm capacity is of</w:t>
-      </w:r>
-      <w:r>
-        <w:t xml:space="preserve"> </w:t>
-      </w:r>
-      <w:r>
-        <w:t xml:space="preserve">the same order as the platform demand, as in the base case and at Hywind</w:t>
-      </w:r>
-      <w:r>
-        <w:t xml:space="preserve"> </w:t>
-      </w:r>
-      <w:r>
-        <w:t xml:space="preserve">Tampen.</w:t>
+        <w:t xml:space="preserve">The energy-shifting part is limited by the wind that can be absorbed. The</w:t>
+      </w:r>
+      <w:r>
+        <w:t xml:space="preserve"> </w:t>
+      </w:r>
+      <w:r>
+        <w:t xml:space="preserve">curtailment decreases by only 13 %, since one GT must remain online and a 30</w:t>
+      </w:r>
+      <w:r>
+        <w:t xml:space="preserve"> </w:t>
+      </w:r>
+      <w:r>
+        <w:t xml:space="preserve">MW farm often produces more power than the platform can use, even with</w:t>
+      </w:r>
+      <w:r>
+        <w:t xml:space="preserve"> </w:t>
+      </w:r>
+      <w:r>
+        <w:t xml:space="preserve">injection at full rate. For the same reason, the value of flexibility does not</w:t>
+      </w:r>
+      <w:r>
+        <w:t xml:space="preserve"> </w:t>
+      </w:r>
+      <w:r>
+        <w:t xml:space="preserve">increase with the size of the wind farm: a larger farm covers the demand more</w:t>
+      </w:r>
+      <w:r>
+        <w:t xml:space="preserve"> </w:t>
+      </w:r>
+      <w:r>
+        <w:t xml:space="preserve">often, so that a second GT is needed in fewer hours, and the additional wind</w:t>
+      </w:r>
+      <w:r>
+        <w:t xml:space="preserve"> </w:t>
+      </w:r>
+      <w:r>
+        <w:t xml:space="preserve">in windy hours cannot be absorbed. Flexibility is thus most valuable when the</w:t>
+      </w:r>
+      <w:r>
+        <w:t xml:space="preserve"> </w:t>
+      </w:r>
+      <w:r>
+        <w:t xml:space="preserve">wind farm capacity is of the same order as the platform demand, as in the base</w:t>
+      </w:r>
+      <w:r>
+        <w:t xml:space="preserve"> </w:t>
+      </w:r>
+      <w:r>
+        <w:t xml:space="preserve">case and at Hywind Tampen.</w:t>
       </w:r>
     </w:p>
     <w:p>
@@ -14846,7 +15370,7 @@
         <w:t xml:space="preserve"> </w:t>
       </w:r>
       <w:r>
-        <w:t xml:space="preserve">profitable only with favourable gas and CO</w:t>
+        <w:t xml:space="preserve">profitable only with favorable gas and CO</w:t>
       </w:r>
       <w:r>
         <w:rPr>
@@ -15044,7 +15568,7 @@
         <w:t xml:space="preserve"> </w:t>
       </w:r>
       <w:r>
-        <w:t xml:space="preserve">starts per day, and this is not penalised in the model. A start cost or a</w:t>
+        <w:t xml:space="preserve">starts per day, and this is not penalized in the model. A start cost or a</w:t>
       </w:r>
       <w:r>
         <w:t xml:space="preserve"> </w:t>
@@ -15352,13 +15876,13 @@
         <w:t xml:space="preserve"> </w:t>
       </w:r>
       <w:r>
-        <w:t xml:space="preserve">behaviour, the start-up times of pumps and GTs beyond a start cost, and the</w:t>
-      </w:r>
-      <w:r>
-        <w:t xml:space="preserve"> </w:t>
-      </w:r>
-      <w:r>
-        <w:t xml:space="preserve">reservoir response to deferred injection are not modelled. The GT part-load</w:t>
+        <w:t xml:space="preserve">behavior, the start-up times of pumps and GTs beyond a start cost, and the</w:t>
+      </w:r>
+      <w:r>
+        <w:t xml:space="preserve"> </w:t>
+      </w:r>
+      <w:r>
+        <w:t xml:space="preserve">reservoir response to deferred injection are not modeled. The GT part-load</w:t>
       </w:r>
       <w:r>
         <w:t xml:space="preserve"> </w:t>
@@ -15476,7 +16000,7 @@
         <w:t xml:space="preserve"> </w:t>
       </w:r>
       <w:r>
-        <w:t xml:space="preserve">what extent an off-grid platform can be decarbonised before power from shore</w:t>
+        <w:t xml:space="preserve">what extent an off-grid platform can be decarbonized before power from shore</w:t>
       </w:r>
       <w:r>
         <w:t xml:space="preserve"> </w:t>
@@ -15531,13 +16055,13 @@
         <w:t xml:space="preserve"> </w:t>
       </w:r>
       <w:r>
-        <w:t xml:space="preserve">demand flexibility and of a battery, and the model was validated against</w:t>
-      </w:r>
-      <w:r>
-        <w:t xml:space="preserve"> </w:t>
-      </w:r>
-      <w:r>
-        <w:t xml:space="preserve">published data for Hywind Tampen and three North Sea field centres.</w:t>
+        <w:t xml:space="preserve">demand flexibility and of a battery, and the model was checked against published data for Hywind Tampen and three</w:t>
+      </w:r>
+      <w:r>
+        <w:t xml:space="preserve"> </w:t>
+      </w:r>
+      <w:r>
+        <w:t xml:space="preserve">North Sea field centers.</w:t>
       </w:r>
     </w:p>
     <w:p>
@@ -15649,7 +16173,13 @@
         <w:t xml:space="preserve"> </w:t>
       </w:r>
       <w:r>
-        <w:t xml:space="preserve">2,180–2,519 to 1,774–2,078 NOK/t. The model reproduces the CO</w:t>
+        <w:t xml:space="preserve">2,180–2,519 to 1,774–2,078 NOK/t. With two GTs kept online, as assumed in the operator’s estimate, the model</w:t>
+      </w:r>
+      <w:r>
+        <w:t xml:space="preserve"> </w:t>
+      </w:r>
+      <w:r>
+        <w:t xml:space="preserve">agrees with the CO</w:t>
       </w:r>
       <w:r>
         <w:rPr>
@@ -15661,19 +16191,13 @@
         <w:t xml:space="preserve"> </w:t>
       </w:r>
       <w:r>
-        <w:t xml:space="preserve">avoided per MWh</w:t>
-      </w:r>
-      <w:r>
-        <w:t xml:space="preserve"> </w:t>
-      </w:r>
-      <w:r>
-        <w:t xml:space="preserve">of wind reported for Hywind Tampen within 2 %, as well as the fuel gas</w:t>
-      </w:r>
-      <w:r>
-        <w:t xml:space="preserve"> </w:t>
-      </w:r>
-      <w:r>
-        <w:t xml:space="preserve">emission factor observed at Gullfaks. Although the exact values would differ</w:t>
+        <w:t xml:space="preserve">avoided per MWh of wind expected for Hywind Tampen, and</w:t>
+      </w:r>
+      <w:r>
+        <w:t xml:space="preserve"> </w:t>
+      </w:r>
+      <w:r>
+        <w:t xml:space="preserve">it reproduces the fuel gas emission factor observed at Gullfaks. Although the exact values would differ</w:t>
       </w:r>
       <w:r>
         <w:t xml:space="preserve"> </w:t>
@@ -18152,6 +18676,14 @@
         <w:pStyle w:val="Bibliography"/>
       </w:pPr>
       <w:r>
+        <w:t xml:space="preserve">Alves EF, Sanchez S, Brandão DI, Tedeschi E (2019) Smart load management with energy storage for power quality enhancement in wind-powered oil and gas applications. Energies 12(15):2985. https://doi.org/10.3390/en12152985.</w:t>
+      </w:r>
+    </w:p>
+    <w:p>
+      <w:pPr>
+        <w:pStyle w:val="Bibliography"/>
+      </w:pPr>
+      <w:r>
         <w:t xml:space="preserve">Bynum ML, Hackebeil GA, Hart WE, Laird CD, Nicholson BL, Siirola JD, et al. (2021) Pyomo – optimization modeling in Python. 3rd ed. Cham: Springer.</w:t>
       </w:r>
     </w:p>
@@ -18168,6 +18700,14 @@
         <w:pStyle w:val="Bibliography"/>
       </w:pPr>
       <w:r>
+        <w:t xml:space="preserve">DNV GL (2016) WIN WIN – wind-powered water injection: joint industry project, phase 1 results [news release, Offshore Technology Conference].</w:t>
+      </w:r>
+    </w:p>
+    <w:p>
+      <w:pPr>
+        <w:pStyle w:val="Bibliography"/>
+      </w:pPr>
+      <w:r>
         <w:t xml:space="preserve">Equinor (2023) The world’s largest floating offshore wind farm officially opened [press release]. 23 August 2023. https://www.equinor.com/news/20230823-hywind-tampen-officially-opened.</w:t>
       </w:r>
     </w:p>
@@ -18256,6 +18796,22 @@
         <w:pStyle w:val="Bibliography"/>
       </w:pPr>
       <w:r>
+        <w:t xml:space="preserve">Nilsen MM, Lorentzen RJ, Leeuwenburgh O, Stordal AS, Barros E (2025a) Closed-loop workflow for short-term optimization of wind-powered reservoir management. Clean Energy Syst 12:100213.</w:t>
+      </w:r>
+    </w:p>
+    <w:p>
+      <w:pPr>
+        <w:pStyle w:val="Bibliography"/>
+      </w:pPr>
+      <w:r>
+        <w:t xml:space="preserve">Nilsen MM, Lorentzen RJ, Stordal AS, Leeuwenburgh O, Barros E (2025b) Wind-powered reservoir management with application to robust multi-objective optimization. Comput Geosci 29:29. https://doi.org/10.1007/s10596-025-10370-w.</w:t>
+      </w:r>
+    </w:p>
+    <w:p>
+      <w:pPr>
+        <w:pStyle w:val="Bibliography"/>
+      </w:pPr>
+      <w:r>
         <w:t xml:space="preserve">Norwegian Environment Agency (n.d.) Norskeutslipp – emissions from Gullfaks, Snorre and Statfjord, 2021–2024. https://www.norskeutslipp.no [accessed DATE].</w:t>
       </w:r>
     </w:p>
@@ -18337,6 +18893,14 @@
       </w:pPr>
       <w:r>
         <w:t xml:space="preserve">Riboldi L, Nord LO (2018) Offshore power plants integrating a wind farm: design optimisation and techno-economic assessment based on surrogate modelling. Processes 6(12):249. https://doi.org/10.3390/pr6120249.</w:t>
+      </w:r>
+    </w:p>
+    <w:p>
+      <w:pPr>
+        <w:pStyle w:val="Bibliography"/>
+      </w:pPr>
+      <w:r>
+        <w:t xml:space="preserve">Sanchez S, Tedeschi E, Silva J, Jafar M, Marichalar A (2017) Smart load management of water injection systems in offshore oil and gas platforms integrating wind power. IET Renew Power Gener 11(9):1153–62. https://doi.org/10.1049/iet-rpg.2016.0989.</w:t>
       </w:r>
     </w:p>
     <w:p>

</xml_diff>

<commit_message>
New sensitivities and the demand/reserve map in the paper
Results of the review runs: solver gap 0.1 % (battery 0.4 kt, real but small),
GT minimum load 16-50 % (flexibility 7.2-10.2 kt), pump start cost (163 starts
at 1 kNOK, 0.08 kt lost), reserve covering wind (benefit 8.5-12.5 kt) and
injection pumps as trippable reserve (60 % of the benefit without scheduling).
New Section 3.5 and Fig. 8: the benefit doubles from 4-5 % to 8-12 % once the
mean demand exceeds one GT's rating minus the reserve. Later sections and
figures renumbered.
</commit_message>
<xml_diff>
--- a/docs/paper/paper.docx
+++ b/docs/paper/paper.docx
@@ -2363,7 +2363,7 @@
         <w:t xml:space="preserve"> </w:t>
       </w:r>
       <w:r>
-        <w:t xml:space="preserve">between 2.32 and 2.40 kg/Sm³ (Section 3.5).</w:t>
+        <w:t xml:space="preserve">between 2.32 and 2.40 kg/Sm³ (Section 3.6).</w:t>
       </w:r>
     </w:p>
     <w:bookmarkEnd w:id="26"/>
@@ -7426,12 +7426,278 @@
         <w:t xml:space="preserve"> </w:t>
       </w:r>
       <w:r>
-        <w:t xml:space="preserve">some operators require for redundancy.</w:t>
+        <w:t xml:space="preserve">some operators require for redundancy;</w:t>
+      </w:r>
+    </w:p>
+    <w:p>
+      <w:pPr>
+        <w:numPr>
+          <w:ilvl w:val="0"/>
+          <w:numId w:val="1005"/>
+        </w:numPr>
+        <w:pStyle w:val="Compact"/>
+      </w:pPr>
+      <w:r>
+        <w:t xml:space="preserve">GT minimum stable load (16, 30, 40 and 50 % of rating), since dry low-NOx</w:t>
+      </w:r>
+      <w:r>
+        <w:t xml:space="preserve"> </w:t>
+      </w:r>
+      <w:r>
+        <w:t xml:space="preserve">combustors often cannot keep their emissions within limits far below about</w:t>
+      </w:r>
+      <w:r>
+        <w:t xml:space="preserve"> </w:t>
+      </w:r>
+      <w:r>
+        <w:t xml:space="preserve">40–50 % load;</w:t>
+      </w:r>
+    </w:p>
+    <w:p>
+      <w:pPr>
+        <w:numPr>
+          <w:ilvl w:val="0"/>
+          <w:numId w:val="1005"/>
+        </w:numPr>
+        <w:pStyle w:val="Compact"/>
+      </w:pPr>
+      <w:r>
+        <w:t xml:space="preserve">a cost per injection pump start (0–20,000 NOK), with the number of running</w:t>
+      </w:r>
+      <w:r>
+        <w:t xml:space="preserve"> </w:t>
+      </w:r>
+      <w:r>
+        <w:t xml:space="preserve">pumps</w:t>
+      </w:r>
+      <w:r>
+        <w:t xml:space="preserve"> </w:t>
+      </w:r>
+      <m:oMath>
+        <m:sSub>
+          <m:e>
+            <m:r>
+              <m:t>n</m:t>
+            </m:r>
+          </m:e>
+          <m:sub>
+            <m:r>
+              <m:t>r</m:t>
+            </m:r>
+            <m:r>
+              <m:t>u</m:t>
+            </m:r>
+            <m:r>
+              <m:t>n</m:t>
+            </m:r>
+          </m:sub>
+        </m:sSub>
+        <m:r>
+          <m:rPr>
+            <m:sty m:val="p"/>
+          </m:rPr>
+          <m:t>=</m:t>
+        </m:r>
+        <m:r>
+          <m:rPr>
+            <m:sty m:val="p"/>
+          </m:rPr>
+          <m:t>⌈</m:t>
+        </m:r>
+        <m:sSub>
+          <m:e>
+            <m:r>
+              <m:t>f</m:t>
+            </m:r>
+          </m:e>
+          <m:sub>
+            <m:r>
+              <m:t>w</m:t>
+            </m:r>
+            <m:r>
+              <m:t>i</m:t>
+            </m:r>
+          </m:sub>
+        </m:sSub>
+        <m:r>
+          <m:t> </m:t>
+        </m:r>
+        <m:r>
+          <m:t>n</m:t>
+        </m:r>
+        <m:r>
+          <m:rPr>
+            <m:sty m:val="p"/>
+          </m:rPr>
+          <m:t>⌉</m:t>
+        </m:r>
+      </m:oMath>
+      <w:r>
+        <w:t xml:space="preserve"> </w:t>
+      </w:r>
+      <w:r>
+        <w:t xml:space="preserve">of Section 2.4 as an integer</w:t>
+      </w:r>
+      <w:r>
+        <w:t xml:space="preserve"> </w:t>
+      </w:r>
+      <w:r>
+        <w:t xml:space="preserve">variable;</w:t>
+      </w:r>
+    </w:p>
+    <w:p>
+      <w:pPr>
+        <w:numPr>
+          <w:ilvl w:val="0"/>
+          <w:numId w:val="1005"/>
+        </w:numPr>
+        <w:pStyle w:val="Compact"/>
+      </w:pPr>
+      <w:r>
+        <w:t xml:space="preserve">the reserve definition: a requirement that also covers 50 % or 100 % of the</w:t>
+      </w:r>
+      <w:r>
+        <w:t xml:space="preserve"> </w:t>
+      </w:r>
+      <w:r>
+        <w:t xml:space="preserve">wind power used,</w:t>
+      </w:r>
+      <w:r>
+        <w:t xml:space="preserve"> </w:t>
+      </w:r>
+      <m:oMath>
+        <m:sSub>
+          <m:e>
+            <m:r>
+              <m:t>R</m:t>
+            </m:r>
+          </m:e>
+          <m:sub>
+            <m:r>
+              <m:t>t</m:t>
+            </m:r>
+          </m:sub>
+        </m:sSub>
+        <m:r>
+          <m:rPr>
+            <m:sty m:val="p"/>
+          </m:rPr>
+          <m:t>=</m:t>
+        </m:r>
+        <m:r>
+          <m:t>R</m:t>
+        </m:r>
+        <m:r>
+          <m:rPr>
+            <m:sty m:val="p"/>
+          </m:rPr>
+          <m:t>+</m:t>
+        </m:r>
+        <m:r>
+          <m:t>k</m:t>
+        </m:r>
+        <m:r>
+          <m:t> </m:t>
+        </m:r>
+        <m:sSubSup>
+          <m:e>
+            <m:r>
+              <m:t>P</m:t>
+            </m:r>
+          </m:e>
+          <m:sub>
+            <m:r>
+              <m:t>t</m:t>
+            </m:r>
+          </m:sub>
+          <m:sup>
+            <m:r>
+              <m:t>w</m:t>
+            </m:r>
+          </m:sup>
+        </m:sSubSup>
+      </m:oMath>
+      <w:r>
+        <w:t xml:space="preserve">, and running injection pumps counted</w:t>
+      </w:r>
+      <w:r>
+        <w:t xml:space="preserve"> </w:t>
+      </w:r>
+      <w:r>
+        <w:t xml:space="preserve">as reserve because they can be tripped within seconds;</w:t>
+      </w:r>
+    </w:p>
+    <w:p>
+      <w:pPr>
+        <w:numPr>
+          <w:ilvl w:val="0"/>
+          <w:numId w:val="1005"/>
+        </w:numPr>
+        <w:pStyle w:val="Compact"/>
+      </w:pPr>
+      <w:r>
+        <w:t xml:space="preserve">the solver gap (0.1 % instead of 0.5 %), to check that the small battery</w:t>
+      </w:r>
+      <w:r>
+        <w:t xml:space="preserve"> </w:t>
+      </w:r>
+      <w:r>
+        <w:t xml:space="preserve">effect is not an artefact of the solver tolerance.</w:t>
       </w:r>
     </w:p>
     <w:p>
       <w:pPr>
         <w:pStyle w:val="FirstParagraph"/>
+      </w:pPr>
+      <w:r>
+        <w:t xml:space="preserve">To test how far the results carry over to other platforms, Cases 2 and 3 were</w:t>
+      </w:r>
+      <w:r>
+        <w:t xml:space="preserve"> </w:t>
+      </w:r>
+      <w:r>
+        <w:t xml:space="preserve">also run with every electric consumer scaled by 0.6–1.2 (mean demand 11.3–22.6</w:t>
+      </w:r>
+      <w:r>
+        <w:t xml:space="preserve"> </w:t>
+      </w:r>
+      <w:r>
+        <w:t xml:space="preserve">MW), combined with a spinning reserve of 3, 5, 7 and 9 MW, 28 platforms in</w:t>
+      </w:r>
+      <w:r>
+        <w:t xml:space="preserve"> </w:t>
+      </w:r>
+      <w:r>
+        <w:t xml:space="preserve">total. Finally, the assumption of perfect wind foresight within each window</w:t>
+      </w:r>
+      <w:r>
+        <w:t xml:space="preserve"> </w:t>
+      </w:r>
+      <w:r>
+        <w:t xml:space="preserve">was tested with a schedule that is re-planned every hour over the next 24 h.</w:t>
+      </w:r>
+      <w:r>
+        <w:t xml:space="preserve"> </w:t>
+      </w:r>
+      <w:r>
+        <w:t xml:space="preserve">Only the wind of the current hour is known; every later hour is assumed equal</w:t>
+      </w:r>
+      <w:r>
+        <w:t xml:space="preserve"> </w:t>
+      </w:r>
+      <w:r>
+        <w:t xml:space="preserve">to it (persistence forecast). The same hourly re-planning with the actual wind</w:t>
+      </w:r>
+      <w:r>
+        <w:t xml:space="preserve"> </w:t>
+      </w:r>
+      <w:r>
+        <w:t xml:space="preserve">isolates the effect of the forecast from that of the shorter horizon.</w:t>
+      </w:r>
+    </w:p>
+    <w:p>
+      <w:pPr>
+        <w:pStyle w:val="BodyText"/>
       </w:pPr>
       <w:r>
         <w:t xml:space="preserve">The results were compared with independent values:</w:t>
@@ -8432,7 +8698,7 @@
     </w:p>
     <w:bookmarkEnd w:id="31"/>
     <w:bookmarkEnd w:id="32"/>
-    <w:bookmarkStart w:id="64" w:name="results"/>
+    <w:bookmarkStart w:id="68" w:name="results"/>
     <w:p>
       <w:pPr>
         <w:pStyle w:val="Heading1"/>
@@ -10917,7 +11183,7 @@
         <w:t xml:space="preserve"> </w:t>
       </w:r>
       <w:r>
-        <w:t xml:space="preserve">[kt/yr] in the sensitivity runs.</w:t>
+        <w:t xml:space="preserve">[kt/yr] in the sensitivity runs (2023).</w:t>
       </w:r>
     </w:p>
     <w:tbl>
@@ -11158,26 +11424,7 @@
               <w:rPr>
                 <w:sz w:val="20"/>
               </w:rPr>
-              <w:t xml:space="preserve">CO</w:t>
-            </w:r>
-            <w:r>
-              <w:rPr>
-                <w:sz w:val="20"/>
-                <w:vertAlign w:val="subscript"/>
-              </w:rPr>
-              <w:t xml:space="preserve">2</w:t>
-            </w:r>
-            <w:r>
-              <w:rPr>
-                <w:sz w:val="20"/>
-              </w:rPr>
-              <w:t xml:space="preserve"> </w:t>
-            </w:r>
-            <w:r>
-              <w:rPr>
-                <w:sz w:val="20"/>
-              </w:rPr>
-              <w:t xml:space="preserve">price [NOK/kg]</w:t>
+              <w:t xml:space="preserve">Battery [MW / MWh]</w:t>
             </w:r>
           </w:p>
         </w:tc>
@@ -11195,7 +11442,7 @@
               <w:rPr>
                 <w:sz w:val="20"/>
               </w:rPr>
-              <w:t xml:space="preserve">0.5 / 1 / 2 / 3</w:t>
+              <w:t xml:space="preserve">0 / 2/2 / 4/4 / 8/8 / 8/16</w:t>
             </w:r>
           </w:p>
         </w:tc>
@@ -11221,12 +11468,6 @@
               <w:spacing w:line="240" w:lineRule="auto" w:after="20"/>
               <w:jc w:val="left"/>
             </w:pPr>
-            <w:r>
-              <w:rPr>
-                <w:sz w:val="20"/>
-              </w:rPr>
-              <w:t xml:space="preserve">57.5 / 57.5 / 57.5 / 57.6</w:t>
-            </w:r>
           </w:p>
         </w:tc>
         <w:tc>
@@ -11239,6 +11480,12 @@
               <w:spacing w:line="240" w:lineRule="auto" w:after="20"/>
               <w:jc w:val="left"/>
             </w:pPr>
+            <w:r>
+              <w:rPr>
+                <w:sz w:val="20"/>
+              </w:rPr>
+              <w:t xml:space="preserve">57.5 / 57.3 / 57.2 / 56.9 / 56.4</w:t>
+            </w:r>
           </w:p>
         </w:tc>
       </w:tr>
@@ -11257,7 +11504,7 @@
               <w:rPr>
                 <w:sz w:val="20"/>
               </w:rPr>
-              <w:t xml:space="preserve">Gas price [NOK/Sm³]</w:t>
+              <w:t xml:space="preserve">Solver gap 0.1 %</w:t>
             </w:r>
           </w:p>
         </w:tc>
@@ -11271,12 +11518,6 @@
               <w:spacing w:line="240" w:lineRule="auto" w:after="20"/>
               <w:jc w:val="left"/>
             </w:pPr>
-            <w:r>
-              <w:rPr>
-                <w:sz w:val="20"/>
-              </w:rPr>
-              <w:t xml:space="preserve">2 / 4.19 / 8</w:t>
-            </w:r>
           </w:p>
         </w:tc>
         <w:tc>
@@ -11305,7 +11546,7 @@
               <w:rPr>
                 <w:sz w:val="20"/>
               </w:rPr>
-              <w:t xml:space="preserve">57.5 / 57.5 / 57.5</w:t>
+              <w:t xml:space="preserve">57.5</w:t>
             </w:r>
           </w:p>
         </w:tc>
@@ -11319,6 +11560,12 @@
               <w:spacing w:line="240" w:lineRule="auto" w:after="20"/>
               <w:jc w:val="left"/>
             </w:pPr>
+            <w:r>
+              <w:rPr>
+                <w:sz w:val="20"/>
+              </w:rPr>
+              <w:t xml:space="preserve">57.1</w:t>
+            </w:r>
           </w:p>
         </w:tc>
       </w:tr>
@@ -11337,7 +11584,7 @@
               <w:rPr>
                 <w:sz w:val="20"/>
               </w:rPr>
-              <w:t xml:space="preserve">Battery [MW / MWh]</w:t>
+              <w:t xml:space="preserve">Injection deficit limit [h]</w:t>
             </w:r>
           </w:p>
         </w:tc>
@@ -11355,7 +11602,7 @@
               <w:rPr>
                 <w:sz w:val="20"/>
               </w:rPr>
-              <w:t xml:space="preserve">0 / 2/2 / 4/4 / 8/8 / 8/16</w:t>
+              <w:t xml:space="preserve">0 / 24 / 72 / 168</w:t>
             </w:r>
           </w:p>
         </w:tc>
@@ -11381,6 +11628,12 @@
               <w:spacing w:line="240" w:lineRule="auto" w:after="20"/>
               <w:jc w:val="left"/>
             </w:pPr>
+            <w:r>
+              <w:rPr>
+                <w:sz w:val="20"/>
+              </w:rPr>
+              <w:t xml:space="preserve">64.7 / 57.5 / 57.5 / 57.5</w:t>
+            </w:r>
           </w:p>
         </w:tc>
         <w:tc>
@@ -11393,12 +11646,6 @@
               <w:spacing w:line="240" w:lineRule="auto" w:after="20"/>
               <w:jc w:val="left"/>
             </w:pPr>
-            <w:r>
-              <w:rPr>
-                <w:sz w:val="20"/>
-              </w:rPr>
-              <w:t xml:space="preserve">57.5 / 57.3 / 57.2 / 56.9 / 56.4</w:t>
-            </w:r>
           </w:p>
         </w:tc>
       </w:tr>
@@ -11417,7 +11664,7 @@
               <w:rPr>
                 <w:sz w:val="20"/>
               </w:rPr>
-              <w:t xml:space="preserve">Injection deficit limit [h]</w:t>
+              <w:t xml:space="preserve">Min. GTs online (8 MW battery)</w:t>
             </w:r>
           </w:p>
         </w:tc>
@@ -11435,7 +11682,7 @@
               <w:rPr>
                 <w:sz w:val="20"/>
               </w:rPr>
-              <w:t xml:space="preserve">0 / 24 / 72 / 168</w:t>
+              <w:t xml:space="preserve">1 / 0</w:t>
             </w:r>
           </w:p>
         </w:tc>
@@ -11461,12 +11708,6 @@
               <w:spacing w:line="240" w:lineRule="auto" w:after="20"/>
               <w:jc w:val="left"/>
             </w:pPr>
-            <w:r>
-              <w:rPr>
-                <w:sz w:val="20"/>
-              </w:rPr>
-              <w:t xml:space="preserve">64.7 / 57.5 / 57.5 / 57.5</w:t>
-            </w:r>
           </w:p>
         </w:tc>
         <w:tc>
@@ -11479,6 +11720,12 @@
               <w:spacing w:line="240" w:lineRule="auto" w:after="20"/>
               <w:jc w:val="left"/>
             </w:pPr>
+            <w:r>
+              <w:rPr>
+                <w:sz w:val="20"/>
+              </w:rPr>
+              <w:t xml:space="preserve">56.9 / 38.7</w:t>
+            </w:r>
           </w:p>
         </w:tc>
       </w:tr>
@@ -11497,7 +11744,7 @@
               <w:rPr>
                 <w:sz w:val="20"/>
               </w:rPr>
-              <w:t xml:space="preserve">Min. GTs online (8 MW battery)</w:t>
+              <w:t xml:space="preserve">GT fleet</w:t>
             </w:r>
           </w:p>
         </w:tc>
@@ -11515,7 +11762,7 @@
               <w:rPr>
                 <w:sz w:val="20"/>
               </w:rPr>
-              <w:t xml:space="preserve">1 / 0</w:t>
+              <w:t xml:space="preserve">3 main / 2 main + 1 small / 3 main + 1 small</w:t>
             </w:r>
           </w:p>
         </w:tc>
@@ -11529,6 +11776,12 @@
               <w:spacing w:line="240" w:lineRule="auto" w:after="20"/>
               <w:jc w:val="left"/>
             </w:pPr>
+            <w:r>
+              <w:rPr>
+                <w:sz w:val="20"/>
+              </w:rPr>
+              <w:t xml:space="preserve">64.7 / 53.9 / 53.9</w:t>
+            </w:r>
           </w:p>
         </w:tc>
         <w:tc>
@@ -11541,6 +11794,12 @@
               <w:spacing w:line="240" w:lineRule="auto" w:after="20"/>
               <w:jc w:val="left"/>
             </w:pPr>
+            <w:r>
+              <w:rPr>
+                <w:sz w:val="20"/>
+              </w:rPr>
+              <w:t xml:space="preserve">57.5 / 47.8 / 47.7</w:t>
+            </w:r>
           </w:p>
         </w:tc>
         <w:tc>
@@ -11553,12 +11812,6 @@
               <w:spacing w:line="240" w:lineRule="auto" w:after="20"/>
               <w:jc w:val="left"/>
             </w:pPr>
-            <w:r>
-              <w:rPr>
-                <w:sz w:val="20"/>
-              </w:rPr>
-              <w:t xml:space="preserve">56.9 / 38.7</w:t>
-            </w:r>
           </w:p>
         </w:tc>
       </w:tr>
@@ -11577,7 +11830,7 @@
               <w:rPr>
                 <w:sz w:val="20"/>
               </w:rPr>
-              <w:t xml:space="preserve">GT fleet</w:t>
+              <w:t xml:space="preserve">Keep two GTs online</w:t>
             </w:r>
           </w:p>
         </w:tc>
@@ -11591,12 +11844,6 @@
               <w:spacing w:line="240" w:lineRule="auto" w:after="20"/>
               <w:jc w:val="left"/>
             </w:pPr>
-            <w:r>
-              <w:rPr>
-                <w:sz w:val="20"/>
-              </w:rPr>
-              <w:t xml:space="preserve">3 main / 2 main + 1 small / 3 main + 1 small</w:t>
-            </w:r>
           </w:p>
         </w:tc>
         <w:tc>
@@ -11613,7 +11860,7 @@
               <w:rPr>
                 <w:sz w:val="20"/>
               </w:rPr>
-              <w:t xml:space="preserve">64.7 / 53.9 / 53.9</w:t>
+              <w:t xml:space="preserve">90.7</w:t>
             </w:r>
           </w:p>
         </w:tc>
@@ -11631,7 +11878,7 @@
               <w:rPr>
                 <w:sz w:val="20"/>
               </w:rPr>
-              <w:t xml:space="preserve">57.5 / 47.8 / 47.7</w:t>
+              <w:t xml:space="preserve">87.7</w:t>
             </w:r>
           </w:p>
         </w:tc>
@@ -11663,7 +11910,7 @@
               <w:rPr>
                 <w:sz w:val="20"/>
               </w:rPr>
-              <w:t xml:space="preserve">Keep two GTs online</w:t>
+              <w:t xml:space="preserve">GT minimum load [% of rating]</w:t>
             </w:r>
           </w:p>
         </w:tc>
@@ -11677,6 +11924,12 @@
               <w:spacing w:line="240" w:lineRule="auto" w:after="20"/>
               <w:jc w:val="left"/>
             </w:pPr>
+            <w:r>
+              <w:rPr>
+                <w:sz w:val="20"/>
+              </w:rPr>
+              <w:t xml:space="preserve">16 / 30 / 40 / 50</w:t>
+            </w:r>
           </w:p>
         </w:tc>
         <w:tc>
@@ -11693,7 +11946,7 @@
               <w:rPr>
                 <w:sz w:val="20"/>
               </w:rPr>
-              <w:t xml:space="preserve">90.7</w:t>
+              <w:t xml:space="preserve">64.7 / 71.9 / 77.5 / 86.4</w:t>
             </w:r>
           </w:p>
         </w:tc>
@@ -11711,7 +11964,253 @@
               <w:rPr>
                 <w:sz w:val="20"/>
               </w:rPr>
-              <w:t xml:space="preserve">87.7</w:t>
+              <w:t xml:space="preserve">57.5 / 64.6 / 70.2 / 76.2</w:t>
+            </w:r>
+          </w:p>
+        </w:tc>
+        <w:tc>
+          <w:tcPr>
+            <w:tcW w:type="dxa" w:w="1970"/>
+          </w:tcPr>
+          <w:p>
+            <w:pPr>
+              <w:pStyle w:val="Compact"/>
+              <w:spacing w:line="240" w:lineRule="auto" w:after="20"/>
+              <w:jc w:val="left"/>
+            </w:pPr>
+          </w:p>
+        </w:tc>
+      </w:tr>
+      <w:tr>
+        <w:tc>
+          <w:tcPr>
+            <w:tcW w:type="dxa" w:w="1847"/>
+          </w:tcPr>
+          <w:p>
+            <w:pPr>
+              <w:pStyle w:val="Compact"/>
+              <w:spacing w:line="240" w:lineRule="auto" w:after="20"/>
+              <w:jc w:val="left"/>
+            </w:pPr>
+            <w:r>
+              <w:rPr>
+                <w:sz w:val="20"/>
+              </w:rPr>
+              <w:t xml:space="preserve">Pump start cost [kNOK]</w:t>
+            </w:r>
+          </w:p>
+        </w:tc>
+        <w:tc>
+          <w:tcPr>
+            <w:tcW w:type="dxa" w:w="2463"/>
+          </w:tcPr>
+          <w:p>
+            <w:pPr>
+              <w:pStyle w:val="Compact"/>
+              <w:spacing w:line="240" w:lineRule="auto" w:after="20"/>
+              <w:jc w:val="left"/>
+            </w:pPr>
+            <w:r>
+              <w:rPr>
+                <w:sz w:val="20"/>
+              </w:rPr>
+              <w:t xml:space="preserve">0 / 1 / 5 / 20</w:t>
+            </w:r>
+          </w:p>
+        </w:tc>
+        <w:tc>
+          <w:tcPr>
+            <w:tcW w:type="dxa" w:w="1539"/>
+          </w:tcPr>
+          <w:p>
+            <w:pPr>
+              <w:pStyle w:val="Compact"/>
+              <w:spacing w:line="240" w:lineRule="auto" w:after="20"/>
+              <w:jc w:val="left"/>
+            </w:pPr>
+          </w:p>
+        </w:tc>
+        <w:tc>
+          <w:tcPr>
+            <w:tcW w:type="dxa" w:w="1539"/>
+          </w:tcPr>
+          <w:p>
+            <w:pPr>
+              <w:pStyle w:val="Compact"/>
+              <w:spacing w:line="240" w:lineRule="auto" w:after="20"/>
+              <w:jc w:val="left"/>
+            </w:pPr>
+            <w:r>
+              <w:rPr>
+                <w:sz w:val="20"/>
+              </w:rPr>
+              <w:t xml:space="preserve">57.5 / 57.6 / 57.6 / 57.6</w:t>
+            </w:r>
+          </w:p>
+        </w:tc>
+        <w:tc>
+          <w:tcPr>
+            <w:tcW w:type="dxa" w:w="1970"/>
+          </w:tcPr>
+          <w:p>
+            <w:pPr>
+              <w:pStyle w:val="Compact"/>
+              <w:spacing w:line="240" w:lineRule="auto" w:after="20"/>
+              <w:jc w:val="left"/>
+            </w:pPr>
+          </w:p>
+        </w:tc>
+      </w:tr>
+      <w:tr>
+        <w:tc>
+          <w:tcPr>
+            <w:tcW w:type="dxa" w:w="1847"/>
+          </w:tcPr>
+          <w:p>
+            <w:pPr>
+              <w:pStyle w:val="Compact"/>
+              <w:spacing w:line="240" w:lineRule="auto" w:after="20"/>
+              <w:jc w:val="left"/>
+            </w:pPr>
+            <w:r>
+              <w:rPr>
+                <w:sz w:val="20"/>
+              </w:rPr>
+              <w:t xml:space="preserve">Reserve covers wind used [%]</w:t>
+            </w:r>
+          </w:p>
+        </w:tc>
+        <w:tc>
+          <w:tcPr>
+            <w:tcW w:type="dxa" w:w="2463"/>
+          </w:tcPr>
+          <w:p>
+            <w:pPr>
+              <w:pStyle w:val="Compact"/>
+              <w:spacing w:line="240" w:lineRule="auto" w:after="20"/>
+              <w:jc w:val="left"/>
+            </w:pPr>
+            <w:r>
+              <w:rPr>
+                <w:sz w:val="20"/>
+              </w:rPr>
+              <w:t xml:space="preserve">0 / 50 / 100</w:t>
+            </w:r>
+          </w:p>
+        </w:tc>
+        <w:tc>
+          <w:tcPr>
+            <w:tcW w:type="dxa" w:w="1539"/>
+          </w:tcPr>
+          <w:p>
+            <w:pPr>
+              <w:pStyle w:val="Compact"/>
+              <w:spacing w:line="240" w:lineRule="auto" w:after="20"/>
+              <w:jc w:val="left"/>
+            </w:pPr>
+            <w:r>
+              <w:rPr>
+                <w:sz w:val="20"/>
+              </w:rPr>
+              <w:t xml:space="preserve">64.7 / 66.2 / 90.7</w:t>
+            </w:r>
+          </w:p>
+        </w:tc>
+        <w:tc>
+          <w:tcPr>
+            <w:tcW w:type="dxa" w:w="1539"/>
+          </w:tcPr>
+          <w:p>
+            <w:pPr>
+              <w:pStyle w:val="Compact"/>
+              <w:spacing w:line="240" w:lineRule="auto" w:after="20"/>
+              <w:jc w:val="left"/>
+            </w:pPr>
+            <w:r>
+              <w:rPr>
+                <w:sz w:val="20"/>
+              </w:rPr>
+              <w:t xml:space="preserve">57.5 / 57.7 / 78.2</w:t>
+            </w:r>
+          </w:p>
+        </w:tc>
+        <w:tc>
+          <w:tcPr>
+            <w:tcW w:type="dxa" w:w="1970"/>
+          </w:tcPr>
+          <w:p>
+            <w:pPr>
+              <w:pStyle w:val="Compact"/>
+              <w:spacing w:line="240" w:lineRule="auto" w:after="20"/>
+              <w:jc w:val="left"/>
+            </w:pPr>
+          </w:p>
+        </w:tc>
+      </w:tr>
+      <w:tr>
+        <w:tc>
+          <w:tcPr>
+            <w:tcW w:type="dxa" w:w="1847"/>
+          </w:tcPr>
+          <w:p>
+            <w:pPr>
+              <w:pStyle w:val="Compact"/>
+              <w:spacing w:line="240" w:lineRule="auto" w:after="20"/>
+              <w:jc w:val="left"/>
+            </w:pPr>
+            <w:r>
+              <w:rPr>
+                <w:sz w:val="20"/>
+              </w:rPr>
+              <w:t xml:space="preserve">Injection pumps as reserve</w:t>
+            </w:r>
+          </w:p>
+        </w:tc>
+        <w:tc>
+          <w:tcPr>
+            <w:tcW w:type="dxa" w:w="2463"/>
+          </w:tcPr>
+          <w:p>
+            <w:pPr>
+              <w:pStyle w:val="Compact"/>
+              <w:spacing w:line="240" w:lineRule="auto" w:after="20"/>
+              <w:jc w:val="left"/>
+            </w:pPr>
+          </w:p>
+        </w:tc>
+        <w:tc>
+          <w:tcPr>
+            <w:tcW w:type="dxa" w:w="1539"/>
+          </w:tcPr>
+          <w:p>
+            <w:pPr>
+              <w:pStyle w:val="Compact"/>
+              <w:spacing w:line="240" w:lineRule="auto" w:after="20"/>
+              <w:jc w:val="left"/>
+            </w:pPr>
+            <w:r>
+              <w:rPr>
+                <w:sz w:val="20"/>
+              </w:rPr>
+              <w:t xml:space="preserve">60.4</w:t>
+            </w:r>
+          </w:p>
+        </w:tc>
+        <w:tc>
+          <w:tcPr>
+            <w:tcW w:type="dxa" w:w="1539"/>
+          </w:tcPr>
+          <w:p>
+            <w:pPr>
+              <w:pStyle w:val="Compact"/>
+              <w:spacing w:line="240" w:lineRule="auto" w:after="20"/>
+              <w:jc w:val="left"/>
+            </w:pPr>
+            <w:r>
+              <w:rPr>
+                <w:sz w:val="20"/>
+              </w:rPr>
+              <w:t xml:space="preserve">57.6</w:t>
             </w:r>
           </w:p>
         </w:tc>
@@ -11735,13 +12234,7 @@
         <w:spacing w:before="200"/>
       </w:pPr>
       <w:r>
-        <w:t xml:space="preserve">The results of the sensitivity runs are given in Table 4 and Figure 7. Several</w:t>
-      </w:r>
-      <w:r>
-        <w:t xml:space="preserve"> </w:t>
-      </w:r>
-      <w:r>
-        <w:t xml:space="preserve">inputs have little effect. Across CO</w:t>
+        <w:t xml:space="preserve">The results of the sensitivity runs are given in Table 4 and Figure 7. The CO</w:t>
       </w:r>
       <w:r>
         <w:rPr>
@@ -11753,37 +12246,55 @@
         <w:t xml:space="preserve"> </w:t>
       </w:r>
       <w:r>
-        <w:t xml:space="preserve">prices of 0.5–3 NOK/kg and gas prices of</w:t>
-      </w:r>
-      <w:r>
-        <w:t xml:space="preserve"> </w:t>
-      </w:r>
-      <w:r>
-        <w:t xml:space="preserve">2–8 NOK/Sm³, the emissions change by less than 0.1 %, since the prices scale</w:t>
-      </w:r>
-      <w:r>
-        <w:t xml:space="preserve"> </w:t>
-      </w:r>
-      <w:r>
-        <w:t xml:space="preserve">the cost of every option alike and the cheapest schedule remains the cheapest.</w:t>
-      </w:r>
-      <w:r>
-        <w:t xml:space="preserve"> </w:t>
-      </w:r>
-      <w:r>
-        <w:t xml:space="preserve">Deferring injection saves fuel at any price, and shedding production is never</w:t>
-      </w:r>
-      <w:r>
-        <w:t xml:space="preserve"> </w:t>
-      </w:r>
-      <w:r>
-        <w:t xml:space="preserve">profitable, as the lost oil and gas are worth about a hundred times more than</w:t>
-      </w:r>
-      <w:r>
-        <w:t xml:space="preserve"> </w:t>
-      </w:r>
-      <w:r>
-        <w:t xml:space="preserve">the fuel saved.</w:t>
+        <w:t xml:space="preserve">and gas prices have almost no effect: across CO</w:t>
+      </w:r>
+      <w:r>
+        <w:rPr>
+          <w:vertAlign w:val="subscript"/>
+        </w:rPr>
+        <w:t xml:space="preserve">2</w:t>
+      </w:r>
+      <w:r>
+        <w:t xml:space="preserve"> </w:t>
+      </w:r>
+      <w:r>
+        <w:t xml:space="preserve">prices of 0.5–3 NOK/kg and</w:t>
+      </w:r>
+      <w:r>
+        <w:t xml:space="preserve"> </w:t>
+      </w:r>
+      <w:r>
+        <w:t xml:space="preserve">gas prices of 2–8 NOK/Sm³, the emissions change by less than 0.1 %. This is</w:t>
+      </w:r>
+      <w:r>
+        <w:t xml:space="preserve"> </w:t>
+      </w:r>
+      <w:r>
+        <w:t xml:space="preserve">expected, since the objective is dominated by fuel multiplied by a price, so</w:t>
+      </w:r>
+      <w:r>
+        <w:t xml:space="preserve"> </w:t>
+      </w:r>
+      <w:r>
+        <w:t xml:space="preserve">the prices scale the cost of every option alike and the cheapest schedule</w:t>
+      </w:r>
+      <w:r>
+        <w:t xml:space="preserve"> </w:t>
+      </w:r>
+      <w:r>
+        <w:t xml:space="preserve">remains the cheapest. Deferring injection saves fuel at any price, and</w:t>
+      </w:r>
+      <w:r>
+        <w:t xml:space="preserve"> </w:t>
+      </w:r>
+      <w:r>
+        <w:t xml:space="preserve">shedding production is never profitable, as the lost oil and gas are worth</w:t>
+      </w:r>
+      <w:r>
+        <w:t xml:space="preserve"> </w:t>
+      </w:r>
+      <w:r>
+        <w:t xml:space="preserve">about a hundred times more than the fuel saved.</w:t>
       </w:r>
     </w:p>
     <w:p>
@@ -11867,6 +12378,24 @@
       <w:r>
         <w:t xml:space="preserve">must remain online; the largest one tested, 8 MW / 16 MWh, saves 1.1 kt (2 %).</w:t>
       </w:r>
+      <w:r>
+        <w:t xml:space="preserve"> </w:t>
+      </w:r>
+      <w:r>
+        <w:t xml:space="preserve">The effect of the 4 MW / 4 MWh battery, 0.3 kt or 0.5 %, is of the order of</w:t>
+      </w:r>
+      <w:r>
+        <w:t xml:space="preserve"> </w:t>
+      </w:r>
+      <w:r>
+        <w:t xml:space="preserve">the 0.5 % solver gap. With a gap of 0.1 % it is 0.4 kt (0.7 %), so it is small</w:t>
+      </w:r>
+      <w:r>
+        <w:t xml:space="preserve"> </w:t>
+      </w:r>
+      <w:r>
+        <w:t xml:space="preserve">but real.</w:t>
+      </w:r>
     </w:p>
     <w:p>
       <w:pPr>
@@ -11990,6 +12519,148 @@
       </w:r>
       <w:r>
         <w:t xml:space="preserve">are 47.7 kt, and the third main unit is never used.</w:t>
+      </w:r>
+    </w:p>
+    <w:p>
+      <w:pPr>
+        <w:pStyle w:val="BodyText"/>
+      </w:pPr>
+      <w:r>
+        <w:t xml:space="preserve">The flexibility benefit is robust to the GT and pump assumptions. A higher GT</w:t>
+      </w:r>
+      <w:r>
+        <w:t xml:space="preserve"> </w:t>
+      </w:r>
+      <w:r>
+        <w:t xml:space="preserve">minimum load raises the emissions of both cases, by 34 % in Case 2 at 50 %</w:t>
+      </w:r>
+      <w:r>
+        <w:t xml:space="preserve"> </w:t>
+      </w:r>
+      <w:r>
+        <w:t xml:space="preserve">minimum load, because the running GT must then produce more power and more</w:t>
+      </w:r>
+      <w:r>
+        <w:t xml:space="preserve"> </w:t>
+      </w:r>
+      <w:r>
+        <w:t xml:space="preserve">wind is curtailed. The saving from flexibility stays between 7.2 and 10.2 kt,</w:t>
+      </w:r>
+      <w:r>
+        <w:t xml:space="preserve"> </w:t>
+      </w:r>
+      <w:r>
+        <w:t xml:space="preserve">or 9.5–11.8 %, and is largest at 50 % minimum load. In the base case the</w:t>
+      </w:r>
+      <w:r>
+        <w:t xml:space="preserve"> </w:t>
+      </w:r>
+      <w:r>
+        <w:t xml:space="preserve">injection pumps start 731 times a year, about twice a day, at no cost. A start</w:t>
+      </w:r>
+      <w:r>
+        <w:t xml:space="preserve"> </w:t>
+      </w:r>
+      <w:r>
+        <w:t xml:space="preserve">cost of only 1,000 NOK reduces this to 163 starts a year and the saving by</w:t>
+      </w:r>
+      <w:r>
+        <w:t xml:space="preserve"> </w:t>
+      </w:r>
+      <w:r>
+        <w:t xml:space="preserve">0.08 kt; at 20,000 NOK per start, 103 starts remain and 0.14 kt of the 7.2 kt</w:t>
+      </w:r>
+      <w:r>
+        <w:t xml:space="preserve"> </w:t>
+      </w:r>
+      <w:r>
+        <w:t xml:space="preserve">is lost. The optimizer then keeps injection at fixed pump steps for longer and</w:t>
+      </w:r>
+      <w:r>
+        <w:t xml:space="preserve"> </w:t>
+      </w:r>
+      <w:r>
+        <w:t xml:space="preserve">uses the deficit mainly in the spells that avoid a second GT.</w:t>
+      </w:r>
+    </w:p>
+    <w:p>
+      <w:pPr>
+        <w:pStyle w:val="BodyText"/>
+      </w:pPr>
+      <w:r>
+        <w:t xml:space="preserve">The reserve definition has a larger effect. A reserve that must also cover</w:t>
+      </w:r>
+      <w:r>
+        <w:t xml:space="preserve"> </w:t>
+      </w:r>
+      <w:r>
+        <w:t xml:space="preserve">half of the wind power used changes Case 3 only slightly (57.7 kt), but raises</w:t>
+      </w:r>
+      <w:r>
+        <w:t xml:space="preserve"> </w:t>
+      </w:r>
+      <w:r>
+        <w:t xml:space="preserve">Case 2 to 66.2 kt, so that the benefit of flexibility increases to 8.5 kt</w:t>
+      </w:r>
+      <w:r>
+        <w:t xml:space="preserve"> </w:t>
+      </w:r>
+      <w:r>
+        <w:t xml:space="preserve">(12.8 %). If the reserve must cover the loss of all wind used, two GTs run in</w:t>
+      </w:r>
+      <w:r>
+        <w:t xml:space="preserve"> </w:t>
+      </w:r>
+      <w:r>
+        <w:t xml:space="preserve">every hour of Case 2 (90.7 kt), whereas flexible scheduling still avoids the</w:t>
+      </w:r>
+      <w:r>
+        <w:t xml:space="preserve"> </w:t>
+      </w:r>
+      <w:r>
+        <w:t xml:space="preserve">second GT in about 3,600 h and saves 12.5 kt (13.8 %). The opposite</w:t>
+      </w:r>
+      <w:r>
+        <w:t xml:space="preserve"> </w:t>
+      </w:r>
+      <w:r>
+        <w:t xml:space="preserve">assumption, that the running injection pumps count as reserve because they can</w:t>
+      </w:r>
+      <w:r>
+        <w:t xml:space="preserve"> </w:t>
+      </w:r>
+      <w:r>
+        <w:t xml:space="preserve">be tripped within seconds, reduces the emissions of Case 2 to 60.4 kt without</w:t>
+      </w:r>
+      <w:r>
+        <w:t xml:space="preserve"> </w:t>
+      </w:r>
+      <w:r>
+        <w:t xml:space="preserve">any scheduling. This captures about 60 % of the benefit of flexibility, since</w:t>
+      </w:r>
+      <w:r>
+        <w:t xml:space="preserve"> </w:t>
+      </w:r>
+      <w:r>
+        <w:t xml:space="preserve">a second GT is then never needed, and scheduling adds a further 2.8 kt (4.7</w:t>
+      </w:r>
+      <w:r>
+        <w:t xml:space="preserve"> </w:t>
+      </w:r>
+      <w:r>
+        <w:t xml:space="preserve">%), close to the energy part of the saving. Load shedding as reserve and load</w:t>
+      </w:r>
+      <w:r>
+        <w:t xml:space="preserve"> </w:t>
+      </w:r>
+      <w:r>
+        <w:t xml:space="preserve">scheduling are thus two routes to the same mechanism, and they do not add up:</w:t>
+      </w:r>
+      <w:r>
+        <w:t xml:space="preserve"> </w:t>
+      </w:r>
+      <w:r>
+        <w:t xml:space="preserve">with both, Case 3 emits 57.6 kt, as without tripping.</w:t>
       </w:r>
     </w:p>
     <w:p>
@@ -12066,7 +12737,194 @@
         <w:t xml:space="preserve"> </w:t>
       </w:r>
       <w:r>
-        <w:t xml:space="preserve">emissions to wind farm size, CO</w:t>
+        <w:t xml:space="preserve">emissions to wind farm size, battery size, injection deficit limit, minimum number of GTs online, GT fleet, operating practice, GT minimum load, pump start cost and reserve definition.</w:t>
+      </w:r>
+    </w:p>
+    <w:bookmarkEnd w:id="54"/>
+    <w:bookmarkStart w:id="58" w:name="platform-demand-and-reserve"/>
+    <w:p>
+      <w:pPr>
+        <w:pStyle w:val="Heading2"/>
+      </w:pPr>
+      <w:r>
+        <w:t xml:space="preserve">3.5 Platform demand and reserve</w:t>
+      </w:r>
+    </w:p>
+    <w:p>
+      <w:pPr>
+        <w:pStyle w:val="FirstParagraph"/>
+      </w:pPr>
+      <w:r>
+        <w:t xml:space="preserve">The base platform has a mean demand of 18.8 MW, just above what one GT can</w:t>
+      </w:r>
+      <w:r>
+        <w:t xml:space="preserve"> </w:t>
+      </w:r>
+      <w:r>
+        <w:t xml:space="preserve">carry while holding the reserve, 21.8 − 5 = 16.8 MW. The demand and reserve</w:t>
+      </w:r>
+      <w:r>
+        <w:t xml:space="preserve"> </w:t>
+      </w:r>
+      <w:r>
+        <w:t xml:space="preserve">map (Figure 8) shows that this margin decides the size of the benefit. When one</w:t>
+      </w:r>
+      <w:r>
+        <w:t xml:space="preserve"> </w:t>
+      </w:r>
+      <w:r>
+        <w:t xml:space="preserve">GT can carry the mean demand plus the reserve (a positive margin), a second GT</w:t>
+      </w:r>
+      <w:r>
+        <w:t xml:space="preserve"> </w:t>
+      </w:r>
+      <w:r>
+        <w:t xml:space="preserve">is rarely needed even with fixed demand, and flexibility saves 4.4–4.8 % of</w:t>
+      </w:r>
+      <w:r>
+        <w:t xml:space="preserve"> </w:t>
+      </w:r>
+      <w:r>
+        <w:t xml:space="preserve">the Case 2 emissions, about the energy part alone. When the mean demand</w:t>
+      </w:r>
+      <w:r>
+        <w:t xml:space="preserve"> </w:t>
+      </w:r>
+      <w:r>
+        <w:t xml:space="preserve">exceeds the rating of one GT minus the reserve, the saving roughly doubles, to</w:t>
+      </w:r>
+      <w:r>
+        <w:t xml:space="preserve"> </w:t>
+      </w:r>
+      <w:r>
+        <w:t xml:space="preserve">8–12 %, because deferring injection then avoids the second GT in many hours.</w:t>
+      </w:r>
+      <w:r>
+        <w:t xml:space="preserve"> </w:t>
+      </w:r>
+      <w:r>
+        <w:t xml:space="preserve">The transition is sharp and occurs at a margin of about zero for all four</w:t>
+      </w:r>
+      <w:r>
+        <w:t xml:space="preserve"> </w:t>
+      </w:r>
+      <w:r>
+        <w:t xml:space="preserve">reserve sizes, so that the curves of Figure 8 (right) nearly coincide when they</w:t>
+      </w:r>
+      <w:r>
+        <w:t xml:space="preserve"> </w:t>
+      </w:r>
+      <w:r>
+        <w:t xml:space="preserve">are plotted against the margin instead of the demand. Further above the</w:t>
+      </w:r>
+      <w:r>
+        <w:t xml:space="preserve"> </w:t>
+      </w:r>
+      <w:r>
+        <w:t xml:space="preserve">margin, the saving decreases slowly, to 10 % at 22.6 MW, since the deferrable</w:t>
+      </w:r>
+      <w:r>
+        <w:t xml:space="preserve"> </w:t>
+      </w:r>
+      <w:r>
+        <w:t xml:space="preserve">load is then more often too small to keep the second GT off.</w:t>
+      </w:r>
+    </w:p>
+    <w:p>
+      <w:pPr>
+        <w:pStyle w:val="BodyText"/>
+      </w:pPr>
+      <w:r>
+        <w:t xml:space="preserve">The margin of one GT is therefore a simple screening criterion. With the LEOGO</w:t>
+      </w:r>
+      <w:r>
+        <w:t xml:space="preserve"> </w:t>
+      </w:r>
+      <w:r>
+        <w:t xml:space="preserve">turbines and a 30 MW wind farm, a platform whose mean demand lies about 2–8 MW</w:t>
+      </w:r>
+      <w:r>
+        <w:t xml:space="preserve"> </w:t>
+      </w:r>
+      <w:r>
+        <w:t xml:space="preserve">above the rating of one GT minus its reserve can expect about 10–12 % lower</w:t>
+      </w:r>
+      <w:r>
+        <w:t xml:space="preserve"> </w:t>
+      </w:r>
+      <w:r>
+        <w:t xml:space="preserve">emissions from scheduling its deferrable loads, and a platform with a positive</w:t>
+      </w:r>
+      <w:r>
+        <w:t xml:space="preserve"> </w:t>
+      </w:r>
+      <w:r>
+        <w:t xml:space="preserve">margin about 4–5 %.</w:t>
+      </w:r>
+    </w:p>
+    <w:p>
+      <w:pPr>
+        <w:pStyle w:val="Figure"/>
+      </w:pPr>
+      <w:r>
+        <w:drawing>
+          <wp:inline>
+            <wp:extent cx="5759999" cy="2192387"/>
+            <wp:effectExtent b="0" l="0" r="0" t="0"/>
+            <wp:docPr descr="" title="" id="56" name="Picture"/>
+            <a:graphic>
+              <a:graphicData uri="http://schemas.openxmlformats.org/drawingml/2006/picture">
+                <pic:pic>
+                  <pic:nvPicPr>
+                    <pic:cNvPr descr="results/paper/fig12_demand_reserve_map.png" id="57" name="Picture"/>
+                    <pic:cNvPicPr>
+                      <a:picLocks noChangeArrowheads="1" noChangeAspect="1"/>
+                    </pic:cNvPicPr>
+                  </pic:nvPicPr>
+                  <pic:blipFill>
+                    <a:blip r:embed="rId55"/>
+                    <a:stretch>
+                      <a:fillRect/>
+                    </a:stretch>
+                  </pic:blipFill>
+                  <pic:spPr bwMode="auto">
+                    <a:xfrm>
+                      <a:off x="0" y="0"/>
+                      <a:ext cx="5759999" cy="2192387"/>
+                    </a:xfrm>
+                    <a:prstGeom prst="rect">
+                      <a:avLst/>
+                    </a:prstGeom>
+                    <a:noFill/>
+                    <a:ln w="9525">
+                      <a:noFill/>
+                      <a:headEnd/>
+                      <a:tailEnd/>
+                    </a:ln>
+                  </pic:spPr>
+                </pic:pic>
+              </a:graphicData>
+            </a:graphic>
+          </wp:inline>
+        </w:drawing>
+      </w:r>
+    </w:p>
+    <w:p>
+      <w:pPr>
+        <w:pStyle w:val="FigureCaption"/>
+      </w:pPr>
+      <w:r>
+        <w:rPr>
+          <w:bCs/>
+          <w:b/>
+        </w:rPr>
+        <w:t xml:space="preserve">Figure 8.</w:t>
+      </w:r>
+      <w:r>
+        <w:t xml:space="preserve"> </w:t>
+      </w:r>
+      <w:r>
+        <w:t xml:space="preserve">Flexibility benefit (Case 2 − Case 3, % of Case 2 CO</w:t>
       </w:r>
       <w:r>
         <w:rPr>
@@ -12075,20 +12933,17 @@
         <w:t xml:space="preserve">2</w:t>
       </w:r>
       <w:r>
-        <w:t xml:space="preserve"> </w:t>
-      </w:r>
-      <w:r>
-        <w:t xml:space="preserve">and gas price, battery size, injection deficit limit, minimum number of GTs online, GT fleet and operating practice.</w:t>
-      </w:r>
-    </w:p>
-    <w:bookmarkEnd w:id="54"/>
-    <w:bookmarkStart w:id="58" w:name="benchmark-checks"/>
+        <w:t xml:space="preserve">) for 28 platforms with all electric consumers scaled by 0.6–1.2 and a spinning reserve of 3–9 MW. Left: by mean demand and reserve. Right: the same points against the margin of one GT, its rating minus the reserve minus the mean demand.</w:t>
+      </w:r>
+    </w:p>
+    <w:bookmarkEnd w:id="58"/>
+    <w:bookmarkStart w:id="62" w:name="benchmark-checks"/>
     <w:p>
       <w:pPr>
         <w:pStyle w:val="Heading2"/>
       </w:pPr>
       <w:r>
-        <w:t xml:space="preserve">3.5 Benchmark checks</w:t>
+        <w:t xml:space="preserve">3.6 Benchmark checks</w:t>
       </w:r>
     </w:p>
     <w:p>
@@ -12940,7 +13795,7 @@
         <w:t xml:space="preserve"> </w:t>
       </w:r>
       <w:r>
-        <w:t xml:space="preserve">Figure 8. The platform power, the wind resource and the pump energy agree with</w:t>
+        <w:t xml:space="preserve">Figure 9. The platform power, the wind resource and the pump energy agree with</w:t>
       </w:r>
       <w:r>
         <w:t xml:space="preserve"> </w:t>
@@ -13112,7 +13967,7 @@
         <w:pStyle w:val="BodyText"/>
       </w:pPr>
       <w:r>
-        <w:t xml:space="preserve">The field data support the fuel and emission model (Figure 8, right). The</w:t>
+        <w:t xml:space="preserve">The field data support the fuel and emission model (Figure 9, right). The</w:t>
       </w:r>
       <w:r>
         <w:t xml:space="preserve"> </w:t>
@@ -13250,18 +14105,18 @@
           <wp:inline>
             <wp:extent cx="5759999" cy="4741971"/>
             <wp:effectExtent b="0" l="0" r="0" t="0"/>
-            <wp:docPr descr="" title="" id="56" name="Picture"/>
+            <wp:docPr descr="" title="" id="60" name="Picture"/>
             <a:graphic>
               <a:graphicData uri="http://schemas.openxmlformats.org/drawingml/2006/picture">
                 <pic:pic>
                   <pic:nvPicPr>
-                    <pic:cNvPr descr="results/paper/fig10_validation.png" id="57" name="Picture"/>
+                    <pic:cNvPr descr="results/paper/fig10_validation.png" id="61" name="Picture"/>
                     <pic:cNvPicPr>
                       <a:picLocks noChangeArrowheads="1" noChangeAspect="1"/>
                     </pic:cNvPicPr>
                   </pic:nvPicPr>
                   <pic:blipFill>
-                    <a:blip r:embed="rId55"/>
+                    <a:blip r:embed="rId59"/>
                     <a:stretch>
                       <a:fillRect/>
                     </a:stretch>
@@ -13297,7 +14152,7 @@
           <w:bCs/>
           <w:b/>
         </w:rPr>
-        <w:t xml:space="preserve">Figure 8.</w:t>
+        <w:t xml:space="preserve">Figure 9.</w:t>
       </w:r>
       <w:r>
         <w:t xml:space="preserve"> </w:t>
@@ -13318,14 +14173,14 @@
         <w:t xml:space="preserve">intensity of the Gullfaks, Snorre and Statfjord field centers (gray: GT-powered; teal: receiving Hywind Tampen power) with the model Case 1 value (dashed).</w:t>
       </w:r>
     </w:p>
-    <w:bookmarkEnd w:id="58"/>
-    <w:bookmarkStart w:id="59" w:name="economic-indicators-1"/>
+    <w:bookmarkEnd w:id="62"/>
+    <w:bookmarkStart w:id="63" w:name="economic-indicators-1"/>
     <w:p>
       <w:pPr>
         <w:pStyle w:val="Heading2"/>
       </w:pPr>
       <w:r>
-        <w:t xml:space="preserve">3.6 Economic indicators</w:t>
+        <w:t xml:space="preserve">3.7 Economic indicators</w:t>
       </w:r>
     </w:p>
     <w:p>
@@ -14153,14 +15008,14 @@
         <w:t xml:space="preserve">its additional maintenance and its 262 starts per year are taken into account.</w:t>
       </w:r>
     </w:p>
-    <w:bookmarkEnd w:id="59"/>
-    <w:bookmarkStart w:id="63" w:name="weather-years"/>
+    <w:bookmarkEnd w:id="63"/>
+    <w:bookmarkStart w:id="67" w:name="weather-years"/>
     <w:p>
       <w:pPr>
         <w:pStyle w:val="Heading2"/>
       </w:pPr>
       <w:r>
-        <w:t xml:space="preserve">3.7 Weather years</w:t>
+        <w:t xml:space="preserve">3.8 Weather years</w:t>
       </w:r>
     </w:p>
     <w:p>
@@ -14839,7 +15694,7 @@
         <w:spacing w:before="200"/>
       </w:pPr>
       <w:r>
-        <w:t xml:space="preserve">The results for the ten weather years are summarized in Table 7 and Figure 9.</w:t>
+        <w:t xml:space="preserve">The results for the ten weather years are summarized in Table 7 and Figure 10.</w:t>
       </w:r>
       <w:r>
         <w:t xml:space="preserve"> </w:t>
@@ -14961,18 +15816,18 @@
           <wp:inline>
             <wp:extent cx="5759999" cy="2790927"/>
             <wp:effectExtent b="0" l="0" r="0" t="0"/>
-            <wp:docPr descr="" title="" id="61" name="Picture"/>
+            <wp:docPr descr="" title="" id="65" name="Picture"/>
             <a:graphic>
               <a:graphicData uri="http://schemas.openxmlformats.org/drawingml/2006/picture">
                 <pic:pic>
                   <pic:nvPicPr>
-                    <pic:cNvPr descr="results/paper/fig11_multi_year.png" id="62" name="Picture"/>
+                    <pic:cNvPr descr="results/paper/fig11_multi_year.png" id="66" name="Picture"/>
                     <pic:cNvPicPr>
                       <a:picLocks noChangeArrowheads="1" noChangeAspect="1"/>
                     </pic:cNvPicPr>
                   </pic:nvPicPr>
                   <pic:blipFill>
-                    <a:blip r:embed="rId60"/>
+                    <a:blip r:embed="rId64"/>
                     <a:stretch>
                       <a:fillRect/>
                     </a:stretch>
@@ -15008,7 +15863,7 @@
           <w:bCs/>
           <w:b/>
         </w:rPr>
-        <w:t xml:space="preserve">Figure 9.</w:t>
+        <w:t xml:space="preserve">Figure 10.</w:t>
       </w:r>
       <w:r>
         <w:t xml:space="preserve"> </w:t>
@@ -15017,9 +15872,9 @@
         <w:t xml:space="preserve">Flexibility benefit (Case 2 − Case 3, bars) and wind capacity factor (line) for the weather years 2014–2023.</w:t>
       </w:r>
     </w:p>
-    <w:bookmarkEnd w:id="63"/>
-    <w:bookmarkEnd w:id="64"/>
-    <w:bookmarkStart w:id="70" w:name="discussion"/>
+    <w:bookmarkEnd w:id="67"/>
+    <w:bookmarkEnd w:id="68"/>
+    <w:bookmarkStart w:id="74" w:name="discussion"/>
     <w:p>
       <w:pPr>
         <w:pStyle w:val="Heading1"/>
@@ -15060,7 +15915,7 @@
         <w:t xml:space="preserve">limitations of the study are discussed in Sections 4.3–4.5.</w:t>
       </w:r>
     </w:p>
-    <w:bookmarkStart w:id="65" w:name="why-load-flexibility-works"/>
+    <w:bookmarkStart w:id="69" w:name="why-load-flexibility-works"/>
     <w:p>
       <w:pPr>
         <w:pStyle w:val="Heading2"/>
@@ -15281,8 +16136,8 @@
         <w:t xml:space="preserve">tolerates about 260 starts a year.</w:t>
       </w:r>
     </w:p>
-    <w:bookmarkEnd w:id="65"/>
-    <w:bookmarkStart w:id="66" w:name="comparison-with-earlier-studies"/>
+    <w:bookmarkEnd w:id="69"/>
+    <w:bookmarkStart w:id="70" w:name="comparison-with-earlier-studies"/>
     <w:p>
       <w:pPr>
         <w:pStyle w:val="Heading2"/>
@@ -15483,8 +16338,8 @@
         <w:t xml:space="preserve">shifting alone, without unit commitment, would not capture most of it.</w:t>
       </w:r>
     </w:p>
-    <w:bookmarkEnd w:id="66"/>
-    <w:bookmarkStart w:id="67" w:name="practical-implementation"/>
+    <w:bookmarkEnd w:id="70"/>
+    <w:bookmarkStart w:id="71" w:name="practical-implementation"/>
     <w:p>
       <w:pPr>
         <w:pStyle w:val="Heading2"/>
@@ -15683,8 +16538,8 @@
         <w:t xml:space="preserve">such as line pack or tank volume is available.</w:t>
       </w:r>
     </w:p>
-    <w:bookmarkEnd w:id="67"/>
-    <w:bookmarkStart w:id="68" w:name="robustness-of-the-conclusions"/>
+    <w:bookmarkEnd w:id="71"/>
+    <w:bookmarkStart w:id="72" w:name="robustness-of-the-conclusions"/>
     <w:p>
       <w:pPr>
         <w:pStyle w:val="Heading2"/>
@@ -15837,8 +16692,8 @@
         <w:t xml:space="preserve">and no plausible change in prices or efficiencies reverses this.</w:t>
       </w:r>
     </w:p>
-    <w:bookmarkEnd w:id="68"/>
-    <w:bookmarkStart w:id="69" w:name="limitations-and-future-work"/>
+    <w:bookmarkEnd w:id="72"/>
+    <w:bookmarkStart w:id="73" w:name="limitations-and-future-work"/>
     <w:p>
       <w:pPr>
         <w:pStyle w:val="Heading2"/>
@@ -16009,9 +16864,9 @@
         <w:t xml:space="preserve">is required.</w:t>
       </w:r>
     </w:p>
-    <w:bookmarkEnd w:id="69"/>
-    <w:bookmarkEnd w:id="70"/>
-    <w:bookmarkStart w:id="71" w:name="conclusions"/>
+    <w:bookmarkEnd w:id="73"/>
+    <w:bookmarkEnd w:id="74"/>
+    <w:bookmarkStart w:id="75" w:name="conclusions"/>
     <w:p>
       <w:pPr>
         <w:pStyle w:val="Heading1"/>
@@ -16236,8 +17091,8 @@
         <w:t xml:space="preserve">and whether grid-forming storage can safely remove the last running GT.</w:t>
       </w:r>
     </w:p>
-    <w:bookmarkEnd w:id="71"/>
-    <w:bookmarkStart w:id="72" w:name="nomenclature"/>
+    <w:bookmarkEnd w:id="75"/>
+    <w:bookmarkStart w:id="76" w:name="nomenclature"/>
     <w:p>
       <w:pPr>
         <w:pStyle w:val="Heading1"/>
@@ -18360,8 +19215,8 @@
         </w:tc>
       </w:tr>
     </w:tbl>
-    <w:bookmarkEnd w:id="72"/>
-    <w:bookmarkStart w:id="73" w:name="list-of-acronyms"/>
+    <w:bookmarkEnd w:id="76"/>
+    <w:bookmarkStart w:id="77" w:name="list-of-acronyms"/>
     <w:p>
       <w:pPr>
         <w:pStyle w:val="Heading1"/>
@@ -18553,8 +19408,8 @@
         </w:tc>
       </w:tr>
     </w:tbl>
-    <w:bookmarkEnd w:id="73"/>
-    <w:bookmarkStart w:id="74" w:name="funding"/>
+    <w:bookmarkEnd w:id="77"/>
+    <w:bookmarkStart w:id="78" w:name="funding"/>
     <w:p>
       <w:pPr>
         <w:pStyle w:val="Heading1"/>
@@ -18571,8 +19426,8 @@
         <w:t xml:space="preserve">[Funding.]</w:t>
       </w:r>
     </w:p>
-    <w:bookmarkEnd w:id="74"/>
-    <w:bookmarkStart w:id="75" w:name="acknowledgements"/>
+    <w:bookmarkEnd w:id="78"/>
+    <w:bookmarkStart w:id="79" w:name="acknowledgements"/>
     <w:p>
       <w:pPr>
         <w:pStyle w:val="Heading1"/>
@@ -18589,8 +19444,8 @@
         <w:t xml:space="preserve">This work contains modified Copernicus Climate Change Service information (2014–2023).</w:t>
       </w:r>
     </w:p>
-    <w:bookmarkEnd w:id="75"/>
-    <w:bookmarkStart w:id="76" w:name="declaration-of-generative-ai-use"/>
+    <w:bookmarkEnd w:id="79"/>
+    <w:bookmarkStart w:id="80" w:name="declaration-of-generative-ai-use"/>
     <w:p>
       <w:pPr>
         <w:pStyle w:val="Heading1"/>
@@ -18607,8 +19462,8 @@
         <w:t xml:space="preserve">During the preparation of this work the author(s) used [tool name] in order to [purpose]. After using this tool, the author(s) reviewed and edited the content as needed and take(s) full responsibility for the content of the published article.</w:t>
       </w:r>
     </w:p>
-    <w:bookmarkEnd w:id="76"/>
-    <w:bookmarkStart w:id="77" w:name="data-and-code-availability"/>
+    <w:bookmarkEnd w:id="80"/>
+    <w:bookmarkStart w:id="81" w:name="data-and-code-availability"/>
     <w:p>
       <w:pPr>
         <w:pStyle w:val="Heading1"/>
@@ -18625,8 +19480,8 @@
         <w:t xml:space="preserve">The model code, configuration with all parameters and sources, and the processed results are available at [repository URL]. ERA5 data are available from the Copernicus Climate Change Service.</w:t>
       </w:r>
     </w:p>
-    <w:bookmarkEnd w:id="77"/>
-    <w:bookmarkStart w:id="78" w:name="conflict-of-interest"/>
+    <w:bookmarkEnd w:id="81"/>
+    <w:bookmarkStart w:id="82" w:name="conflict-of-interest"/>
     <w:p>
       <w:pPr>
         <w:pStyle w:val="Heading1"/>
@@ -18643,8 +19498,8 @@
         <w:t xml:space="preserve">The authors declare that they have no known competing financial interests or personal relationships that could have appeared to influence the work reported in this paper.</w:t>
       </w:r>
     </w:p>
-    <w:bookmarkEnd w:id="78"/>
-    <w:bookmarkStart w:id="79" w:name="credit-authorship-contribution-statement"/>
+    <w:bookmarkEnd w:id="82"/>
+    <w:bookmarkStart w:id="83" w:name="credit-authorship-contribution-statement"/>
     <w:p>
       <w:pPr>
         <w:pStyle w:val="Heading1"/>
@@ -18661,8 +19516,8 @@
         <w:t xml:space="preserve">[Author 1]: Conceptualization, Methodology, Software, Formal analysis, Writing – original draft. [Author 2]: Supervision, Writing – review &amp; editing.</w:t>
       </w:r>
     </w:p>
-    <w:bookmarkEnd w:id="79"/>
-    <w:bookmarkStart w:id="80" w:name="references"/>
+    <w:bookmarkEnd w:id="83"/>
+    <w:bookmarkStart w:id="84" w:name="references"/>
     <w:p>
       <w:pPr>
         <w:pStyle w:val="Heading1"/>
@@ -18991,7 +19846,7 @@
         <w:t xml:space="preserve">Zhang Q, Grossmann IE (2016) Enterprise-wide optimization for industrial demand side management: fundamentals, advances, and perspectives. Chem Eng Res Des 116:114–31.</w:t>
       </w:r>
     </w:p>
-    <w:bookmarkEnd w:id="80"/>
+    <w:bookmarkEnd w:id="84"/>
     <w:sectPr>
       <w:footerReference r:id="rId9" w:type="default"/>
       <w:pgSz w:h="15840" w:w="12240"/>

</xml_diff>

<commit_message>
Discussion updated with the tested assumptions; text condensed; verification moved to S5
</commit_message>
<xml_diff>
--- a/docs/paper/paper.docx
+++ b/docs/paper/paper.docx
@@ -1284,79 +1284,49 @@
         <w:pStyle w:val="BodyText"/>
       </w:pPr>
       <w:r>
-        <w:t xml:space="preserve">The base case uses the existing main turbines rather than a new, smaller</w:t>
-      </w:r>
-      <w:r>
-        <w:t xml:space="preserve"> </w:t>
-      </w:r>
-      <w:r>
-        <w:t xml:space="preserve">GT, for three reasons. First, wind is being added to existing platforms that</w:t>
-      </w:r>
-      <w:r>
-        <w:t xml:space="preserve"> </w:t>
-      </w:r>
-      <w:r>
-        <w:t xml:space="preserve">keep their installed turbines; the five platforms supplied by Hywind Tampen</w:t>
-      </w:r>
-      <w:r>
-        <w:t xml:space="preserve"> </w:t>
-      </w:r>
-      <w:r>
-        <w:t xml:space="preserve">are an example (Equinor 2023). Second, load flexibility is an operational</w:t>
-      </w:r>
-      <w:r>
-        <w:t xml:space="preserve"> </w:t>
-      </w:r>
-      <w:r>
-        <w:t xml:space="preserve">measure, whereas a new GT is an investment; keeping the fleet fixed isolates</w:t>
-      </w:r>
-      <w:r>
-        <w:t xml:space="preserve"> </w:t>
-      </w:r>
-      <w:r>
-        <w:t xml:space="preserve">the value of flexibility. The effect of a smaller unit is quantified</w:t>
-      </w:r>
-      <w:r>
-        <w:t xml:space="preserve"> </w:t>
-      </w:r>
-      <w:r>
-        <w:t xml:space="preserve">separately in the sensitivity analysis with an 11.35 MW Solar Turbines</w:t>
-      </w:r>
-      <w:r>
-        <w:t xml:space="preserve"> </w:t>
-      </w:r>
-      <w:r>
-        <w:t xml:space="preserve">Mars 100 (Solar Turbines n.d.), either replacing one main unit or added to the</w:t>
-      </w:r>
-      <w:r>
-        <w:t xml:space="preserve"> </w:t>
-      </w:r>
-      <w:r>
-        <w:t xml:space="preserve">three, with both fixed and flexible demand. Third, the main turbine is a published reference machine with</w:t>
-      </w:r>
-      <w:r>
-        <w:t xml:space="preserve"> </w:t>
-      </w:r>
-      <w:r>
-        <w:t xml:space="preserve">a documented part-load curve (Svendsen et al. 2023), whereas manufacturers publish</w:t>
-      </w:r>
-      <w:r>
-        <w:t xml:space="preserve"> </w:t>
-      </w:r>
-      <w:r>
-        <w:t xml:space="preserve">only full-load ratings for small units. A small unit alone could not carry</w:t>
-      </w:r>
-      <w:r>
-        <w:t xml:space="preserve"> </w:t>
-      </w:r>
-      <w:r>
-        <w:t xml:space="preserve">the 20 MW platform with 5 MW of reserve in calm periods, so it is meaningful</w:t>
-      </w:r>
-      <w:r>
-        <w:t xml:space="preserve"> </w:t>
-      </w:r>
-      <w:r>
-        <w:t xml:space="preserve">only as part of a mixed fleet.</w:t>
+        <w:t xml:space="preserve">The base case keeps the existing main turbines, as on the five platforms</w:t>
+      </w:r>
+      <w:r>
+        <w:t xml:space="preserve"> </w:t>
+      </w:r>
+      <w:r>
+        <w:t xml:space="preserve">supplied by Hywind Tampen (Equinor 2023), for two reasons: load flexibility is</w:t>
+      </w:r>
+      <w:r>
+        <w:t xml:space="preserve"> </w:t>
+      </w:r>
+      <w:r>
+        <w:t xml:space="preserve">an operational measure, whereas a new GT is an investment, so a fixed fleet</w:t>
+      </w:r>
+      <w:r>
+        <w:t xml:space="preserve"> </w:t>
+      </w:r>
+      <w:r>
+        <w:t xml:space="preserve">isolates the value of flexibility; and the main turbine is a published</w:t>
+      </w:r>
+      <w:r>
+        <w:t xml:space="preserve"> </w:t>
+      </w:r>
+      <w:r>
+        <w:t xml:space="preserve">reference machine with a documented part-load curve (Svendsen et al. 2023). A smaller</w:t>
+      </w:r>
+      <w:r>
+        <w:t xml:space="preserve"> </w:t>
+      </w:r>
+      <w:r>
+        <w:t xml:space="preserve">unit, an 11.35 MW Solar Turbines Mars 100 (Solar Turbines n.d.), is tested in the</w:t>
+      </w:r>
+      <w:r>
+        <w:t xml:space="preserve"> </w:t>
+      </w:r>
+      <w:r>
+        <w:t xml:space="preserve">sensitivity analysis, replacing one main unit or added to the three. Alone it</w:t>
+      </w:r>
+      <w:r>
+        <w:t xml:space="preserve"> </w:t>
+      </w:r>
+      <w:r>
+        <w:t xml:space="preserve">could not carry the 20 MW platform with 5 MW of reserve in calm periods.</w:t>
       </w:r>
     </w:p>
     <w:p>
@@ -1400,19 +1370,7 @@
         <w:t xml:space="preserve"> </w:t>
       </w:r>
       <w:r>
-        <w:t xml:space="preserve">as assumptions because no published value could be found (Table S1). An</w:t>
-      </w:r>
-      <w:r>
-        <w:t xml:space="preserve"> </w:t>
-      </w:r>
-      <w:r>
-        <w:t xml:space="preserve">automated test suite checks each model component against hand calculations</w:t>
-      </w:r>
-      <w:r>
-        <w:t xml:space="preserve"> </w:t>
-      </w:r>
-      <w:r>
-        <w:t xml:space="preserve">and published values.</w:t>
+        <w:t xml:space="preserve">as assumptions because no published value could be found (Table S1).</w:t>
       </w:r>
     </w:p>
     <w:p>
@@ -7944,61 +7902,13 @@
         <w:pStyle w:val="FirstParagraph"/>
       </w:pPr>
       <w:r>
-        <w:t xml:space="preserve">The model components were verified by automated tests before the case</w:t>
-      </w:r>
-      <w:r>
-        <w:t xml:space="preserve"> </w:t>
-      </w:r>
-      <w:r>
-        <w:t xml:space="preserve">runs. The water injection pump power from NeqSim matches a hand calculation</w:t>
-      </w:r>
-      <w:r>
-        <w:t xml:space="preserve"> </w:t>
-      </w:r>
-      <w:r>
-        <w:t xml:space="preserve">of hydraulic power, the fuel model reproduces the LEOGO fuel coefficients,</w:t>
-      </w:r>
-      <w:r>
-        <w:t xml:space="preserve"> </w:t>
-      </w:r>
-      <w:r>
-        <w:t xml:space="preserve">and the piecewise-linear lever curves used by the scheduler match the</w:t>
-      </w:r>
-      <w:r>
-        <w:t xml:space="preserve"> </w:t>
-      </w:r>
-      <w:r>
-        <w:t xml:space="preserve">process model at every breakpoint. For the scheduler, the tests check on</w:t>
-      </w:r>
-      <w:r>
-        <w:t xml:space="preserve"> </w:t>
-      </w:r>
-      <w:r>
-        <w:t xml:space="preserve">short synthetic wind series that the power and heat balances close in every</w:t>
-      </w:r>
-      <w:r>
-        <w:t xml:space="preserve"> </w:t>
-      </w:r>
-      <w:r>
-        <w:t xml:space="preserve">hour, that the consumer limits and ramp rates are respected, that the fuel</w:t>
-      </w:r>
-      <w:r>
-        <w:t xml:space="preserve"> </w:t>
-      </w:r>
-      <w:r>
-        <w:t xml:space="preserve">reported equals the GT model applied to the scheduled loads, that a zero</w:t>
-      </w:r>
-      <w:r>
-        <w:t xml:space="preserve"> </w:t>
-      </w:r>
-      <w:r>
-        <w:t xml:space="preserve">deficit limit reproduces fixed injection, and that neither flexibility nor</w:t>
-      </w:r>
-      <w:r>
-        <w:t xml:space="preserve"> </w:t>
-      </w:r>
-      <w:r>
-        <w:t xml:space="preserve">a battery ever increases fuel use compared with fixed demand.</w:t>
+        <w:t xml:space="preserve">The model components were verified by automated tests against hand</w:t>
+      </w:r>
+      <w:r>
+        <w:t xml:space="preserve"> </w:t>
+      </w:r>
+      <w:r>
+        <w:t xml:space="preserve">calculations and published values (Supplementary material, S5).</w:t>
       </w:r>
     </w:p>
     <w:p>
@@ -10052,19 +9962,59 @@
         <w:t xml:space="preserve"> </w:t>
       </w:r>
       <w:r>
-        <w:t xml:space="preserve">With GTs only (Case 1), two turbines run in every hour in order to carry the</w:t>
-      </w:r>
-      <w:r>
-        <w:t xml:space="preserve"> </w:t>
-      </w:r>
-      <w:r>
-        <w:t xml:space="preserve">average load of 18.8 MW and the reserve of 5 MW, each at about 43 % load. The</w:t>
-      </w:r>
-      <w:r>
-        <w:t xml:space="preserve"> </w:t>
-      </w:r>
-      <w:r>
-        <w:t xml:space="preserve">platform burns 54.6 MSm³ of fuel gas and emits 127.7 kt CO</w:t>
+        <w:t xml:space="preserve">With GTs only (Case 1), two turbines run in every hour to carry the average</w:t>
+      </w:r>
+      <w:r>
+        <w:t xml:space="preserve"> </w:t>
+      </w:r>
+      <w:r>
+        <w:t xml:space="preserve">load of 18.8 MW and the 5 MW reserve, each at about 43 % load, so all 17,520</w:t>
+      </w:r>
+      <w:r>
+        <w:t xml:space="preserve"> </w:t>
+      </w:r>
+      <w:r>
+        <w:t xml:space="preserve">GT unit-hours are low-load hours. Even without wind, the reserve keeps the</w:t>
+      </w:r>
+      <w:r>
+        <w:t xml:space="preserve"> </w:t>
+      </w:r>
+      <w:r>
+        <w:t xml:space="preserve">turbines far from their best efficiency.</w:t>
+      </w:r>
+    </w:p>
+    <w:p>
+      <w:pPr>
+        <w:pStyle w:val="BodyText"/>
+      </w:pPr>
+      <w:r>
+        <w:t xml:space="preserve">A 30 MW wind farm with fixed demand (Case 2) halves the emissions, to 64.7 kt</w:t>
+      </w:r>
+      <w:r>
+        <w:t xml:space="preserve"> </w:t>
+      </w:r>
+      <w:r>
+        <w:t xml:space="preserve">(−49.4 %). Wind covers 54 % of the demand, and one GT is sufficient in 7,058</w:t>
+      </w:r>
+      <w:r>
+        <w:t xml:space="preserve"> </w:t>
+      </w:r>
+      <w:r>
+        <w:t xml:space="preserve">h. Since the demand cannot follow the wind, 33 % of the available wind energy</w:t>
+      </w:r>
+      <w:r>
+        <w:t xml:space="preserve"> </w:t>
+      </w:r>
+      <w:r>
+        <w:t xml:space="preserve">is curtailed, and a second GT is still required in 1,702 h.</w:t>
+      </w:r>
+    </w:p>
+    <w:p>
+      <w:pPr>
+        <w:pStyle w:val="BodyText"/>
+      </w:pPr>
+      <w:r>
+        <w:t xml:space="preserve">Flexible scheduling (Case 3) reduces the CO</w:t>
       </w:r>
       <w:r>
         <w:rPr>
@@ -10076,71 +10026,31 @@
         <w:t xml:space="preserve"> </w:t>
       </w:r>
       <w:r>
-        <w:t xml:space="preserve">per year, and all</w:t>
-      </w:r>
-      <w:r>
-        <w:t xml:space="preserve"> </w:t>
-      </w:r>
-      <w:r>
-        <w:t xml:space="preserve">17,520 GT unit-hours are low-load hours. This result illustrates the reserve</w:t>
-      </w:r>
-      <w:r>
-        <w:t xml:space="preserve"> </w:t>
-      </w:r>
-      <w:r>
-        <w:t xml:space="preserve">problem of off-grid platforms: even without wind, the turbines are operated</w:t>
-      </w:r>
-      <w:r>
-        <w:t xml:space="preserve"> </w:t>
-      </w:r>
-      <w:r>
-        <w:t xml:space="preserve">far from their best efficiency.</w:t>
-      </w:r>
-    </w:p>
-    <w:p>
-      <w:pPr>
-        <w:pStyle w:val="BodyText"/>
-      </w:pPr>
-      <w:r>
-        <w:t xml:space="preserve">A 30 MW wind farm with fixed demand (Case 2) halves the emissions, to 64.7 kt</w:t>
-      </w:r>
-      <w:r>
-        <w:t xml:space="preserve"> </w:t>
-      </w:r>
-      <w:r>
-        <w:t xml:space="preserve">(−49.4 %). Wind covers 54 % of the electricity demand, and one GT is</w:t>
-      </w:r>
-      <w:r>
-        <w:t xml:space="preserve"> </w:t>
-      </w:r>
-      <w:r>
-        <w:t xml:space="preserve">sufficient in 7,058 h. Since the demand cannot follow the wind, 44.5 GWh, or</w:t>
-      </w:r>
-      <w:r>
-        <w:t xml:space="preserve"> </w:t>
-      </w:r>
-      <w:r>
-        <w:t xml:space="preserve">33 % of the available wind energy, is curtailed, and the mean load of the</w:t>
-      </w:r>
-      <w:r>
-        <w:t xml:space="preserve"> </w:t>
-      </w:r>
-      <w:r>
-        <w:t xml:space="preserve">running GTs decreases to 32 % of rating. A second GT is still required in</w:t>
-      </w:r>
-      <w:r>
-        <w:t xml:space="preserve"> </w:t>
-      </w:r>
-      <w:r>
-        <w:t xml:space="preserve">1,702 h and is started 149 times.</w:t>
-      </w:r>
-    </w:p>
-    <w:p>
-      <w:pPr>
-        <w:pStyle w:val="BodyText"/>
-      </w:pPr>
-      <w:r>
-        <w:t xml:space="preserve">Flexible scheduling (Case 3) reduces the CO</w:t>
+        <w:t xml:space="preserve">emissions by a further 7.2</w:t>
+      </w:r>
+      <w:r>
+        <w:t xml:space="preserve"> </w:t>
+      </w:r>
+      <w:r>
+        <w:t xml:space="preserve">kt/yr, or 11.1 % relative to Case 2, without any loss of production. The GT</w:t>
+      </w:r>
+      <w:r>
+        <w:t xml:space="preserve"> </w:t>
+      </w:r>
+      <w:r>
+        <w:t xml:space="preserve">running hours fall from 10,462 to 8,788 unit-h, the low-load unit-hours by 34</w:t>
+      </w:r>
+      <w:r>
+        <w:t xml:space="preserve"> </w:t>
+      </w:r>
+      <w:r>
+        <w:t xml:space="preserve">% and the GT starts from 149 to 3, and the curtailment decreases by 13 %. The</w:t>
+      </w:r>
+      <w:r>
+        <w:t xml:space="preserve"> </w:t>
+      </w:r>
+      <w:r>
+        <w:t xml:space="preserve">combined fuel value and CO</w:t>
       </w:r>
       <w:r>
         <w:rPr>
@@ -10152,61 +10062,13 @@
         <w:t xml:space="preserve"> </w:t>
       </w:r>
       <w:r>
-        <w:t xml:space="preserve">emissions by a further 7.2 kt/yr,</w:t>
-      </w:r>
-      <w:r>
-        <w:t xml:space="preserve"> </w:t>
-      </w:r>
-      <w:r>
-        <w:t xml:space="preserve">or 11.1 % relative to Case 2, to 57.5 kt, without any loss of production, and</w:t>
-      </w:r>
-      <w:r>
-        <w:t xml:space="preserve"> </w:t>
-      </w:r>
-      <w:r>
-        <w:t xml:space="preserve">the fuel use decreases by the same 11 %. The GT running hours fall from 10,462</w:t>
-      </w:r>
-      <w:r>
-        <w:t xml:space="preserve"> </w:t>
-      </w:r>
-      <w:r>
-        <w:t xml:space="preserve">to 8,788 unit-h, the low-load unit-hours by 34 % and the number of GT starts</w:t>
-      </w:r>
-      <w:r>
-        <w:t xml:space="preserve"> </w:t>
-      </w:r>
-      <w:r>
-        <w:t xml:space="preserve">from 149 to 3. Wind covers 57.6 % of the demand, the curtailment decreases by</w:t>
-      </w:r>
-      <w:r>
-        <w:t xml:space="preserve"> </w:t>
-      </w:r>
-      <w:r>
-        <w:t xml:space="preserve">13 % to 38.7 GWh, and the mean load of the running GTs increases to 36 %. The</w:t>
-      </w:r>
-      <w:r>
-        <w:t xml:space="preserve"> </w:t>
-      </w:r>
-      <w:r>
-        <w:t xml:space="preserve">combined fuel value and CO</w:t>
-      </w:r>
-      <w:r>
-        <w:rPr>
-          <w:vertAlign w:val="subscript"/>
-        </w:rPr>
-        <w:t xml:space="preserve">2</w:t>
-      </w:r>
-      <w:r>
-        <w:t xml:space="preserve"> </w:t>
-      </w:r>
-      <w:r>
-        <w:t xml:space="preserve">cost is reduced by 27 MNOK/yr, of which 12.9 MNOK</w:t>
-      </w:r>
-      <w:r>
-        <w:t xml:space="preserve"> </w:t>
-      </w:r>
-      <w:r>
-        <w:t xml:space="preserve">is the value of the fuel saved.</w:t>
+        <w:t xml:space="preserve">cost is reduced by 27 MNOK/yr, of which 12.9</w:t>
+      </w:r>
+      <w:r>
+        <w:t xml:space="preserve"> </w:t>
+      </w:r>
+      <w:r>
+        <w:t xml:space="preserve">MNOK is the value of the fuel saved.</w:t>
       </w:r>
     </w:p>
     <w:p>
@@ -10214,43 +10076,25 @@
         <w:pStyle w:val="BodyText"/>
       </w:pPr>
       <w:r>
-        <w:t xml:space="preserve">The 4 MW / 4 MWh battery (Case 4) gives an additional reduction of only 0.3</w:t>
-      </w:r>
-      <w:r>
-        <w:t xml:space="preserve"> </w:t>
-      </w:r>
-      <w:r>
-        <w:t xml:space="preserve">kt, or 0.6 % relative to Case 3. It removes the remaining starts and the last</w:t>
-      </w:r>
-      <w:r>
-        <w:t xml:space="preserve"> </w:t>
-      </w:r>
-      <w:r>
-        <w:t xml:space="preserve">hours with a second GT, but its annual throughput is only 0.8 GWh. As one GT</w:t>
-      </w:r>
-      <w:r>
-        <w:t xml:space="preserve"> </w:t>
-      </w:r>
-      <w:r>
-        <w:t xml:space="preserve">must always be online, the battery cannot remove the main remaining loss,</w:t>
-      </w:r>
-      <w:r>
-        <w:t xml:space="preserve"> </w:t>
-      </w:r>
-      <w:r>
-        <w:t xml:space="preserve">which is one turbine idling near minimum load whenever the wind covers the</w:t>
-      </w:r>
-      <w:r>
-        <w:t xml:space="preserve"> </w:t>
-      </w:r>
-      <w:r>
-        <w:t xml:space="preserve">demand, and the low-load unit-hours even increase slightly, from 5,932 to</w:t>
-      </w:r>
-      <w:r>
-        <w:t xml:space="preserve"> </w:t>
-      </w:r>
-      <w:r>
-        <w:t xml:space="preserve">6,242.</w:t>
+        <w:t xml:space="preserve">The 4 MW / 4 MWh battery (Case 4) adds only 0.3 kt (0.6 %). It removes the</w:t>
+      </w:r>
+      <w:r>
+        <w:t xml:space="preserve"> </w:t>
+      </w:r>
+      <w:r>
+        <w:t xml:space="preserve">last starts and hours with a second GT, but with one GT always online it</w:t>
+      </w:r>
+      <w:r>
+        <w:t xml:space="preserve"> </w:t>
+      </w:r>
+      <w:r>
+        <w:t xml:space="preserve">cannot remove the main remaining loss, one turbine idling near minimum load</w:t>
+      </w:r>
+      <w:r>
+        <w:t xml:space="preserve"> </w:t>
+      </w:r>
+      <w:r>
+        <w:t xml:space="preserve">whenever the wind covers the demand.</w:t>
       </w:r>
     </w:p>
     <w:p>
@@ -16411,31 +16255,31 @@
         <w:pStyle w:val="BodyText"/>
       </w:pPr>
       <w:r>
-        <w:t xml:space="preserve">The schedule also changes the duty of the injection pumps. In Case 3, the</w:t>
-      </w:r>
-      <w:r>
-        <w:t xml:space="preserve"> </w:t>
-      </w:r>
-      <w:r>
-        <w:t xml:space="preserve">number of running pumps changes about 730 times a year, i.e. roughly two</w:t>
-      </w:r>
-      <w:r>
-        <w:t xml:space="preserve"> </w:t>
-      </w:r>
-      <w:r>
-        <w:t xml:space="preserve">starts per day, and this is not penalized in the model. A start cost or a</w:t>
-      </w:r>
-      <w:r>
-        <w:t xml:space="preserve"> </w:t>
-      </w:r>
-      <w:r>
-        <w:t xml:space="preserve">minimum run time would probably reduce the saving only slightly, since the</w:t>
-      </w:r>
-      <w:r>
-        <w:t xml:space="preserve"> </w:t>
-      </w:r>
-      <w:r>
-        <w:t xml:space="preserve">deficit limit is rarely reached, but this has not been tested.</w:t>
+        <w:t xml:space="preserve">The schedule also changes the duty of the injection pumps. Without a cost,</w:t>
+      </w:r>
+      <w:r>
+        <w:t xml:space="preserve"> </w:t>
+      </w:r>
+      <w:r>
+        <w:t xml:space="preserve">they start 731 times a year in Case 3, about twice a day. A modest start cost</w:t>
+      </w:r>
+      <w:r>
+        <w:t xml:space="preserve"> </w:t>
+      </w:r>
+      <w:r>
+        <w:t xml:space="preserve">reduces this to 100–160 starts a year at a loss of only 1–2 % of the saving</w:t>
+      </w:r>
+      <w:r>
+        <w:t xml:space="preserve"> </w:t>
+      </w:r>
+      <w:r>
+        <w:t xml:space="preserve">(Section 3.4), so pump wear is not an obstacle; an operator can choose the</w:t>
+      </w:r>
+      <w:r>
+        <w:t xml:space="preserve"> </w:t>
+      </w:r>
+      <w:r>
+        <w:t xml:space="preserve">start frequency it accepts.</w:t>
       </w:r>
     </w:p>
     <w:p>
@@ -16467,31 +16311,43 @@
         <w:t xml:space="preserve"> </w:t>
       </w:r>
       <w:r>
-        <w:t xml:space="preserve">53 % with flexible demand, and they remove most of the value of flexibility.</w:t>
-      </w:r>
-      <w:r>
-        <w:t xml:space="preserve"> </w:t>
-      </w:r>
-      <w:r>
-        <w:t xml:space="preserve">Such rules exist for good reasons of safety and regularity, and changing them</w:t>
-      </w:r>
-      <w:r>
-        <w:t xml:space="preserve"> </w:t>
-      </w:r>
-      <w:r>
-        <w:t xml:space="preserve">requires a technical justification, for instance grid-forming batteries that</w:t>
-      </w:r>
-      <w:r>
-        <w:t xml:space="preserve"> </w:t>
-      </w:r>
-      <w:r>
-        <w:t xml:space="preserve">can provide reserve and stability without a running GT. This is the logical</w:t>
-      </w:r>
-      <w:r>
-        <w:t xml:space="preserve"> </w:t>
-      </w:r>
-      <w:r>
-        <w:t xml:space="preserve">next step after demand flexibility.</w:t>
+        <w:t xml:space="preserve">53 % with flexible demand and remove most of the value of flexibility. Such</w:t>
+      </w:r>
+      <w:r>
+        <w:t xml:space="preserve"> </w:t>
+      </w:r>
+      <w:r>
+        <w:t xml:space="preserve">rules exist for good reasons of safety and regularity. Two measures can relax</w:t>
+      </w:r>
+      <w:r>
+        <w:t xml:space="preserve"> </w:t>
+      </w:r>
+      <w:r>
+        <w:t xml:space="preserve">them without new generation. Running injection pumps can serve as reserve,</w:t>
+      </w:r>
+      <w:r>
+        <w:t xml:space="preserve"> </w:t>
+      </w:r>
+      <w:r>
+        <w:t xml:space="preserve">since tripping them is fast and costs no production; this alone captures about</w:t>
+      </w:r>
+      <w:r>
+        <w:t xml:space="preserve"> </w:t>
+      </w:r>
+      <w:r>
+        <w:t xml:space="preserve">60 % of the benefit of flexibility. Grid-forming batteries that provide</w:t>
+      </w:r>
+      <w:r>
+        <w:t xml:space="preserve"> </w:t>
+      </w:r>
+      <w:r>
+        <w:t xml:space="preserve">reserve and stability without a running GT would go further and are the</w:t>
+      </w:r>
+      <w:r>
+        <w:t xml:space="preserve"> </w:t>
+      </w:r>
+      <w:r>
+        <w:t xml:space="preserve">logical next step after demand flexibility.</w:t>
       </w:r>
     </w:p>
     <w:p>
@@ -16499,43 +16355,49 @@
         <w:pStyle w:val="BodyText"/>
       </w:pPr>
       <w:r>
-        <w:t xml:space="preserve">The approach should be transferable to other installations, with some</w:t>
-      </w:r>
-      <w:r>
-        <w:t xml:space="preserve"> </w:t>
-      </w:r>
-      <w:r>
-        <w:t xml:space="preserve">reservations. A platform gains most when it has a large deferrable consumer,</w:t>
-      </w:r>
-      <w:r>
-        <w:t xml:space="preserve"> </w:t>
-      </w:r>
-      <w:r>
-        <w:t xml:space="preserve">an average demand close to the capacity of one GT minus the reserve, and a</w:t>
-      </w:r>
-      <w:r>
-        <w:t xml:space="preserve"> </w:t>
-      </w:r>
-      <w:r>
-        <w:t xml:space="preserve">wind supply of the same order as its demand. On other types of installations,</w:t>
-      </w:r>
-      <w:r>
-        <w:t xml:space="preserve"> </w:t>
-      </w:r>
-      <w:r>
-        <w:t xml:space="preserve">gas export compression, electric heating and the regeneration of glycol or</w:t>
-      </w:r>
-      <w:r>
-        <w:t xml:space="preserve"> </w:t>
-      </w:r>
-      <w:r>
-        <w:t xml:space="preserve">other process chemicals could be deferrable, but only where buffer storage</w:t>
-      </w:r>
-      <w:r>
-        <w:t xml:space="preserve"> </w:t>
-      </w:r>
-      <w:r>
-        <w:t xml:space="preserve">such as line pack or tank volume is available.</w:t>
+        <w:t xml:space="preserve">The approach should be transferable to other installations. The demand and</w:t>
+      </w:r>
+      <w:r>
+        <w:t xml:space="preserve"> </w:t>
+      </w:r>
+      <w:r>
+        <w:t xml:space="preserve">reserve map (Section 3.5) gives a simple screening rule: a platform gains</w:t>
+      </w:r>
+      <w:r>
+        <w:t xml:space="preserve"> </w:t>
+      </w:r>
+      <w:r>
+        <w:t xml:space="preserve">most, about 10–12 %, when its mean demand exceeds the rating of one GT minus</w:t>
+      </w:r>
+      <w:r>
+        <w:t xml:space="preserve"> </w:t>
+      </w:r>
+      <w:r>
+        <w:t xml:space="preserve">the reserve, and about 4–5 % otherwise, provided it has a large deferrable</w:t>
+      </w:r>
+      <w:r>
+        <w:t xml:space="preserve"> </w:t>
+      </w:r>
+      <w:r>
+        <w:t xml:space="preserve">consumer and a wind supply of the same order as its demand. On other types of</w:t>
+      </w:r>
+      <w:r>
+        <w:t xml:space="preserve"> </w:t>
+      </w:r>
+      <w:r>
+        <w:t xml:space="preserve">installations, gas export compression, electric heating and the regeneration</w:t>
+      </w:r>
+      <w:r>
+        <w:t xml:space="preserve"> </w:t>
+      </w:r>
+      <w:r>
+        <w:t xml:space="preserve">of glycol or other process chemicals could be deferrable, but only where</w:t>
+      </w:r>
+      <w:r>
+        <w:t xml:space="preserve"> </w:t>
+      </w:r>
+      <w:r>
+        <w:t xml:space="preserve">buffer storage such as line pack or tank volume is available.</w:t>
       </w:r>
     </w:p>
     <w:bookmarkEnd w:id="71"/>
@@ -16553,61 +16415,43 @@
         <w:pStyle w:val="FirstParagraph"/>
       </w:pPr>
       <w:r>
-        <w:t xml:space="preserve">Not all assumptions were varied in the sensitivity analysis, and the effect of</w:t>
-      </w:r>
-      <w:r>
-        <w:t xml:space="preserve"> </w:t>
-      </w:r>
-      <w:r>
-        <w:t xml:space="preserve">the untested ones can be traced through the mechanism described above. The</w:t>
-      </w:r>
-      <w:r>
-        <w:t xml:space="preserve"> </w:t>
-      </w:r>
-      <w:r>
-        <w:t xml:space="preserve">saving is determined by the number of hours in which, at fixed demand, the</w:t>
-      </w:r>
-      <w:r>
-        <w:t xml:space="preserve"> </w:t>
-      </w:r>
-      <w:r>
-        <w:t xml:space="preserve">platform runs one GT more than its load requires. This number increases with</w:t>
-      </w:r>
-      <w:r>
-        <w:t xml:space="preserve"> </w:t>
-      </w:r>
-      <w:r>
-        <w:t xml:space="preserve">the reserve requirement, with the demand relative to the capacity of one GT</w:t>
-      </w:r>
-      <w:r>
-        <w:t xml:space="preserve"> </w:t>
-      </w:r>
-      <w:r>
-        <w:t xml:space="preserve">and with the time that the wind spends just below the demand. A reserve larger</w:t>
-      </w:r>
-      <w:r>
-        <w:t xml:space="preserve"> </w:t>
-      </w:r>
-      <w:r>
-        <w:t xml:space="preserve">than 5 MW, or a platform whose demand is closer to the rating of one GT,</w:t>
-      </w:r>
-      <w:r>
-        <w:t xml:space="preserve"> </w:t>
-      </w:r>
-      <w:r>
-        <w:t xml:space="preserve">should thus increase the value of flexibility. A large spare GT capacity, or a</w:t>
-      </w:r>
-      <w:r>
-        <w:t xml:space="preserve"> </w:t>
-      </w:r>
-      <w:r>
-        <w:t xml:space="preserve">wind farm much larger than the demand, should reduce it, as the wind farm</w:t>
-      </w:r>
-      <w:r>
-        <w:t xml:space="preserve"> </w:t>
-      </w:r>
-      <w:r>
-        <w:t xml:space="preserve">sensitivity shows for the latter.</w:t>
+        <w:t xml:space="preserve">The saving is determined by the number of hours in which, at fixed demand, the</w:t>
+      </w:r>
+      <w:r>
+        <w:t xml:space="preserve"> </w:t>
+      </w:r>
+      <w:r>
+        <w:t xml:space="preserve">platform runs one GT more than its load requires. The sensitivity runs confirm</w:t>
+      </w:r>
+      <w:r>
+        <w:t xml:space="preserve"> </w:t>
+      </w:r>
+      <w:r>
+        <w:t xml:space="preserve">the expected direction of the main assumptions: a larger reserve, a reserve</w:t>
+      </w:r>
+      <w:r>
+        <w:t xml:space="preserve"> </w:t>
+      </w:r>
+      <w:r>
+        <w:t xml:space="preserve">that covers the wind, a higher GT minimum load and a demand above the margin</w:t>
+      </w:r>
+      <w:r>
+        <w:t xml:space="preserve"> </w:t>
+      </w:r>
+      <w:r>
+        <w:t xml:space="preserve">of one GT all increase the value of flexibility, whereas a wind farm much</w:t>
+      </w:r>
+      <w:r>
+        <w:t xml:space="preserve"> </w:t>
+      </w:r>
+      <w:r>
+        <w:t xml:space="preserve">larger than the demand, or injection pumps that already count as reserve,</w:t>
+      </w:r>
+      <w:r>
+        <w:t xml:space="preserve"> </w:t>
+      </w:r>
+      <w:r>
+        <w:t xml:space="preserve">reduce it.</w:t>
       </w:r>
     </w:p>
     <w:p>

</xml_diff>